<commit_message>
Add: add section 1.4.2 1.4.3
</commit_message>
<xml_diff>
--- a/Documentation/Основной документ.docx
+++ b/Documentation/Основной документ.docx
@@ -2549,23 +2549,7 @@
             <w:noProof/>
             <w:lang w:eastAsia="ru-RU"/>
           </w:rPr>
-          <w:t>Проектирование</w:t>
-        </w:r>
-        <w:r>
-          <w:rPr>
-            <w:rStyle w:val="a6"/>
-            <w:noProof/>
-            <w:lang w:eastAsia="ru-RU"/>
-          </w:rPr>
-          <w:t xml:space="preserve"> </w:t>
-        </w:r>
-        <w:r>
-          <w:rPr>
-            <w:rStyle w:val="a6"/>
-            <w:noProof/>
-            <w:lang w:eastAsia="ru-RU"/>
-          </w:rPr>
-          <w:t>слоев</w:t>
+          <w:t>Проектирование слоев</w:t>
         </w:r>
         <w:r>
           <w:rPr>
@@ -10950,8 +10934,6 @@
         </w:rPr>
       </w:pPr>
       <w:bookmarkStart w:id="20" w:name="_Toc243599233"/>
-      <w:bookmarkStart w:id="21" w:name="_GoBack"/>
-      <w:bookmarkEnd w:id="21"/>
       <w:r>
         <w:rPr>
           <w:lang w:eastAsia="ru-RU"/>
@@ -11496,6 +11478,7 @@
       </w:pPr>
       <w:r>
         <w:rPr>
+          <w:noProof/>
           <w:lang w:eastAsia="ru-RU"/>
         </w:rPr>
         <w:drawing>
@@ -11634,6 +11617,7 @@
       </w:pPr>
       <w:r>
         <w:rPr>
+          <w:noProof/>
           <w:lang w:eastAsia="ru-RU"/>
         </w:rPr>
         <w:drawing>
@@ -11691,48 +11675,6 @@
     </w:p>
     <w:p>
       <w:pPr>
-        <w:pStyle w:val="a9"/>
-        <w:jc w:val="left"/>
-        <w:rPr>
-          <w:lang w:eastAsia="ru-RU"/>
-        </w:rPr>
-      </w:pPr>
-    </w:p>
-    <w:p>
-      <w:pPr>
-        <w:pStyle w:val="a9"/>
-        <w:jc w:val="left"/>
-        <w:rPr>
-          <w:lang w:eastAsia="ru-RU"/>
-        </w:rPr>
-      </w:pPr>
-      <w:r>
-        <w:rPr>
-          <w:lang w:eastAsia="ru-RU"/>
-        </w:rPr>
-        <w:t>Добавить сюда диаграмму</w:t>
-      </w:r>
-    </w:p>
-    <w:p>
-      <w:pPr>
-        <w:pStyle w:val="a9"/>
-        <w:jc w:val="left"/>
-        <w:rPr>
-          <w:lang w:eastAsia="ru-RU"/>
-        </w:rPr>
-      </w:pPr>
-    </w:p>
-    <w:p>
-      <w:pPr>
-        <w:pStyle w:val="a9"/>
-        <w:jc w:val="left"/>
-        <w:rPr>
-          <w:lang w:eastAsia="ru-RU"/>
-        </w:rPr>
-      </w:pPr>
-    </w:p>
-    <w:p>
-      <w:pPr>
         <w:pStyle w:val="3"/>
         <w:numPr>
           <w:ilvl w:val="2"/>
@@ -11743,7 +11685,7 @@
           <w:lang w:val="en-US" w:eastAsia="ru-RU"/>
         </w:rPr>
       </w:pPr>
-      <w:bookmarkStart w:id="22" w:name="_Toc243599234"/>
+      <w:bookmarkStart w:id="21" w:name="_Toc243599234"/>
       <w:r>
         <w:rPr>
           <w:lang w:eastAsia="ru-RU"/>
@@ -11756,7 +11698,80 @@
         </w:rPr>
         <w:t>domain</w:t>
       </w:r>
-      <w:bookmarkEnd w:id="22"/>
+      <w:bookmarkEnd w:id="21"/>
+    </w:p>
+    <w:p>
+      <w:pPr>
+        <w:pStyle w:val="a9"/>
+        <w:rPr>
+          <w:lang w:eastAsia="ru-RU"/>
+        </w:rPr>
+      </w:pPr>
+      <w:r>
+        <w:rPr>
+          <w:lang w:eastAsia="ru-RU"/>
+        </w:rPr>
+        <w:t>Для более наглядного</w:t>
+      </w:r>
+    </w:p>
+    <w:p>
+      <w:pPr>
+        <w:pStyle w:val="a9"/>
+        <w:rPr>
+          <w:lang w:eastAsia="ru-RU"/>
+        </w:rPr>
+      </w:pPr>
+      <w:r>
+        <w:rPr>
+          <w:lang w:eastAsia="ru-RU"/>
+        </w:rPr>
+        <w:t xml:space="preserve">Сущности слоя </w:t>
+      </w:r>
+      <w:proofErr w:type="spellStart"/>
+      <w:r>
+        <w:rPr>
+          <w:lang w:eastAsia="ru-RU"/>
+        </w:rPr>
+        <w:t>Domain</w:t>
+      </w:r>
+      <w:proofErr w:type="spellEnd"/>
+      <w:r>
+        <w:rPr>
+          <w:lang w:eastAsia="ru-RU"/>
+        </w:rPr>
+        <w:t xml:space="preserve"> представляют собой модели предметной области, независимые от способа хранения.</w:t>
+      </w:r>
+    </w:p>
+    <w:p>
+      <w:pPr>
+        <w:pStyle w:val="a9"/>
+        <w:spacing w:before="240"/>
+        <w:ind w:firstLine="0"/>
+        <w:contextualSpacing w:val="0"/>
+        <w:rPr>
+          <w:lang w:eastAsia="ru-RU"/>
+        </w:rPr>
+      </w:pPr>
+      <w:r>
+        <w:rPr>
+          <w:lang w:eastAsia="ru-RU"/>
+        </w:rPr>
+        <w:t xml:space="preserve">Таблица 6 – Список моделей слоя </w:t>
+      </w:r>
+      <w:proofErr w:type="spellStart"/>
+      <w:r>
+        <w:rPr>
+          <w:lang w:eastAsia="ru-RU"/>
+        </w:rPr>
+        <w:t>Domain</w:t>
+      </w:r>
+      <w:proofErr w:type="spellEnd"/>
+      <w:r>
+        <w:rPr>
+          <w:lang w:eastAsia="ru-RU"/>
+        </w:rPr>
+        <w:t>.</w:t>
+      </w:r>
     </w:p>
     <w:tbl>
       <w:tblPr>
@@ -11765,9 +11780,9 @@
         <w:tblLook w:val="04A0" w:firstRow="1" w:lastRow="0" w:firstColumn="1" w:lastColumn="0" w:noHBand="0" w:noVBand="1"/>
       </w:tblPr>
       <w:tblGrid>
-        <w:gridCol w:w="3172"/>
-        <w:gridCol w:w="3085"/>
-        <w:gridCol w:w="3088"/>
+        <w:gridCol w:w="3164"/>
+        <w:gridCol w:w="3104"/>
+        <w:gridCol w:w="3077"/>
       </w:tblGrid>
       <w:tr>
         <w:tc>
@@ -11887,203 +11902,33 @@
                 <w:szCs w:val="24"/>
                 <w:lang w:val="en-US"/>
               </w:rPr>
-              <w:t>id, title, introduction, objective, status</w:t>
-            </w:r>
-          </w:p>
-        </w:tc>
-        <w:tc>
-          <w:tcPr>
-            <w:tcW w:w="3408" w:type="dxa"/>
-          </w:tcPr>
-          <w:p>
-            <w:pPr>
-              <w:spacing w:line="240" w:lineRule="auto"/>
+              <w:t>id, title (</w:t>
+            </w:r>
+            <w:r>
               <w:rPr>
                 <w:rFonts w:ascii="Times New Roman" w:hAnsi="Times New Roman" w:cs="Times New Roman"/>
                 <w:sz w:val="24"/>
                 <w:szCs w:val="24"/>
               </w:rPr>
-            </w:pPr>
-            <w:r>
-              <w:rPr>
-                <w:rFonts w:ascii="Times New Roman" w:hAnsi="Times New Roman" w:cs="Times New Roman"/>
-                <w:sz w:val="24"/>
-                <w:szCs w:val="24"/>
-              </w:rPr>
-              <w:t>Детективное дело и состояние расследования.</w:t>
-            </w:r>
-          </w:p>
-        </w:tc>
-      </w:tr>
-      <w:tr>
-        <w:tc>
-          <w:tcPr>
-            <w:tcW w:w="3408" w:type="dxa"/>
-          </w:tcPr>
-          <w:p>
-            <w:pPr>
-              <w:spacing w:line="240" w:lineRule="auto"/>
-              <w:rPr>
-                <w:rFonts w:ascii="Times New Roman" w:hAnsi="Times New Roman" w:cs="Times New Roman"/>
-                <w:sz w:val="24"/>
-                <w:szCs w:val="24"/>
-              </w:rPr>
-            </w:pPr>
-            <w:proofErr w:type="spellStart"/>
-            <w:r>
-              <w:rPr>
-                <w:rFonts w:ascii="Times New Roman" w:hAnsi="Times New Roman" w:cs="Times New Roman"/>
-                <w:sz w:val="24"/>
-                <w:szCs w:val="24"/>
-              </w:rPr>
-              <w:t>Suspect</w:t>
-            </w:r>
-            <w:proofErr w:type="spellEnd"/>
-          </w:p>
-        </w:tc>
-        <w:tc>
-          <w:tcPr>
-            <w:tcW w:w="3408" w:type="dxa"/>
-          </w:tcPr>
-          <w:p>
-            <w:pPr>
-              <w:spacing w:line="240" w:lineRule="auto"/>
-              <w:rPr>
-                <w:rFonts w:ascii="Times New Roman" w:hAnsi="Times New Roman" w:cs="Times New Roman"/>
-                <w:sz w:val="24"/>
-                <w:szCs w:val="24"/>
-              </w:rPr>
-            </w:pPr>
-            <w:proofErr w:type="spellStart"/>
-            <w:r>
-              <w:rPr>
-                <w:rFonts w:ascii="Times New Roman" w:hAnsi="Times New Roman" w:cs="Times New Roman"/>
-                <w:sz w:val="24"/>
-                <w:szCs w:val="24"/>
-              </w:rPr>
-              <w:t>id</w:t>
-            </w:r>
-            <w:proofErr w:type="spellEnd"/>
-            <w:r>
-              <w:rPr>
-                <w:rFonts w:ascii="Times New Roman" w:hAnsi="Times New Roman" w:cs="Times New Roman"/>
-                <w:sz w:val="24"/>
-                <w:szCs w:val="24"/>
-              </w:rPr>
-              <w:t xml:space="preserve">, </w:t>
-            </w:r>
-            <w:proofErr w:type="spellStart"/>
-            <w:r>
-              <w:rPr>
-                <w:rFonts w:ascii="Times New Roman" w:hAnsi="Times New Roman" w:cs="Times New Roman"/>
-                <w:sz w:val="24"/>
-                <w:szCs w:val="24"/>
-              </w:rPr>
-              <w:t>caseId</w:t>
-            </w:r>
-            <w:proofErr w:type="spellEnd"/>
-            <w:r>
-              <w:rPr>
-                <w:rFonts w:ascii="Times New Roman" w:hAnsi="Times New Roman" w:cs="Times New Roman"/>
-                <w:sz w:val="24"/>
-                <w:szCs w:val="24"/>
-              </w:rPr>
-              <w:t xml:space="preserve">, </w:t>
-            </w:r>
-            <w:proofErr w:type="spellStart"/>
-            <w:r>
-              <w:rPr>
-                <w:rFonts w:ascii="Times New Roman" w:hAnsi="Times New Roman" w:cs="Times New Roman"/>
-                <w:sz w:val="24"/>
-                <w:szCs w:val="24"/>
-              </w:rPr>
-              <w:t>name</w:t>
-            </w:r>
-            <w:proofErr w:type="spellEnd"/>
-            <w:r>
-              <w:rPr>
-                <w:rFonts w:ascii="Times New Roman" w:hAnsi="Times New Roman" w:cs="Times New Roman"/>
-                <w:sz w:val="24"/>
-                <w:szCs w:val="24"/>
-              </w:rPr>
-              <w:t xml:space="preserve">, </w:t>
-            </w:r>
-            <w:proofErr w:type="spellStart"/>
-            <w:r>
-              <w:rPr>
-                <w:rFonts w:ascii="Times New Roman" w:hAnsi="Times New Roman" w:cs="Times New Roman"/>
-                <w:sz w:val="24"/>
-                <w:szCs w:val="24"/>
-              </w:rPr>
-              <w:t>profile</w:t>
-            </w:r>
-            <w:proofErr w:type="spellEnd"/>
-          </w:p>
-        </w:tc>
-        <w:tc>
-          <w:tcPr>
-            <w:tcW w:w="3408" w:type="dxa"/>
-          </w:tcPr>
-          <w:p>
-            <w:pPr>
-              <w:spacing w:line="240" w:lineRule="auto"/>
-              <w:rPr>
-                <w:rFonts w:ascii="Times New Roman" w:hAnsi="Times New Roman" w:cs="Times New Roman"/>
-                <w:sz w:val="24"/>
-                <w:szCs w:val="24"/>
-              </w:rPr>
-            </w:pPr>
-            <w:r>
-              <w:rPr>
-                <w:rFonts w:ascii="Times New Roman" w:hAnsi="Times New Roman" w:cs="Times New Roman"/>
-                <w:sz w:val="24"/>
-                <w:szCs w:val="24"/>
-              </w:rPr>
-              <w:t>Подозреваемый в рамках дела.</w:t>
-            </w:r>
-          </w:p>
-        </w:tc>
-      </w:tr>
-      <w:tr>
-        <w:tc>
-          <w:tcPr>
-            <w:tcW w:w="3408" w:type="dxa"/>
-          </w:tcPr>
-          <w:p>
-            <w:pPr>
-              <w:spacing w:line="240" w:lineRule="auto"/>
-              <w:rPr>
-                <w:rFonts w:ascii="Times New Roman" w:hAnsi="Times New Roman" w:cs="Times New Roman"/>
-                <w:sz w:val="24"/>
-                <w:szCs w:val="24"/>
-              </w:rPr>
-            </w:pPr>
-            <w:proofErr w:type="spellStart"/>
-            <w:r>
-              <w:rPr>
-                <w:rFonts w:ascii="Times New Roman" w:hAnsi="Times New Roman" w:cs="Times New Roman"/>
-                <w:sz w:val="24"/>
-                <w:szCs w:val="24"/>
-              </w:rPr>
-              <w:t>Clue</w:t>
-            </w:r>
-            <w:proofErr w:type="spellEnd"/>
-          </w:p>
-        </w:tc>
-        <w:tc>
-          <w:tcPr>
-            <w:tcW w:w="3408" w:type="dxa"/>
-          </w:tcPr>
-          <w:p>
-            <w:pPr>
-              <w:spacing w:line="240" w:lineRule="auto"/>
+              <w:t>название</w:t>
+            </w:r>
+            <w:r>
               <w:rPr>
                 <w:rFonts w:ascii="Times New Roman" w:hAnsi="Times New Roman" w:cs="Times New Roman"/>
                 <w:sz w:val="24"/>
                 <w:szCs w:val="24"/>
                 <w:lang w:val="en-US"/>
               </w:rPr>
-            </w:pPr>
+              <w:t>), introduction (</w:t>
+            </w:r>
+            <w:r>
+              <w:rPr>
+                <w:rFonts w:ascii="Times New Roman" w:hAnsi="Times New Roman" w:cs="Times New Roman"/>
+                <w:sz w:val="24"/>
+                <w:szCs w:val="24"/>
+              </w:rPr>
+              <w:t>вступление</w:t>
+            </w:r>
             <w:r>
               <w:rPr>
                 <w:rFonts w:ascii="Times New Roman" w:hAnsi="Times New Roman" w:cs="Times New Roman"/>
@@ -12091,9 +11936,16 @@
                 <w:szCs w:val="24"/>
                 <w:lang w:val="en-US"/>
               </w:rPr>
-              <w:t xml:space="preserve">id, </w:t>
-            </w:r>
-            <w:proofErr w:type="spellStart"/>
+              <w:t>), objective (</w:t>
+            </w:r>
+            <w:r>
+              <w:rPr>
+                <w:rFonts w:ascii="Times New Roman" w:hAnsi="Times New Roman" w:cs="Times New Roman"/>
+                <w:sz w:val="24"/>
+                <w:szCs w:val="24"/>
+              </w:rPr>
+              <w:t>цель</w:t>
+            </w:r>
             <w:r>
               <w:rPr>
                 <w:rFonts w:ascii="Times New Roman" w:hAnsi="Times New Roman" w:cs="Times New Roman"/>
@@ -12101,9 +11953,16 @@
                 <w:szCs w:val="24"/>
                 <w:lang w:val="en-US"/>
               </w:rPr>
-              <w:t>caseId</w:t>
-            </w:r>
-            <w:proofErr w:type="spellEnd"/>
+              <w:t>), status (</w:t>
+            </w:r>
+            <w:r>
+              <w:rPr>
+                <w:rFonts w:ascii="Times New Roman" w:hAnsi="Times New Roman" w:cs="Times New Roman"/>
+                <w:sz w:val="24"/>
+                <w:szCs w:val="24"/>
+              </w:rPr>
+              <w:t>статус</w:t>
+            </w:r>
             <w:r>
               <w:rPr>
                 <w:rFonts w:ascii="Times New Roman" w:hAnsi="Times New Roman" w:cs="Times New Roman"/>
@@ -12111,9 +11970,16 @@
                 <w:szCs w:val="24"/>
                 <w:lang w:val="en-US"/>
               </w:rPr>
-              <w:t xml:space="preserve">, title, description, source, </w:t>
-            </w:r>
-            <w:proofErr w:type="spellStart"/>
+              <w:t xml:space="preserve"> </w:t>
+            </w:r>
+            <w:r>
+              <w:rPr>
+                <w:rFonts w:ascii="Times New Roman" w:hAnsi="Times New Roman" w:cs="Times New Roman"/>
+                <w:sz w:val="24"/>
+                <w:szCs w:val="24"/>
+              </w:rPr>
+              <w:t>дела</w:t>
+            </w:r>
             <w:r>
               <w:rPr>
                 <w:rFonts w:ascii="Times New Roman" w:hAnsi="Times New Roman" w:cs="Times New Roman"/>
@@ -12121,9 +11987,8 @@
                 <w:szCs w:val="24"/>
                 <w:lang w:val="en-US"/>
               </w:rPr>
-              <w:t>isCritical</w:t>
-            </w:r>
-            <w:proofErr w:type="spellEnd"/>
+              <w:t>).</w:t>
+            </w:r>
           </w:p>
         </w:tc>
         <w:tc>
@@ -12145,7 +12010,7 @@
                 <w:sz w:val="24"/>
                 <w:szCs w:val="24"/>
               </w:rPr>
-              <w:t>Улика, которую игрок получает и изучает.</w:t>
+              <w:t>Детективное дело и состояние расследования.</w:t>
             </w:r>
           </w:p>
         </w:tc>
@@ -12171,7 +12036,7 @@
                 <w:sz w:val="24"/>
                 <w:szCs w:val="24"/>
               </w:rPr>
-              <w:t>DialogueMessage</w:t>
+              <w:t>Suspect</w:t>
             </w:r>
             <w:proofErr w:type="spellEnd"/>
           </w:p>
@@ -12183,13 +12048,175 @@
           <w:p>
             <w:pPr>
               <w:spacing w:line="240" w:lineRule="auto"/>
+              <w:rPr>
+                <w:rFonts w:ascii="Times New Roman" w:hAnsi="Times New Roman" w:cs="Times New Roman"/>
+                <w:sz w:val="24"/>
+                <w:szCs w:val="24"/>
+              </w:rPr>
+            </w:pPr>
+            <w:proofErr w:type="spellStart"/>
+            <w:r>
+              <w:rPr>
+                <w:rFonts w:ascii="Times New Roman" w:hAnsi="Times New Roman" w:cs="Times New Roman"/>
+                <w:sz w:val="24"/>
+                <w:szCs w:val="24"/>
+              </w:rPr>
+              <w:t>id</w:t>
+            </w:r>
+            <w:proofErr w:type="spellEnd"/>
+            <w:r>
+              <w:rPr>
+                <w:rFonts w:ascii="Times New Roman" w:hAnsi="Times New Roman" w:cs="Times New Roman"/>
+                <w:sz w:val="24"/>
+                <w:szCs w:val="24"/>
+              </w:rPr>
+              <w:t xml:space="preserve">, </w:t>
+            </w:r>
+            <w:proofErr w:type="spellStart"/>
+            <w:r>
+              <w:rPr>
+                <w:rFonts w:ascii="Times New Roman" w:hAnsi="Times New Roman" w:cs="Times New Roman"/>
+                <w:sz w:val="24"/>
+                <w:szCs w:val="24"/>
+              </w:rPr>
+              <w:t>caseId</w:t>
+            </w:r>
+            <w:proofErr w:type="spellEnd"/>
+            <w:r>
+              <w:rPr>
+                <w:rFonts w:ascii="Times New Roman" w:hAnsi="Times New Roman" w:cs="Times New Roman"/>
+                <w:sz w:val="24"/>
+                <w:szCs w:val="24"/>
+              </w:rPr>
+              <w:t xml:space="preserve"> (идентификатор дела), </w:t>
+            </w:r>
+            <w:proofErr w:type="spellStart"/>
+            <w:r>
+              <w:rPr>
+                <w:rFonts w:ascii="Times New Roman" w:hAnsi="Times New Roman" w:cs="Times New Roman"/>
+                <w:sz w:val="24"/>
+                <w:szCs w:val="24"/>
+              </w:rPr>
+              <w:t>name</w:t>
+            </w:r>
+            <w:proofErr w:type="spellEnd"/>
+            <w:r>
+              <w:rPr>
+                <w:rFonts w:ascii="Times New Roman" w:hAnsi="Times New Roman" w:cs="Times New Roman"/>
+                <w:sz w:val="24"/>
+                <w:szCs w:val="24"/>
+              </w:rPr>
+              <w:t xml:space="preserve"> (имя</w:t>
+            </w:r>
+            <w:r>
+              <w:rPr>
+                <w:rFonts w:ascii="Times New Roman" w:hAnsi="Times New Roman" w:cs="Times New Roman"/>
+                <w:sz w:val="24"/>
+                <w:szCs w:val="24"/>
+              </w:rPr>
+              <w:t xml:space="preserve">), </w:t>
+            </w:r>
+            <w:proofErr w:type="spellStart"/>
+            <w:r>
+              <w:rPr>
+                <w:rFonts w:ascii="Times New Roman" w:hAnsi="Times New Roman" w:cs="Times New Roman"/>
+                <w:sz w:val="24"/>
+                <w:szCs w:val="24"/>
+              </w:rPr>
+              <w:t>profile</w:t>
+            </w:r>
+            <w:proofErr w:type="spellEnd"/>
+            <w:r>
+              <w:rPr>
+                <w:rFonts w:ascii="Times New Roman" w:hAnsi="Times New Roman" w:cs="Times New Roman"/>
+                <w:sz w:val="24"/>
+                <w:szCs w:val="24"/>
+              </w:rPr>
+              <w:t xml:space="preserve"> (описание персонажа)</w:t>
+            </w:r>
+          </w:p>
+        </w:tc>
+        <w:tc>
+          <w:tcPr>
+            <w:tcW w:w="3408" w:type="dxa"/>
+          </w:tcPr>
+          <w:p>
+            <w:pPr>
+              <w:spacing w:line="240" w:lineRule="auto"/>
+              <w:rPr>
+                <w:rFonts w:ascii="Times New Roman" w:hAnsi="Times New Roman" w:cs="Times New Roman"/>
+                <w:sz w:val="24"/>
+                <w:szCs w:val="24"/>
+              </w:rPr>
+            </w:pPr>
+            <w:r>
+              <w:rPr>
+                <w:rFonts w:ascii="Times New Roman" w:hAnsi="Times New Roman" w:cs="Times New Roman"/>
+                <w:sz w:val="24"/>
+                <w:szCs w:val="24"/>
+              </w:rPr>
+              <w:t>Подозреваемый в рамках дела.</w:t>
+            </w:r>
+          </w:p>
+        </w:tc>
+      </w:tr>
+      <w:tr>
+        <w:tc>
+          <w:tcPr>
+            <w:tcW w:w="3408" w:type="dxa"/>
+          </w:tcPr>
+          <w:p>
+            <w:pPr>
+              <w:spacing w:line="240" w:lineRule="auto"/>
+              <w:rPr>
+                <w:rFonts w:ascii="Times New Roman" w:hAnsi="Times New Roman" w:cs="Times New Roman"/>
+                <w:sz w:val="24"/>
+                <w:szCs w:val="24"/>
+              </w:rPr>
+            </w:pPr>
+            <w:proofErr w:type="spellStart"/>
+            <w:r>
+              <w:rPr>
+                <w:rFonts w:ascii="Times New Roman" w:hAnsi="Times New Roman" w:cs="Times New Roman"/>
+                <w:sz w:val="24"/>
+                <w:szCs w:val="24"/>
+              </w:rPr>
+              <w:t>Clue</w:t>
+            </w:r>
+            <w:proofErr w:type="spellEnd"/>
+          </w:p>
+        </w:tc>
+        <w:tc>
+          <w:tcPr>
+            <w:tcW w:w="3408" w:type="dxa"/>
+          </w:tcPr>
+          <w:p>
+            <w:pPr>
+              <w:spacing w:line="240" w:lineRule="auto"/>
+              <w:rPr>
+                <w:rFonts w:ascii="Times New Roman" w:hAnsi="Times New Roman" w:cs="Times New Roman"/>
+                <w:sz w:val="24"/>
+                <w:szCs w:val="24"/>
+              </w:rPr>
+            </w:pPr>
+            <w:r>
               <w:rPr>
                 <w:rFonts w:ascii="Times New Roman" w:hAnsi="Times New Roman" w:cs="Times New Roman"/>
                 <w:sz w:val="24"/>
                 <w:szCs w:val="24"/>
                 <w:lang w:val="en-US"/>
               </w:rPr>
-            </w:pPr>
+              <w:t>id</w:t>
+            </w:r>
+            <w:r>
+              <w:rPr>
+                <w:rFonts w:ascii="Times New Roman" w:hAnsi="Times New Roman" w:cs="Times New Roman"/>
+                <w:sz w:val="24"/>
+                <w:szCs w:val="24"/>
+              </w:rPr>
+              <w:t xml:space="preserve">, </w:t>
+            </w:r>
+            <w:proofErr w:type="spellStart"/>
             <w:r>
               <w:rPr>
                 <w:rFonts w:ascii="Times New Roman" w:hAnsi="Times New Roman" w:cs="Times New Roman"/>
@@ -12197,9 +12224,17 @@
                 <w:szCs w:val="24"/>
                 <w:lang w:val="en-US"/>
               </w:rPr>
-              <w:t xml:space="preserve">id, </w:t>
-            </w:r>
-            <w:proofErr w:type="spellStart"/>
+              <w:t>caseId</w:t>
+            </w:r>
+            <w:proofErr w:type="spellEnd"/>
+            <w:r>
+              <w:rPr>
+                <w:rFonts w:ascii="Times New Roman" w:hAnsi="Times New Roman" w:cs="Times New Roman"/>
+                <w:sz w:val="24"/>
+                <w:szCs w:val="24"/>
+              </w:rPr>
+              <w:t xml:space="preserve"> (идентификатор дела), </w:t>
+            </w:r>
             <w:r>
               <w:rPr>
                 <w:rFonts w:ascii="Times New Roman" w:hAnsi="Times New Roman" w:cs="Times New Roman"/>
@@ -12207,9 +12242,16 @@
                 <w:szCs w:val="24"/>
                 <w:lang w:val="en-US"/>
               </w:rPr>
-              <w:t>caseId</w:t>
-            </w:r>
-            <w:proofErr w:type="spellEnd"/>
+              <w:t>title</w:t>
+            </w:r>
+            <w:r>
+              <w:rPr>
+                <w:rFonts w:ascii="Times New Roman" w:hAnsi="Times New Roman" w:cs="Times New Roman"/>
+                <w:sz w:val="24"/>
+                <w:szCs w:val="24"/>
+              </w:rPr>
+              <w:t xml:space="preserve"> (название), </w:t>
+            </w:r>
             <w:r>
               <w:rPr>
                 <w:rFonts w:ascii="Times New Roman" w:hAnsi="Times New Roman" w:cs="Times New Roman"/>
@@ -12217,9 +12259,17 @@
                 <w:szCs w:val="24"/>
                 <w:lang w:val="en-US"/>
               </w:rPr>
-              <w:t xml:space="preserve">, </w:t>
-            </w:r>
-            <w:proofErr w:type="spellStart"/>
+              <w:lastRenderedPageBreak/>
+              <w:t>description</w:t>
+            </w:r>
+            <w:r>
+              <w:rPr>
+                <w:rFonts w:ascii="Times New Roman" w:hAnsi="Times New Roman" w:cs="Times New Roman"/>
+                <w:sz w:val="24"/>
+                <w:szCs w:val="24"/>
+              </w:rPr>
+              <w:t xml:space="preserve"> (описание), </w:t>
+            </w:r>
             <w:r>
               <w:rPr>
                 <w:rFonts w:ascii="Times New Roman" w:hAnsi="Times New Roman" w:cs="Times New Roman"/>
@@ -12227,9 +12277,83 @@
                 <w:szCs w:val="24"/>
                 <w:lang w:val="en-US"/>
               </w:rPr>
-              <w:t>suspectId</w:t>
+              <w:t>source</w:t>
+            </w:r>
+            <w:r>
+              <w:rPr>
+                <w:rFonts w:ascii="Times New Roman" w:hAnsi="Times New Roman" w:cs="Times New Roman"/>
+                <w:sz w:val="24"/>
+                <w:szCs w:val="24"/>
+              </w:rPr>
+              <w:t xml:space="preserve"> (источник)</w:t>
+            </w:r>
+          </w:p>
+        </w:tc>
+        <w:tc>
+          <w:tcPr>
+            <w:tcW w:w="3408" w:type="dxa"/>
+          </w:tcPr>
+          <w:p>
+            <w:pPr>
+              <w:spacing w:line="240" w:lineRule="auto"/>
+              <w:rPr>
+                <w:rFonts w:ascii="Times New Roman" w:hAnsi="Times New Roman" w:cs="Times New Roman"/>
+                <w:sz w:val="24"/>
+                <w:szCs w:val="24"/>
+              </w:rPr>
+            </w:pPr>
+            <w:r>
+              <w:rPr>
+                <w:rFonts w:ascii="Times New Roman" w:hAnsi="Times New Roman" w:cs="Times New Roman"/>
+                <w:sz w:val="24"/>
+                <w:szCs w:val="24"/>
+              </w:rPr>
+              <w:lastRenderedPageBreak/>
+              <w:t>Улика, которую игрок получает и изучает.</w:t>
+            </w:r>
+          </w:p>
+        </w:tc>
+      </w:tr>
+      <w:tr>
+        <w:tc>
+          <w:tcPr>
+            <w:tcW w:w="3408" w:type="dxa"/>
+          </w:tcPr>
+          <w:p>
+            <w:pPr>
+              <w:spacing w:line="240" w:lineRule="auto"/>
+              <w:rPr>
+                <w:rFonts w:ascii="Times New Roman" w:hAnsi="Times New Roman" w:cs="Times New Roman"/>
+                <w:sz w:val="24"/>
+                <w:szCs w:val="24"/>
+              </w:rPr>
+            </w:pPr>
+            <w:proofErr w:type="spellStart"/>
+            <w:r>
+              <w:rPr>
+                <w:rFonts w:ascii="Times New Roman" w:hAnsi="Times New Roman" w:cs="Times New Roman"/>
+                <w:sz w:val="24"/>
+                <w:szCs w:val="24"/>
+              </w:rPr>
+              <w:lastRenderedPageBreak/>
+              <w:t>DialogueMessage</w:t>
             </w:r>
             <w:proofErr w:type="spellEnd"/>
+          </w:p>
+        </w:tc>
+        <w:tc>
+          <w:tcPr>
+            <w:tcW w:w="3408" w:type="dxa"/>
+          </w:tcPr>
+          <w:p>
+            <w:pPr>
+              <w:spacing w:line="240" w:lineRule="auto"/>
+              <w:rPr>
+                <w:rFonts w:ascii="Times New Roman" w:hAnsi="Times New Roman" w:cs="Times New Roman"/>
+                <w:sz w:val="24"/>
+                <w:szCs w:val="24"/>
+              </w:rPr>
+            </w:pPr>
             <w:r>
               <w:rPr>
                 <w:rFonts w:ascii="Times New Roman" w:hAnsi="Times New Roman" w:cs="Times New Roman"/>
@@ -12237,7 +12361,15 @@
                 <w:szCs w:val="24"/>
                 <w:lang w:val="en-US"/>
               </w:rPr>
-              <w:t xml:space="preserve">, author, text, </w:t>
+              <w:t>id</w:t>
+            </w:r>
+            <w:r>
+              <w:rPr>
+                <w:rFonts w:ascii="Times New Roman" w:hAnsi="Times New Roman" w:cs="Times New Roman"/>
+                <w:sz w:val="24"/>
+                <w:szCs w:val="24"/>
+              </w:rPr>
+              <w:t xml:space="preserve">, </w:t>
             </w:r>
             <w:proofErr w:type="spellStart"/>
             <w:r>
@@ -12247,205 +12379,36 @@
                 <w:szCs w:val="24"/>
                 <w:lang w:val="en-US"/>
               </w:rPr>
-              <w:t>createdAt</w:t>
+              <w:t>caseId</w:t>
             </w:r>
             <w:proofErr w:type="spellEnd"/>
-          </w:p>
-        </w:tc>
-        <w:tc>
-          <w:tcPr>
-            <w:tcW w:w="3408" w:type="dxa"/>
-          </w:tcPr>
-          <w:p>
-            <w:pPr>
-              <w:spacing w:line="240" w:lineRule="auto"/>
+            <w:r>
               <w:rPr>
                 <w:rFonts w:ascii="Times New Roman" w:hAnsi="Times New Roman" w:cs="Times New Roman"/>
                 <w:sz w:val="24"/>
                 <w:szCs w:val="24"/>
               </w:rPr>
-            </w:pPr>
-            <w:r>
-              <w:rPr>
-                <w:rFonts w:ascii="Times New Roman" w:hAnsi="Times New Roman" w:cs="Times New Roman"/>
-                <w:sz w:val="24"/>
-                <w:szCs w:val="24"/>
-              </w:rPr>
-              <w:t>Сообщение игрока или персонажа.</w:t>
-            </w:r>
-          </w:p>
-        </w:tc>
-      </w:tr>
-      <w:tr>
-        <w:tc>
-          <w:tcPr>
-            <w:tcW w:w="3408" w:type="dxa"/>
-          </w:tcPr>
-          <w:p>
-            <w:pPr>
-              <w:spacing w:line="240" w:lineRule="auto"/>
-              <w:rPr>
-                <w:rFonts w:ascii="Times New Roman" w:hAnsi="Times New Roman" w:cs="Times New Roman"/>
-                <w:sz w:val="24"/>
-                <w:szCs w:val="24"/>
-              </w:rPr>
-            </w:pPr>
+              <w:t xml:space="preserve"> (идентификатор дела), </w:t>
+            </w:r>
             <w:proofErr w:type="spellStart"/>
             <w:r>
-              <w:rPr>
-                <w:rFonts w:ascii="Times New Roman" w:hAnsi="Times New Roman" w:cs="Times New Roman"/>
-                <w:sz w:val="24"/>
-                <w:szCs w:val="24"/>
-              </w:rPr>
-              <w:t>InvestigationProgress</w:t>
-            </w:r>
-            <w:proofErr w:type="spellEnd"/>
-          </w:p>
-        </w:tc>
-        <w:tc>
-          <w:tcPr>
-            <w:tcW w:w="3408" w:type="dxa"/>
-          </w:tcPr>
-          <w:p>
-            <w:pPr>
-              <w:spacing w:line="240" w:lineRule="auto"/>
-              <w:rPr>
-                <w:rFonts w:ascii="Times New Roman" w:hAnsi="Times New Roman" w:cs="Times New Roman"/>
-                <w:sz w:val="24"/>
-                <w:szCs w:val="24"/>
-              </w:rPr>
-            </w:pPr>
-            <w:proofErr w:type="spellStart"/>
-            <w:r>
-              <w:rPr>
-                <w:rFonts w:ascii="Times New Roman" w:hAnsi="Times New Roman" w:cs="Times New Roman"/>
-                <w:sz w:val="24"/>
-                <w:szCs w:val="24"/>
-              </w:rPr>
-              <w:t>userId</w:t>
-            </w:r>
-            <w:proofErr w:type="spellEnd"/>
-            <w:r>
-              <w:rPr>
-                <w:rFonts w:ascii="Times New Roman" w:hAnsi="Times New Roman" w:cs="Times New Roman"/>
-                <w:sz w:val="24"/>
-                <w:szCs w:val="24"/>
-              </w:rPr>
-              <w:t xml:space="preserve">, </w:t>
-            </w:r>
-            <w:proofErr w:type="spellStart"/>
-            <w:r>
-              <w:rPr>
-                <w:rFonts w:ascii="Times New Roman" w:hAnsi="Times New Roman" w:cs="Times New Roman"/>
-                <w:sz w:val="24"/>
-                <w:szCs w:val="24"/>
-              </w:rPr>
-              <w:t>caseId</w:t>
-            </w:r>
-            <w:proofErr w:type="spellEnd"/>
-            <w:r>
-              <w:rPr>
-                <w:rFonts w:ascii="Times New Roman" w:hAnsi="Times New Roman" w:cs="Times New Roman"/>
-                <w:sz w:val="24"/>
-                <w:szCs w:val="24"/>
-              </w:rPr>
-              <w:t xml:space="preserve">, </w:t>
-            </w:r>
-            <w:proofErr w:type="spellStart"/>
-            <w:r>
-              <w:rPr>
-                <w:rFonts w:ascii="Times New Roman" w:hAnsi="Times New Roman" w:cs="Times New Roman"/>
-                <w:sz w:val="24"/>
-                <w:szCs w:val="24"/>
-              </w:rPr>
-              <w:t>collectedClueIds</w:t>
-            </w:r>
-            <w:proofErr w:type="spellEnd"/>
-            <w:r>
-              <w:rPr>
-                <w:rFonts w:ascii="Times New Roman" w:hAnsi="Times New Roman" w:cs="Times New Roman"/>
-                <w:sz w:val="24"/>
-                <w:szCs w:val="24"/>
-              </w:rPr>
-              <w:t xml:space="preserve">, </w:t>
-            </w:r>
-            <w:proofErr w:type="spellStart"/>
-            <w:r>
-              <w:rPr>
-                <w:rFonts w:ascii="Times New Roman" w:hAnsi="Times New Roman" w:cs="Times New Roman"/>
-                <w:sz w:val="24"/>
-                <w:szCs w:val="24"/>
-              </w:rPr>
-              <w:t>status</w:t>
-            </w:r>
-            <w:proofErr w:type="spellEnd"/>
-          </w:p>
-        </w:tc>
-        <w:tc>
-          <w:tcPr>
-            <w:tcW w:w="3408" w:type="dxa"/>
-          </w:tcPr>
-          <w:p>
-            <w:pPr>
-              <w:spacing w:line="240" w:lineRule="auto"/>
-              <w:rPr>
-                <w:rFonts w:ascii="Times New Roman" w:hAnsi="Times New Roman" w:cs="Times New Roman"/>
-                <w:sz w:val="24"/>
-                <w:szCs w:val="24"/>
-              </w:rPr>
-            </w:pPr>
-            <w:r>
-              <w:rPr>
-                <w:rFonts w:ascii="Times New Roman" w:hAnsi="Times New Roman" w:cs="Times New Roman"/>
-                <w:sz w:val="24"/>
-                <w:szCs w:val="24"/>
-              </w:rPr>
-              <w:t>Сохранённый прогресс игрока.</w:t>
-            </w:r>
-          </w:p>
-        </w:tc>
-      </w:tr>
-      <w:tr>
-        <w:tc>
-          <w:tcPr>
-            <w:tcW w:w="3408" w:type="dxa"/>
-          </w:tcPr>
-          <w:p>
-            <w:pPr>
-              <w:spacing w:line="240" w:lineRule="auto"/>
-              <w:rPr>
-                <w:rFonts w:ascii="Times New Roman" w:hAnsi="Times New Roman" w:cs="Times New Roman"/>
-                <w:sz w:val="24"/>
-                <w:szCs w:val="24"/>
-              </w:rPr>
-            </w:pPr>
-            <w:proofErr w:type="spellStart"/>
-            <w:r>
-              <w:rPr>
-                <w:rFonts w:ascii="Times New Roman" w:hAnsi="Times New Roman" w:cs="Times New Roman"/>
-                <w:sz w:val="24"/>
-                <w:szCs w:val="24"/>
-              </w:rPr>
-              <w:lastRenderedPageBreak/>
-              <w:t>Accusation</w:t>
-            </w:r>
-            <w:proofErr w:type="spellEnd"/>
-          </w:p>
-        </w:tc>
-        <w:tc>
-          <w:tcPr>
-            <w:tcW w:w="3408" w:type="dxa"/>
-          </w:tcPr>
-          <w:p>
-            <w:pPr>
-              <w:spacing w:line="240" w:lineRule="auto"/>
               <w:rPr>
                 <w:rFonts w:ascii="Times New Roman" w:hAnsi="Times New Roman" w:cs="Times New Roman"/>
                 <w:sz w:val="24"/>
                 <w:szCs w:val="24"/>
                 <w:lang w:val="en-US"/>
               </w:rPr>
-            </w:pPr>
+              <w:t>suspectId</w:t>
+            </w:r>
+            <w:proofErr w:type="spellEnd"/>
+            <w:r>
+              <w:rPr>
+                <w:rFonts w:ascii="Times New Roman" w:hAnsi="Times New Roman" w:cs="Times New Roman"/>
+                <w:sz w:val="24"/>
+                <w:szCs w:val="24"/>
+              </w:rPr>
+              <w:t xml:space="preserve"> (идентификатор подозреваемого), </w:t>
+            </w:r>
             <w:r>
               <w:rPr>
                 <w:rFonts w:ascii="Times New Roman" w:hAnsi="Times New Roman" w:cs="Times New Roman"/>
@@ -12453,9 +12416,16 @@
                 <w:szCs w:val="24"/>
                 <w:lang w:val="en-US"/>
               </w:rPr>
-              <w:t xml:space="preserve">id, </w:t>
-            </w:r>
-            <w:proofErr w:type="spellStart"/>
+              <w:t>author</w:t>
+            </w:r>
+            <w:r>
+              <w:rPr>
+                <w:rFonts w:ascii="Times New Roman" w:hAnsi="Times New Roman" w:cs="Times New Roman"/>
+                <w:sz w:val="24"/>
+                <w:szCs w:val="24"/>
+              </w:rPr>
+              <w:t xml:space="preserve"> (автор сообщения), </w:t>
+            </w:r>
             <w:r>
               <w:rPr>
                 <w:rFonts w:ascii="Times New Roman" w:hAnsi="Times New Roman" w:cs="Times New Roman"/>
@@ -12463,9 +12433,17 @@
                 <w:szCs w:val="24"/>
                 <w:lang w:val="en-US"/>
               </w:rPr>
-              <w:t>caseId</w:t>
-            </w:r>
-            <w:proofErr w:type="spellEnd"/>
+              <w:t>text</w:t>
+            </w:r>
+            <w:r>
+              <w:rPr>
+                <w:rFonts w:ascii="Times New Roman" w:hAnsi="Times New Roman" w:cs="Times New Roman"/>
+                <w:sz w:val="24"/>
+                <w:szCs w:val="24"/>
+              </w:rPr>
+              <w:t xml:space="preserve"> (текст), </w:t>
+            </w:r>
+            <w:proofErr w:type="spellStart"/>
             <w:r>
               <w:rPr>
                 <w:rFonts w:ascii="Times New Roman" w:hAnsi="Times New Roman" w:cs="Times New Roman"/>
@@ -12473,9 +12451,219 @@
                 <w:szCs w:val="24"/>
                 <w:lang w:val="en-US"/>
               </w:rPr>
-              <w:t xml:space="preserve">, </w:t>
-            </w:r>
+              <w:t>createdAt</w:t>
+            </w:r>
+            <w:proofErr w:type="spellEnd"/>
+            <w:r>
+              <w:rPr>
+                <w:rFonts w:ascii="Times New Roman" w:hAnsi="Times New Roman" w:cs="Times New Roman"/>
+                <w:sz w:val="24"/>
+                <w:szCs w:val="24"/>
+              </w:rPr>
+              <w:t xml:space="preserve"> (дата и время создания).</w:t>
+            </w:r>
+          </w:p>
+        </w:tc>
+        <w:tc>
+          <w:tcPr>
+            <w:tcW w:w="3408" w:type="dxa"/>
+          </w:tcPr>
+          <w:p>
+            <w:pPr>
+              <w:spacing w:line="240" w:lineRule="auto"/>
+              <w:rPr>
+                <w:rFonts w:ascii="Times New Roman" w:hAnsi="Times New Roman" w:cs="Times New Roman"/>
+                <w:sz w:val="24"/>
+                <w:szCs w:val="24"/>
+              </w:rPr>
+            </w:pPr>
+            <w:r>
+              <w:rPr>
+                <w:rFonts w:ascii="Times New Roman" w:hAnsi="Times New Roman" w:cs="Times New Roman"/>
+                <w:sz w:val="24"/>
+                <w:szCs w:val="24"/>
+              </w:rPr>
+              <w:t>Сообщение игрока или персонажа.</w:t>
+            </w:r>
+          </w:p>
+        </w:tc>
+      </w:tr>
+      <w:tr>
+        <w:tc>
+          <w:tcPr>
+            <w:tcW w:w="3408" w:type="dxa"/>
+          </w:tcPr>
+          <w:p>
+            <w:pPr>
+              <w:spacing w:line="240" w:lineRule="auto"/>
+              <w:rPr>
+                <w:rFonts w:ascii="Times New Roman" w:hAnsi="Times New Roman" w:cs="Times New Roman"/>
+                <w:sz w:val="24"/>
+                <w:szCs w:val="24"/>
+              </w:rPr>
+            </w:pPr>
             <w:proofErr w:type="spellStart"/>
+            <w:r>
+              <w:rPr>
+                <w:rFonts w:ascii="Times New Roman" w:hAnsi="Times New Roman" w:cs="Times New Roman"/>
+                <w:sz w:val="24"/>
+                <w:szCs w:val="24"/>
+              </w:rPr>
+              <w:t>InvestigationProgress</w:t>
+            </w:r>
+            <w:proofErr w:type="spellEnd"/>
+          </w:p>
+        </w:tc>
+        <w:tc>
+          <w:tcPr>
+            <w:tcW w:w="3408" w:type="dxa"/>
+          </w:tcPr>
+          <w:p>
+            <w:pPr>
+              <w:spacing w:line="240" w:lineRule="auto"/>
+              <w:rPr>
+                <w:rFonts w:ascii="Times New Roman" w:hAnsi="Times New Roman" w:cs="Times New Roman"/>
+                <w:sz w:val="24"/>
+                <w:szCs w:val="24"/>
+              </w:rPr>
+            </w:pPr>
+            <w:proofErr w:type="spellStart"/>
+            <w:r>
+              <w:rPr>
+                <w:rFonts w:ascii="Times New Roman" w:hAnsi="Times New Roman" w:cs="Times New Roman"/>
+                <w:sz w:val="24"/>
+                <w:szCs w:val="24"/>
+              </w:rPr>
+              <w:t>userId</w:t>
+            </w:r>
+            <w:proofErr w:type="spellEnd"/>
+            <w:r>
+              <w:rPr>
+                <w:rFonts w:ascii="Times New Roman" w:hAnsi="Times New Roman" w:cs="Times New Roman"/>
+                <w:sz w:val="24"/>
+                <w:szCs w:val="24"/>
+              </w:rPr>
+              <w:t xml:space="preserve"> (идентификатор игрока), </w:t>
+            </w:r>
+            <w:proofErr w:type="spellStart"/>
+            <w:r>
+              <w:rPr>
+                <w:rFonts w:ascii="Times New Roman" w:hAnsi="Times New Roman" w:cs="Times New Roman"/>
+                <w:sz w:val="24"/>
+                <w:szCs w:val="24"/>
+              </w:rPr>
+              <w:t>caseId</w:t>
+            </w:r>
+            <w:proofErr w:type="spellEnd"/>
+            <w:r>
+              <w:rPr>
+                <w:rFonts w:ascii="Times New Roman" w:hAnsi="Times New Roman" w:cs="Times New Roman"/>
+                <w:sz w:val="24"/>
+                <w:szCs w:val="24"/>
+              </w:rPr>
+              <w:t xml:space="preserve"> (идентификатор дела), </w:t>
+            </w:r>
+            <w:proofErr w:type="spellStart"/>
+            <w:r>
+              <w:rPr>
+                <w:rFonts w:ascii="Times New Roman" w:hAnsi="Times New Roman" w:cs="Times New Roman"/>
+                <w:sz w:val="24"/>
+                <w:szCs w:val="24"/>
+              </w:rPr>
+              <w:t>collectedClueIds</w:t>
+            </w:r>
+            <w:proofErr w:type="spellEnd"/>
+            <w:r>
+              <w:rPr>
+                <w:rFonts w:ascii="Times New Roman" w:hAnsi="Times New Roman" w:cs="Times New Roman"/>
+                <w:sz w:val="24"/>
+                <w:szCs w:val="24"/>
+              </w:rPr>
+              <w:t xml:space="preserve"> (идентификаторы собранных улик), </w:t>
+            </w:r>
+            <w:proofErr w:type="spellStart"/>
+            <w:r>
+              <w:rPr>
+                <w:rFonts w:ascii="Times New Roman" w:hAnsi="Times New Roman" w:cs="Times New Roman"/>
+                <w:sz w:val="24"/>
+                <w:szCs w:val="24"/>
+              </w:rPr>
+              <w:t>status</w:t>
+            </w:r>
+            <w:proofErr w:type="spellEnd"/>
+            <w:r>
+              <w:rPr>
+                <w:rFonts w:ascii="Times New Roman" w:hAnsi="Times New Roman" w:cs="Times New Roman"/>
+                <w:sz w:val="24"/>
+                <w:szCs w:val="24"/>
+              </w:rPr>
+              <w:t xml:space="preserve"> (статус расследования).</w:t>
+            </w:r>
+          </w:p>
+        </w:tc>
+        <w:tc>
+          <w:tcPr>
+            <w:tcW w:w="3408" w:type="dxa"/>
+          </w:tcPr>
+          <w:p>
+            <w:pPr>
+              <w:spacing w:line="240" w:lineRule="auto"/>
+              <w:rPr>
+                <w:rFonts w:ascii="Times New Roman" w:hAnsi="Times New Roman" w:cs="Times New Roman"/>
+                <w:sz w:val="24"/>
+                <w:szCs w:val="24"/>
+              </w:rPr>
+            </w:pPr>
+            <w:r>
+              <w:rPr>
+                <w:rFonts w:ascii="Times New Roman" w:hAnsi="Times New Roman" w:cs="Times New Roman"/>
+                <w:sz w:val="24"/>
+                <w:szCs w:val="24"/>
+              </w:rPr>
+              <w:t>Сохранённый прогресс игрока.</w:t>
+            </w:r>
+          </w:p>
+        </w:tc>
+      </w:tr>
+      <w:tr>
+        <w:tc>
+          <w:tcPr>
+            <w:tcW w:w="3408" w:type="dxa"/>
+          </w:tcPr>
+          <w:p>
+            <w:pPr>
+              <w:spacing w:line="240" w:lineRule="auto"/>
+              <w:rPr>
+                <w:rFonts w:ascii="Times New Roman" w:hAnsi="Times New Roman" w:cs="Times New Roman"/>
+                <w:sz w:val="24"/>
+                <w:szCs w:val="24"/>
+              </w:rPr>
+            </w:pPr>
+            <w:proofErr w:type="spellStart"/>
+            <w:r>
+              <w:rPr>
+                <w:rFonts w:ascii="Times New Roman" w:hAnsi="Times New Roman" w:cs="Times New Roman"/>
+                <w:sz w:val="24"/>
+                <w:szCs w:val="24"/>
+              </w:rPr>
+              <w:t>Accusation</w:t>
+            </w:r>
+            <w:proofErr w:type="spellEnd"/>
+          </w:p>
+        </w:tc>
+        <w:tc>
+          <w:tcPr>
+            <w:tcW w:w="3408" w:type="dxa"/>
+          </w:tcPr>
+          <w:p>
+            <w:pPr>
+              <w:spacing w:line="240" w:lineRule="auto"/>
+              <w:rPr>
+                <w:rFonts w:ascii="Times New Roman" w:hAnsi="Times New Roman" w:cs="Times New Roman"/>
+                <w:sz w:val="24"/>
+                <w:szCs w:val="24"/>
+              </w:rPr>
+            </w:pPr>
             <w:r>
               <w:rPr>
                 <w:rFonts w:ascii="Times New Roman" w:hAnsi="Times New Roman" w:cs="Times New Roman"/>
@@ -12483,9 +12671,17 @@
                 <w:szCs w:val="24"/>
                 <w:lang w:val="en-US"/>
               </w:rPr>
-              <w:t>suspectId</w:t>
-            </w:r>
-            <w:proofErr w:type="spellEnd"/>
+              <w:t>id</w:t>
+            </w:r>
+            <w:r>
+              <w:rPr>
+                <w:rFonts w:ascii="Times New Roman" w:hAnsi="Times New Roman" w:cs="Times New Roman"/>
+                <w:sz w:val="24"/>
+                <w:szCs w:val="24"/>
+              </w:rPr>
+              <w:t xml:space="preserve">, </w:t>
+            </w:r>
+            <w:proofErr w:type="spellStart"/>
             <w:r>
               <w:rPr>
                 <w:rFonts w:ascii="Times New Roman" w:hAnsi="Times New Roman" w:cs="Times New Roman"/>
@@ -12493,7 +12689,16 @@
                 <w:szCs w:val="24"/>
                 <w:lang w:val="en-US"/>
               </w:rPr>
-              <w:t xml:space="preserve">, </w:t>
+              <w:t>caseId</w:t>
+            </w:r>
+            <w:proofErr w:type="spellEnd"/>
+            <w:r>
+              <w:rPr>
+                <w:rFonts w:ascii="Times New Roman" w:hAnsi="Times New Roman" w:cs="Times New Roman"/>
+                <w:sz w:val="24"/>
+                <w:szCs w:val="24"/>
+              </w:rPr>
+              <w:t xml:space="preserve"> (идентификатор дела), </w:t>
             </w:r>
             <w:proofErr w:type="spellStart"/>
             <w:r>
@@ -12503,9 +12708,18 @@
                 <w:szCs w:val="24"/>
                 <w:lang w:val="en-US"/>
               </w:rPr>
-              <w:t>isCorrect</w:t>
+              <w:t>suspectId</w:t>
             </w:r>
             <w:proofErr w:type="spellEnd"/>
+            <w:r>
+              <w:rPr>
+                <w:rFonts w:ascii="Times New Roman" w:hAnsi="Times New Roman" w:cs="Times New Roman"/>
+                <w:sz w:val="24"/>
+                <w:szCs w:val="24"/>
+              </w:rPr>
+              <w:t xml:space="preserve"> (идентификатор подозреваемого), </w:t>
+            </w:r>
+            <w:proofErr w:type="spellStart"/>
             <w:r>
               <w:rPr>
                 <w:rFonts w:ascii="Times New Roman" w:hAnsi="Times New Roman" w:cs="Times New Roman"/>
@@ -12513,28 +12727,54 @@
                 <w:szCs w:val="24"/>
                 <w:lang w:val="en-US"/>
               </w:rPr>
-              <w:t>, explanation</w:t>
-            </w:r>
-          </w:p>
-        </w:tc>
-        <w:tc>
-          <w:tcPr>
-            <w:tcW w:w="3408" w:type="dxa"/>
-          </w:tcPr>
-          <w:p>
-            <w:pPr>
-              <w:spacing w:line="240" w:lineRule="auto"/>
+              <w:t>isCorrect</w:t>
+            </w:r>
+            <w:proofErr w:type="spellEnd"/>
+            <w:r>
               <w:rPr>
                 <w:rFonts w:ascii="Times New Roman" w:hAnsi="Times New Roman" w:cs="Times New Roman"/>
                 <w:sz w:val="24"/>
                 <w:szCs w:val="24"/>
               </w:rPr>
-            </w:pPr>
+              <w:t xml:space="preserve"> (правильность обвинения), </w:t>
+            </w:r>
             <w:r>
               <w:rPr>
                 <w:rFonts w:ascii="Times New Roman" w:hAnsi="Times New Roman" w:cs="Times New Roman"/>
                 <w:sz w:val="24"/>
                 <w:szCs w:val="24"/>
+                <w:lang w:val="en-US"/>
+              </w:rPr>
+              <w:t>explanation</w:t>
+            </w:r>
+            <w:r>
+              <w:rPr>
+                <w:rFonts w:ascii="Times New Roman" w:hAnsi="Times New Roman" w:cs="Times New Roman"/>
+                <w:sz w:val="24"/>
+                <w:szCs w:val="24"/>
+              </w:rPr>
+              <w:t xml:space="preserve"> (объяснение результата)</w:t>
+            </w:r>
+          </w:p>
+        </w:tc>
+        <w:tc>
+          <w:tcPr>
+            <w:tcW w:w="3408" w:type="dxa"/>
+          </w:tcPr>
+          <w:p>
+            <w:pPr>
+              <w:spacing w:line="240" w:lineRule="auto"/>
+              <w:rPr>
+                <w:rFonts w:ascii="Times New Roman" w:hAnsi="Times New Roman" w:cs="Times New Roman"/>
+                <w:sz w:val="24"/>
+                <w:szCs w:val="24"/>
+              </w:rPr>
+            </w:pPr>
+            <w:r>
+              <w:rPr>
+                <w:rFonts w:ascii="Times New Roman" w:hAnsi="Times New Roman" w:cs="Times New Roman"/>
+                <w:sz w:val="24"/>
+                <w:szCs w:val="24"/>
               </w:rPr>
               <w:t>Итоговый выбор подозреваемого.</w:t>
             </w:r>
@@ -12614,7 +12854,7 @@
                 <w:sz w:val="24"/>
                 <w:szCs w:val="24"/>
               </w:rPr>
-              <w:t xml:space="preserve">, </w:t>
+              <w:t xml:space="preserve"> (закодированный сигнал), </w:t>
             </w:r>
             <w:proofErr w:type="spellStart"/>
             <w:r>
@@ -12632,7 +12872,7 @@
                 <w:sz w:val="24"/>
                 <w:szCs w:val="24"/>
               </w:rPr>
-              <w:t xml:space="preserve">, </w:t>
+              <w:t xml:space="preserve"> (правильный ответ), </w:t>
             </w:r>
             <w:proofErr w:type="spellStart"/>
             <w:r>
@@ -12644,6 +12884,14 @@
               <w:t>clueRewardId</w:t>
             </w:r>
             <w:proofErr w:type="spellEnd"/>
+            <w:r>
+              <w:rPr>
+                <w:rFonts w:ascii="Times New Roman" w:hAnsi="Times New Roman" w:cs="Times New Roman"/>
+                <w:sz w:val="24"/>
+                <w:szCs w:val="24"/>
+              </w:rPr>
+              <w:t xml:space="preserve"> (идентификатор награды-улики)</w:t>
+            </w:r>
           </w:p>
         </w:tc>
         <w:tc>
@@ -12725,7 +12973,7 @@
           <w:lang w:eastAsia="ru-RU"/>
         </w:rPr>
       </w:pPr>
-      <w:bookmarkStart w:id="23" w:name="_Toc243599235"/>
+      <w:bookmarkStart w:id="22" w:name="_Toc243599235"/>
       <w:r>
         <w:rPr>
           <w:lang w:eastAsia="ru-RU"/>
@@ -12762,25 +13010,73 @@
         </w:rPr>
         <w:t>и интерфейсов проекта</w:t>
       </w:r>
-      <w:bookmarkEnd w:id="23"/>
+      <w:bookmarkEnd w:id="22"/>
     </w:p>
     <w:p>
       <w:pPr>
         <w:pStyle w:val="a9"/>
-        <w:jc w:val="left"/>
-        <w:rPr>
-          <w:lang w:eastAsia="ru-RU"/>
-        </w:rPr>
-      </w:pPr>
+      </w:pPr>
+      <w:r>
+        <w:t xml:space="preserve">Для слоя </w:t>
+      </w:r>
+      <w:proofErr w:type="spellStart"/>
+      <w:r>
+        <w:t>Domain</w:t>
+      </w:r>
+      <w:proofErr w:type="spellEnd"/>
+      <w:r>
+        <w:t xml:space="preserve"> бы</w:t>
+      </w:r>
+      <w:r>
+        <w:t xml:space="preserve">ли спроектированы основные </w:t>
+      </w:r>
+      <w:proofErr w:type="spellStart"/>
+      <w:r>
+        <w:t>юзкейсы</w:t>
+      </w:r>
+      <w:proofErr w:type="spellEnd"/>
+      <w:r>
+        <w:t xml:space="preserve"> и </w:t>
+      </w:r>
+      <w:proofErr w:type="spellStart"/>
+      <w:r>
+        <w:t>интерфесйсы</w:t>
+      </w:r>
+      <w:proofErr w:type="spellEnd"/>
+      <w:r>
+        <w:t>, а также представлены в виде таблиц.</w:t>
+      </w:r>
     </w:p>
     <w:p>
       <w:pPr>
         <w:pStyle w:val="a9"/>
-        <w:jc w:val="left"/>
-        <w:rPr>
-          <w:lang w:eastAsia="ru-RU"/>
-        </w:rPr>
-      </w:pPr>
+        <w:spacing w:before="240"/>
+        <w:ind w:firstLine="0"/>
+        <w:contextualSpacing w:val="0"/>
+        <w:rPr>
+          <w:lang w:eastAsia="ru-RU"/>
+        </w:rPr>
+      </w:pPr>
+      <w:r>
+        <w:rPr>
+          <w:lang w:eastAsia="ru-RU"/>
+        </w:rPr>
+        <w:t xml:space="preserve">Таблица 7 – Таблица </w:t>
+      </w:r>
+      <w:proofErr w:type="spellStart"/>
+      <w:r>
+        <w:rPr>
+          <w:lang w:val="en-US" w:eastAsia="ru-RU"/>
+        </w:rPr>
+        <w:t>usecases</w:t>
+      </w:r>
+      <w:proofErr w:type="spellEnd"/>
+      <w:r>
+        <w:rPr>
+          <w:lang w:eastAsia="ru-RU"/>
+        </w:rPr>
+        <w:t>.</w:t>
+      </w:r>
     </w:p>
     <w:tbl>
       <w:tblPr>
@@ -12795,23 +13091,20 @@
       <w:tr>
         <w:tc>
           <w:tcPr>
-            <w:tcW w:w="5112" w:type="dxa"/>
+            <w:tcW w:w="4705" w:type="dxa"/>
           </w:tcPr>
           <w:p>
             <w:pPr>
               <w:spacing w:line="240" w:lineRule="auto"/>
-              <w:rPr>
-                <w:rFonts w:ascii="Times New Roman" w:hAnsi="Times New Roman" w:cs="Times New Roman"/>
-                <w:sz w:val="28"/>
-                <w:szCs w:val="28"/>
+              <w:contextualSpacing/>
+              <w:rPr>
+                <w:rFonts w:ascii="Times New Roman" w:hAnsi="Times New Roman" w:cs="Times New Roman"/>
               </w:rPr>
             </w:pPr>
             <w:proofErr w:type="spellStart"/>
             <w:r>
               <w:rPr>
                 <w:rFonts w:ascii="Times New Roman" w:hAnsi="Times New Roman" w:cs="Times New Roman"/>
-                <w:sz w:val="28"/>
-                <w:szCs w:val="28"/>
               </w:rPr>
               <w:t>Use</w:t>
             </w:r>
@@ -12819,8 +13112,6 @@
             <w:r>
               <w:rPr>
                 <w:rFonts w:ascii="Times New Roman" w:hAnsi="Times New Roman" w:cs="Times New Roman"/>
-                <w:sz w:val="28"/>
-                <w:szCs w:val="28"/>
               </w:rPr>
               <w:t xml:space="preserve"> </w:t>
             </w:r>
@@ -12828,8 +13119,6 @@
             <w:r>
               <w:rPr>
                 <w:rFonts w:ascii="Times New Roman" w:hAnsi="Times New Roman" w:cs="Times New Roman"/>
-                <w:sz w:val="28"/>
-                <w:szCs w:val="28"/>
               </w:rPr>
               <w:t>case</w:t>
             </w:r>
@@ -12838,22 +13127,19 @@
         </w:tc>
         <w:tc>
           <w:tcPr>
-            <w:tcW w:w="5112" w:type="dxa"/>
+            <w:tcW w:w="4640" w:type="dxa"/>
           </w:tcPr>
           <w:p>
             <w:pPr>
               <w:spacing w:line="240" w:lineRule="auto"/>
-              <w:rPr>
-                <w:rFonts w:ascii="Times New Roman" w:hAnsi="Times New Roman" w:cs="Times New Roman"/>
-                <w:sz w:val="28"/>
-                <w:szCs w:val="28"/>
-              </w:rPr>
-            </w:pPr>
-            <w:r>
-              <w:rPr>
-                <w:rFonts w:ascii="Times New Roman" w:hAnsi="Times New Roman" w:cs="Times New Roman"/>
-                <w:sz w:val="28"/>
-                <w:szCs w:val="28"/>
+              <w:contextualSpacing/>
+              <w:rPr>
+                <w:rFonts w:ascii="Times New Roman" w:hAnsi="Times New Roman" w:cs="Times New Roman"/>
+              </w:rPr>
+            </w:pPr>
+            <w:r>
+              <w:rPr>
+                <w:rFonts w:ascii="Times New Roman" w:hAnsi="Times New Roman" w:cs="Times New Roman"/>
               </w:rPr>
               <w:t>Назначение</w:t>
             </w:r>
@@ -12863,23 +13149,20 @@
       <w:tr>
         <w:tc>
           <w:tcPr>
-            <w:tcW w:w="5112" w:type="dxa"/>
+            <w:tcW w:w="4705" w:type="dxa"/>
           </w:tcPr>
           <w:p>
             <w:pPr>
               <w:spacing w:line="240" w:lineRule="auto"/>
-              <w:rPr>
-                <w:rFonts w:ascii="Times New Roman" w:hAnsi="Times New Roman" w:cs="Times New Roman"/>
-                <w:sz w:val="28"/>
-                <w:szCs w:val="28"/>
+              <w:contextualSpacing/>
+              <w:rPr>
+                <w:rFonts w:ascii="Times New Roman" w:hAnsi="Times New Roman" w:cs="Times New Roman"/>
               </w:rPr>
             </w:pPr>
             <w:proofErr w:type="spellStart"/>
             <w:r>
               <w:rPr>
                 <w:rFonts w:ascii="Times New Roman" w:hAnsi="Times New Roman" w:cs="Times New Roman"/>
-                <w:sz w:val="28"/>
-                <w:szCs w:val="28"/>
               </w:rPr>
               <w:t>SignIn</w:t>
             </w:r>
@@ -12888,42 +13171,21 @@
         </w:tc>
         <w:tc>
           <w:tcPr>
-            <w:tcW w:w="5112" w:type="dxa"/>
+            <w:tcW w:w="4640" w:type="dxa"/>
           </w:tcPr>
           <w:p>
             <w:pPr>
               <w:spacing w:line="240" w:lineRule="auto"/>
-              <w:rPr>
-                <w:rFonts w:ascii="Times New Roman" w:hAnsi="Times New Roman" w:cs="Times New Roman"/>
-                <w:sz w:val="28"/>
-                <w:szCs w:val="28"/>
-              </w:rPr>
-            </w:pPr>
-            <w:r>
-              <w:rPr>
-                <w:rFonts w:ascii="Times New Roman" w:hAnsi="Times New Roman" w:cs="Times New Roman"/>
-                <w:sz w:val="28"/>
-                <w:szCs w:val="28"/>
-              </w:rPr>
-              <w:t xml:space="preserve">Вход пользователя через </w:t>
-            </w:r>
-            <w:proofErr w:type="spellStart"/>
-            <w:r>
-              <w:rPr>
-                <w:rFonts w:ascii="Times New Roman" w:hAnsi="Times New Roman" w:cs="Times New Roman"/>
-                <w:sz w:val="28"/>
-                <w:szCs w:val="28"/>
-              </w:rPr>
-              <w:t>AuthRepository</w:t>
-            </w:r>
-            <w:proofErr w:type="spellEnd"/>
-            <w:r>
-              <w:rPr>
-                <w:rFonts w:ascii="Times New Roman" w:hAnsi="Times New Roman" w:cs="Times New Roman"/>
-                <w:sz w:val="28"/>
-                <w:szCs w:val="28"/>
-              </w:rPr>
-              <w:t>.</w:t>
+              <w:contextualSpacing/>
+              <w:rPr>
+                <w:rFonts w:ascii="Times New Roman" w:hAnsi="Times New Roman" w:cs="Times New Roman"/>
+              </w:rPr>
+            </w:pPr>
+            <w:r>
+              <w:rPr>
+                <w:rFonts w:ascii="Times New Roman" w:hAnsi="Times New Roman" w:cs="Times New Roman"/>
+              </w:rPr>
+              <w:t xml:space="preserve">Вход пользователя </w:t>
             </w:r>
           </w:p>
         </w:tc>
@@ -12931,23 +13193,20 @@
       <w:tr>
         <w:tc>
           <w:tcPr>
-            <w:tcW w:w="5112" w:type="dxa"/>
+            <w:tcW w:w="4705" w:type="dxa"/>
           </w:tcPr>
           <w:p>
             <w:pPr>
               <w:spacing w:line="240" w:lineRule="auto"/>
-              <w:rPr>
-                <w:rFonts w:ascii="Times New Roman" w:hAnsi="Times New Roman" w:cs="Times New Roman"/>
-                <w:sz w:val="28"/>
-                <w:szCs w:val="28"/>
+              <w:contextualSpacing/>
+              <w:rPr>
+                <w:rFonts w:ascii="Times New Roman" w:hAnsi="Times New Roman" w:cs="Times New Roman"/>
               </w:rPr>
             </w:pPr>
             <w:proofErr w:type="spellStart"/>
             <w:r>
               <w:rPr>
                 <w:rFonts w:ascii="Times New Roman" w:hAnsi="Times New Roman" w:cs="Times New Roman"/>
-                <w:sz w:val="28"/>
-                <w:szCs w:val="28"/>
               </w:rPr>
               <w:t>SignUp</w:t>
             </w:r>
@@ -12956,24 +13215,21 @@
         </w:tc>
         <w:tc>
           <w:tcPr>
-            <w:tcW w:w="5112" w:type="dxa"/>
+            <w:tcW w:w="4640" w:type="dxa"/>
           </w:tcPr>
           <w:p>
             <w:pPr>
               <w:spacing w:line="240" w:lineRule="auto"/>
-              <w:rPr>
-                <w:rFonts w:ascii="Times New Roman" w:hAnsi="Times New Roman" w:cs="Times New Roman"/>
-                <w:sz w:val="28"/>
-                <w:szCs w:val="28"/>
-              </w:rPr>
-            </w:pPr>
-            <w:r>
-              <w:rPr>
-                <w:rFonts w:ascii="Times New Roman" w:hAnsi="Times New Roman" w:cs="Times New Roman"/>
-                <w:sz w:val="28"/>
-                <w:szCs w:val="28"/>
-              </w:rPr>
-              <w:t>Регистрация пользователя.</w:t>
+              <w:contextualSpacing/>
+              <w:rPr>
+                <w:rFonts w:ascii="Times New Roman" w:hAnsi="Times New Roman" w:cs="Times New Roman"/>
+              </w:rPr>
+            </w:pPr>
+            <w:r>
+              <w:rPr>
+                <w:rFonts w:ascii="Times New Roman" w:hAnsi="Times New Roman" w:cs="Times New Roman"/>
+              </w:rPr>
+              <w:t>Регистрация пользователя</w:t>
             </w:r>
           </w:p>
         </w:tc>
@@ -12981,24 +13237,22 @@
       <w:tr>
         <w:tc>
           <w:tcPr>
-            <w:tcW w:w="5112" w:type="dxa"/>
+            <w:tcW w:w="4705" w:type="dxa"/>
           </w:tcPr>
           <w:p>
             <w:pPr>
               <w:spacing w:line="240" w:lineRule="auto"/>
-              <w:rPr>
-                <w:rFonts w:ascii="Times New Roman" w:hAnsi="Times New Roman" w:cs="Times New Roman"/>
-                <w:sz w:val="28"/>
-                <w:szCs w:val="28"/>
+              <w:contextualSpacing/>
+              <w:rPr>
+                <w:rFonts w:ascii="Times New Roman" w:hAnsi="Times New Roman" w:cs="Times New Roman"/>
               </w:rPr>
             </w:pPr>
             <w:proofErr w:type="spellStart"/>
             <w:r>
               <w:rPr>
                 <w:rFonts w:ascii="Times New Roman" w:hAnsi="Times New Roman" w:cs="Times New Roman"/>
-                <w:sz w:val="28"/>
-                <w:szCs w:val="28"/>
-              </w:rPr>
+              </w:rPr>
+              <w:lastRenderedPageBreak/>
               <w:t>LoadAvailableCases</w:t>
             </w:r>
             <w:proofErr w:type="spellEnd"/>
@@ -13006,24 +13260,21 @@
         </w:tc>
         <w:tc>
           <w:tcPr>
-            <w:tcW w:w="5112" w:type="dxa"/>
+            <w:tcW w:w="4640" w:type="dxa"/>
           </w:tcPr>
           <w:p>
             <w:pPr>
               <w:spacing w:line="240" w:lineRule="auto"/>
-              <w:rPr>
-                <w:rFonts w:ascii="Times New Roman" w:hAnsi="Times New Roman" w:cs="Times New Roman"/>
-                <w:sz w:val="28"/>
-                <w:szCs w:val="28"/>
-              </w:rPr>
-            </w:pPr>
-            <w:r>
-              <w:rPr>
-                <w:rFonts w:ascii="Times New Roman" w:hAnsi="Times New Roman" w:cs="Times New Roman"/>
-                <w:sz w:val="28"/>
-                <w:szCs w:val="28"/>
-              </w:rPr>
-              <w:t>Получение списка доступных дел.</w:t>
+              <w:contextualSpacing/>
+              <w:rPr>
+                <w:rFonts w:ascii="Times New Roman" w:hAnsi="Times New Roman" w:cs="Times New Roman"/>
+              </w:rPr>
+            </w:pPr>
+            <w:r>
+              <w:rPr>
+                <w:rFonts w:ascii="Times New Roman" w:hAnsi="Times New Roman" w:cs="Times New Roman"/>
+              </w:rPr>
+              <w:t>Получение списка доступных дел</w:t>
             </w:r>
           </w:p>
         </w:tc>
@@ -13031,23 +13282,20 @@
       <w:tr>
         <w:tc>
           <w:tcPr>
-            <w:tcW w:w="5112" w:type="dxa"/>
+            <w:tcW w:w="4705" w:type="dxa"/>
           </w:tcPr>
           <w:p>
             <w:pPr>
               <w:spacing w:line="240" w:lineRule="auto"/>
-              <w:rPr>
-                <w:rFonts w:ascii="Times New Roman" w:hAnsi="Times New Roman" w:cs="Times New Roman"/>
-                <w:sz w:val="28"/>
-                <w:szCs w:val="28"/>
+              <w:contextualSpacing/>
+              <w:rPr>
+                <w:rFonts w:ascii="Times New Roman" w:hAnsi="Times New Roman" w:cs="Times New Roman"/>
               </w:rPr>
             </w:pPr>
             <w:proofErr w:type="spellStart"/>
             <w:r>
               <w:rPr>
                 <w:rFonts w:ascii="Times New Roman" w:hAnsi="Times New Roman" w:cs="Times New Roman"/>
-                <w:sz w:val="28"/>
-                <w:szCs w:val="28"/>
               </w:rPr>
               <w:t>StartInvestigation</w:t>
             </w:r>
@@ -13056,24 +13304,21 @@
         </w:tc>
         <w:tc>
           <w:tcPr>
-            <w:tcW w:w="5112" w:type="dxa"/>
+            <w:tcW w:w="4640" w:type="dxa"/>
           </w:tcPr>
           <w:p>
             <w:pPr>
               <w:spacing w:line="240" w:lineRule="auto"/>
-              <w:rPr>
-                <w:rFonts w:ascii="Times New Roman" w:hAnsi="Times New Roman" w:cs="Times New Roman"/>
-                <w:sz w:val="28"/>
-                <w:szCs w:val="28"/>
-              </w:rPr>
-            </w:pPr>
-            <w:r>
-              <w:rPr>
-                <w:rFonts w:ascii="Times New Roman" w:hAnsi="Times New Roman" w:cs="Times New Roman"/>
-                <w:sz w:val="28"/>
-                <w:szCs w:val="28"/>
-              </w:rPr>
-              <w:t>Начало дела и создание/восстановление прогресса.</w:t>
+              <w:contextualSpacing/>
+              <w:rPr>
+                <w:rFonts w:ascii="Times New Roman" w:hAnsi="Times New Roman" w:cs="Times New Roman"/>
+              </w:rPr>
+            </w:pPr>
+            <w:r>
+              <w:rPr>
+                <w:rFonts w:ascii="Times New Roman" w:hAnsi="Times New Roman" w:cs="Times New Roman"/>
+              </w:rPr>
+              <w:t>Начало дела и создание или восстановление прогресса</w:t>
             </w:r>
           </w:p>
         </w:tc>
@@ -13081,49 +13326,43 @@
       <w:tr>
         <w:tc>
           <w:tcPr>
-            <w:tcW w:w="5112" w:type="dxa"/>
+            <w:tcW w:w="4705" w:type="dxa"/>
           </w:tcPr>
           <w:p>
             <w:pPr>
               <w:spacing w:line="240" w:lineRule="auto"/>
-              <w:rPr>
-                <w:rFonts w:ascii="Times New Roman" w:hAnsi="Times New Roman" w:cs="Times New Roman"/>
-                <w:sz w:val="28"/>
-                <w:szCs w:val="28"/>
+              <w:contextualSpacing/>
+              <w:rPr>
+                <w:rFonts w:ascii="Times New Roman" w:hAnsi="Times New Roman" w:cs="Times New Roman"/>
               </w:rPr>
             </w:pPr>
             <w:proofErr w:type="spellStart"/>
             <w:r>
               <w:rPr>
                 <w:rFonts w:ascii="Times New Roman" w:hAnsi="Times New Roman" w:cs="Times New Roman"/>
-                <w:sz w:val="28"/>
-                <w:szCs w:val="28"/>
-              </w:rPr>
-              <w:t>LoadSuspects</w:t>
+              </w:rPr>
+              <w:t>RestoreInvestigationProgress</w:t>
             </w:r>
             <w:proofErr w:type="spellEnd"/>
           </w:p>
         </w:tc>
         <w:tc>
           <w:tcPr>
-            <w:tcW w:w="5112" w:type="dxa"/>
+            <w:tcW w:w="4640" w:type="dxa"/>
           </w:tcPr>
           <w:p>
             <w:pPr>
               <w:spacing w:line="240" w:lineRule="auto"/>
-              <w:rPr>
-                <w:rFonts w:ascii="Times New Roman" w:hAnsi="Times New Roman" w:cs="Times New Roman"/>
-                <w:sz w:val="28"/>
-                <w:szCs w:val="28"/>
-              </w:rPr>
-            </w:pPr>
-            <w:r>
-              <w:rPr>
-                <w:rFonts w:ascii="Times New Roman" w:hAnsi="Times New Roman" w:cs="Times New Roman"/>
-                <w:sz w:val="28"/>
-                <w:szCs w:val="28"/>
-              </w:rPr>
-              <w:t>Загрузка подозреваемых выбранного дела.</w:t>
+              <w:contextualSpacing/>
+              <w:rPr>
+                <w:rFonts w:ascii="Times New Roman" w:hAnsi="Times New Roman" w:cs="Times New Roman"/>
+              </w:rPr>
+            </w:pPr>
+            <w:r>
+              <w:rPr>
+                <w:rFonts w:ascii="Times New Roman" w:hAnsi="Times New Roman" w:cs="Times New Roman"/>
+              </w:rPr>
+              <w:t>Восстановление прогресса после перезапуска</w:t>
             </w:r>
           </w:p>
         </w:tc>
@@ -13131,49 +13370,43 @@
       <w:tr>
         <w:tc>
           <w:tcPr>
-            <w:tcW w:w="5112" w:type="dxa"/>
+            <w:tcW w:w="4705" w:type="dxa"/>
           </w:tcPr>
           <w:p>
             <w:pPr>
               <w:spacing w:line="240" w:lineRule="auto"/>
-              <w:rPr>
-                <w:rFonts w:ascii="Times New Roman" w:hAnsi="Times New Roman" w:cs="Times New Roman"/>
-                <w:sz w:val="28"/>
-                <w:szCs w:val="28"/>
+              <w:contextualSpacing/>
+              <w:rPr>
+                <w:rFonts w:ascii="Times New Roman" w:hAnsi="Times New Roman" w:cs="Times New Roman"/>
               </w:rPr>
             </w:pPr>
             <w:proofErr w:type="spellStart"/>
             <w:r>
               <w:rPr>
                 <w:rFonts w:ascii="Times New Roman" w:hAnsi="Times New Roman" w:cs="Times New Roman"/>
-                <w:sz w:val="28"/>
-                <w:szCs w:val="28"/>
-              </w:rPr>
-              <w:t>SendSuspectMessage</w:t>
+              </w:rPr>
+              <w:t>LoadSuspects</w:t>
             </w:r>
             <w:proofErr w:type="spellEnd"/>
           </w:p>
         </w:tc>
         <w:tc>
           <w:tcPr>
-            <w:tcW w:w="5112" w:type="dxa"/>
+            <w:tcW w:w="4640" w:type="dxa"/>
           </w:tcPr>
           <w:p>
             <w:pPr>
               <w:spacing w:line="240" w:lineRule="auto"/>
-              <w:rPr>
-                <w:rFonts w:ascii="Times New Roman" w:hAnsi="Times New Roman" w:cs="Times New Roman"/>
-                <w:sz w:val="28"/>
-                <w:szCs w:val="28"/>
-              </w:rPr>
-            </w:pPr>
-            <w:r>
-              <w:rPr>
-                <w:rFonts w:ascii="Times New Roman" w:hAnsi="Times New Roman" w:cs="Times New Roman"/>
-                <w:sz w:val="28"/>
-                <w:szCs w:val="28"/>
-              </w:rPr>
-              <w:t>Проверка текста, отправка вопроса и получение ответа персонажа.</w:t>
+              <w:contextualSpacing/>
+              <w:rPr>
+                <w:rFonts w:ascii="Times New Roman" w:hAnsi="Times New Roman" w:cs="Times New Roman"/>
+              </w:rPr>
+            </w:pPr>
+            <w:r>
+              <w:rPr>
+                <w:rFonts w:ascii="Times New Roman" w:hAnsi="Times New Roman" w:cs="Times New Roman"/>
+              </w:rPr>
+              <w:t>Загрузка подозреваемых выбранного дела</w:t>
             </w:r>
           </w:p>
         </w:tc>
@@ -13181,49 +13414,43 @@
       <w:tr>
         <w:tc>
           <w:tcPr>
-            <w:tcW w:w="5112" w:type="dxa"/>
+            <w:tcW w:w="4705" w:type="dxa"/>
           </w:tcPr>
           <w:p>
             <w:pPr>
               <w:spacing w:line="240" w:lineRule="auto"/>
-              <w:rPr>
-                <w:rFonts w:ascii="Times New Roman" w:hAnsi="Times New Roman" w:cs="Times New Roman"/>
-                <w:sz w:val="28"/>
-                <w:szCs w:val="28"/>
+              <w:contextualSpacing/>
+              <w:rPr>
+                <w:rFonts w:ascii="Times New Roman" w:hAnsi="Times New Roman" w:cs="Times New Roman"/>
               </w:rPr>
             </w:pPr>
             <w:proofErr w:type="spellStart"/>
             <w:r>
               <w:rPr>
                 <w:rFonts w:ascii="Times New Roman" w:hAnsi="Times New Roman" w:cs="Times New Roman"/>
-                <w:sz w:val="28"/>
-                <w:szCs w:val="28"/>
-              </w:rPr>
-              <w:t>LoadDialogueHistory</w:t>
+              </w:rPr>
+              <w:t>SyncProgress</w:t>
             </w:r>
             <w:proofErr w:type="spellEnd"/>
           </w:p>
         </w:tc>
         <w:tc>
           <w:tcPr>
-            <w:tcW w:w="5112" w:type="dxa"/>
+            <w:tcW w:w="4640" w:type="dxa"/>
           </w:tcPr>
           <w:p>
             <w:pPr>
               <w:spacing w:line="240" w:lineRule="auto"/>
-              <w:rPr>
-                <w:rFonts w:ascii="Times New Roman" w:hAnsi="Times New Roman" w:cs="Times New Roman"/>
-                <w:sz w:val="28"/>
-                <w:szCs w:val="28"/>
-              </w:rPr>
-            </w:pPr>
-            <w:r>
-              <w:rPr>
-                <w:rFonts w:ascii="Times New Roman" w:hAnsi="Times New Roman" w:cs="Times New Roman"/>
-                <w:sz w:val="28"/>
-                <w:szCs w:val="28"/>
-              </w:rPr>
-              <w:t>Получение истории диалога.</w:t>
+              <w:contextualSpacing/>
+              <w:rPr>
+                <w:rFonts w:ascii="Times New Roman" w:hAnsi="Times New Roman" w:cs="Times New Roman"/>
+              </w:rPr>
+            </w:pPr>
+            <w:r>
+              <w:rPr>
+                <w:rFonts w:ascii="Times New Roman" w:hAnsi="Times New Roman" w:cs="Times New Roman"/>
+              </w:rPr>
+              <w:t>Отправка в облако изменений и фото, накопленных без сети</w:t>
             </w:r>
           </w:p>
         </w:tc>
@@ -13231,49 +13458,43 @@
       <w:tr>
         <w:tc>
           <w:tcPr>
-            <w:tcW w:w="5112" w:type="dxa"/>
+            <w:tcW w:w="4705" w:type="dxa"/>
           </w:tcPr>
           <w:p>
             <w:pPr>
               <w:spacing w:line="240" w:lineRule="auto"/>
-              <w:rPr>
-                <w:rFonts w:ascii="Times New Roman" w:hAnsi="Times New Roman" w:cs="Times New Roman"/>
-                <w:sz w:val="28"/>
-                <w:szCs w:val="28"/>
+              <w:contextualSpacing/>
+              <w:rPr>
+                <w:rFonts w:ascii="Times New Roman" w:hAnsi="Times New Roman" w:cs="Times New Roman"/>
               </w:rPr>
             </w:pPr>
             <w:proofErr w:type="spellStart"/>
             <w:r>
               <w:rPr>
                 <w:rFonts w:ascii="Times New Roman" w:hAnsi="Times New Roman" w:cs="Times New Roman"/>
-                <w:sz w:val="28"/>
-                <w:szCs w:val="28"/>
-              </w:rPr>
-              <w:t>CollectClue</w:t>
+              </w:rPr>
+              <w:t>SendSuspectMessage</w:t>
             </w:r>
             <w:proofErr w:type="spellEnd"/>
           </w:p>
         </w:tc>
         <w:tc>
           <w:tcPr>
-            <w:tcW w:w="5112" w:type="dxa"/>
+            <w:tcW w:w="4640" w:type="dxa"/>
           </w:tcPr>
           <w:p>
             <w:pPr>
               <w:spacing w:line="240" w:lineRule="auto"/>
-              <w:rPr>
-                <w:rFonts w:ascii="Times New Roman" w:hAnsi="Times New Roman" w:cs="Times New Roman"/>
-                <w:sz w:val="28"/>
-                <w:szCs w:val="28"/>
-              </w:rPr>
-            </w:pPr>
-            <w:r>
-              <w:rPr>
-                <w:rFonts w:ascii="Times New Roman" w:hAnsi="Times New Roman" w:cs="Times New Roman"/>
-                <w:sz w:val="28"/>
-                <w:szCs w:val="28"/>
-              </w:rPr>
-              <w:t>Проверка условия получения улики и обновление прогресса.</w:t>
+              <w:contextualSpacing/>
+              <w:rPr>
+                <w:rFonts w:ascii="Times New Roman" w:hAnsi="Times New Roman" w:cs="Times New Roman"/>
+              </w:rPr>
+            </w:pPr>
+            <w:r>
+              <w:rPr>
+                <w:rFonts w:ascii="Times New Roman" w:hAnsi="Times New Roman" w:cs="Times New Roman"/>
+              </w:rPr>
+              <w:t>Проверка текста, отправка вопроса и получение ответа персонажа</w:t>
             </w:r>
           </w:p>
         </w:tc>
@@ -13281,49 +13502,43 @@
       <w:tr>
         <w:tc>
           <w:tcPr>
-            <w:tcW w:w="5112" w:type="dxa"/>
+            <w:tcW w:w="4705" w:type="dxa"/>
           </w:tcPr>
           <w:p>
             <w:pPr>
               <w:spacing w:line="240" w:lineRule="auto"/>
-              <w:rPr>
-                <w:rFonts w:ascii="Times New Roman" w:hAnsi="Times New Roman" w:cs="Times New Roman"/>
-                <w:sz w:val="28"/>
-                <w:szCs w:val="28"/>
+              <w:contextualSpacing/>
+              <w:rPr>
+                <w:rFonts w:ascii="Times New Roman" w:hAnsi="Times New Roman" w:cs="Times New Roman"/>
               </w:rPr>
             </w:pPr>
             <w:proofErr w:type="spellStart"/>
             <w:r>
               <w:rPr>
                 <w:rFonts w:ascii="Times New Roman" w:hAnsi="Times New Roman" w:cs="Times New Roman"/>
-                <w:sz w:val="28"/>
-                <w:szCs w:val="28"/>
-              </w:rPr>
-              <w:t>LoadClueJournal</w:t>
+              </w:rPr>
+              <w:t>PresentClueToSuspect</w:t>
             </w:r>
             <w:proofErr w:type="spellEnd"/>
           </w:p>
         </w:tc>
         <w:tc>
           <w:tcPr>
-            <w:tcW w:w="5112" w:type="dxa"/>
+            <w:tcW w:w="4640" w:type="dxa"/>
           </w:tcPr>
           <w:p>
             <w:pPr>
               <w:spacing w:line="240" w:lineRule="auto"/>
-              <w:rPr>
-                <w:rFonts w:ascii="Times New Roman" w:hAnsi="Times New Roman" w:cs="Times New Roman"/>
-                <w:sz w:val="28"/>
-                <w:szCs w:val="28"/>
-              </w:rPr>
-            </w:pPr>
-            <w:r>
-              <w:rPr>
-                <w:rFonts w:ascii="Times New Roman" w:hAnsi="Times New Roman" w:cs="Times New Roman"/>
-                <w:sz w:val="28"/>
-                <w:szCs w:val="28"/>
-              </w:rPr>
-              <w:t>Загрузка полученных улик.</w:t>
+              <w:contextualSpacing/>
+              <w:rPr>
+                <w:rFonts w:ascii="Times New Roman" w:hAnsi="Times New Roman" w:cs="Times New Roman"/>
+              </w:rPr>
+            </w:pPr>
+            <w:r>
+              <w:rPr>
+                <w:rFonts w:ascii="Times New Roman" w:hAnsi="Times New Roman" w:cs="Times New Roman"/>
+              </w:rPr>
+              <w:t>Предъявление улики из инвентаря подозреваемому и получение его реакции</w:t>
             </w:r>
           </w:p>
         </w:tc>
@@ -13331,49 +13546,43 @@
       <w:tr>
         <w:tc>
           <w:tcPr>
-            <w:tcW w:w="5112" w:type="dxa"/>
+            <w:tcW w:w="4705" w:type="dxa"/>
           </w:tcPr>
           <w:p>
             <w:pPr>
               <w:spacing w:line="240" w:lineRule="auto"/>
-              <w:rPr>
-                <w:rFonts w:ascii="Times New Roman" w:hAnsi="Times New Roman" w:cs="Times New Roman"/>
-                <w:sz w:val="28"/>
-                <w:szCs w:val="28"/>
+              <w:contextualSpacing/>
+              <w:rPr>
+                <w:rFonts w:ascii="Times New Roman" w:hAnsi="Times New Roman" w:cs="Times New Roman"/>
               </w:rPr>
             </w:pPr>
             <w:proofErr w:type="spellStart"/>
             <w:r>
               <w:rPr>
                 <w:rFonts w:ascii="Times New Roman" w:hAnsi="Times New Roman" w:cs="Times New Roman"/>
-                <w:sz w:val="28"/>
-                <w:szCs w:val="28"/>
-              </w:rPr>
-              <w:t>PlayMorsePuzzle</w:t>
+              </w:rPr>
+              <w:t>LoadDialogueHistory</w:t>
             </w:r>
             <w:proofErr w:type="spellEnd"/>
           </w:p>
         </w:tc>
         <w:tc>
           <w:tcPr>
-            <w:tcW w:w="5112" w:type="dxa"/>
+            <w:tcW w:w="4640" w:type="dxa"/>
           </w:tcPr>
           <w:p>
             <w:pPr>
               <w:spacing w:line="240" w:lineRule="auto"/>
-              <w:rPr>
-                <w:rFonts w:ascii="Times New Roman" w:hAnsi="Times New Roman" w:cs="Times New Roman"/>
-                <w:sz w:val="28"/>
-                <w:szCs w:val="28"/>
-              </w:rPr>
-            </w:pPr>
-            <w:r>
-              <w:rPr>
-                <w:rFonts w:ascii="Times New Roman" w:hAnsi="Times New Roman" w:cs="Times New Roman"/>
-                <w:sz w:val="28"/>
-                <w:szCs w:val="28"/>
-              </w:rPr>
-              <w:t>Проверка ответа на загадку Морзе и выдача награды.</w:t>
+              <w:contextualSpacing/>
+              <w:rPr>
+                <w:rFonts w:ascii="Times New Roman" w:hAnsi="Times New Roman" w:cs="Times New Roman"/>
+              </w:rPr>
+            </w:pPr>
+            <w:r>
+              <w:rPr>
+                <w:rFonts w:ascii="Times New Roman" w:hAnsi="Times New Roman" w:cs="Times New Roman"/>
+              </w:rPr>
+              <w:t>Получение истории диалога</w:t>
             </w:r>
           </w:p>
         </w:tc>
@@ -13381,49 +13590,43 @@
       <w:tr>
         <w:tc>
           <w:tcPr>
-            <w:tcW w:w="5112" w:type="dxa"/>
+            <w:tcW w:w="4705" w:type="dxa"/>
           </w:tcPr>
           <w:p>
             <w:pPr>
               <w:spacing w:line="240" w:lineRule="auto"/>
-              <w:rPr>
-                <w:rFonts w:ascii="Times New Roman" w:hAnsi="Times New Roman" w:cs="Times New Roman"/>
-                <w:sz w:val="28"/>
-                <w:szCs w:val="28"/>
+              <w:contextualSpacing/>
+              <w:rPr>
+                <w:rFonts w:ascii="Times New Roman" w:hAnsi="Times New Roman" w:cs="Times New Roman"/>
               </w:rPr>
             </w:pPr>
             <w:proofErr w:type="spellStart"/>
             <w:r>
               <w:rPr>
                 <w:rFonts w:ascii="Times New Roman" w:hAnsi="Times New Roman" w:cs="Times New Roman"/>
-                <w:sz w:val="28"/>
-                <w:szCs w:val="28"/>
-              </w:rPr>
-              <w:t>SubmitAccusation</w:t>
+              </w:rPr>
+              <w:t>LoadNotebook</w:t>
             </w:r>
             <w:proofErr w:type="spellEnd"/>
           </w:p>
         </w:tc>
         <w:tc>
           <w:tcPr>
-            <w:tcW w:w="5112" w:type="dxa"/>
+            <w:tcW w:w="4640" w:type="dxa"/>
           </w:tcPr>
           <w:p>
             <w:pPr>
               <w:spacing w:line="240" w:lineRule="auto"/>
-              <w:rPr>
-                <w:rFonts w:ascii="Times New Roman" w:hAnsi="Times New Roman" w:cs="Times New Roman"/>
-                <w:sz w:val="28"/>
-                <w:szCs w:val="28"/>
-              </w:rPr>
-            </w:pPr>
-            <w:r>
-              <w:rPr>
-                <w:rFonts w:ascii="Times New Roman" w:hAnsi="Times New Roman" w:cs="Times New Roman"/>
-                <w:sz w:val="28"/>
-                <w:szCs w:val="28"/>
-              </w:rPr>
-              <w:t>Фиксация подозреваемого и показ результата.</w:t>
+              <w:contextualSpacing/>
+              <w:rPr>
+                <w:rFonts w:ascii="Times New Roman" w:hAnsi="Times New Roman" w:cs="Times New Roman"/>
+              </w:rPr>
+            </w:pPr>
+            <w:r>
+              <w:rPr>
+                <w:rFonts w:ascii="Times New Roman" w:hAnsi="Times New Roman" w:cs="Times New Roman"/>
+              </w:rPr>
+              <w:t>Загрузка блокнота: показания персонажей и заметки игрока</w:t>
             </w:r>
           </w:p>
         </w:tc>
@@ -13431,50 +13634,589 @@
       <w:tr>
         <w:tc>
           <w:tcPr>
-            <w:tcW w:w="5112" w:type="dxa"/>
+            <w:tcW w:w="4705" w:type="dxa"/>
           </w:tcPr>
           <w:p>
             <w:pPr>
               <w:spacing w:line="240" w:lineRule="auto"/>
-              <w:rPr>
-                <w:rFonts w:ascii="Times New Roman" w:hAnsi="Times New Roman" w:cs="Times New Roman"/>
-                <w:sz w:val="28"/>
-                <w:szCs w:val="28"/>
+              <w:contextualSpacing/>
+              <w:rPr>
+                <w:rFonts w:ascii="Times New Roman" w:hAnsi="Times New Roman" w:cs="Times New Roman"/>
               </w:rPr>
             </w:pPr>
             <w:proofErr w:type="spellStart"/>
             <w:r>
               <w:rPr>
                 <w:rFonts w:ascii="Times New Roman" w:hAnsi="Times New Roman" w:cs="Times New Roman"/>
-                <w:sz w:val="28"/>
-                <w:szCs w:val="28"/>
-              </w:rPr>
-              <w:lastRenderedPageBreak/>
-              <w:t>RestoreInvestigationProgress</w:t>
+              </w:rPr>
+              <w:t>SaveNote</w:t>
             </w:r>
             <w:proofErr w:type="spellEnd"/>
           </w:p>
         </w:tc>
         <w:tc>
           <w:tcPr>
-            <w:tcW w:w="5112" w:type="dxa"/>
+            <w:tcW w:w="4640" w:type="dxa"/>
           </w:tcPr>
           <w:p>
             <w:pPr>
               <w:spacing w:line="240" w:lineRule="auto"/>
-              <w:rPr>
-                <w:rFonts w:ascii="Times New Roman" w:hAnsi="Times New Roman" w:cs="Times New Roman"/>
-                <w:sz w:val="28"/>
-                <w:szCs w:val="28"/>
-              </w:rPr>
-            </w:pPr>
-            <w:r>
-              <w:rPr>
-                <w:rFonts w:ascii="Times New Roman" w:hAnsi="Times New Roman" w:cs="Times New Roman"/>
-                <w:sz w:val="28"/>
-                <w:szCs w:val="28"/>
-              </w:rPr>
-              <w:t>Восстановление прогресса после перезапуска.</w:t>
+              <w:contextualSpacing/>
+              <w:rPr>
+                <w:rFonts w:ascii="Times New Roman" w:hAnsi="Times New Roman" w:cs="Times New Roman"/>
+              </w:rPr>
+            </w:pPr>
+            <w:r>
+              <w:rPr>
+                <w:rFonts w:ascii="Times New Roman" w:hAnsi="Times New Roman" w:cs="Times New Roman"/>
+              </w:rPr>
+              <w:t>Сохранение заметки игрока</w:t>
+            </w:r>
+          </w:p>
+        </w:tc>
+      </w:tr>
+      <w:tr>
+        <w:tc>
+          <w:tcPr>
+            <w:tcW w:w="4705" w:type="dxa"/>
+          </w:tcPr>
+          <w:p>
+            <w:pPr>
+              <w:spacing w:line="240" w:lineRule="auto"/>
+              <w:contextualSpacing/>
+              <w:rPr>
+                <w:rFonts w:ascii="Times New Roman" w:hAnsi="Times New Roman" w:cs="Times New Roman"/>
+              </w:rPr>
+            </w:pPr>
+            <w:proofErr w:type="spellStart"/>
+            <w:r>
+              <w:rPr>
+                <w:rFonts w:ascii="Times New Roman" w:hAnsi="Times New Roman" w:cs="Times New Roman"/>
+              </w:rPr>
+              <w:t>FindClueByAzimuth</w:t>
+            </w:r>
+            <w:proofErr w:type="spellEnd"/>
+          </w:p>
+        </w:tc>
+        <w:tc>
+          <w:tcPr>
+            <w:tcW w:w="4640" w:type="dxa"/>
+          </w:tcPr>
+          <w:p>
+            <w:pPr>
+              <w:spacing w:line="240" w:lineRule="auto"/>
+              <w:contextualSpacing/>
+              <w:rPr>
+                <w:rFonts w:ascii="Times New Roman" w:hAnsi="Times New Roman" w:cs="Times New Roman"/>
+              </w:rPr>
+            </w:pPr>
+            <w:r>
+              <w:rPr>
+                <w:rFonts w:ascii="Times New Roman" w:hAnsi="Times New Roman" w:cs="Times New Roman"/>
+              </w:rPr>
+              <w:t>Определение по направлению телефона, какая улика находится в поле зрения</w:t>
+            </w:r>
+          </w:p>
+        </w:tc>
+      </w:tr>
+      <w:tr>
+        <w:tc>
+          <w:tcPr>
+            <w:tcW w:w="4705" w:type="dxa"/>
+          </w:tcPr>
+          <w:p>
+            <w:pPr>
+              <w:spacing w:line="240" w:lineRule="auto"/>
+              <w:contextualSpacing/>
+              <w:rPr>
+                <w:rFonts w:ascii="Times New Roman" w:hAnsi="Times New Roman" w:cs="Times New Roman"/>
+              </w:rPr>
+            </w:pPr>
+            <w:proofErr w:type="spellStart"/>
+            <w:r>
+              <w:rPr>
+                <w:rFonts w:ascii="Times New Roman" w:hAnsi="Times New Roman" w:cs="Times New Roman"/>
+              </w:rPr>
+              <w:t>ConfirmClueApproach</w:t>
+            </w:r>
+            <w:proofErr w:type="spellEnd"/>
+          </w:p>
+        </w:tc>
+        <w:tc>
+          <w:tcPr>
+            <w:tcW w:w="4640" w:type="dxa"/>
+          </w:tcPr>
+          <w:p>
+            <w:pPr>
+              <w:spacing w:line="240" w:lineRule="auto"/>
+              <w:contextualSpacing/>
+              <w:rPr>
+                <w:rFonts w:ascii="Times New Roman" w:hAnsi="Times New Roman" w:cs="Times New Roman"/>
+              </w:rPr>
+            </w:pPr>
+            <w:r>
+              <w:rPr>
+                <w:rFonts w:ascii="Times New Roman" w:hAnsi="Times New Roman" w:cs="Times New Roman"/>
+              </w:rPr>
+              <w:t>Проверка, что игрок прошёл нужное число шагов до улики</w:t>
+            </w:r>
+          </w:p>
+        </w:tc>
+      </w:tr>
+      <w:tr>
+        <w:tc>
+          <w:tcPr>
+            <w:tcW w:w="4705" w:type="dxa"/>
+          </w:tcPr>
+          <w:p>
+            <w:pPr>
+              <w:spacing w:line="240" w:lineRule="auto"/>
+              <w:contextualSpacing/>
+              <w:rPr>
+                <w:rFonts w:ascii="Times New Roman" w:hAnsi="Times New Roman" w:cs="Times New Roman"/>
+              </w:rPr>
+            </w:pPr>
+            <w:proofErr w:type="spellStart"/>
+            <w:r>
+              <w:rPr>
+                <w:rFonts w:ascii="Times New Roman" w:hAnsi="Times New Roman" w:cs="Times New Roman"/>
+              </w:rPr>
+              <w:t>SaveCluePhoto</w:t>
+            </w:r>
+            <w:proofErr w:type="spellEnd"/>
+          </w:p>
+        </w:tc>
+        <w:tc>
+          <w:tcPr>
+            <w:tcW w:w="4640" w:type="dxa"/>
+          </w:tcPr>
+          <w:p>
+            <w:pPr>
+              <w:spacing w:line="240" w:lineRule="auto"/>
+              <w:contextualSpacing/>
+              <w:rPr>
+                <w:rFonts w:ascii="Times New Roman" w:hAnsi="Times New Roman" w:cs="Times New Roman"/>
+              </w:rPr>
+            </w:pPr>
+            <w:r>
+              <w:rPr>
+                <w:rFonts w:ascii="Times New Roman" w:hAnsi="Times New Roman" w:cs="Times New Roman"/>
+              </w:rPr>
+              <w:t>Сохранение фото улики на устройство и постановка в очередь отправки</w:t>
+            </w:r>
+          </w:p>
+        </w:tc>
+      </w:tr>
+      <w:tr>
+        <w:tc>
+          <w:tcPr>
+            <w:tcW w:w="4705" w:type="dxa"/>
+          </w:tcPr>
+          <w:p>
+            <w:pPr>
+              <w:spacing w:line="240" w:lineRule="auto"/>
+              <w:contextualSpacing/>
+              <w:rPr>
+                <w:rFonts w:ascii="Times New Roman" w:hAnsi="Times New Roman" w:cs="Times New Roman"/>
+              </w:rPr>
+            </w:pPr>
+            <w:proofErr w:type="spellStart"/>
+            <w:r>
+              <w:rPr>
+                <w:rFonts w:ascii="Times New Roman" w:hAnsi="Times New Roman" w:cs="Times New Roman"/>
+              </w:rPr>
+              <w:t>CollectClue</w:t>
+            </w:r>
+            <w:proofErr w:type="spellEnd"/>
+          </w:p>
+        </w:tc>
+        <w:tc>
+          <w:tcPr>
+            <w:tcW w:w="4640" w:type="dxa"/>
+          </w:tcPr>
+          <w:p>
+            <w:pPr>
+              <w:spacing w:line="240" w:lineRule="auto"/>
+              <w:contextualSpacing/>
+              <w:rPr>
+                <w:rFonts w:ascii="Times New Roman" w:hAnsi="Times New Roman" w:cs="Times New Roman"/>
+              </w:rPr>
+            </w:pPr>
+            <w:r>
+              <w:rPr>
+                <w:rFonts w:ascii="Times New Roman" w:hAnsi="Times New Roman" w:cs="Times New Roman"/>
+              </w:rPr>
+              <w:t>Проверка условия получения улики и обновление прогресса</w:t>
+            </w:r>
+          </w:p>
+        </w:tc>
+      </w:tr>
+      <w:tr>
+        <w:tc>
+          <w:tcPr>
+            <w:tcW w:w="4705" w:type="dxa"/>
+          </w:tcPr>
+          <w:p>
+            <w:pPr>
+              <w:spacing w:line="240" w:lineRule="auto"/>
+              <w:contextualSpacing/>
+              <w:rPr>
+                <w:rFonts w:ascii="Times New Roman" w:hAnsi="Times New Roman" w:cs="Times New Roman"/>
+              </w:rPr>
+            </w:pPr>
+            <w:proofErr w:type="spellStart"/>
+            <w:r>
+              <w:rPr>
+                <w:rFonts w:ascii="Times New Roman" w:hAnsi="Times New Roman" w:cs="Times New Roman"/>
+              </w:rPr>
+              <w:t>AddToInventory</w:t>
+            </w:r>
+            <w:proofErr w:type="spellEnd"/>
+          </w:p>
+        </w:tc>
+        <w:tc>
+          <w:tcPr>
+            <w:tcW w:w="4640" w:type="dxa"/>
+          </w:tcPr>
+          <w:p>
+            <w:pPr>
+              <w:spacing w:line="240" w:lineRule="auto"/>
+              <w:contextualSpacing/>
+              <w:rPr>
+                <w:rFonts w:ascii="Times New Roman" w:hAnsi="Times New Roman" w:cs="Times New Roman"/>
+              </w:rPr>
+            </w:pPr>
+            <w:r>
+              <w:rPr>
+                <w:rFonts w:ascii="Times New Roman" w:hAnsi="Times New Roman" w:cs="Times New Roman"/>
+              </w:rPr>
+              <w:t xml:space="preserve">Добавление найденного </w:t>
+            </w:r>
+            <w:r>
+              <w:rPr>
+                <w:rFonts w:ascii="Times New Roman" w:hAnsi="Times New Roman" w:cs="Times New Roman"/>
+              </w:rPr>
+              <w:t>предмета или улики в инвентарь</w:t>
+            </w:r>
+          </w:p>
+        </w:tc>
+      </w:tr>
+      <w:tr>
+        <w:tc>
+          <w:tcPr>
+            <w:tcW w:w="4705" w:type="dxa"/>
+          </w:tcPr>
+          <w:p>
+            <w:pPr>
+              <w:spacing w:line="240" w:lineRule="auto"/>
+              <w:contextualSpacing/>
+              <w:rPr>
+                <w:rFonts w:ascii="Times New Roman" w:hAnsi="Times New Roman" w:cs="Times New Roman"/>
+              </w:rPr>
+            </w:pPr>
+            <w:proofErr w:type="spellStart"/>
+            <w:r>
+              <w:rPr>
+                <w:rFonts w:ascii="Times New Roman" w:hAnsi="Times New Roman" w:cs="Times New Roman"/>
+              </w:rPr>
+              <w:t>LoadInventory</w:t>
+            </w:r>
+            <w:proofErr w:type="spellEnd"/>
+          </w:p>
+        </w:tc>
+        <w:tc>
+          <w:tcPr>
+            <w:tcW w:w="4640" w:type="dxa"/>
+          </w:tcPr>
+          <w:p>
+            <w:pPr>
+              <w:spacing w:line="240" w:lineRule="auto"/>
+              <w:contextualSpacing/>
+              <w:rPr>
+                <w:rFonts w:ascii="Times New Roman" w:hAnsi="Times New Roman" w:cs="Times New Roman"/>
+              </w:rPr>
+            </w:pPr>
+            <w:r>
+              <w:rPr>
+                <w:rFonts w:ascii="Times New Roman" w:hAnsi="Times New Roman" w:cs="Times New Roman"/>
+              </w:rPr>
+              <w:t>Загрузка инвентаря: вкладки «Предметы» и «Улики»</w:t>
+            </w:r>
+          </w:p>
+        </w:tc>
+      </w:tr>
+      <w:tr>
+        <w:tc>
+          <w:tcPr>
+            <w:tcW w:w="4705" w:type="dxa"/>
+          </w:tcPr>
+          <w:p>
+            <w:pPr>
+              <w:spacing w:line="240" w:lineRule="auto"/>
+              <w:contextualSpacing/>
+              <w:rPr>
+                <w:rFonts w:ascii="Times New Roman" w:hAnsi="Times New Roman" w:cs="Times New Roman"/>
+              </w:rPr>
+            </w:pPr>
+            <w:proofErr w:type="spellStart"/>
+            <w:r>
+              <w:rPr>
+                <w:rFonts w:ascii="Times New Roman" w:hAnsi="Times New Roman" w:cs="Times New Roman"/>
+              </w:rPr>
+              <w:t>InspectItem</w:t>
+            </w:r>
+            <w:proofErr w:type="spellEnd"/>
+          </w:p>
+        </w:tc>
+        <w:tc>
+          <w:tcPr>
+            <w:tcW w:w="4640" w:type="dxa"/>
+          </w:tcPr>
+          <w:p>
+            <w:pPr>
+              <w:spacing w:line="240" w:lineRule="auto"/>
+              <w:contextualSpacing/>
+              <w:rPr>
+                <w:rFonts w:ascii="Times New Roman" w:hAnsi="Times New Roman" w:cs="Times New Roman"/>
+              </w:rPr>
+            </w:pPr>
+            <w:r>
+              <w:rPr>
+                <w:rFonts w:ascii="Times New Roman" w:hAnsi="Times New Roman" w:cs="Times New Roman"/>
+              </w:rPr>
+              <w:t>Осмотр предмета: описание, увеличение, скрытая деталь</w:t>
+            </w:r>
+          </w:p>
+        </w:tc>
+      </w:tr>
+      <w:tr>
+        <w:tc>
+          <w:tcPr>
+            <w:tcW w:w="4705" w:type="dxa"/>
+          </w:tcPr>
+          <w:p>
+            <w:pPr>
+              <w:spacing w:line="240" w:lineRule="auto"/>
+              <w:contextualSpacing/>
+              <w:rPr>
+                <w:rFonts w:ascii="Times New Roman" w:hAnsi="Times New Roman" w:cs="Times New Roman"/>
+              </w:rPr>
+            </w:pPr>
+            <w:proofErr w:type="spellStart"/>
+            <w:r>
+              <w:rPr>
+                <w:rFonts w:ascii="Times New Roman" w:hAnsi="Times New Roman" w:cs="Times New Roman"/>
+              </w:rPr>
+              <w:t>PlayPuzzle</w:t>
+            </w:r>
+            <w:proofErr w:type="spellEnd"/>
+          </w:p>
+        </w:tc>
+        <w:tc>
+          <w:tcPr>
+            <w:tcW w:w="4640" w:type="dxa"/>
+          </w:tcPr>
+          <w:p>
+            <w:pPr>
+              <w:spacing w:line="240" w:lineRule="auto"/>
+              <w:contextualSpacing/>
+              <w:rPr>
+                <w:rFonts w:ascii="Times New Roman" w:hAnsi="Times New Roman" w:cs="Times New Roman"/>
+              </w:rPr>
+            </w:pPr>
+            <w:r>
+              <w:rPr>
+                <w:rFonts w:ascii="Times New Roman" w:hAnsi="Times New Roman" w:cs="Times New Roman"/>
+              </w:rPr>
+              <w:t>Проверка ответа на головоломку</w:t>
+            </w:r>
+            <w:r>
+              <w:rPr>
+                <w:rFonts w:ascii="Times New Roman" w:hAnsi="Times New Roman" w:cs="Times New Roman"/>
+              </w:rPr>
+              <w:t xml:space="preserve"> </w:t>
+            </w:r>
+            <w:r>
+              <w:rPr>
+                <w:rFonts w:ascii="Times New Roman" w:hAnsi="Times New Roman" w:cs="Times New Roman"/>
+              </w:rPr>
+              <w:t>и выдача награды</w:t>
+            </w:r>
+          </w:p>
+        </w:tc>
+      </w:tr>
+      <w:tr>
+        <w:tc>
+          <w:tcPr>
+            <w:tcW w:w="4705" w:type="dxa"/>
+          </w:tcPr>
+          <w:p>
+            <w:pPr>
+              <w:spacing w:line="240" w:lineRule="auto"/>
+              <w:contextualSpacing/>
+              <w:rPr>
+                <w:rFonts w:ascii="Times New Roman" w:hAnsi="Times New Roman" w:cs="Times New Roman"/>
+              </w:rPr>
+            </w:pPr>
+            <w:proofErr w:type="spellStart"/>
+            <w:r>
+              <w:rPr>
+                <w:rFonts w:ascii="Times New Roman" w:hAnsi="Times New Roman" w:cs="Times New Roman"/>
+              </w:rPr>
+              <w:t>PlayMorseSignal</w:t>
+            </w:r>
+            <w:proofErr w:type="spellEnd"/>
+          </w:p>
+        </w:tc>
+        <w:tc>
+          <w:tcPr>
+            <w:tcW w:w="4640" w:type="dxa"/>
+          </w:tcPr>
+          <w:p>
+            <w:pPr>
+              <w:spacing w:line="240" w:lineRule="auto"/>
+              <w:contextualSpacing/>
+              <w:rPr>
+                <w:rFonts w:ascii="Times New Roman" w:hAnsi="Times New Roman" w:cs="Times New Roman"/>
+              </w:rPr>
+            </w:pPr>
+            <w:r>
+              <w:rPr>
+                <w:rFonts w:ascii="Times New Roman" w:hAnsi="Times New Roman" w:cs="Times New Roman"/>
+              </w:rPr>
+              <w:t>Преобразование слова в вибрации и его воспроизведение</w:t>
+            </w:r>
+          </w:p>
+        </w:tc>
+      </w:tr>
+      <w:tr>
+        <w:tc>
+          <w:tcPr>
+            <w:tcW w:w="4705" w:type="dxa"/>
+          </w:tcPr>
+          <w:p>
+            <w:pPr>
+              <w:spacing w:line="240" w:lineRule="auto"/>
+              <w:contextualSpacing/>
+              <w:rPr>
+                <w:rFonts w:ascii="Times New Roman" w:hAnsi="Times New Roman" w:cs="Times New Roman"/>
+              </w:rPr>
+            </w:pPr>
+            <w:proofErr w:type="spellStart"/>
+            <w:r>
+              <w:rPr>
+                <w:rFonts w:ascii="Times New Roman" w:hAnsi="Times New Roman" w:cs="Times New Roman"/>
+              </w:rPr>
+              <w:t>InspectScene</w:t>
+            </w:r>
+            <w:proofErr w:type="spellEnd"/>
+          </w:p>
+        </w:tc>
+        <w:tc>
+          <w:tcPr>
+            <w:tcW w:w="4640" w:type="dxa"/>
+          </w:tcPr>
+          <w:p>
+            <w:pPr>
+              <w:spacing w:line="240" w:lineRule="auto"/>
+              <w:contextualSpacing/>
+              <w:rPr>
+                <w:rFonts w:ascii="Times New Roman" w:hAnsi="Times New Roman" w:cs="Times New Roman"/>
+              </w:rPr>
+            </w:pPr>
+            <w:r>
+              <w:rPr>
+                <w:rFonts w:ascii="Times New Roman" w:hAnsi="Times New Roman" w:cs="Times New Roman"/>
+              </w:rPr>
+              <w:t>Осмотр места происшествия: обработка касания зоны и открытие детали</w:t>
+            </w:r>
+          </w:p>
+        </w:tc>
+      </w:tr>
+      <w:tr>
+        <w:tc>
+          <w:tcPr>
+            <w:tcW w:w="4705" w:type="dxa"/>
+          </w:tcPr>
+          <w:p>
+            <w:pPr>
+              <w:spacing w:line="240" w:lineRule="auto"/>
+              <w:contextualSpacing/>
+              <w:rPr>
+                <w:rFonts w:ascii="Times New Roman" w:hAnsi="Times New Roman" w:cs="Times New Roman"/>
+              </w:rPr>
+            </w:pPr>
+            <w:proofErr w:type="spellStart"/>
+            <w:r>
+              <w:rPr>
+                <w:rFonts w:ascii="Times New Roman" w:hAnsi="Times New Roman" w:cs="Times New Roman"/>
+              </w:rPr>
+              <w:t>MatchFingerprint</w:t>
+            </w:r>
+            <w:proofErr w:type="spellEnd"/>
+          </w:p>
+        </w:tc>
+        <w:tc>
+          <w:tcPr>
+            <w:tcW w:w="4640" w:type="dxa"/>
+          </w:tcPr>
+          <w:p>
+            <w:pPr>
+              <w:spacing w:line="240" w:lineRule="auto"/>
+              <w:contextualSpacing/>
+              <w:rPr>
+                <w:rFonts w:ascii="Times New Roman" w:hAnsi="Times New Roman" w:cs="Times New Roman"/>
+              </w:rPr>
+            </w:pPr>
+            <w:r>
+              <w:rPr>
+                <w:rFonts w:ascii="Times New Roman" w:hAnsi="Times New Roman" w:cs="Times New Roman"/>
+              </w:rPr>
+              <w:t>Проверка выбранного отпечатка и выдача улики</w:t>
+            </w:r>
+          </w:p>
+        </w:tc>
+      </w:tr>
+      <w:tr>
+        <w:tc>
+          <w:tcPr>
+            <w:tcW w:w="4705" w:type="dxa"/>
+          </w:tcPr>
+          <w:p>
+            <w:pPr>
+              <w:spacing w:line="240" w:lineRule="auto"/>
+              <w:contextualSpacing/>
+              <w:rPr>
+                <w:rFonts w:ascii="Times New Roman" w:hAnsi="Times New Roman" w:cs="Times New Roman"/>
+              </w:rPr>
+            </w:pPr>
+            <w:proofErr w:type="spellStart"/>
+            <w:r>
+              <w:rPr>
+                <w:rFonts w:ascii="Times New Roman" w:hAnsi="Times New Roman" w:cs="Times New Roman"/>
+              </w:rPr>
+              <w:t>SubmitAccusation</w:t>
+            </w:r>
+            <w:proofErr w:type="spellEnd"/>
+          </w:p>
+        </w:tc>
+        <w:tc>
+          <w:tcPr>
+            <w:tcW w:w="4640" w:type="dxa"/>
+          </w:tcPr>
+          <w:p>
+            <w:pPr>
+              <w:spacing w:line="240" w:lineRule="auto"/>
+              <w:contextualSpacing/>
+              <w:rPr>
+                <w:rFonts w:ascii="Times New Roman" w:hAnsi="Times New Roman" w:cs="Times New Roman"/>
+              </w:rPr>
+            </w:pPr>
+            <w:r>
+              <w:rPr>
+                <w:rFonts w:ascii="Times New Roman" w:hAnsi="Times New Roman" w:cs="Times New Roman"/>
+              </w:rPr>
+              <w:t>Фиксация подозреваемого и улик</w:t>
             </w:r>
           </w:p>
         </w:tc>
@@ -13483,7 +14225,6 @@
     <w:p>
       <w:pPr>
         <w:pStyle w:val="a9"/>
-        <w:jc w:val="left"/>
         <w:rPr>
           <w:lang w:eastAsia="ru-RU"/>
         </w:rPr>
@@ -13492,20 +14233,33 @@
     <w:p>
       <w:pPr>
         <w:pStyle w:val="a9"/>
-        <w:jc w:val="left"/>
-        <w:rPr>
-          <w:lang w:eastAsia="ru-RU"/>
-        </w:rPr>
-      </w:pPr>
+        <w:rPr>
+          <w:lang w:eastAsia="ru-RU"/>
+        </w:rPr>
+      </w:pPr>
+      <w:r>
+        <w:rPr>
+          <w:lang w:eastAsia="ru-RU"/>
+        </w:rPr>
+        <w:t>Так же были разработаны основные интерфейсы для системы.</w:t>
+      </w:r>
     </w:p>
     <w:p>
       <w:pPr>
         <w:pStyle w:val="a9"/>
-        <w:jc w:val="left"/>
-        <w:rPr>
-          <w:lang w:eastAsia="ru-RU"/>
-        </w:rPr>
-      </w:pPr>
+        <w:spacing w:before="120"/>
+        <w:ind w:firstLine="0"/>
+        <w:contextualSpacing w:val="0"/>
+        <w:rPr>
+          <w:lang w:eastAsia="ru-RU"/>
+        </w:rPr>
+      </w:pPr>
+      <w:r>
+        <w:rPr>
+          <w:lang w:eastAsia="ru-RU"/>
+        </w:rPr>
+        <w:t>Таблица 8 – Таблица интерфейсов проекта.</w:t>
+      </w:r>
     </w:p>
     <w:tbl>
       <w:tblPr>
@@ -13521,7 +14275,7 @@
       <w:tr>
         <w:tc>
           <w:tcPr>
-            <w:tcW w:w="3408" w:type="dxa"/>
+            <w:tcW w:w="3105" w:type="dxa"/>
           </w:tcPr>
           <w:p>
             <w:pPr>
@@ -13544,7 +14298,7 @@
         </w:tc>
         <w:tc>
           <w:tcPr>
-            <w:tcW w:w="3408" w:type="dxa"/>
+            <w:tcW w:w="3336" w:type="dxa"/>
           </w:tcPr>
           <w:p>
             <w:pPr>
@@ -13567,7 +14321,7 @@
         </w:tc>
         <w:tc>
           <w:tcPr>
-            <w:tcW w:w="3408" w:type="dxa"/>
+            <w:tcW w:w="2904" w:type="dxa"/>
           </w:tcPr>
           <w:p>
             <w:pPr>
@@ -13592,7 +14346,7 @@
       <w:tr>
         <w:tc>
           <w:tcPr>
-            <w:tcW w:w="3408" w:type="dxa"/>
+            <w:tcW w:w="3105" w:type="dxa"/>
           </w:tcPr>
           <w:p>
             <w:pPr>
@@ -13617,7 +14371,7 @@
         </w:tc>
         <w:tc>
           <w:tcPr>
-            <w:tcW w:w="3408" w:type="dxa"/>
+            <w:tcW w:w="3336" w:type="dxa"/>
           </w:tcPr>
           <w:p>
             <w:pPr>
@@ -13704,7 +14458,7 @@
         </w:tc>
         <w:tc>
           <w:tcPr>
-            <w:tcW w:w="3408" w:type="dxa"/>
+            <w:tcW w:w="2904" w:type="dxa"/>
           </w:tcPr>
           <w:p>
             <w:pPr>
@@ -13729,7 +14483,7 @@
       <w:tr>
         <w:tc>
           <w:tcPr>
-            <w:tcW w:w="3408" w:type="dxa"/>
+            <w:tcW w:w="3105" w:type="dxa"/>
           </w:tcPr>
           <w:p>
             <w:pPr>
@@ -13754,7 +14508,7 @@
         </w:tc>
         <w:tc>
           <w:tcPr>
-            <w:tcW w:w="3408" w:type="dxa"/>
+            <w:tcW w:w="3336" w:type="dxa"/>
           </w:tcPr>
           <w:p>
             <w:pPr>
@@ -13830,7 +14584,7 @@
         </w:tc>
         <w:tc>
           <w:tcPr>
-            <w:tcW w:w="3408" w:type="dxa"/>
+            <w:tcW w:w="2904" w:type="dxa"/>
           </w:tcPr>
           <w:p>
             <w:pPr>
@@ -13855,7 +14609,7 @@
       <w:tr>
         <w:tc>
           <w:tcPr>
-            <w:tcW w:w="3408" w:type="dxa"/>
+            <w:tcW w:w="3105" w:type="dxa"/>
           </w:tcPr>
           <w:p>
             <w:pPr>
@@ -13880,7 +14634,7 @@
         </w:tc>
         <w:tc>
           <w:tcPr>
-            <w:tcW w:w="3408" w:type="dxa"/>
+            <w:tcW w:w="3336" w:type="dxa"/>
           </w:tcPr>
           <w:p>
             <w:pPr>
@@ -13967,7 +14721,7 @@
         </w:tc>
         <w:tc>
           <w:tcPr>
-            <w:tcW w:w="3408" w:type="dxa"/>
+            <w:tcW w:w="2904" w:type="dxa"/>
           </w:tcPr>
           <w:p>
             <w:pPr>
@@ -13992,7 +14746,7 @@
       <w:tr>
         <w:tc>
           <w:tcPr>
-            <w:tcW w:w="3408" w:type="dxa"/>
+            <w:tcW w:w="3105" w:type="dxa"/>
           </w:tcPr>
           <w:p>
             <w:pPr>
@@ -14010,6 +14764,7 @@
                 <w:sz w:val="28"/>
                 <w:szCs w:val="28"/>
               </w:rPr>
+              <w:lastRenderedPageBreak/>
               <w:t>DialogueRepository</w:t>
             </w:r>
             <w:proofErr w:type="spellEnd"/>
@@ -14017,7 +14772,7 @@
         </w:tc>
         <w:tc>
           <w:tcPr>
-            <w:tcW w:w="3408" w:type="dxa"/>
+            <w:tcW w:w="3336" w:type="dxa"/>
           </w:tcPr>
           <w:p>
             <w:pPr>
@@ -14104,7 +14859,7 @@
         </w:tc>
         <w:tc>
           <w:tcPr>
-            <w:tcW w:w="3408" w:type="dxa"/>
+            <w:tcW w:w="2904" w:type="dxa"/>
           </w:tcPr>
           <w:p>
             <w:pPr>
@@ -14165,7 +14920,7 @@
       <w:tr>
         <w:tc>
           <w:tcPr>
-            <w:tcW w:w="3408" w:type="dxa"/>
+            <w:tcW w:w="3105" w:type="dxa"/>
           </w:tcPr>
           <w:p>
             <w:pPr>
@@ -14190,7 +14945,7 @@
         </w:tc>
         <w:tc>
           <w:tcPr>
-            <w:tcW w:w="3408" w:type="dxa"/>
+            <w:tcW w:w="3336" w:type="dxa"/>
           </w:tcPr>
           <w:p>
             <w:pPr>
@@ -14286,7 +15041,7 @@
         </w:tc>
         <w:tc>
           <w:tcPr>
-            <w:tcW w:w="3408" w:type="dxa"/>
+            <w:tcW w:w="2904" w:type="dxa"/>
           </w:tcPr>
           <w:p>
             <w:pPr>
@@ -14311,7 +15066,7 @@
       <w:tr>
         <w:tc>
           <w:tcPr>
-            <w:tcW w:w="3408" w:type="dxa"/>
+            <w:tcW w:w="3105" w:type="dxa"/>
           </w:tcPr>
           <w:p>
             <w:pPr>
@@ -14336,7 +15091,7 @@
         </w:tc>
         <w:tc>
           <w:tcPr>
-            <w:tcW w:w="3408" w:type="dxa"/>
+            <w:tcW w:w="3336" w:type="dxa"/>
           </w:tcPr>
           <w:p>
             <w:pPr>
@@ -14432,7 +15187,7 @@
         </w:tc>
         <w:tc>
           <w:tcPr>
-            <w:tcW w:w="3408" w:type="dxa"/>
+            <w:tcW w:w="2904" w:type="dxa"/>
           </w:tcPr>
           <w:p>
             <w:pPr>
@@ -14457,7 +15212,7 @@
       <w:tr>
         <w:tc>
           <w:tcPr>
-            <w:tcW w:w="3408" w:type="dxa"/>
+            <w:tcW w:w="3105" w:type="dxa"/>
           </w:tcPr>
           <w:p>
             <w:pPr>
@@ -14482,7 +15237,7 @@
         </w:tc>
         <w:tc>
           <w:tcPr>
-            <w:tcW w:w="3408" w:type="dxa"/>
+            <w:tcW w:w="3336" w:type="dxa"/>
           </w:tcPr>
           <w:p>
             <w:pPr>
@@ -14551,7 +15306,7 @@
         </w:tc>
         <w:tc>
           <w:tcPr>
-            <w:tcW w:w="3408" w:type="dxa"/>
+            <w:tcW w:w="2904" w:type="dxa"/>
           </w:tcPr>
           <w:p>
             <w:pPr>
@@ -14569,6 +15324,751 @@
                 <w:szCs w:val="28"/>
               </w:rPr>
               <w:t>Финальный выбор и результат.</w:t>
+            </w:r>
+          </w:p>
+        </w:tc>
+      </w:tr>
+      <w:tr>
+        <w:tc>
+          <w:tcPr>
+            <w:tcW w:w="3105" w:type="dxa"/>
+          </w:tcPr>
+          <w:p>
+            <w:pPr>
+              <w:spacing w:line="240" w:lineRule="auto"/>
+              <w:rPr>
+                <w:rFonts w:ascii="Times New Roman" w:hAnsi="Times New Roman" w:cs="Times New Roman"/>
+                <w:sz w:val="28"/>
+                <w:szCs w:val="28"/>
+              </w:rPr>
+            </w:pPr>
+            <w:proofErr w:type="spellStart"/>
+            <w:r>
+              <w:rPr>
+                <w:rFonts w:ascii="Times New Roman" w:hAnsi="Times New Roman" w:cs="Times New Roman"/>
+                <w:sz w:val="28"/>
+                <w:szCs w:val="28"/>
+              </w:rPr>
+              <w:t>InventoryRepository</w:t>
+            </w:r>
+            <w:proofErr w:type="spellEnd"/>
+          </w:p>
+        </w:tc>
+        <w:tc>
+          <w:tcPr>
+            <w:tcW w:w="3336" w:type="dxa"/>
+          </w:tcPr>
+          <w:p>
+            <w:pPr>
+              <w:spacing w:line="240" w:lineRule="auto"/>
+              <w:rPr>
+                <w:rFonts w:ascii="Times New Roman" w:hAnsi="Times New Roman" w:cs="Times New Roman"/>
+                <w:sz w:val="28"/>
+                <w:szCs w:val="28"/>
+                <w:lang w:val="en-US"/>
+              </w:rPr>
+            </w:pPr>
+            <w:proofErr w:type="spellStart"/>
+            <w:r>
+              <w:rPr>
+                <w:rFonts w:ascii="Times New Roman" w:hAnsi="Times New Roman" w:cs="Times New Roman"/>
+                <w:sz w:val="28"/>
+                <w:szCs w:val="28"/>
+                <w:lang w:val="en-US"/>
+              </w:rPr>
+              <w:t>getInventory</w:t>
+            </w:r>
+            <w:proofErr w:type="spellEnd"/>
+            <w:r>
+              <w:rPr>
+                <w:rFonts w:ascii="Times New Roman" w:hAnsi="Times New Roman" w:cs="Times New Roman"/>
+                <w:sz w:val="28"/>
+                <w:szCs w:val="28"/>
+                <w:lang w:val="en-US"/>
+              </w:rPr>
+              <w:t>(</w:t>
+            </w:r>
+            <w:proofErr w:type="spellStart"/>
+            <w:r>
+              <w:rPr>
+                <w:rFonts w:ascii="Times New Roman" w:hAnsi="Times New Roman" w:cs="Times New Roman"/>
+                <w:sz w:val="28"/>
+                <w:szCs w:val="28"/>
+                <w:lang w:val="en-US"/>
+              </w:rPr>
+              <w:t>caseId</w:t>
+            </w:r>
+            <w:proofErr w:type="spellEnd"/>
+            <w:r>
+              <w:rPr>
+                <w:rFonts w:ascii="Times New Roman" w:hAnsi="Times New Roman" w:cs="Times New Roman"/>
+                <w:sz w:val="28"/>
+                <w:szCs w:val="28"/>
+                <w:lang w:val="en-US"/>
+              </w:rPr>
+              <w:t xml:space="preserve">), </w:t>
+            </w:r>
+            <w:proofErr w:type="spellStart"/>
+            <w:r>
+              <w:rPr>
+                <w:rFonts w:ascii="Times New Roman" w:hAnsi="Times New Roman" w:cs="Times New Roman"/>
+                <w:sz w:val="28"/>
+                <w:szCs w:val="28"/>
+                <w:lang w:val="en-US"/>
+              </w:rPr>
+              <w:t>addItem</w:t>
+            </w:r>
+            <w:proofErr w:type="spellEnd"/>
+            <w:r>
+              <w:rPr>
+                <w:rFonts w:ascii="Times New Roman" w:hAnsi="Times New Roman" w:cs="Times New Roman"/>
+                <w:sz w:val="28"/>
+                <w:szCs w:val="28"/>
+                <w:lang w:val="en-US"/>
+              </w:rPr>
+              <w:t xml:space="preserve">(item), </w:t>
+            </w:r>
+            <w:proofErr w:type="spellStart"/>
+            <w:r>
+              <w:rPr>
+                <w:rFonts w:ascii="Times New Roman" w:hAnsi="Times New Roman" w:cs="Times New Roman"/>
+                <w:sz w:val="28"/>
+                <w:szCs w:val="28"/>
+                <w:lang w:val="en-US"/>
+              </w:rPr>
+              <w:t>markSeen</w:t>
+            </w:r>
+            <w:proofErr w:type="spellEnd"/>
+            <w:r>
+              <w:rPr>
+                <w:rFonts w:ascii="Times New Roman" w:hAnsi="Times New Roman" w:cs="Times New Roman"/>
+                <w:sz w:val="28"/>
+                <w:szCs w:val="28"/>
+                <w:lang w:val="en-US"/>
+              </w:rPr>
+              <w:t>(</w:t>
+            </w:r>
+            <w:proofErr w:type="spellStart"/>
+            <w:r>
+              <w:rPr>
+                <w:rFonts w:ascii="Times New Roman" w:hAnsi="Times New Roman" w:cs="Times New Roman"/>
+                <w:sz w:val="28"/>
+                <w:szCs w:val="28"/>
+                <w:lang w:val="en-US"/>
+              </w:rPr>
+              <w:t>itemId</w:t>
+            </w:r>
+            <w:proofErr w:type="spellEnd"/>
+            <w:r>
+              <w:rPr>
+                <w:rFonts w:ascii="Times New Roman" w:hAnsi="Times New Roman" w:cs="Times New Roman"/>
+                <w:sz w:val="28"/>
+                <w:szCs w:val="28"/>
+                <w:lang w:val="en-US"/>
+              </w:rPr>
+              <w:t>)</w:t>
+            </w:r>
+          </w:p>
+        </w:tc>
+        <w:tc>
+          <w:tcPr>
+            <w:tcW w:w="2904" w:type="dxa"/>
+          </w:tcPr>
+          <w:p>
+            <w:pPr>
+              <w:spacing w:line="240" w:lineRule="auto"/>
+              <w:rPr>
+                <w:rFonts w:ascii="Times New Roman" w:hAnsi="Times New Roman" w:cs="Times New Roman"/>
+                <w:sz w:val="28"/>
+                <w:szCs w:val="28"/>
+              </w:rPr>
+            </w:pPr>
+            <w:r>
+              <w:rPr>
+                <w:rFonts w:ascii="Times New Roman" w:hAnsi="Times New Roman" w:cs="Times New Roman"/>
+                <w:sz w:val="28"/>
+                <w:szCs w:val="28"/>
+              </w:rPr>
+              <w:t>Предметы и улики игрока</w:t>
+            </w:r>
+          </w:p>
+        </w:tc>
+      </w:tr>
+      <w:tr>
+        <w:tc>
+          <w:tcPr>
+            <w:tcW w:w="3105" w:type="dxa"/>
+          </w:tcPr>
+          <w:p>
+            <w:pPr>
+              <w:spacing w:line="240" w:lineRule="auto"/>
+              <w:rPr>
+                <w:rFonts w:ascii="Times New Roman" w:hAnsi="Times New Roman" w:cs="Times New Roman"/>
+                <w:sz w:val="28"/>
+                <w:szCs w:val="28"/>
+              </w:rPr>
+            </w:pPr>
+            <w:proofErr w:type="spellStart"/>
+            <w:r>
+              <w:rPr>
+                <w:rFonts w:ascii="Times New Roman" w:hAnsi="Times New Roman" w:cs="Times New Roman"/>
+                <w:sz w:val="28"/>
+                <w:szCs w:val="28"/>
+              </w:rPr>
+              <w:t>NotebookRepository</w:t>
+            </w:r>
+            <w:proofErr w:type="spellEnd"/>
+          </w:p>
+        </w:tc>
+        <w:tc>
+          <w:tcPr>
+            <w:tcW w:w="3336" w:type="dxa"/>
+          </w:tcPr>
+          <w:p>
+            <w:pPr>
+              <w:spacing w:line="240" w:lineRule="auto"/>
+              <w:rPr>
+                <w:rFonts w:ascii="Times New Roman" w:hAnsi="Times New Roman" w:cs="Times New Roman"/>
+                <w:sz w:val="28"/>
+                <w:szCs w:val="28"/>
+                <w:lang w:val="en-US"/>
+              </w:rPr>
+            </w:pPr>
+            <w:proofErr w:type="spellStart"/>
+            <w:r>
+              <w:rPr>
+                <w:rFonts w:ascii="Times New Roman" w:hAnsi="Times New Roman" w:cs="Times New Roman"/>
+                <w:sz w:val="28"/>
+                <w:szCs w:val="28"/>
+                <w:lang w:val="en-US"/>
+              </w:rPr>
+              <w:t>getStatements</w:t>
+            </w:r>
+            <w:proofErr w:type="spellEnd"/>
+            <w:r>
+              <w:rPr>
+                <w:rFonts w:ascii="Times New Roman" w:hAnsi="Times New Roman" w:cs="Times New Roman"/>
+                <w:sz w:val="28"/>
+                <w:szCs w:val="28"/>
+                <w:lang w:val="en-US"/>
+              </w:rPr>
+              <w:t>(</w:t>
+            </w:r>
+            <w:proofErr w:type="spellStart"/>
+            <w:r>
+              <w:rPr>
+                <w:rFonts w:ascii="Times New Roman" w:hAnsi="Times New Roman" w:cs="Times New Roman"/>
+                <w:sz w:val="28"/>
+                <w:szCs w:val="28"/>
+                <w:lang w:val="en-US"/>
+              </w:rPr>
+              <w:t>caseId</w:t>
+            </w:r>
+            <w:proofErr w:type="spellEnd"/>
+            <w:r>
+              <w:rPr>
+                <w:rFonts w:ascii="Times New Roman" w:hAnsi="Times New Roman" w:cs="Times New Roman"/>
+                <w:sz w:val="28"/>
+                <w:szCs w:val="28"/>
+                <w:lang w:val="en-US"/>
+              </w:rPr>
+              <w:t xml:space="preserve">), </w:t>
+            </w:r>
+            <w:proofErr w:type="spellStart"/>
+            <w:r>
+              <w:rPr>
+                <w:rFonts w:ascii="Times New Roman" w:hAnsi="Times New Roman" w:cs="Times New Roman"/>
+                <w:sz w:val="28"/>
+                <w:szCs w:val="28"/>
+                <w:lang w:val="en-US"/>
+              </w:rPr>
+              <w:t>getNotes</w:t>
+            </w:r>
+            <w:proofErr w:type="spellEnd"/>
+            <w:r>
+              <w:rPr>
+                <w:rFonts w:ascii="Times New Roman" w:hAnsi="Times New Roman" w:cs="Times New Roman"/>
+                <w:sz w:val="28"/>
+                <w:szCs w:val="28"/>
+                <w:lang w:val="en-US"/>
+              </w:rPr>
+              <w:t>(</w:t>
+            </w:r>
+            <w:proofErr w:type="spellStart"/>
+            <w:r>
+              <w:rPr>
+                <w:rFonts w:ascii="Times New Roman" w:hAnsi="Times New Roman" w:cs="Times New Roman"/>
+                <w:sz w:val="28"/>
+                <w:szCs w:val="28"/>
+                <w:lang w:val="en-US"/>
+              </w:rPr>
+              <w:t>caseId</w:t>
+            </w:r>
+            <w:proofErr w:type="spellEnd"/>
+            <w:r>
+              <w:rPr>
+                <w:rFonts w:ascii="Times New Roman" w:hAnsi="Times New Roman" w:cs="Times New Roman"/>
+                <w:sz w:val="28"/>
+                <w:szCs w:val="28"/>
+                <w:lang w:val="en-US"/>
+              </w:rPr>
+              <w:t xml:space="preserve">), </w:t>
+            </w:r>
+            <w:proofErr w:type="spellStart"/>
+            <w:r>
+              <w:rPr>
+                <w:rFonts w:ascii="Times New Roman" w:hAnsi="Times New Roman" w:cs="Times New Roman"/>
+                <w:sz w:val="28"/>
+                <w:szCs w:val="28"/>
+                <w:lang w:val="en-US"/>
+              </w:rPr>
+              <w:t>saveNote</w:t>
+            </w:r>
+            <w:proofErr w:type="spellEnd"/>
+            <w:r>
+              <w:rPr>
+                <w:rFonts w:ascii="Times New Roman" w:hAnsi="Times New Roman" w:cs="Times New Roman"/>
+                <w:sz w:val="28"/>
+                <w:szCs w:val="28"/>
+                <w:lang w:val="en-US"/>
+              </w:rPr>
+              <w:t>(</w:t>
+            </w:r>
+            <w:proofErr w:type="spellStart"/>
+            <w:r>
+              <w:rPr>
+                <w:rFonts w:ascii="Times New Roman" w:hAnsi="Times New Roman" w:cs="Times New Roman"/>
+                <w:sz w:val="28"/>
+                <w:szCs w:val="28"/>
+                <w:lang w:val="en-US"/>
+              </w:rPr>
+              <w:t>caseId</w:t>
+            </w:r>
+            <w:proofErr w:type="spellEnd"/>
+            <w:r>
+              <w:rPr>
+                <w:rFonts w:ascii="Times New Roman" w:hAnsi="Times New Roman" w:cs="Times New Roman"/>
+                <w:sz w:val="28"/>
+                <w:szCs w:val="28"/>
+                <w:lang w:val="en-US"/>
+              </w:rPr>
+              <w:t>, text)</w:t>
+            </w:r>
+          </w:p>
+        </w:tc>
+        <w:tc>
+          <w:tcPr>
+            <w:tcW w:w="2904" w:type="dxa"/>
+          </w:tcPr>
+          <w:p>
+            <w:pPr>
+              <w:spacing w:line="240" w:lineRule="auto"/>
+              <w:rPr>
+                <w:rFonts w:ascii="Times New Roman" w:hAnsi="Times New Roman" w:cs="Times New Roman"/>
+                <w:sz w:val="28"/>
+                <w:szCs w:val="28"/>
+              </w:rPr>
+            </w:pPr>
+            <w:r>
+              <w:rPr>
+                <w:rFonts w:ascii="Times New Roman" w:hAnsi="Times New Roman" w:cs="Times New Roman"/>
+                <w:sz w:val="28"/>
+                <w:szCs w:val="28"/>
+              </w:rPr>
+              <w:t>Показания и заметки</w:t>
+            </w:r>
+          </w:p>
+        </w:tc>
+      </w:tr>
+      <w:tr>
+        <w:tc>
+          <w:tcPr>
+            <w:tcW w:w="3105" w:type="dxa"/>
+          </w:tcPr>
+          <w:p>
+            <w:pPr>
+              <w:spacing w:line="240" w:lineRule="auto"/>
+              <w:rPr>
+                <w:rFonts w:ascii="Times New Roman" w:hAnsi="Times New Roman" w:cs="Times New Roman"/>
+                <w:sz w:val="28"/>
+                <w:szCs w:val="28"/>
+              </w:rPr>
+            </w:pPr>
+            <w:proofErr w:type="spellStart"/>
+            <w:r>
+              <w:rPr>
+                <w:rFonts w:ascii="Times New Roman" w:hAnsi="Times New Roman" w:cs="Times New Roman"/>
+                <w:sz w:val="28"/>
+                <w:szCs w:val="28"/>
+              </w:rPr>
+              <w:t>SceneRepository</w:t>
+            </w:r>
+            <w:proofErr w:type="spellEnd"/>
+          </w:p>
+        </w:tc>
+        <w:tc>
+          <w:tcPr>
+            <w:tcW w:w="3336" w:type="dxa"/>
+          </w:tcPr>
+          <w:p>
+            <w:pPr>
+              <w:spacing w:line="240" w:lineRule="auto"/>
+              <w:rPr>
+                <w:rFonts w:ascii="Times New Roman" w:hAnsi="Times New Roman" w:cs="Times New Roman"/>
+                <w:sz w:val="28"/>
+                <w:szCs w:val="28"/>
+              </w:rPr>
+            </w:pPr>
+            <w:proofErr w:type="spellStart"/>
+            <w:r>
+              <w:rPr>
+                <w:rFonts w:ascii="Times New Roman" w:hAnsi="Times New Roman" w:cs="Times New Roman"/>
+                <w:sz w:val="28"/>
+                <w:szCs w:val="28"/>
+              </w:rPr>
+              <w:t>getScene</w:t>
+            </w:r>
+            <w:proofErr w:type="spellEnd"/>
+            <w:r>
+              <w:rPr>
+                <w:rFonts w:ascii="Times New Roman" w:hAnsi="Times New Roman" w:cs="Times New Roman"/>
+                <w:sz w:val="28"/>
+                <w:szCs w:val="28"/>
+              </w:rPr>
+              <w:t>(</w:t>
+            </w:r>
+            <w:proofErr w:type="spellStart"/>
+            <w:r>
+              <w:rPr>
+                <w:rFonts w:ascii="Times New Roman" w:hAnsi="Times New Roman" w:cs="Times New Roman"/>
+                <w:sz w:val="28"/>
+                <w:szCs w:val="28"/>
+              </w:rPr>
+              <w:t>caseId</w:t>
+            </w:r>
+            <w:proofErr w:type="spellEnd"/>
+            <w:r>
+              <w:rPr>
+                <w:rFonts w:ascii="Times New Roman" w:hAnsi="Times New Roman" w:cs="Times New Roman"/>
+                <w:sz w:val="28"/>
+                <w:szCs w:val="28"/>
+              </w:rPr>
+              <w:t xml:space="preserve">, </w:t>
+            </w:r>
+            <w:proofErr w:type="spellStart"/>
+            <w:r>
+              <w:rPr>
+                <w:rFonts w:ascii="Times New Roman" w:hAnsi="Times New Roman" w:cs="Times New Roman"/>
+                <w:sz w:val="28"/>
+                <w:szCs w:val="28"/>
+              </w:rPr>
+              <w:t>sceneId</w:t>
+            </w:r>
+            <w:proofErr w:type="spellEnd"/>
+            <w:r>
+              <w:rPr>
+                <w:rFonts w:ascii="Times New Roman" w:hAnsi="Times New Roman" w:cs="Times New Roman"/>
+                <w:sz w:val="28"/>
+                <w:szCs w:val="28"/>
+              </w:rPr>
+              <w:t>)</w:t>
+            </w:r>
+          </w:p>
+        </w:tc>
+        <w:tc>
+          <w:tcPr>
+            <w:tcW w:w="2904" w:type="dxa"/>
+          </w:tcPr>
+          <w:p>
+            <w:pPr>
+              <w:spacing w:line="240" w:lineRule="auto"/>
+              <w:rPr>
+                <w:rFonts w:ascii="Times New Roman" w:hAnsi="Times New Roman" w:cs="Times New Roman"/>
+                <w:sz w:val="28"/>
+                <w:szCs w:val="28"/>
+              </w:rPr>
+            </w:pPr>
+            <w:r>
+              <w:rPr>
+                <w:rFonts w:ascii="Times New Roman" w:hAnsi="Times New Roman" w:cs="Times New Roman"/>
+                <w:sz w:val="28"/>
+                <w:szCs w:val="28"/>
+              </w:rPr>
+              <w:t>Сцены для осмотра места происшествия</w:t>
+            </w:r>
+          </w:p>
+        </w:tc>
+      </w:tr>
+      <w:tr>
+        <w:tc>
+          <w:tcPr>
+            <w:tcW w:w="3105" w:type="dxa"/>
+          </w:tcPr>
+          <w:p>
+            <w:pPr>
+              <w:spacing w:line="240" w:lineRule="auto"/>
+              <w:rPr>
+                <w:rFonts w:ascii="Times New Roman" w:hAnsi="Times New Roman" w:cs="Times New Roman"/>
+                <w:sz w:val="28"/>
+                <w:szCs w:val="28"/>
+              </w:rPr>
+            </w:pPr>
+            <w:proofErr w:type="spellStart"/>
+            <w:r>
+              <w:rPr>
+                <w:rFonts w:ascii="Times New Roman" w:hAnsi="Times New Roman" w:cs="Times New Roman"/>
+                <w:sz w:val="28"/>
+                <w:szCs w:val="28"/>
+              </w:rPr>
+              <w:t>PuzzleRepository</w:t>
+            </w:r>
+            <w:proofErr w:type="spellEnd"/>
+          </w:p>
+        </w:tc>
+        <w:tc>
+          <w:tcPr>
+            <w:tcW w:w="3336" w:type="dxa"/>
+          </w:tcPr>
+          <w:p>
+            <w:pPr>
+              <w:spacing w:line="240" w:lineRule="auto"/>
+              <w:rPr>
+                <w:rFonts w:ascii="Times New Roman" w:hAnsi="Times New Roman" w:cs="Times New Roman"/>
+                <w:sz w:val="28"/>
+                <w:szCs w:val="28"/>
+              </w:rPr>
+            </w:pPr>
+            <w:proofErr w:type="spellStart"/>
+            <w:r>
+              <w:rPr>
+                <w:rFonts w:ascii="Times New Roman" w:hAnsi="Times New Roman" w:cs="Times New Roman"/>
+                <w:sz w:val="28"/>
+                <w:szCs w:val="28"/>
+              </w:rPr>
+              <w:t>getPuzzle</w:t>
+            </w:r>
+            <w:proofErr w:type="spellEnd"/>
+            <w:r>
+              <w:rPr>
+                <w:rFonts w:ascii="Times New Roman" w:hAnsi="Times New Roman" w:cs="Times New Roman"/>
+                <w:sz w:val="28"/>
+                <w:szCs w:val="28"/>
+              </w:rPr>
+              <w:t>(</w:t>
+            </w:r>
+            <w:proofErr w:type="spellStart"/>
+            <w:r>
+              <w:rPr>
+                <w:rFonts w:ascii="Times New Roman" w:hAnsi="Times New Roman" w:cs="Times New Roman"/>
+                <w:sz w:val="28"/>
+                <w:szCs w:val="28"/>
+              </w:rPr>
+              <w:t>id</w:t>
+            </w:r>
+            <w:proofErr w:type="spellEnd"/>
+            <w:r>
+              <w:rPr>
+                <w:rFonts w:ascii="Times New Roman" w:hAnsi="Times New Roman" w:cs="Times New Roman"/>
+                <w:sz w:val="28"/>
+                <w:szCs w:val="28"/>
+              </w:rPr>
+              <w:t xml:space="preserve">), </w:t>
+            </w:r>
+            <w:proofErr w:type="spellStart"/>
+            <w:r>
+              <w:rPr>
+                <w:rFonts w:ascii="Times New Roman" w:hAnsi="Times New Roman" w:cs="Times New Roman"/>
+                <w:sz w:val="28"/>
+                <w:szCs w:val="28"/>
+              </w:rPr>
+              <w:t>markSolved</w:t>
+            </w:r>
+            <w:proofErr w:type="spellEnd"/>
+            <w:r>
+              <w:rPr>
+                <w:rFonts w:ascii="Times New Roman" w:hAnsi="Times New Roman" w:cs="Times New Roman"/>
+                <w:sz w:val="28"/>
+                <w:szCs w:val="28"/>
+              </w:rPr>
+              <w:t>(</w:t>
+            </w:r>
+            <w:proofErr w:type="spellStart"/>
+            <w:r>
+              <w:rPr>
+                <w:rFonts w:ascii="Times New Roman" w:hAnsi="Times New Roman" w:cs="Times New Roman"/>
+                <w:sz w:val="28"/>
+                <w:szCs w:val="28"/>
+              </w:rPr>
+              <w:t>id</w:t>
+            </w:r>
+            <w:proofErr w:type="spellEnd"/>
+            <w:r>
+              <w:rPr>
+                <w:rFonts w:ascii="Times New Roman" w:hAnsi="Times New Roman" w:cs="Times New Roman"/>
+                <w:sz w:val="28"/>
+                <w:szCs w:val="28"/>
+              </w:rPr>
+              <w:t>)</w:t>
+            </w:r>
+          </w:p>
+        </w:tc>
+        <w:tc>
+          <w:tcPr>
+            <w:tcW w:w="2904" w:type="dxa"/>
+          </w:tcPr>
+          <w:p>
+            <w:pPr>
+              <w:spacing w:line="240" w:lineRule="auto"/>
+              <w:rPr>
+                <w:rFonts w:ascii="Times New Roman" w:hAnsi="Times New Roman" w:cs="Times New Roman"/>
+                <w:sz w:val="28"/>
+                <w:szCs w:val="28"/>
+              </w:rPr>
+            </w:pPr>
+            <w:r>
+              <w:rPr>
+                <w:rFonts w:ascii="Times New Roman" w:hAnsi="Times New Roman" w:cs="Times New Roman"/>
+                <w:sz w:val="28"/>
+                <w:szCs w:val="28"/>
+              </w:rPr>
+              <w:t>Головоломки, Морзе и отпечатки</w:t>
+            </w:r>
+          </w:p>
+        </w:tc>
+      </w:tr>
+      <w:tr>
+        <w:tc>
+          <w:tcPr>
+            <w:tcW w:w="3105" w:type="dxa"/>
+          </w:tcPr>
+          <w:p>
+            <w:pPr>
+              <w:spacing w:line="240" w:lineRule="auto"/>
+              <w:rPr>
+                <w:rFonts w:ascii="Times New Roman" w:hAnsi="Times New Roman" w:cs="Times New Roman"/>
+                <w:sz w:val="28"/>
+                <w:szCs w:val="28"/>
+              </w:rPr>
+            </w:pPr>
+            <w:proofErr w:type="spellStart"/>
+            <w:r>
+              <w:rPr>
+                <w:rFonts w:ascii="Times New Roman" w:hAnsi="Times New Roman" w:cs="Times New Roman"/>
+                <w:sz w:val="28"/>
+                <w:szCs w:val="28"/>
+              </w:rPr>
+              <w:t>PhotoRepository</w:t>
+            </w:r>
+            <w:proofErr w:type="spellEnd"/>
+          </w:p>
+        </w:tc>
+        <w:tc>
+          <w:tcPr>
+            <w:tcW w:w="3336" w:type="dxa"/>
+          </w:tcPr>
+          <w:p>
+            <w:pPr>
+              <w:spacing w:line="240" w:lineRule="auto"/>
+              <w:rPr>
+                <w:rFonts w:ascii="Times New Roman" w:hAnsi="Times New Roman" w:cs="Times New Roman"/>
+                <w:sz w:val="28"/>
+                <w:szCs w:val="28"/>
+              </w:rPr>
+            </w:pPr>
+            <w:proofErr w:type="spellStart"/>
+            <w:r>
+              <w:rPr>
+                <w:rFonts w:ascii="Times New Roman" w:hAnsi="Times New Roman" w:cs="Times New Roman"/>
+                <w:sz w:val="28"/>
+                <w:szCs w:val="28"/>
+              </w:rPr>
+              <w:t>savePhoto</w:t>
+            </w:r>
+            <w:proofErr w:type="spellEnd"/>
+            <w:r>
+              <w:rPr>
+                <w:rFonts w:ascii="Times New Roman" w:hAnsi="Times New Roman" w:cs="Times New Roman"/>
+                <w:sz w:val="28"/>
+                <w:szCs w:val="28"/>
+              </w:rPr>
+              <w:t>(</w:t>
+            </w:r>
+            <w:proofErr w:type="spellStart"/>
+            <w:r>
+              <w:rPr>
+                <w:rFonts w:ascii="Times New Roman" w:hAnsi="Times New Roman" w:cs="Times New Roman"/>
+                <w:sz w:val="28"/>
+                <w:szCs w:val="28"/>
+              </w:rPr>
+              <w:t>clueId</w:t>
+            </w:r>
+            <w:proofErr w:type="spellEnd"/>
+            <w:r>
+              <w:rPr>
+                <w:rFonts w:ascii="Times New Roman" w:hAnsi="Times New Roman" w:cs="Times New Roman"/>
+                <w:sz w:val="28"/>
+                <w:szCs w:val="28"/>
+              </w:rPr>
+              <w:t xml:space="preserve">, </w:t>
+            </w:r>
+            <w:proofErr w:type="spellStart"/>
+            <w:r>
+              <w:rPr>
+                <w:rFonts w:ascii="Times New Roman" w:hAnsi="Times New Roman" w:cs="Times New Roman"/>
+                <w:sz w:val="28"/>
+                <w:szCs w:val="28"/>
+              </w:rPr>
+              <w:t>file</w:t>
+            </w:r>
+            <w:proofErr w:type="spellEnd"/>
+            <w:r>
+              <w:rPr>
+                <w:rFonts w:ascii="Times New Roman" w:hAnsi="Times New Roman" w:cs="Times New Roman"/>
+                <w:sz w:val="28"/>
+                <w:szCs w:val="28"/>
+              </w:rPr>
+              <w:t xml:space="preserve">), </w:t>
+            </w:r>
+            <w:proofErr w:type="spellStart"/>
+            <w:r>
+              <w:rPr>
+                <w:rFonts w:ascii="Times New Roman" w:hAnsi="Times New Roman" w:cs="Times New Roman"/>
+                <w:sz w:val="28"/>
+                <w:szCs w:val="28"/>
+              </w:rPr>
+              <w:t>uploadPending</w:t>
+            </w:r>
+            <w:proofErr w:type="spellEnd"/>
+            <w:r>
+              <w:rPr>
+                <w:rFonts w:ascii="Times New Roman" w:hAnsi="Times New Roman" w:cs="Times New Roman"/>
+                <w:sz w:val="28"/>
+                <w:szCs w:val="28"/>
+              </w:rPr>
+              <w:t>()</w:t>
+            </w:r>
+          </w:p>
+        </w:tc>
+        <w:tc>
+          <w:tcPr>
+            <w:tcW w:w="2904" w:type="dxa"/>
+          </w:tcPr>
+          <w:p>
+            <w:pPr>
+              <w:spacing w:line="240" w:lineRule="auto"/>
+              <w:rPr>
+                <w:rFonts w:ascii="Times New Roman" w:hAnsi="Times New Roman" w:cs="Times New Roman"/>
+                <w:sz w:val="28"/>
+                <w:szCs w:val="28"/>
+              </w:rPr>
+            </w:pPr>
+            <w:r>
+              <w:rPr>
+                <w:rFonts w:ascii="Times New Roman" w:hAnsi="Times New Roman" w:cs="Times New Roman"/>
+                <w:sz w:val="28"/>
+                <w:szCs w:val="28"/>
+              </w:rPr>
+              <w:t>Фото улик и отложенная отправка</w:t>
             </w:r>
           </w:p>
         </w:tc>
@@ -14577,20 +16077,14 @@
     <w:p>
       <w:pPr>
         <w:pStyle w:val="a9"/>
+        <w:ind w:firstLine="0"/>
         <w:jc w:val="left"/>
         <w:rPr>
           <w:lang w:eastAsia="ru-RU"/>
         </w:rPr>
       </w:pPr>
-    </w:p>
-    <w:p>
-      <w:pPr>
-        <w:pStyle w:val="a9"/>
-        <w:jc w:val="left"/>
-        <w:rPr>
-          <w:lang w:eastAsia="ru-RU"/>
-        </w:rPr>
-      </w:pPr>
+      <w:bookmarkStart w:id="23" w:name="_GoBack"/>
+      <w:bookmarkEnd w:id="23"/>
     </w:p>
     <w:p>
       <w:pPr>
@@ -14821,96 +16315,104 @@
                 <w:sz w:val="28"/>
                 <w:szCs w:val="28"/>
               </w:rPr>
+              <w:t>Open</w:t>
+            </w:r>
+            <w:proofErr w:type="spellEnd"/>
+            <w:r>
+              <w:rPr>
+                <w:rFonts w:ascii="Times New Roman" w:hAnsi="Times New Roman" w:cs="Times New Roman"/>
+                <w:sz w:val="28"/>
+                <w:szCs w:val="28"/>
+              </w:rPr>
+              <w:t>/</w:t>
+            </w:r>
+            <w:proofErr w:type="spellStart"/>
+            <w:r>
+              <w:rPr>
+                <w:rFonts w:ascii="Times New Roman" w:hAnsi="Times New Roman" w:cs="Times New Roman"/>
+                <w:sz w:val="28"/>
+                <w:szCs w:val="28"/>
+              </w:rPr>
+              <w:t>Closed</w:t>
+            </w:r>
+            <w:proofErr w:type="spellEnd"/>
+          </w:p>
+        </w:tc>
+        <w:tc>
+          <w:tcPr>
+            <w:tcW w:w="5112" w:type="dxa"/>
+          </w:tcPr>
+          <w:p>
+            <w:pPr>
+              <w:spacing w:line="240" w:lineRule="auto"/>
+              <w:rPr>
+                <w:rFonts w:ascii="Times New Roman" w:hAnsi="Times New Roman" w:cs="Times New Roman"/>
+                <w:sz w:val="28"/>
+                <w:szCs w:val="28"/>
+              </w:rPr>
+            </w:pPr>
+            <w:proofErr w:type="spellStart"/>
+            <w:r>
+              <w:rPr>
+                <w:rFonts w:ascii="Times New Roman" w:hAnsi="Times New Roman" w:cs="Times New Roman"/>
+                <w:sz w:val="28"/>
+                <w:szCs w:val="28"/>
+              </w:rPr>
+              <w:t>PuzzleGameUseCase</w:t>
+            </w:r>
+            <w:proofErr w:type="spellEnd"/>
+            <w:r>
+              <w:rPr>
+                <w:rFonts w:ascii="Times New Roman" w:hAnsi="Times New Roman" w:cs="Times New Roman"/>
+                <w:sz w:val="28"/>
+                <w:szCs w:val="28"/>
+              </w:rPr>
+              <w:t xml:space="preserve"> работает с абстракцией </w:t>
+            </w:r>
+            <w:proofErr w:type="spellStart"/>
+            <w:r>
+              <w:rPr>
+                <w:rFonts w:ascii="Times New Roman" w:hAnsi="Times New Roman" w:cs="Times New Roman"/>
+                <w:sz w:val="28"/>
+                <w:szCs w:val="28"/>
+              </w:rPr>
+              <w:t>Puzzle</w:t>
+            </w:r>
+            <w:proofErr w:type="spellEnd"/>
+            <w:r>
+              <w:rPr>
+                <w:rFonts w:ascii="Times New Roman" w:hAnsi="Times New Roman" w:cs="Times New Roman"/>
+                <w:sz w:val="28"/>
+                <w:szCs w:val="28"/>
+              </w:rPr>
+              <w:t xml:space="preserve">; </w:t>
+            </w:r>
+            <w:proofErr w:type="spellStart"/>
+            <w:r>
+              <w:rPr>
+                <w:rFonts w:ascii="Times New Roman" w:hAnsi="Times New Roman" w:cs="Times New Roman"/>
+                <w:sz w:val="28"/>
+                <w:szCs w:val="28"/>
+              </w:rPr>
+              <w:t>MorsePuzzle</w:t>
+            </w:r>
+            <w:proofErr w:type="spellEnd"/>
+            <w:r>
+              <w:rPr>
+                <w:rFonts w:ascii="Times New Roman" w:hAnsi="Times New Roman" w:cs="Times New Roman"/>
+                <w:sz w:val="28"/>
+                <w:szCs w:val="28"/>
+              </w:rPr>
+              <w:t xml:space="preserve"> — одна реализация, новые типы </w:t>
+            </w:r>
+            <w:r>
+              <w:rPr>
+                <w:rFonts w:ascii="Times New Roman" w:hAnsi="Times New Roman" w:cs="Times New Roman"/>
+                <w:sz w:val="28"/>
+                <w:szCs w:val="28"/>
+              </w:rPr>
               <w:lastRenderedPageBreak/>
-              <w:t>Open</w:t>
-            </w:r>
-            <w:proofErr w:type="spellEnd"/>
-            <w:r>
-              <w:rPr>
-                <w:rFonts w:ascii="Times New Roman" w:hAnsi="Times New Roman" w:cs="Times New Roman"/>
-                <w:sz w:val="28"/>
-                <w:szCs w:val="28"/>
-              </w:rPr>
-              <w:t>/</w:t>
-            </w:r>
-            <w:proofErr w:type="spellStart"/>
-            <w:r>
-              <w:rPr>
-                <w:rFonts w:ascii="Times New Roman" w:hAnsi="Times New Roman" w:cs="Times New Roman"/>
-                <w:sz w:val="28"/>
-                <w:szCs w:val="28"/>
-              </w:rPr>
-              <w:t>Closed</w:t>
-            </w:r>
-            <w:proofErr w:type="spellEnd"/>
-          </w:p>
-        </w:tc>
-        <w:tc>
-          <w:tcPr>
-            <w:tcW w:w="5112" w:type="dxa"/>
-          </w:tcPr>
-          <w:p>
-            <w:pPr>
-              <w:spacing w:line="240" w:lineRule="auto"/>
-              <w:rPr>
-                <w:rFonts w:ascii="Times New Roman" w:hAnsi="Times New Roman" w:cs="Times New Roman"/>
-                <w:sz w:val="28"/>
-                <w:szCs w:val="28"/>
-              </w:rPr>
-            </w:pPr>
-            <w:proofErr w:type="spellStart"/>
-            <w:r>
-              <w:rPr>
-                <w:rFonts w:ascii="Times New Roman" w:hAnsi="Times New Roman" w:cs="Times New Roman"/>
-                <w:sz w:val="28"/>
-                <w:szCs w:val="28"/>
-              </w:rPr>
-              <w:t>PuzzleGameUseCase</w:t>
-            </w:r>
-            <w:proofErr w:type="spellEnd"/>
-            <w:r>
-              <w:rPr>
-                <w:rFonts w:ascii="Times New Roman" w:hAnsi="Times New Roman" w:cs="Times New Roman"/>
-                <w:sz w:val="28"/>
-                <w:szCs w:val="28"/>
-              </w:rPr>
-              <w:t xml:space="preserve"> работает с абстракцией </w:t>
-            </w:r>
-            <w:proofErr w:type="spellStart"/>
-            <w:r>
-              <w:rPr>
-                <w:rFonts w:ascii="Times New Roman" w:hAnsi="Times New Roman" w:cs="Times New Roman"/>
-                <w:sz w:val="28"/>
-                <w:szCs w:val="28"/>
-              </w:rPr>
-              <w:t>Puzzle</w:t>
-            </w:r>
-            <w:proofErr w:type="spellEnd"/>
-            <w:r>
-              <w:rPr>
-                <w:rFonts w:ascii="Times New Roman" w:hAnsi="Times New Roman" w:cs="Times New Roman"/>
-                <w:sz w:val="28"/>
-                <w:szCs w:val="28"/>
-              </w:rPr>
-              <w:t xml:space="preserve">; </w:t>
-            </w:r>
-            <w:proofErr w:type="spellStart"/>
-            <w:r>
-              <w:rPr>
-                <w:rFonts w:ascii="Times New Roman" w:hAnsi="Times New Roman" w:cs="Times New Roman"/>
-                <w:sz w:val="28"/>
-                <w:szCs w:val="28"/>
-              </w:rPr>
-              <w:t>MorsePuzzle</w:t>
-            </w:r>
-            <w:proofErr w:type="spellEnd"/>
-            <w:r>
-              <w:rPr>
-                <w:rFonts w:ascii="Times New Roman" w:hAnsi="Times New Roman" w:cs="Times New Roman"/>
-                <w:sz w:val="28"/>
-                <w:szCs w:val="28"/>
-              </w:rPr>
-              <w:t xml:space="preserve"> — одна реализация, новые типы головоломок добавляются отдельными классами.</w:t>
+              <w:t>головоломок добавляются отдельными классами.</w:t>
             </w:r>
           </w:p>
         </w:tc>
@@ -14936,6 +16438,7 @@
                 <w:sz w:val="28"/>
                 <w:szCs w:val="28"/>
               </w:rPr>
+              <w:lastRenderedPageBreak/>
               <w:t>Liskov</w:t>
             </w:r>
             <w:proofErr w:type="spellEnd"/>
@@ -18677,7 +20180,7 @@
     <w:name w:val="No Spacing"/>
     <w:uiPriority w:val="1"/>
     <w:qFormat/>
-    <w:rsid w:val="009402DC"/>
+    <w:rsid w:val="00BA2AD6"/>
     <w:pPr>
       <w:spacing w:after="0" w:line="360" w:lineRule="auto"/>
       <w:ind w:firstLine="709"/>
@@ -19055,7 +20558,7 @@
 </file>
 
 <file path=customXml/itemProps1.xml><?xml version="1.0" encoding="utf-8"?>
-<ds:datastoreItem xmlns:ds="http://schemas.openxmlformats.org/officeDocument/2006/customXml" ds:itemID="{C9C3A023-B013-4C78-94E7-ACD690FAB411}">
+<ds:datastoreItem xmlns:ds="http://schemas.openxmlformats.org/officeDocument/2006/customXml" ds:itemID="{7E2856DF-D13D-4CE3-A44F-67C8B0B91462}">
   <ds:schemaRefs>
     <ds:schemaRef ds:uri="http://schemas.openxmlformats.org/officeDocument/2006/bibliography"/>
   </ds:schemaRefs>

</xml_diff>

<commit_message>
Add: add section 1.4.4, but in 1.4.2.  not add diagramm, because it's don't complete. That all in main document
</commit_message>
<xml_diff>
--- a/Documentation/Основной документ.docx
+++ b/Documentation/Основной документ.docx
@@ -11863,6 +11863,7 @@
           <w:p>
             <w:pPr>
               <w:spacing w:line="240" w:lineRule="auto"/>
+              <w:jc w:val="both"/>
               <w:rPr>
                 <w:rFonts w:ascii="Times New Roman" w:hAnsi="Times New Roman" w:cs="Times New Roman"/>
                 <w:sz w:val="24"/>
@@ -11888,6 +11889,7 @@
           <w:p>
             <w:pPr>
               <w:spacing w:line="240" w:lineRule="auto"/>
+              <w:jc w:val="both"/>
               <w:rPr>
                 <w:rFonts w:ascii="Times New Roman" w:hAnsi="Times New Roman" w:cs="Times New Roman"/>
                 <w:sz w:val="24"/>
@@ -11998,6 +12000,7 @@
           <w:p>
             <w:pPr>
               <w:spacing w:line="240" w:lineRule="auto"/>
+              <w:jc w:val="both"/>
               <w:rPr>
                 <w:rFonts w:ascii="Times New Roman" w:hAnsi="Times New Roman" w:cs="Times New Roman"/>
                 <w:sz w:val="24"/>
@@ -12023,6 +12026,7 @@
           <w:p>
             <w:pPr>
               <w:spacing w:line="240" w:lineRule="auto"/>
+              <w:jc w:val="both"/>
               <w:rPr>
                 <w:rFonts w:ascii="Times New Roman" w:hAnsi="Times New Roman" w:cs="Times New Roman"/>
                 <w:sz w:val="24"/>
@@ -12048,6 +12052,7 @@
           <w:p>
             <w:pPr>
               <w:spacing w:line="240" w:lineRule="auto"/>
+              <w:jc w:val="both"/>
               <w:rPr>
                 <w:rFonts w:ascii="Times New Roman" w:hAnsi="Times New Roman" w:cs="Times New Roman"/>
                 <w:sz w:val="24"/>
@@ -12143,6 +12148,7 @@
           <w:p>
             <w:pPr>
               <w:spacing w:line="240" w:lineRule="auto"/>
+              <w:jc w:val="both"/>
               <w:rPr>
                 <w:rFonts w:ascii="Times New Roman" w:hAnsi="Times New Roman" w:cs="Times New Roman"/>
                 <w:sz w:val="24"/>
@@ -12168,6 +12174,7 @@
           <w:p>
             <w:pPr>
               <w:spacing w:line="240" w:lineRule="auto"/>
+              <w:jc w:val="both"/>
               <w:rPr>
                 <w:rFonts w:ascii="Times New Roman" w:hAnsi="Times New Roman" w:cs="Times New Roman"/>
                 <w:sz w:val="24"/>
@@ -12193,6 +12200,7 @@
           <w:p>
             <w:pPr>
               <w:spacing w:line="240" w:lineRule="auto"/>
+              <w:jc w:val="both"/>
               <w:rPr>
                 <w:rFonts w:ascii="Times New Roman" w:hAnsi="Times New Roman" w:cs="Times New Roman"/>
                 <w:sz w:val="24"/>
@@ -12296,6 +12304,7 @@
           <w:p>
             <w:pPr>
               <w:spacing w:line="240" w:lineRule="auto"/>
+              <w:jc w:val="both"/>
               <w:rPr>
                 <w:rFonts w:ascii="Times New Roman" w:hAnsi="Times New Roman" w:cs="Times New Roman"/>
                 <w:sz w:val="24"/>
@@ -12322,6 +12331,7 @@
           <w:p>
             <w:pPr>
               <w:spacing w:line="240" w:lineRule="auto"/>
+              <w:jc w:val="both"/>
               <w:rPr>
                 <w:rFonts w:ascii="Times New Roman" w:hAnsi="Times New Roman" w:cs="Times New Roman"/>
                 <w:sz w:val="24"/>
@@ -12348,6 +12358,7 @@
           <w:p>
             <w:pPr>
               <w:spacing w:line="240" w:lineRule="auto"/>
+              <w:jc w:val="both"/>
               <w:rPr>
                 <w:rFonts w:ascii="Times New Roman" w:hAnsi="Times New Roman" w:cs="Times New Roman"/>
                 <w:sz w:val="24"/>
@@ -12471,6 +12482,7 @@
           <w:p>
             <w:pPr>
               <w:spacing w:line="240" w:lineRule="auto"/>
+              <w:jc w:val="both"/>
               <w:rPr>
                 <w:rFonts w:ascii="Times New Roman" w:hAnsi="Times New Roman" w:cs="Times New Roman"/>
                 <w:sz w:val="24"/>
@@ -12496,6 +12508,7 @@
           <w:p>
             <w:pPr>
               <w:spacing w:line="240" w:lineRule="auto"/>
+              <w:jc w:val="both"/>
               <w:rPr>
                 <w:rFonts w:ascii="Times New Roman" w:hAnsi="Times New Roman" w:cs="Times New Roman"/>
                 <w:sz w:val="24"/>
@@ -12521,6 +12534,7 @@
           <w:p>
             <w:pPr>
               <w:spacing w:line="240" w:lineRule="auto"/>
+              <w:jc w:val="both"/>
               <w:rPr>
                 <w:rFonts w:ascii="Times New Roman" w:hAnsi="Times New Roman" w:cs="Times New Roman"/>
                 <w:sz w:val="24"/>
@@ -12608,6 +12622,7 @@
           <w:p>
             <w:pPr>
               <w:spacing w:line="240" w:lineRule="auto"/>
+              <w:jc w:val="both"/>
               <w:rPr>
                 <w:rFonts w:ascii="Times New Roman" w:hAnsi="Times New Roman" w:cs="Times New Roman"/>
                 <w:sz w:val="24"/>
@@ -12633,6 +12648,7 @@
           <w:p>
             <w:pPr>
               <w:spacing w:line="240" w:lineRule="auto"/>
+              <w:jc w:val="both"/>
               <w:rPr>
                 <w:rFonts w:ascii="Times New Roman" w:hAnsi="Times New Roman" w:cs="Times New Roman"/>
                 <w:sz w:val="24"/>
@@ -12658,6 +12674,7 @@
           <w:p>
             <w:pPr>
               <w:spacing w:line="240" w:lineRule="auto"/>
+              <w:jc w:val="both"/>
               <w:rPr>
                 <w:rFonts w:ascii="Times New Roman" w:hAnsi="Times New Roman" w:cs="Times New Roman"/>
                 <w:sz w:val="24"/>
@@ -12764,6 +12781,7 @@
           <w:p>
             <w:pPr>
               <w:spacing w:line="240" w:lineRule="auto"/>
+              <w:jc w:val="both"/>
               <w:rPr>
                 <w:rFonts w:ascii="Times New Roman" w:hAnsi="Times New Roman" w:cs="Times New Roman"/>
                 <w:sz w:val="24"/>
@@ -12789,6 +12807,7 @@
           <w:p>
             <w:pPr>
               <w:spacing w:line="240" w:lineRule="auto"/>
+              <w:jc w:val="both"/>
               <w:rPr>
                 <w:rFonts w:ascii="Times New Roman" w:hAnsi="Times New Roman" w:cs="Times New Roman"/>
                 <w:sz w:val="24"/>
@@ -12814,6 +12833,7 @@
           <w:p>
             <w:pPr>
               <w:spacing w:line="240" w:lineRule="auto"/>
+              <w:jc w:val="both"/>
               <w:rPr>
                 <w:rFonts w:ascii="Times New Roman" w:hAnsi="Times New Roman" w:cs="Times New Roman"/>
                 <w:sz w:val="24"/>
@@ -12901,6 +12921,7 @@
           <w:p>
             <w:pPr>
               <w:spacing w:line="240" w:lineRule="auto"/>
+              <w:jc w:val="both"/>
               <w:rPr>
                 <w:rFonts w:ascii="Times New Roman" w:hAnsi="Times New Roman" w:cs="Times New Roman"/>
                 <w:sz w:val="24"/>
@@ -13097,6 +13118,7 @@
             <w:pPr>
               <w:spacing w:line="240" w:lineRule="auto"/>
               <w:contextualSpacing/>
+              <w:jc w:val="both"/>
               <w:rPr>
                 <w:rFonts w:ascii="Times New Roman" w:hAnsi="Times New Roman" w:cs="Times New Roman"/>
               </w:rPr>
@@ -13133,6 +13155,7 @@
             <w:pPr>
               <w:spacing w:line="240" w:lineRule="auto"/>
               <w:contextualSpacing/>
+              <w:jc w:val="both"/>
               <w:rPr>
                 <w:rFonts w:ascii="Times New Roman" w:hAnsi="Times New Roman" w:cs="Times New Roman"/>
               </w:rPr>
@@ -13155,6 +13178,7 @@
             <w:pPr>
               <w:spacing w:line="240" w:lineRule="auto"/>
               <w:contextualSpacing/>
+              <w:jc w:val="both"/>
               <w:rPr>
                 <w:rFonts w:ascii="Times New Roman" w:hAnsi="Times New Roman" w:cs="Times New Roman"/>
               </w:rPr>
@@ -13177,6 +13201,7 @@
             <w:pPr>
               <w:spacing w:line="240" w:lineRule="auto"/>
               <w:contextualSpacing/>
+              <w:jc w:val="both"/>
               <w:rPr>
                 <w:rFonts w:ascii="Times New Roman" w:hAnsi="Times New Roman" w:cs="Times New Roman"/>
               </w:rPr>
@@ -13199,6 +13224,7 @@
             <w:pPr>
               <w:spacing w:line="240" w:lineRule="auto"/>
               <w:contextualSpacing/>
+              <w:jc w:val="both"/>
               <w:rPr>
                 <w:rFonts w:ascii="Times New Roman" w:hAnsi="Times New Roman" w:cs="Times New Roman"/>
               </w:rPr>
@@ -13221,6 +13247,7 @@
             <w:pPr>
               <w:spacing w:line="240" w:lineRule="auto"/>
               <w:contextualSpacing/>
+              <w:jc w:val="both"/>
               <w:rPr>
                 <w:rFonts w:ascii="Times New Roman" w:hAnsi="Times New Roman" w:cs="Times New Roman"/>
               </w:rPr>
@@ -13243,6 +13270,7 @@
             <w:pPr>
               <w:spacing w:line="240" w:lineRule="auto"/>
               <w:contextualSpacing/>
+              <w:jc w:val="both"/>
               <w:rPr>
                 <w:rFonts w:ascii="Times New Roman" w:hAnsi="Times New Roman" w:cs="Times New Roman"/>
               </w:rPr>
@@ -13266,6 +13294,7 @@
             <w:pPr>
               <w:spacing w:line="240" w:lineRule="auto"/>
               <w:contextualSpacing/>
+              <w:jc w:val="both"/>
               <w:rPr>
                 <w:rFonts w:ascii="Times New Roman" w:hAnsi="Times New Roman" w:cs="Times New Roman"/>
               </w:rPr>
@@ -13288,6 +13317,7 @@
             <w:pPr>
               <w:spacing w:line="240" w:lineRule="auto"/>
               <w:contextualSpacing/>
+              <w:jc w:val="both"/>
               <w:rPr>
                 <w:rFonts w:ascii="Times New Roman" w:hAnsi="Times New Roman" w:cs="Times New Roman"/>
               </w:rPr>
@@ -13310,6 +13340,7 @@
             <w:pPr>
               <w:spacing w:line="240" w:lineRule="auto"/>
               <w:contextualSpacing/>
+              <w:jc w:val="both"/>
               <w:rPr>
                 <w:rFonts w:ascii="Times New Roman" w:hAnsi="Times New Roman" w:cs="Times New Roman"/>
               </w:rPr>
@@ -13332,6 +13363,7 @@
             <w:pPr>
               <w:spacing w:line="240" w:lineRule="auto"/>
               <w:contextualSpacing/>
+              <w:jc w:val="both"/>
               <w:rPr>
                 <w:rFonts w:ascii="Times New Roman" w:hAnsi="Times New Roman" w:cs="Times New Roman"/>
               </w:rPr>
@@ -13354,6 +13386,7 @@
             <w:pPr>
               <w:spacing w:line="240" w:lineRule="auto"/>
               <w:contextualSpacing/>
+              <w:jc w:val="both"/>
               <w:rPr>
                 <w:rFonts w:ascii="Times New Roman" w:hAnsi="Times New Roman" w:cs="Times New Roman"/>
               </w:rPr>
@@ -13376,6 +13409,7 @@
             <w:pPr>
               <w:spacing w:line="240" w:lineRule="auto"/>
               <w:contextualSpacing/>
+              <w:jc w:val="both"/>
               <w:rPr>
                 <w:rFonts w:ascii="Times New Roman" w:hAnsi="Times New Roman" w:cs="Times New Roman"/>
               </w:rPr>
@@ -13398,6 +13432,7 @@
             <w:pPr>
               <w:spacing w:line="240" w:lineRule="auto"/>
               <w:contextualSpacing/>
+              <w:jc w:val="both"/>
               <w:rPr>
                 <w:rFonts w:ascii="Times New Roman" w:hAnsi="Times New Roman" w:cs="Times New Roman"/>
               </w:rPr>
@@ -13420,6 +13455,7 @@
             <w:pPr>
               <w:spacing w:line="240" w:lineRule="auto"/>
               <w:contextualSpacing/>
+              <w:jc w:val="both"/>
               <w:rPr>
                 <w:rFonts w:ascii="Times New Roman" w:hAnsi="Times New Roman" w:cs="Times New Roman"/>
               </w:rPr>
@@ -13442,6 +13478,7 @@
             <w:pPr>
               <w:spacing w:line="240" w:lineRule="auto"/>
               <w:contextualSpacing/>
+              <w:jc w:val="both"/>
               <w:rPr>
                 <w:rFonts w:ascii="Times New Roman" w:hAnsi="Times New Roman" w:cs="Times New Roman"/>
               </w:rPr>
@@ -13464,6 +13501,7 @@
             <w:pPr>
               <w:spacing w:line="240" w:lineRule="auto"/>
               <w:contextualSpacing/>
+              <w:jc w:val="both"/>
               <w:rPr>
                 <w:rFonts w:ascii="Times New Roman" w:hAnsi="Times New Roman" w:cs="Times New Roman"/>
               </w:rPr>
@@ -13486,6 +13524,7 @@
             <w:pPr>
               <w:spacing w:line="240" w:lineRule="auto"/>
               <w:contextualSpacing/>
+              <w:jc w:val="both"/>
               <w:rPr>
                 <w:rFonts w:ascii="Times New Roman" w:hAnsi="Times New Roman" w:cs="Times New Roman"/>
               </w:rPr>
@@ -13508,6 +13547,7 @@
             <w:pPr>
               <w:spacing w:line="240" w:lineRule="auto"/>
               <w:contextualSpacing/>
+              <w:jc w:val="both"/>
               <w:rPr>
                 <w:rFonts w:ascii="Times New Roman" w:hAnsi="Times New Roman" w:cs="Times New Roman"/>
               </w:rPr>
@@ -13530,6 +13570,7 @@
             <w:pPr>
               <w:spacing w:line="240" w:lineRule="auto"/>
               <w:contextualSpacing/>
+              <w:jc w:val="both"/>
               <w:rPr>
                 <w:rFonts w:ascii="Times New Roman" w:hAnsi="Times New Roman" w:cs="Times New Roman"/>
               </w:rPr>
@@ -13552,6 +13593,7 @@
             <w:pPr>
               <w:spacing w:line="240" w:lineRule="auto"/>
               <w:contextualSpacing/>
+              <w:jc w:val="both"/>
               <w:rPr>
                 <w:rFonts w:ascii="Times New Roman" w:hAnsi="Times New Roman" w:cs="Times New Roman"/>
               </w:rPr>
@@ -13574,6 +13616,7 @@
             <w:pPr>
               <w:spacing w:line="240" w:lineRule="auto"/>
               <w:contextualSpacing/>
+              <w:jc w:val="both"/>
               <w:rPr>
                 <w:rFonts w:ascii="Times New Roman" w:hAnsi="Times New Roman" w:cs="Times New Roman"/>
               </w:rPr>
@@ -13596,6 +13639,7 @@
             <w:pPr>
               <w:spacing w:line="240" w:lineRule="auto"/>
               <w:contextualSpacing/>
+              <w:jc w:val="both"/>
               <w:rPr>
                 <w:rFonts w:ascii="Times New Roman" w:hAnsi="Times New Roman" w:cs="Times New Roman"/>
               </w:rPr>
@@ -13618,6 +13662,7 @@
             <w:pPr>
               <w:spacing w:line="240" w:lineRule="auto"/>
               <w:contextualSpacing/>
+              <w:jc w:val="both"/>
               <w:rPr>
                 <w:rFonts w:ascii="Times New Roman" w:hAnsi="Times New Roman" w:cs="Times New Roman"/>
               </w:rPr>
@@ -13640,6 +13685,7 @@
             <w:pPr>
               <w:spacing w:line="240" w:lineRule="auto"/>
               <w:contextualSpacing/>
+              <w:jc w:val="both"/>
               <w:rPr>
                 <w:rFonts w:ascii="Times New Roman" w:hAnsi="Times New Roman" w:cs="Times New Roman"/>
               </w:rPr>
@@ -13662,6 +13708,7 @@
             <w:pPr>
               <w:spacing w:line="240" w:lineRule="auto"/>
               <w:contextualSpacing/>
+              <w:jc w:val="both"/>
               <w:rPr>
                 <w:rFonts w:ascii="Times New Roman" w:hAnsi="Times New Roman" w:cs="Times New Roman"/>
               </w:rPr>
@@ -13684,6 +13731,7 @@
             <w:pPr>
               <w:spacing w:line="240" w:lineRule="auto"/>
               <w:contextualSpacing/>
+              <w:jc w:val="both"/>
               <w:rPr>
                 <w:rFonts w:ascii="Times New Roman" w:hAnsi="Times New Roman" w:cs="Times New Roman"/>
               </w:rPr>
@@ -13706,6 +13754,7 @@
             <w:pPr>
               <w:spacing w:line="240" w:lineRule="auto"/>
               <w:contextualSpacing/>
+              <w:jc w:val="both"/>
               <w:rPr>
                 <w:rFonts w:ascii="Times New Roman" w:hAnsi="Times New Roman" w:cs="Times New Roman"/>
               </w:rPr>
@@ -13728,6 +13777,7 @@
             <w:pPr>
               <w:spacing w:line="240" w:lineRule="auto"/>
               <w:contextualSpacing/>
+              <w:jc w:val="both"/>
               <w:rPr>
                 <w:rFonts w:ascii="Times New Roman" w:hAnsi="Times New Roman" w:cs="Times New Roman"/>
               </w:rPr>
@@ -13750,6 +13800,7 @@
             <w:pPr>
               <w:spacing w:line="240" w:lineRule="auto"/>
               <w:contextualSpacing/>
+              <w:jc w:val="both"/>
               <w:rPr>
                 <w:rFonts w:ascii="Times New Roman" w:hAnsi="Times New Roman" w:cs="Times New Roman"/>
               </w:rPr>
@@ -13772,6 +13823,7 @@
             <w:pPr>
               <w:spacing w:line="240" w:lineRule="auto"/>
               <w:contextualSpacing/>
+              <w:jc w:val="both"/>
               <w:rPr>
                 <w:rFonts w:ascii="Times New Roman" w:hAnsi="Times New Roman" w:cs="Times New Roman"/>
               </w:rPr>
@@ -13794,6 +13846,7 @@
             <w:pPr>
               <w:spacing w:line="240" w:lineRule="auto"/>
               <w:contextualSpacing/>
+              <w:jc w:val="both"/>
               <w:rPr>
                 <w:rFonts w:ascii="Times New Roman" w:hAnsi="Times New Roman" w:cs="Times New Roman"/>
               </w:rPr>
@@ -13816,6 +13869,7 @@
             <w:pPr>
               <w:spacing w:line="240" w:lineRule="auto"/>
               <w:contextualSpacing/>
+              <w:jc w:val="both"/>
               <w:rPr>
                 <w:rFonts w:ascii="Times New Roman" w:hAnsi="Times New Roman" w:cs="Times New Roman"/>
               </w:rPr>
@@ -13838,6 +13892,7 @@
             <w:pPr>
               <w:spacing w:line="240" w:lineRule="auto"/>
               <w:contextualSpacing/>
+              <w:jc w:val="both"/>
               <w:rPr>
                 <w:rFonts w:ascii="Times New Roman" w:hAnsi="Times New Roman" w:cs="Times New Roman"/>
               </w:rPr>
@@ -13860,6 +13915,7 @@
             <w:pPr>
               <w:spacing w:line="240" w:lineRule="auto"/>
               <w:contextualSpacing/>
+              <w:jc w:val="both"/>
               <w:rPr>
                 <w:rFonts w:ascii="Times New Roman" w:hAnsi="Times New Roman" w:cs="Times New Roman"/>
               </w:rPr>
@@ -13882,6 +13938,7 @@
             <w:pPr>
               <w:spacing w:line="240" w:lineRule="auto"/>
               <w:contextualSpacing/>
+              <w:jc w:val="both"/>
               <w:rPr>
                 <w:rFonts w:ascii="Times New Roman" w:hAnsi="Times New Roman" w:cs="Times New Roman"/>
               </w:rPr>
@@ -13910,6 +13967,7 @@
             <w:pPr>
               <w:spacing w:line="240" w:lineRule="auto"/>
               <w:contextualSpacing/>
+              <w:jc w:val="both"/>
               <w:rPr>
                 <w:rFonts w:ascii="Times New Roman" w:hAnsi="Times New Roman" w:cs="Times New Roman"/>
               </w:rPr>
@@ -13932,6 +13990,7 @@
             <w:pPr>
               <w:spacing w:line="240" w:lineRule="auto"/>
               <w:contextualSpacing/>
+              <w:jc w:val="both"/>
               <w:rPr>
                 <w:rFonts w:ascii="Times New Roman" w:hAnsi="Times New Roman" w:cs="Times New Roman"/>
               </w:rPr>
@@ -13954,6 +14013,7 @@
             <w:pPr>
               <w:spacing w:line="240" w:lineRule="auto"/>
               <w:contextualSpacing/>
+              <w:jc w:val="both"/>
               <w:rPr>
                 <w:rFonts w:ascii="Times New Roman" w:hAnsi="Times New Roman" w:cs="Times New Roman"/>
               </w:rPr>
@@ -13976,6 +14036,7 @@
             <w:pPr>
               <w:spacing w:line="240" w:lineRule="auto"/>
               <w:contextualSpacing/>
+              <w:jc w:val="both"/>
               <w:rPr>
                 <w:rFonts w:ascii="Times New Roman" w:hAnsi="Times New Roman" w:cs="Times New Roman"/>
               </w:rPr>
@@ -13998,6 +14059,7 @@
             <w:pPr>
               <w:spacing w:line="240" w:lineRule="auto"/>
               <w:contextualSpacing/>
+              <w:jc w:val="both"/>
               <w:rPr>
                 <w:rFonts w:ascii="Times New Roman" w:hAnsi="Times New Roman" w:cs="Times New Roman"/>
               </w:rPr>
@@ -14020,6 +14082,7 @@
             <w:pPr>
               <w:spacing w:line="240" w:lineRule="auto"/>
               <w:contextualSpacing/>
+              <w:jc w:val="both"/>
               <w:rPr>
                 <w:rFonts w:ascii="Times New Roman" w:hAnsi="Times New Roman" w:cs="Times New Roman"/>
               </w:rPr>
@@ -14054,6 +14117,7 @@
             <w:pPr>
               <w:spacing w:line="240" w:lineRule="auto"/>
               <w:contextualSpacing/>
+              <w:jc w:val="both"/>
               <w:rPr>
                 <w:rFonts w:ascii="Times New Roman" w:hAnsi="Times New Roman" w:cs="Times New Roman"/>
               </w:rPr>
@@ -14076,6 +14140,7 @@
             <w:pPr>
               <w:spacing w:line="240" w:lineRule="auto"/>
               <w:contextualSpacing/>
+              <w:jc w:val="both"/>
               <w:rPr>
                 <w:rFonts w:ascii="Times New Roman" w:hAnsi="Times New Roman" w:cs="Times New Roman"/>
               </w:rPr>
@@ -14098,6 +14163,7 @@
             <w:pPr>
               <w:spacing w:line="240" w:lineRule="auto"/>
               <w:contextualSpacing/>
+              <w:jc w:val="both"/>
               <w:rPr>
                 <w:rFonts w:ascii="Times New Roman" w:hAnsi="Times New Roman" w:cs="Times New Roman"/>
               </w:rPr>
@@ -14120,6 +14186,7 @@
             <w:pPr>
               <w:spacing w:line="240" w:lineRule="auto"/>
               <w:contextualSpacing/>
+              <w:jc w:val="both"/>
               <w:rPr>
                 <w:rFonts w:ascii="Times New Roman" w:hAnsi="Times New Roman" w:cs="Times New Roman"/>
               </w:rPr>
@@ -14142,6 +14209,7 @@
             <w:pPr>
               <w:spacing w:line="240" w:lineRule="auto"/>
               <w:contextualSpacing/>
+              <w:jc w:val="both"/>
               <w:rPr>
                 <w:rFonts w:ascii="Times New Roman" w:hAnsi="Times New Roman" w:cs="Times New Roman"/>
               </w:rPr>
@@ -14164,6 +14232,7 @@
             <w:pPr>
               <w:spacing w:line="240" w:lineRule="auto"/>
               <w:contextualSpacing/>
+              <w:jc w:val="both"/>
               <w:rPr>
                 <w:rFonts w:ascii="Times New Roman" w:hAnsi="Times New Roman" w:cs="Times New Roman"/>
               </w:rPr>
@@ -14186,6 +14255,7 @@
             <w:pPr>
               <w:spacing w:line="240" w:lineRule="auto"/>
               <w:contextualSpacing/>
+              <w:jc w:val="both"/>
               <w:rPr>
                 <w:rFonts w:ascii="Times New Roman" w:hAnsi="Times New Roman" w:cs="Times New Roman"/>
               </w:rPr>
@@ -14208,6 +14278,7 @@
             <w:pPr>
               <w:spacing w:line="240" w:lineRule="auto"/>
               <w:contextualSpacing/>
+              <w:jc w:val="both"/>
               <w:rPr>
                 <w:rFonts w:ascii="Times New Roman" w:hAnsi="Times New Roman" w:cs="Times New Roman"/>
               </w:rPr>
@@ -14241,7 +14312,27 @@
         <w:rPr>
           <w:lang w:eastAsia="ru-RU"/>
         </w:rPr>
-        <w:t>Так же были разработаны основные интерфейсы для системы.</w:t>
+        <w:t>Так же были разработаны основные интерфейсы</w:t>
+      </w:r>
+      <w:r>
+        <w:rPr>
+          <w:lang w:eastAsia="ru-RU"/>
+        </w:rPr>
+        <w:t xml:space="preserve"> </w:t>
+      </w:r>
+      <w:proofErr w:type="spellStart"/>
+      <w:r>
+        <w:rPr>
+          <w:lang w:eastAsia="ru-RU"/>
+        </w:rPr>
+        <w:t>репозиториев</w:t>
+      </w:r>
+      <w:proofErr w:type="spellEnd"/>
+      <w:r>
+        <w:rPr>
+          <w:lang w:eastAsia="ru-RU"/>
+        </w:rPr>
+        <w:t xml:space="preserve"> для системы.</w:t>
       </w:r>
     </w:p>
     <w:p>
@@ -14258,7 +14349,35 @@
         <w:rPr>
           <w:lang w:eastAsia="ru-RU"/>
         </w:rPr>
-        <w:t>Таблица 8 – Таблица интерфейсов проекта.</w:t>
+        <w:t>Таблица 8 – Таблица интерфейсов</w:t>
+      </w:r>
+      <w:r>
+        <w:rPr>
+          <w:lang w:eastAsia="ru-RU"/>
+        </w:rPr>
+        <w:t xml:space="preserve"> </w:t>
+      </w:r>
+      <w:proofErr w:type="spellStart"/>
+      <w:r>
+        <w:rPr>
+          <w:lang w:eastAsia="ru-RU"/>
+        </w:rPr>
+        <w:t>репо</w:t>
+      </w:r>
+      <w:bookmarkStart w:id="23" w:name="_GoBack"/>
+      <w:bookmarkEnd w:id="23"/>
+      <w:r>
+        <w:rPr>
+          <w:lang w:eastAsia="ru-RU"/>
+        </w:rPr>
+        <w:t>зиториев</w:t>
+      </w:r>
+      <w:proofErr w:type="spellEnd"/>
+      <w:r>
+        <w:rPr>
+          <w:lang w:eastAsia="ru-RU"/>
+        </w:rPr>
+        <w:t xml:space="preserve"> проекта.</w:t>
       </w:r>
     </w:p>
     <w:tbl>
@@ -14351,6 +14470,7 @@
           <w:p>
             <w:pPr>
               <w:spacing w:line="240" w:lineRule="auto"/>
+              <w:jc w:val="both"/>
               <w:rPr>
                 <w:rFonts w:ascii="Times New Roman" w:hAnsi="Times New Roman" w:cs="Times New Roman"/>
                 <w:sz w:val="28"/>
@@ -14376,6 +14496,7 @@
           <w:p>
             <w:pPr>
               <w:spacing w:line="240" w:lineRule="auto"/>
+              <w:jc w:val="both"/>
               <w:rPr>
                 <w:rFonts w:ascii="Times New Roman" w:hAnsi="Times New Roman" w:cs="Times New Roman"/>
                 <w:sz w:val="28"/>
@@ -14463,6 +14584,7 @@
           <w:p>
             <w:pPr>
               <w:spacing w:line="240" w:lineRule="auto"/>
+              <w:jc w:val="both"/>
               <w:rPr>
                 <w:rFonts w:ascii="Times New Roman" w:hAnsi="Times New Roman" w:cs="Times New Roman"/>
                 <w:sz w:val="28"/>
@@ -14488,6 +14610,7 @@
           <w:p>
             <w:pPr>
               <w:spacing w:line="240" w:lineRule="auto"/>
+              <w:jc w:val="both"/>
               <w:rPr>
                 <w:rFonts w:ascii="Times New Roman" w:hAnsi="Times New Roman" w:cs="Times New Roman"/>
                 <w:sz w:val="28"/>
@@ -14513,6 +14636,7 @@
           <w:p>
             <w:pPr>
               <w:spacing w:line="240" w:lineRule="auto"/>
+              <w:jc w:val="both"/>
               <w:rPr>
                 <w:rFonts w:ascii="Times New Roman" w:hAnsi="Times New Roman" w:cs="Times New Roman"/>
                 <w:sz w:val="28"/>
@@ -14589,6 +14713,7 @@
           <w:p>
             <w:pPr>
               <w:spacing w:line="240" w:lineRule="auto"/>
+              <w:jc w:val="both"/>
               <w:rPr>
                 <w:rFonts w:ascii="Times New Roman" w:hAnsi="Times New Roman" w:cs="Times New Roman"/>
                 <w:sz w:val="28"/>
@@ -14614,6 +14739,7 @@
           <w:p>
             <w:pPr>
               <w:spacing w:line="240" w:lineRule="auto"/>
+              <w:jc w:val="both"/>
               <w:rPr>
                 <w:rFonts w:ascii="Times New Roman" w:hAnsi="Times New Roman" w:cs="Times New Roman"/>
                 <w:sz w:val="28"/>
@@ -14627,6 +14753,7 @@
                 <w:sz w:val="28"/>
                 <w:szCs w:val="28"/>
               </w:rPr>
+              <w:lastRenderedPageBreak/>
               <w:t>SuspectRepository</w:t>
             </w:r>
             <w:proofErr w:type="spellEnd"/>
@@ -14639,6 +14766,7 @@
           <w:p>
             <w:pPr>
               <w:spacing w:line="240" w:lineRule="auto"/>
+              <w:jc w:val="both"/>
               <w:rPr>
                 <w:rFonts w:ascii="Times New Roman" w:hAnsi="Times New Roman" w:cs="Times New Roman"/>
                 <w:sz w:val="28"/>
@@ -14726,6 +14854,7 @@
           <w:p>
             <w:pPr>
               <w:spacing w:line="240" w:lineRule="auto"/>
+              <w:jc w:val="both"/>
               <w:rPr>
                 <w:rFonts w:ascii="Times New Roman" w:hAnsi="Times New Roman" w:cs="Times New Roman"/>
                 <w:sz w:val="28"/>
@@ -14751,6 +14880,7 @@
           <w:p>
             <w:pPr>
               <w:spacing w:line="240" w:lineRule="auto"/>
+              <w:jc w:val="both"/>
               <w:rPr>
                 <w:rFonts w:ascii="Times New Roman" w:hAnsi="Times New Roman" w:cs="Times New Roman"/>
                 <w:sz w:val="28"/>
@@ -14764,7 +14894,6 @@
                 <w:sz w:val="28"/>
                 <w:szCs w:val="28"/>
               </w:rPr>
-              <w:lastRenderedPageBreak/>
               <w:t>DialogueRepository</w:t>
             </w:r>
             <w:proofErr w:type="spellEnd"/>
@@ -14777,6 +14906,7 @@
           <w:p>
             <w:pPr>
               <w:spacing w:line="240" w:lineRule="auto"/>
+              <w:jc w:val="both"/>
               <w:rPr>
                 <w:rFonts w:ascii="Times New Roman" w:hAnsi="Times New Roman" w:cs="Times New Roman"/>
                 <w:sz w:val="28"/>
@@ -14864,6 +14994,7 @@
           <w:p>
             <w:pPr>
               <w:spacing w:line="240" w:lineRule="auto"/>
+              <w:jc w:val="both"/>
               <w:rPr>
                 <w:rFonts w:ascii="Times New Roman" w:hAnsi="Times New Roman" w:cs="Times New Roman"/>
                 <w:sz w:val="28"/>
@@ -14925,6 +15056,7 @@
           <w:p>
             <w:pPr>
               <w:spacing w:line="240" w:lineRule="auto"/>
+              <w:jc w:val="both"/>
               <w:rPr>
                 <w:rFonts w:ascii="Times New Roman" w:hAnsi="Times New Roman" w:cs="Times New Roman"/>
                 <w:sz w:val="28"/>
@@ -14950,6 +15082,7 @@
           <w:p>
             <w:pPr>
               <w:spacing w:line="240" w:lineRule="auto"/>
+              <w:jc w:val="both"/>
               <w:rPr>
                 <w:rFonts w:ascii="Times New Roman" w:hAnsi="Times New Roman" w:cs="Times New Roman"/>
                 <w:sz w:val="28"/>
@@ -15046,6 +15179,7 @@
           <w:p>
             <w:pPr>
               <w:spacing w:line="240" w:lineRule="auto"/>
+              <w:jc w:val="both"/>
               <w:rPr>
                 <w:rFonts w:ascii="Times New Roman" w:hAnsi="Times New Roman" w:cs="Times New Roman"/>
                 <w:sz w:val="28"/>
@@ -15071,6 +15205,7 @@
           <w:p>
             <w:pPr>
               <w:spacing w:line="240" w:lineRule="auto"/>
+              <w:jc w:val="both"/>
               <w:rPr>
                 <w:rFonts w:ascii="Times New Roman" w:hAnsi="Times New Roman" w:cs="Times New Roman"/>
                 <w:sz w:val="28"/>
@@ -15096,6 +15231,7 @@
           <w:p>
             <w:pPr>
               <w:spacing w:line="240" w:lineRule="auto"/>
+              <w:jc w:val="both"/>
               <w:rPr>
                 <w:rFonts w:ascii="Times New Roman" w:hAnsi="Times New Roman" w:cs="Times New Roman"/>
                 <w:sz w:val="28"/>
@@ -15192,6 +15328,7 @@
           <w:p>
             <w:pPr>
               <w:spacing w:line="240" w:lineRule="auto"/>
+              <w:jc w:val="both"/>
               <w:rPr>
                 <w:rFonts w:ascii="Times New Roman" w:hAnsi="Times New Roman" w:cs="Times New Roman"/>
                 <w:sz w:val="28"/>
@@ -15217,6 +15354,7 @@
           <w:p>
             <w:pPr>
               <w:spacing w:line="240" w:lineRule="auto"/>
+              <w:jc w:val="both"/>
               <w:rPr>
                 <w:rFonts w:ascii="Times New Roman" w:hAnsi="Times New Roman" w:cs="Times New Roman"/>
                 <w:sz w:val="28"/>
@@ -15242,6 +15380,7 @@
           <w:p>
             <w:pPr>
               <w:spacing w:line="240" w:lineRule="auto"/>
+              <w:jc w:val="both"/>
               <w:rPr>
                 <w:rFonts w:ascii="Times New Roman" w:hAnsi="Times New Roman" w:cs="Times New Roman"/>
                 <w:sz w:val="28"/>
@@ -15311,6 +15450,7 @@
           <w:p>
             <w:pPr>
               <w:spacing w:line="240" w:lineRule="auto"/>
+              <w:jc w:val="both"/>
               <w:rPr>
                 <w:rFonts w:ascii="Times New Roman" w:hAnsi="Times New Roman" w:cs="Times New Roman"/>
                 <w:sz w:val="28"/>
@@ -15336,6 +15476,7 @@
           <w:p>
             <w:pPr>
               <w:spacing w:line="240" w:lineRule="auto"/>
+              <w:jc w:val="both"/>
               <w:rPr>
                 <w:rFonts w:ascii="Times New Roman" w:hAnsi="Times New Roman" w:cs="Times New Roman"/>
                 <w:sz w:val="28"/>
@@ -15361,6 +15502,7 @@
           <w:p>
             <w:pPr>
               <w:spacing w:line="240" w:lineRule="auto"/>
+              <w:jc w:val="both"/>
               <w:rPr>
                 <w:rFonts w:ascii="Times New Roman" w:hAnsi="Times New Roman" w:cs="Times New Roman"/>
                 <w:sz w:val="28"/>
@@ -15477,6 +15619,7 @@
           <w:p>
             <w:pPr>
               <w:spacing w:line="240" w:lineRule="auto"/>
+              <w:jc w:val="both"/>
               <w:rPr>
                 <w:rFonts w:ascii="Times New Roman" w:hAnsi="Times New Roman" w:cs="Times New Roman"/>
                 <w:sz w:val="28"/>
@@ -15502,6 +15645,7 @@
           <w:p>
             <w:pPr>
               <w:spacing w:line="240" w:lineRule="auto"/>
+              <w:jc w:val="both"/>
               <w:rPr>
                 <w:rFonts w:ascii="Times New Roman" w:hAnsi="Times New Roman" w:cs="Times New Roman"/>
                 <w:sz w:val="28"/>
@@ -15527,6 +15671,7 @@
           <w:p>
             <w:pPr>
               <w:spacing w:line="240" w:lineRule="auto"/>
+              <w:jc w:val="both"/>
               <w:rPr>
                 <w:rFonts w:ascii="Times New Roman" w:hAnsi="Times New Roman" w:cs="Times New Roman"/>
                 <w:sz w:val="28"/>
@@ -15663,6 +15808,7 @@
           <w:p>
             <w:pPr>
               <w:spacing w:line="240" w:lineRule="auto"/>
+              <w:jc w:val="both"/>
               <w:rPr>
                 <w:rFonts w:ascii="Times New Roman" w:hAnsi="Times New Roman" w:cs="Times New Roman"/>
                 <w:sz w:val="28"/>
@@ -15688,6 +15834,7 @@
           <w:p>
             <w:pPr>
               <w:spacing w:line="240" w:lineRule="auto"/>
+              <w:jc w:val="both"/>
               <w:rPr>
                 <w:rFonts w:ascii="Times New Roman" w:hAnsi="Times New Roman" w:cs="Times New Roman"/>
                 <w:sz w:val="28"/>
@@ -15713,6 +15860,7 @@
           <w:p>
             <w:pPr>
               <w:spacing w:line="240" w:lineRule="auto"/>
+              <w:jc w:val="both"/>
               <w:rPr>
                 <w:rFonts w:ascii="Times New Roman" w:hAnsi="Times New Roman" w:cs="Times New Roman"/>
                 <w:sz w:val="28"/>
@@ -15782,6 +15930,7 @@
           <w:p>
             <w:pPr>
               <w:spacing w:line="240" w:lineRule="auto"/>
+              <w:jc w:val="both"/>
               <w:rPr>
                 <w:rFonts w:ascii="Times New Roman" w:hAnsi="Times New Roman" w:cs="Times New Roman"/>
                 <w:sz w:val="28"/>
@@ -15800,6 +15949,9 @@
         </w:tc>
       </w:tr>
       <w:tr>
+        <w:trPr>
+          <w:trHeight w:val="70"/>
+        </w:trPr>
         <w:tc>
           <w:tcPr>
             <w:tcW w:w="3105" w:type="dxa"/>
@@ -15807,6 +15959,7 @@
           <w:p>
             <w:pPr>
               <w:spacing w:line="240" w:lineRule="auto"/>
+              <w:jc w:val="both"/>
               <w:rPr>
                 <w:rFonts w:ascii="Times New Roman" w:hAnsi="Times New Roman" w:cs="Times New Roman"/>
                 <w:sz w:val="28"/>
@@ -15832,6 +15985,7 @@
           <w:p>
             <w:pPr>
               <w:spacing w:line="240" w:lineRule="auto"/>
+              <w:jc w:val="both"/>
               <w:rPr>
                 <w:rFonts w:ascii="Times New Roman" w:hAnsi="Times New Roman" w:cs="Times New Roman"/>
                 <w:sz w:val="28"/>
@@ -15919,6 +16073,7 @@
           <w:p>
             <w:pPr>
               <w:spacing w:line="240" w:lineRule="auto"/>
+              <w:jc w:val="both"/>
               <w:rPr>
                 <w:rFonts w:ascii="Times New Roman" w:hAnsi="Times New Roman" w:cs="Times New Roman"/>
                 <w:sz w:val="28"/>
@@ -15944,6 +16099,7 @@
           <w:p>
             <w:pPr>
               <w:spacing w:line="240" w:lineRule="auto"/>
+              <w:jc w:val="both"/>
               <w:rPr>
                 <w:rFonts w:ascii="Times New Roman" w:hAnsi="Times New Roman" w:cs="Times New Roman"/>
                 <w:sz w:val="28"/>
@@ -15969,6 +16125,7 @@
           <w:p>
             <w:pPr>
               <w:spacing w:line="240" w:lineRule="auto"/>
+              <w:jc w:val="both"/>
               <w:rPr>
                 <w:rFonts w:ascii="Times New Roman" w:hAnsi="Times New Roman" w:cs="Times New Roman"/>
                 <w:sz w:val="28"/>
@@ -16056,6 +16213,7 @@
           <w:p>
             <w:pPr>
               <w:spacing w:line="240" w:lineRule="auto"/>
+              <w:jc w:val="both"/>
               <w:rPr>
                 <w:rFonts w:ascii="Times New Roman" w:hAnsi="Times New Roman" w:cs="Times New Roman"/>
                 <w:sz w:val="28"/>
@@ -16080,11 +16238,9 @@
         <w:ind w:firstLine="0"/>
         <w:jc w:val="left"/>
         <w:rPr>
-          <w:lang w:eastAsia="ru-RU"/>
-        </w:rPr>
-      </w:pPr>
-      <w:bookmarkStart w:id="23" w:name="_GoBack"/>
-      <w:bookmarkEnd w:id="23"/>
+          <w:lang w:val="en-US" w:eastAsia="ru-RU"/>
+        </w:rPr>
+      </w:pPr>
     </w:p>
     <w:p>
       <w:pPr>
@@ -16116,11 +16272,56 @@
     <w:p>
       <w:pPr>
         <w:pStyle w:val="a9"/>
-        <w:jc w:val="left"/>
-        <w:rPr>
-          <w:lang w:eastAsia="ru-RU"/>
-        </w:rPr>
-      </w:pPr>
+      </w:pPr>
+      <w:r>
+        <w:t>В проекте будет соблюдаться все принципы SOLID.</w:t>
+      </w:r>
+    </w:p>
+    <w:p>
+      <w:pPr>
+        <w:pStyle w:val="a9"/>
+      </w:pPr>
+      <w:r>
+        <w:t xml:space="preserve">SOLID - </w:t>
+      </w:r>
+      <w:r>
+        <w:t xml:space="preserve">это набор из пяти принципов проектирования в объектно‑ориентированном программировании (ООП). Они помогают писать код, который проще поддерживать, расширять и тестировать. </w:t>
+      </w:r>
+      <w:r>
+        <w:t>Была составлена таблица, где приведены примеры, как будут реализовываться данные принципы.</w:t>
+      </w:r>
+    </w:p>
+    <w:p>
+      <w:pPr>
+        <w:pStyle w:val="a9"/>
+      </w:pPr>
+    </w:p>
+    <w:p>
+      <w:pPr>
+        <w:pStyle w:val="a9"/>
+      </w:pPr>
+    </w:p>
+    <w:p>
+      <w:pPr>
+        <w:pStyle w:val="a9"/>
+      </w:pPr>
+    </w:p>
+    <w:p>
+      <w:pPr>
+        <w:pStyle w:val="a9"/>
+        <w:spacing w:before="240"/>
+        <w:ind w:firstLine="0"/>
+        <w:contextualSpacing w:val="0"/>
+      </w:pPr>
+      <w:r>
+        <w:t xml:space="preserve">Таблица 9 – Распределение </w:t>
+      </w:r>
+      <w:r>
+        <w:t xml:space="preserve">SOLID </w:t>
+      </w:r>
+      <w:r>
+        <w:t>принципов.</w:t>
+      </w:r>
     </w:p>
     <w:tbl>
       <w:tblPr>
@@ -16129,13 +16330,14 @@
         <w:tblLook w:val="04A0" w:firstRow="1" w:lastRow="0" w:firstColumn="1" w:lastColumn="0" w:noHBand="0" w:noVBand="1"/>
       </w:tblPr>
       <w:tblGrid>
-        <w:gridCol w:w="4510"/>
-        <w:gridCol w:w="4835"/>
+        <w:gridCol w:w="2350"/>
+        <w:gridCol w:w="3963"/>
+        <w:gridCol w:w="3032"/>
       </w:tblGrid>
       <w:tr>
         <w:tc>
           <w:tcPr>
-            <w:tcW w:w="5112" w:type="dxa"/>
+            <w:tcW w:w="2991" w:type="dxa"/>
           </w:tcPr>
           <w:p>
             <w:pPr>
@@ -16158,7 +16360,7 @@
         </w:tc>
         <w:tc>
           <w:tcPr>
-            <w:tcW w:w="5112" w:type="dxa"/>
+            <w:tcW w:w="4138" w:type="dxa"/>
           </w:tcPr>
           <w:p>
             <w:pPr>
@@ -16175,7 +16377,30 @@
                 <w:sz w:val="28"/>
                 <w:szCs w:val="28"/>
               </w:rPr>
-              <w:t>Применение в проекте</w:t>
+              <w:t>Пример</w:t>
+            </w:r>
+          </w:p>
+        </w:tc>
+        <w:tc>
+          <w:tcPr>
+            <w:tcW w:w="2216" w:type="dxa"/>
+          </w:tcPr>
+          <w:p>
+            <w:pPr>
+              <w:spacing w:line="240" w:lineRule="auto"/>
+              <w:rPr>
+                <w:rFonts w:ascii="Times New Roman" w:hAnsi="Times New Roman" w:cs="Times New Roman"/>
+                <w:sz w:val="28"/>
+                <w:szCs w:val="28"/>
+              </w:rPr>
+            </w:pPr>
+            <w:r>
+              <w:rPr>
+                <w:rFonts w:ascii="Times New Roman" w:hAnsi="Times New Roman" w:cs="Times New Roman"/>
+                <w:sz w:val="28"/>
+                <w:szCs w:val="28"/>
+              </w:rPr>
+              <w:t>Как проявляется в проекте</w:t>
             </w:r>
           </w:p>
         </w:tc>
@@ -16183,11 +16408,36 @@
       <w:tr>
         <w:tc>
           <w:tcPr>
-            <w:tcW w:w="5112" w:type="dxa"/>
+            <w:tcW w:w="2991" w:type="dxa"/>
           </w:tcPr>
           <w:p>
             <w:pPr>
               <w:spacing w:line="240" w:lineRule="auto"/>
+              <w:jc w:val="both"/>
+              <w:rPr>
+                <w:rFonts w:ascii="Times New Roman" w:hAnsi="Times New Roman" w:cs="Times New Roman"/>
+                <w:sz w:val="28"/>
+                <w:szCs w:val="28"/>
+              </w:rPr>
+            </w:pPr>
+            <w:r>
+              <w:rPr>
+                <w:rFonts w:ascii="Times New Roman" w:hAnsi="Times New Roman" w:cs="Times New Roman"/>
+                <w:sz w:val="28"/>
+                <w:szCs w:val="28"/>
+              </w:rPr>
+              <w:t>S</w:t>
+            </w:r>
+          </w:p>
+        </w:tc>
+        <w:tc>
+          <w:tcPr>
+            <w:tcW w:w="4138" w:type="dxa"/>
+          </w:tcPr>
+          <w:p>
+            <w:pPr>
+              <w:spacing w:line="240" w:lineRule="auto"/>
+              <w:jc w:val="both"/>
               <w:rPr>
                 <w:rFonts w:ascii="Times New Roman" w:hAnsi="Times New Roman" w:cs="Times New Roman"/>
                 <w:sz w:val="28"/>
@@ -16201,7 +16451,7 @@
                 <w:sz w:val="28"/>
                 <w:szCs w:val="28"/>
               </w:rPr>
-              <w:t>Single</w:t>
+              <w:t>SendSuspectMessageUseCase</w:t>
             </w:r>
             <w:proofErr w:type="spellEnd"/>
             <w:r>
@@ -16210,6 +16460,76 @@
                 <w:sz w:val="28"/>
                 <w:szCs w:val="28"/>
               </w:rPr>
+              <w:t xml:space="preserve">, </w:t>
+            </w:r>
+            <w:proofErr w:type="spellStart"/>
+            <w:r>
+              <w:rPr>
+                <w:rFonts w:ascii="Times New Roman" w:hAnsi="Times New Roman" w:cs="Times New Roman"/>
+                <w:sz w:val="28"/>
+                <w:szCs w:val="28"/>
+              </w:rPr>
+              <w:t>SupabaseDialogueRepository</w:t>
+            </w:r>
+            <w:proofErr w:type="spellEnd"/>
+            <w:r>
+              <w:rPr>
+                <w:rFonts w:ascii="Times New Roman" w:hAnsi="Times New Roman" w:cs="Times New Roman"/>
+                <w:sz w:val="28"/>
+                <w:szCs w:val="28"/>
+              </w:rPr>
+              <w:t xml:space="preserve">, </w:t>
+            </w:r>
+            <w:proofErr w:type="spellStart"/>
+            <w:r>
+              <w:rPr>
+                <w:rFonts w:ascii="Times New Roman" w:hAnsi="Times New Roman" w:cs="Times New Roman"/>
+                <w:sz w:val="28"/>
+                <w:szCs w:val="28"/>
+              </w:rPr>
+              <w:t>DialogueViewModel</w:t>
+            </w:r>
+            <w:proofErr w:type="spellEnd"/>
+          </w:p>
+        </w:tc>
+        <w:tc>
+          <w:tcPr>
+            <w:tcW w:w="2216" w:type="dxa"/>
+          </w:tcPr>
+          <w:p>
+            <w:pPr>
+              <w:spacing w:line="240" w:lineRule="auto"/>
+              <w:jc w:val="both"/>
+              <w:rPr>
+                <w:rFonts w:ascii="Times New Roman" w:hAnsi="Times New Roman" w:cs="Times New Roman"/>
+                <w:sz w:val="28"/>
+                <w:szCs w:val="28"/>
+              </w:rPr>
+            </w:pPr>
+            <w:r>
+              <w:rPr>
+                <w:rFonts w:ascii="Times New Roman" w:hAnsi="Times New Roman" w:cs="Times New Roman"/>
+                <w:sz w:val="28"/>
+                <w:szCs w:val="28"/>
+              </w:rPr>
+              <w:t xml:space="preserve">У каждого класса одна причина для изменения. </w:t>
+            </w:r>
+            <w:proofErr w:type="spellStart"/>
+            <w:r>
+              <w:rPr>
+                <w:rFonts w:ascii="Times New Roman" w:hAnsi="Times New Roman" w:cs="Times New Roman"/>
+                <w:sz w:val="28"/>
+                <w:szCs w:val="28"/>
+              </w:rPr>
+              <w:t>Use</w:t>
+            </w:r>
+            <w:proofErr w:type="spellEnd"/>
+            <w:r>
+              <w:rPr>
+                <w:rFonts w:ascii="Times New Roman" w:hAnsi="Times New Roman" w:cs="Times New Roman"/>
+                <w:sz w:val="28"/>
+                <w:szCs w:val="28"/>
+              </w:rPr>
               <w:t xml:space="preserve"> </w:t>
             </w:r>
             <w:proofErr w:type="spellStart"/>
@@ -16219,24 +16539,25 @@
                 <w:sz w:val="28"/>
                 <w:szCs w:val="28"/>
               </w:rPr>
-              <w:t>Responsibility</w:t>
+              <w:t>case</w:t>
             </w:r>
             <w:proofErr w:type="spellEnd"/>
-          </w:p>
-        </w:tc>
-        <w:tc>
-          <w:tcPr>
-            <w:tcW w:w="5112" w:type="dxa"/>
-          </w:tcPr>
-          <w:p>
-            <w:pPr>
-              <w:spacing w:line="240" w:lineRule="auto"/>
-              <w:rPr>
-                <w:rFonts w:ascii="Times New Roman" w:hAnsi="Times New Roman" w:cs="Times New Roman"/>
-                <w:sz w:val="28"/>
-                <w:szCs w:val="28"/>
-              </w:rPr>
-            </w:pPr>
+            <w:r>
+              <w:rPr>
+                <w:rFonts w:ascii="Times New Roman" w:hAnsi="Times New Roman" w:cs="Times New Roman"/>
+                <w:sz w:val="28"/>
+                <w:szCs w:val="28"/>
+              </w:rPr>
+              <w:t xml:space="preserve"> отвечает толь</w:t>
+            </w:r>
+            <w:r>
+              <w:rPr>
+                <w:rFonts w:ascii="Times New Roman" w:hAnsi="Times New Roman" w:cs="Times New Roman"/>
+                <w:sz w:val="28"/>
+                <w:szCs w:val="28"/>
+              </w:rPr>
+              <w:t xml:space="preserve">ко за сценарий отправки вопроса, </w:t>
+            </w:r>
             <w:proofErr w:type="spellStart"/>
             <w:r>
               <w:rPr>
@@ -16244,7 +16565,7 @@
                 <w:sz w:val="28"/>
                 <w:szCs w:val="28"/>
               </w:rPr>
-              <w:t>SendSuspectMessageUseCase</w:t>
+              <w:t>репозиторий</w:t>
             </w:r>
             <w:proofErr w:type="spellEnd"/>
             <w:r>
@@ -16253,7 +16574,7 @@
                 <w:sz w:val="28"/>
                 <w:szCs w:val="28"/>
               </w:rPr>
-              <w:t xml:space="preserve"> отвечает за сценарий отправки вопроса; </w:t>
+              <w:t xml:space="preserve"> за доступ к диалогам в </w:t>
             </w:r>
             <w:proofErr w:type="spellStart"/>
             <w:r>
@@ -16262,7 +16583,7 @@
                 <w:sz w:val="28"/>
                 <w:szCs w:val="28"/>
               </w:rPr>
-              <w:t>SupabaseDialogueRepository</w:t>
+              <w:t>Supabase</w:t>
             </w:r>
             <w:proofErr w:type="spellEnd"/>
             <w:r>
@@ -16271,7 +16592,7 @@
                 <w:sz w:val="28"/>
                 <w:szCs w:val="28"/>
               </w:rPr>
-              <w:t xml:space="preserve"> — за доступ к диалогам; </w:t>
+              <w:t xml:space="preserve">, </w:t>
             </w:r>
             <w:proofErr w:type="spellStart"/>
             <w:r>
@@ -16280,7 +16601,7 @@
                 <w:sz w:val="28"/>
                 <w:szCs w:val="28"/>
               </w:rPr>
-              <w:t>DialogueViewModel</w:t>
+              <w:t>ViewModel</w:t>
             </w:r>
             <w:proofErr w:type="spellEnd"/>
             <w:r>
@@ -16289,7 +16610,31 @@
                 <w:sz w:val="28"/>
                 <w:szCs w:val="28"/>
               </w:rPr>
-              <w:t xml:space="preserve"> — за состояние экрана.</w:t>
+              <w:t xml:space="preserve"> </w:t>
+            </w:r>
+            <w:r>
+              <w:rPr>
+                <w:rFonts w:ascii="Times New Roman" w:hAnsi="Times New Roman" w:cs="Times New Roman"/>
+                <w:sz w:val="28"/>
+                <w:szCs w:val="28"/>
+              </w:rPr>
+              <w:t>-</w:t>
+            </w:r>
+            <w:r>
+              <w:rPr>
+                <w:rFonts w:ascii="Times New Roman" w:hAnsi="Times New Roman" w:cs="Times New Roman"/>
+                <w:sz w:val="28"/>
+                <w:szCs w:val="28"/>
+              </w:rPr>
+              <w:t xml:space="preserve"> </w:t>
+            </w:r>
+            <w:r>
+              <w:rPr>
+                <w:rFonts w:ascii="Times New Roman" w:hAnsi="Times New Roman" w:cs="Times New Roman"/>
+                <w:sz w:val="28"/>
+                <w:szCs w:val="28"/>
+              </w:rPr>
+              <w:t>за состояние экрана чата.</w:t>
             </w:r>
           </w:p>
         </w:tc>
@@ -16297,11 +16642,36 @@
       <w:tr>
         <w:tc>
           <w:tcPr>
-            <w:tcW w:w="5112" w:type="dxa"/>
+            <w:tcW w:w="2991" w:type="dxa"/>
           </w:tcPr>
           <w:p>
             <w:pPr>
               <w:spacing w:line="240" w:lineRule="auto"/>
+              <w:jc w:val="both"/>
+              <w:rPr>
+                <w:rFonts w:ascii="Times New Roman" w:hAnsi="Times New Roman" w:cs="Times New Roman"/>
+                <w:sz w:val="28"/>
+                <w:szCs w:val="28"/>
+              </w:rPr>
+            </w:pPr>
+            <w:r>
+              <w:rPr>
+                <w:rFonts w:ascii="Times New Roman" w:hAnsi="Times New Roman" w:cs="Times New Roman"/>
+                <w:sz w:val="28"/>
+                <w:szCs w:val="28"/>
+              </w:rPr>
+              <w:t>O</w:t>
+            </w:r>
+          </w:p>
+        </w:tc>
+        <w:tc>
+          <w:tcPr>
+            <w:tcW w:w="4138" w:type="dxa"/>
+          </w:tcPr>
+          <w:p>
+            <w:pPr>
+              <w:spacing w:line="240" w:lineRule="auto"/>
+              <w:jc w:val="both"/>
               <w:rPr>
                 <w:rFonts w:ascii="Times New Roman" w:hAnsi="Times New Roman" w:cs="Times New Roman"/>
                 <w:sz w:val="28"/>
@@ -16315,17 +16685,25 @@
                 <w:sz w:val="28"/>
                 <w:szCs w:val="28"/>
               </w:rPr>
-              <w:t>Open</w:t>
+              <w:t>PlayPuzzleUseCase</w:t>
             </w:r>
             <w:proofErr w:type="spellEnd"/>
-            <w:r>
-              <w:rPr>
-                <w:rFonts w:ascii="Times New Roman" w:hAnsi="Times New Roman" w:cs="Times New Roman"/>
-                <w:sz w:val="28"/>
-                <w:szCs w:val="28"/>
-              </w:rPr>
-              <w:t>/</w:t>
-            </w:r>
+          </w:p>
+        </w:tc>
+        <w:tc>
+          <w:tcPr>
+            <w:tcW w:w="2216" w:type="dxa"/>
+          </w:tcPr>
+          <w:p>
+            <w:pPr>
+              <w:spacing w:line="240" w:lineRule="auto"/>
+              <w:jc w:val="both"/>
+              <w:rPr>
+                <w:rFonts w:ascii="Times New Roman" w:hAnsi="Times New Roman" w:cs="Times New Roman"/>
+                <w:sz w:val="28"/>
+                <w:szCs w:val="28"/>
+              </w:rPr>
+            </w:pPr>
             <w:proofErr w:type="spellStart"/>
             <w:r>
               <w:rPr>
@@ -16333,24 +16711,17 @@
                 <w:sz w:val="28"/>
                 <w:szCs w:val="28"/>
               </w:rPr>
-              <w:t>Closed</w:t>
+              <w:t>PlayPuzzleUseCase</w:t>
             </w:r>
             <w:proofErr w:type="spellEnd"/>
-          </w:p>
-        </w:tc>
-        <w:tc>
-          <w:tcPr>
-            <w:tcW w:w="5112" w:type="dxa"/>
-          </w:tcPr>
-          <w:p>
-            <w:pPr>
-              <w:spacing w:line="240" w:lineRule="auto"/>
-              <w:rPr>
-                <w:rFonts w:ascii="Times New Roman" w:hAnsi="Times New Roman" w:cs="Times New Roman"/>
-                <w:sz w:val="28"/>
-                <w:szCs w:val="28"/>
-              </w:rPr>
-            </w:pPr>
+            <w:r>
+              <w:rPr>
+                <w:rFonts w:ascii="Times New Roman" w:hAnsi="Times New Roman" w:cs="Times New Roman"/>
+                <w:sz w:val="28"/>
+                <w:szCs w:val="28"/>
+              </w:rPr>
+              <w:t xml:space="preserve"> работает с абстракцией </w:t>
+            </w:r>
             <w:proofErr w:type="spellStart"/>
             <w:r>
               <w:rPr>
@@ -16358,7 +16729,7 @@
                 <w:sz w:val="28"/>
                 <w:szCs w:val="28"/>
               </w:rPr>
-              <w:t>PuzzleGameUseCase</w:t>
+              <w:t>Puzzle</w:t>
             </w:r>
             <w:proofErr w:type="spellEnd"/>
             <w:r>
@@ -16367,9 +16738,37 @@
                 <w:sz w:val="28"/>
                 <w:szCs w:val="28"/>
               </w:rPr>
-              <w:t xml:space="preserve"> работает с абстракцией </w:t>
+              <w:t xml:space="preserve"> и вызывает </w:t>
             </w:r>
             <w:proofErr w:type="spellStart"/>
+            <w:proofErr w:type="gramStart"/>
+            <w:r>
+              <w:rPr>
+                <w:rFonts w:ascii="Times New Roman" w:hAnsi="Times New Roman" w:cs="Times New Roman"/>
+                <w:sz w:val="28"/>
+                <w:szCs w:val="28"/>
+              </w:rPr>
+              <w:t>checkAnswer</w:t>
+            </w:r>
+            <w:proofErr w:type="spellEnd"/>
+            <w:r>
+              <w:rPr>
+                <w:rFonts w:ascii="Times New Roman" w:hAnsi="Times New Roman" w:cs="Times New Roman"/>
+                <w:sz w:val="28"/>
+                <w:szCs w:val="28"/>
+              </w:rPr>
+              <w:t>(</w:t>
+            </w:r>
+            <w:proofErr w:type="gramEnd"/>
+            <w:r>
+              <w:rPr>
+                <w:rFonts w:ascii="Times New Roman" w:hAnsi="Times New Roman" w:cs="Times New Roman"/>
+                <w:sz w:val="28"/>
+                <w:szCs w:val="28"/>
+              </w:rPr>
+              <w:t xml:space="preserve">). Чтобы добавить новый тип головоломки, достаточно написать новый класс, реализующий </w:t>
+            </w:r>
+            <w:proofErr w:type="spellStart"/>
             <w:r>
               <w:rPr>
                 <w:rFonts w:ascii="Times New Roman" w:hAnsi="Times New Roman" w:cs="Times New Roman"/>
@@ -16385,7 +16784,7 @@
                 <w:sz w:val="28"/>
                 <w:szCs w:val="28"/>
               </w:rPr>
-              <w:t xml:space="preserve">; </w:t>
+              <w:t xml:space="preserve">. Код </w:t>
             </w:r>
             <w:proofErr w:type="spellStart"/>
             <w:r>
@@ -16394,7 +16793,7 @@
                 <w:sz w:val="28"/>
                 <w:szCs w:val="28"/>
               </w:rPr>
-              <w:t>MorsePuzzle</w:t>
+              <w:t>use</w:t>
             </w:r>
             <w:proofErr w:type="spellEnd"/>
             <w:r>
@@ -16403,16 +16802,25 @@
                 <w:sz w:val="28"/>
                 <w:szCs w:val="28"/>
               </w:rPr>
-              <w:t xml:space="preserve"> — одна реализация, новые типы </w:t>
-            </w:r>
-            <w:r>
-              <w:rPr>
-                <w:rFonts w:ascii="Times New Roman" w:hAnsi="Times New Roman" w:cs="Times New Roman"/>
-                <w:sz w:val="28"/>
-                <w:szCs w:val="28"/>
-              </w:rPr>
-              <w:lastRenderedPageBreak/>
-              <w:t>головоломок добавляются отдельными классами.</w:t>
+              <w:t xml:space="preserve"> </w:t>
+            </w:r>
+            <w:proofErr w:type="spellStart"/>
+            <w:r>
+              <w:rPr>
+                <w:rFonts w:ascii="Times New Roman" w:hAnsi="Times New Roman" w:cs="Times New Roman"/>
+                <w:sz w:val="28"/>
+                <w:szCs w:val="28"/>
+              </w:rPr>
+              <w:t>case</w:t>
+            </w:r>
+            <w:proofErr w:type="spellEnd"/>
+            <w:r>
+              <w:rPr>
+                <w:rFonts w:ascii="Times New Roman" w:hAnsi="Times New Roman" w:cs="Times New Roman"/>
+                <w:sz w:val="28"/>
+                <w:szCs w:val="28"/>
+              </w:rPr>
+              <w:t xml:space="preserve"> менять не нужно</w:t>
             </w:r>
           </w:p>
         </w:tc>
@@ -16420,11 +16828,36 @@
       <w:tr>
         <w:tc>
           <w:tcPr>
-            <w:tcW w:w="5112" w:type="dxa"/>
+            <w:tcW w:w="2991" w:type="dxa"/>
           </w:tcPr>
           <w:p>
             <w:pPr>
               <w:spacing w:line="240" w:lineRule="auto"/>
+              <w:jc w:val="both"/>
+              <w:rPr>
+                <w:rFonts w:ascii="Times New Roman" w:hAnsi="Times New Roman" w:cs="Times New Roman"/>
+                <w:sz w:val="28"/>
+                <w:szCs w:val="28"/>
+              </w:rPr>
+            </w:pPr>
+            <w:r>
+              <w:rPr>
+                <w:rFonts w:ascii="Times New Roman" w:hAnsi="Times New Roman" w:cs="Times New Roman"/>
+                <w:sz w:val="28"/>
+                <w:szCs w:val="28"/>
+              </w:rPr>
+              <w:t>L</w:t>
+            </w:r>
+          </w:p>
+        </w:tc>
+        <w:tc>
+          <w:tcPr>
+            <w:tcW w:w="4138" w:type="dxa"/>
+          </w:tcPr>
+          <w:p>
+            <w:pPr>
+              <w:spacing w:line="240" w:lineRule="auto"/>
+              <w:jc w:val="both"/>
               <w:rPr>
                 <w:rFonts w:ascii="Times New Roman" w:hAnsi="Times New Roman" w:cs="Times New Roman"/>
                 <w:sz w:val="28"/>
@@ -16438,10 +16871,79 @@
                 <w:sz w:val="28"/>
                 <w:szCs w:val="28"/>
               </w:rPr>
-              <w:lastRenderedPageBreak/>
-              <w:t>Liskov</w:t>
+              <w:t>ClueRepository</w:t>
             </w:r>
             <w:proofErr w:type="spellEnd"/>
+          </w:p>
+        </w:tc>
+        <w:tc>
+          <w:tcPr>
+            <w:tcW w:w="2216" w:type="dxa"/>
+          </w:tcPr>
+          <w:p>
+            <w:pPr>
+              <w:spacing w:line="240" w:lineRule="auto"/>
+              <w:jc w:val="both"/>
+              <w:rPr>
+                <w:rFonts w:ascii="Times New Roman" w:hAnsi="Times New Roman" w:cs="Times New Roman"/>
+                <w:sz w:val="28"/>
+                <w:szCs w:val="28"/>
+              </w:rPr>
+            </w:pPr>
+            <w:r>
+              <w:rPr>
+                <w:rFonts w:ascii="Times New Roman" w:hAnsi="Times New Roman" w:cs="Times New Roman"/>
+                <w:sz w:val="28"/>
+                <w:szCs w:val="28"/>
+              </w:rPr>
+              <w:t xml:space="preserve">Реализации взаимозаменяемы: </w:t>
+            </w:r>
+            <w:proofErr w:type="spellStart"/>
+            <w:r>
+              <w:rPr>
+                <w:rFonts w:ascii="Times New Roman" w:hAnsi="Times New Roman" w:cs="Times New Roman"/>
+                <w:sz w:val="28"/>
+                <w:szCs w:val="28"/>
+              </w:rPr>
+              <w:t>FakeClueRepository</w:t>
+            </w:r>
+            <w:proofErr w:type="spellEnd"/>
+            <w:r>
+              <w:rPr>
+                <w:rFonts w:ascii="Times New Roman" w:hAnsi="Times New Roman" w:cs="Times New Roman"/>
+                <w:sz w:val="28"/>
+                <w:szCs w:val="28"/>
+              </w:rPr>
+              <w:t xml:space="preserve"> (для тестов) подставляется вместо </w:t>
+            </w:r>
+            <w:proofErr w:type="spellStart"/>
+            <w:r>
+              <w:rPr>
+                <w:rFonts w:ascii="Times New Roman" w:hAnsi="Times New Roman" w:cs="Times New Roman"/>
+                <w:sz w:val="28"/>
+                <w:szCs w:val="28"/>
+              </w:rPr>
+              <w:t>SupabaseClueRepository</w:t>
+            </w:r>
+            <w:proofErr w:type="spellEnd"/>
+            <w:r>
+              <w:rPr>
+                <w:rFonts w:ascii="Times New Roman" w:hAnsi="Times New Roman" w:cs="Times New Roman"/>
+                <w:sz w:val="28"/>
+                <w:szCs w:val="28"/>
+              </w:rPr>
+              <w:t xml:space="preserve"> без изменения </w:t>
+            </w:r>
+            <w:proofErr w:type="spellStart"/>
+            <w:r>
+              <w:rPr>
+                <w:rFonts w:ascii="Times New Roman" w:hAnsi="Times New Roman" w:cs="Times New Roman"/>
+                <w:sz w:val="28"/>
+                <w:szCs w:val="28"/>
+              </w:rPr>
+              <w:t>use</w:t>
+            </w:r>
+            <w:proofErr w:type="spellEnd"/>
             <w:r>
               <w:rPr>
                 <w:rFonts w:ascii="Times New Roman" w:hAnsi="Times New Roman" w:cs="Times New Roman"/>
@@ -16457,77 +16959,16 @@
                 <w:sz w:val="28"/>
                 <w:szCs w:val="28"/>
               </w:rPr>
-              <w:t>Substitution</w:t>
+              <w:t>case</w:t>
             </w:r>
             <w:proofErr w:type="spellEnd"/>
-          </w:p>
-        </w:tc>
-        <w:tc>
-          <w:tcPr>
-            <w:tcW w:w="5112" w:type="dxa"/>
-          </w:tcPr>
-          <w:p>
-            <w:pPr>
-              <w:spacing w:line="240" w:lineRule="auto"/>
-              <w:rPr>
-                <w:rFonts w:ascii="Times New Roman" w:hAnsi="Times New Roman" w:cs="Times New Roman"/>
-                <w:sz w:val="28"/>
-                <w:szCs w:val="28"/>
-              </w:rPr>
-            </w:pPr>
-            <w:proofErr w:type="spellStart"/>
-            <w:r>
-              <w:rPr>
-                <w:rFonts w:ascii="Times New Roman" w:hAnsi="Times New Roman" w:cs="Times New Roman"/>
-                <w:sz w:val="28"/>
-                <w:szCs w:val="28"/>
-              </w:rPr>
-              <w:t>SupabaseClueRepository</w:t>
-            </w:r>
-            <w:proofErr w:type="spellEnd"/>
-            <w:r>
-              <w:rPr>
-                <w:rFonts w:ascii="Times New Roman" w:hAnsi="Times New Roman" w:cs="Times New Roman"/>
-                <w:sz w:val="28"/>
-                <w:szCs w:val="28"/>
-              </w:rPr>
-              <w:t xml:space="preserve"> и </w:t>
-            </w:r>
-            <w:proofErr w:type="spellStart"/>
-            <w:r>
-              <w:rPr>
-                <w:rFonts w:ascii="Times New Roman" w:hAnsi="Times New Roman" w:cs="Times New Roman"/>
-                <w:sz w:val="28"/>
-                <w:szCs w:val="28"/>
-              </w:rPr>
-              <w:t>FakeClueRepository</w:t>
-            </w:r>
-            <w:proofErr w:type="spellEnd"/>
-            <w:r>
-              <w:rPr>
-                <w:rFonts w:ascii="Times New Roman" w:hAnsi="Times New Roman" w:cs="Times New Roman"/>
-                <w:sz w:val="28"/>
-                <w:szCs w:val="28"/>
-              </w:rPr>
-              <w:t xml:space="preserve"> взаимозаменяемы через </w:t>
-            </w:r>
-            <w:proofErr w:type="spellStart"/>
-            <w:r>
-              <w:rPr>
-                <w:rFonts w:ascii="Times New Roman" w:hAnsi="Times New Roman" w:cs="Times New Roman"/>
-                <w:sz w:val="28"/>
-                <w:szCs w:val="28"/>
-              </w:rPr>
-              <w:t>ClueRepository</w:t>
-            </w:r>
-            <w:proofErr w:type="spellEnd"/>
-            <w:r>
-              <w:rPr>
-                <w:rFonts w:ascii="Times New Roman" w:hAnsi="Times New Roman" w:cs="Times New Roman"/>
-                <w:sz w:val="28"/>
-                <w:szCs w:val="28"/>
-              </w:rPr>
-              <w:t xml:space="preserve"> и соблюдают один контракт результата/ошибок.</w:t>
+            <w:r>
+              <w:rPr>
+                <w:rFonts w:ascii="Times New Roman" w:hAnsi="Times New Roman" w:cs="Times New Roman"/>
+                <w:sz w:val="28"/>
+                <w:szCs w:val="28"/>
+              </w:rPr>
+              <w:t xml:space="preserve"> и соблюдает тот же контракт: те же типы результатов и те же ошибки</w:t>
             </w:r>
           </w:p>
         </w:tc>
@@ -16535,15 +16976,41 @@
       <w:tr>
         <w:tc>
           <w:tcPr>
-            <w:tcW w:w="5112" w:type="dxa"/>
+            <w:tcW w:w="2991" w:type="dxa"/>
           </w:tcPr>
           <w:p>
             <w:pPr>
               <w:spacing w:line="240" w:lineRule="auto"/>
-              <w:rPr>
-                <w:rFonts w:ascii="Times New Roman" w:hAnsi="Times New Roman" w:cs="Times New Roman"/>
-                <w:sz w:val="28"/>
-                <w:szCs w:val="28"/>
+              <w:jc w:val="both"/>
+              <w:rPr>
+                <w:rFonts w:ascii="Times New Roman" w:hAnsi="Times New Roman" w:cs="Times New Roman"/>
+                <w:sz w:val="28"/>
+                <w:szCs w:val="28"/>
+              </w:rPr>
+            </w:pPr>
+            <w:r>
+              <w:rPr>
+                <w:rFonts w:ascii="Times New Roman" w:hAnsi="Times New Roman" w:cs="Times New Roman"/>
+                <w:sz w:val="28"/>
+                <w:szCs w:val="28"/>
+              </w:rPr>
+              <w:t>I</w:t>
+            </w:r>
+          </w:p>
+        </w:tc>
+        <w:tc>
+          <w:tcPr>
+            <w:tcW w:w="4138" w:type="dxa"/>
+          </w:tcPr>
+          <w:p>
+            <w:pPr>
+              <w:spacing w:line="240" w:lineRule="auto"/>
+              <w:jc w:val="both"/>
+              <w:rPr>
+                <w:rFonts w:ascii="Times New Roman" w:hAnsi="Times New Roman" w:cs="Times New Roman"/>
+                <w:sz w:val="28"/>
+                <w:szCs w:val="28"/>
+                <w:lang w:val="en-US"/>
               </w:rPr>
             </w:pPr>
             <w:proofErr w:type="spellStart"/>
@@ -16552,10 +17019,54 @@
                 <w:rFonts w:ascii="Times New Roman" w:hAnsi="Times New Roman" w:cs="Times New Roman"/>
                 <w:sz w:val="28"/>
                 <w:szCs w:val="28"/>
-              </w:rPr>
-              <w:t>Interface</w:t>
+                <w:lang w:val="en-US"/>
+              </w:rPr>
+              <w:t>Auth</w:t>
+            </w:r>
+            <w:r>
+              <w:rPr>
+                <w:rFonts w:ascii="Times New Roman" w:hAnsi="Times New Roman" w:cs="Times New Roman"/>
+                <w:sz w:val="28"/>
+                <w:szCs w:val="28"/>
+                <w:lang w:val="en-US"/>
+              </w:rPr>
+              <w:t>Repository</w:t>
             </w:r>
             <w:proofErr w:type="spellEnd"/>
+          </w:p>
+        </w:tc>
+        <w:tc>
+          <w:tcPr>
+            <w:tcW w:w="2216" w:type="dxa"/>
+          </w:tcPr>
+          <w:p>
+            <w:pPr>
+              <w:spacing w:line="240" w:lineRule="auto"/>
+              <w:jc w:val="both"/>
+              <w:rPr>
+                <w:rFonts w:ascii="Times New Roman" w:hAnsi="Times New Roman" w:cs="Times New Roman"/>
+                <w:sz w:val="28"/>
+                <w:szCs w:val="28"/>
+              </w:rPr>
+            </w:pPr>
+            <w:r>
+              <w:rPr>
+                <w:rFonts w:ascii="Times New Roman" w:hAnsi="Times New Roman" w:cs="Times New Roman"/>
+                <w:sz w:val="28"/>
+                <w:szCs w:val="28"/>
+              </w:rPr>
+              <w:t xml:space="preserve">Вместо одного большого </w:t>
+            </w:r>
+            <w:proofErr w:type="spellStart"/>
+            <w:r>
+              <w:rPr>
+                <w:rFonts w:ascii="Times New Roman" w:hAnsi="Times New Roman" w:cs="Times New Roman"/>
+                <w:sz w:val="28"/>
+                <w:szCs w:val="28"/>
+              </w:rPr>
+              <w:t>GameRepository</w:t>
+            </w:r>
+            <w:proofErr w:type="spellEnd"/>
             <w:r>
               <w:rPr>
                 <w:rFonts w:ascii="Times New Roman" w:hAnsi="Times New Roman" w:cs="Times New Roman"/>
@@ -16564,6 +17075,15 @@
               </w:rPr>
               <w:t xml:space="preserve"> </w:t>
             </w:r>
+            <w:r>
+              <w:rPr>
+                <w:rFonts w:ascii="Times New Roman" w:hAnsi="Times New Roman" w:cs="Times New Roman"/>
+                <w:sz w:val="28"/>
+                <w:szCs w:val="28"/>
+              </w:rPr>
+              <w:lastRenderedPageBreak/>
+              <w:t xml:space="preserve">созданы 7 небольших интерфейсов по задачам. </w:t>
+            </w:r>
             <w:proofErr w:type="spellStart"/>
             <w:r>
               <w:rPr>
@@ -16571,24 +17091,17 @@
                 <w:sz w:val="28"/>
                 <w:szCs w:val="28"/>
               </w:rPr>
-              <w:t>Segregation</w:t>
+              <w:t>SignInUseCase</w:t>
             </w:r>
             <w:proofErr w:type="spellEnd"/>
-          </w:p>
-        </w:tc>
-        <w:tc>
-          <w:tcPr>
-            <w:tcW w:w="5112" w:type="dxa"/>
-          </w:tcPr>
-          <w:p>
-            <w:pPr>
-              <w:spacing w:line="240" w:lineRule="auto"/>
-              <w:rPr>
-                <w:rFonts w:ascii="Times New Roman" w:hAnsi="Times New Roman" w:cs="Times New Roman"/>
-                <w:sz w:val="28"/>
-                <w:szCs w:val="28"/>
-              </w:rPr>
-            </w:pPr>
+            <w:r>
+              <w:rPr>
+                <w:rFonts w:ascii="Times New Roman" w:hAnsi="Times New Roman" w:cs="Times New Roman"/>
+                <w:sz w:val="28"/>
+                <w:szCs w:val="28"/>
+              </w:rPr>
+              <w:t xml:space="preserve"> зависит только от </w:t>
+            </w:r>
             <w:proofErr w:type="spellStart"/>
             <w:r>
               <w:rPr>
@@ -16605,61 +17118,7 @@
                 <w:sz w:val="28"/>
                 <w:szCs w:val="28"/>
               </w:rPr>
-              <w:t xml:space="preserve">, </w:t>
-            </w:r>
-            <w:proofErr w:type="spellStart"/>
-            <w:r>
-              <w:rPr>
-                <w:rFonts w:ascii="Times New Roman" w:hAnsi="Times New Roman" w:cs="Times New Roman"/>
-                <w:sz w:val="28"/>
-                <w:szCs w:val="28"/>
-              </w:rPr>
-              <w:t>ClueRepository</w:t>
-            </w:r>
-            <w:proofErr w:type="spellEnd"/>
-            <w:r>
-              <w:rPr>
-                <w:rFonts w:ascii="Times New Roman" w:hAnsi="Times New Roman" w:cs="Times New Roman"/>
-                <w:sz w:val="28"/>
-                <w:szCs w:val="28"/>
-              </w:rPr>
-              <w:t xml:space="preserve"> и </w:t>
-            </w:r>
-            <w:proofErr w:type="spellStart"/>
-            <w:r>
-              <w:rPr>
-                <w:rFonts w:ascii="Times New Roman" w:hAnsi="Times New Roman" w:cs="Times New Roman"/>
-                <w:sz w:val="28"/>
-                <w:szCs w:val="28"/>
-              </w:rPr>
-              <w:t>DialogueRepository</w:t>
-            </w:r>
-            <w:proofErr w:type="spellEnd"/>
-            <w:r>
-              <w:rPr>
-                <w:rFonts w:ascii="Times New Roman" w:hAnsi="Times New Roman" w:cs="Times New Roman"/>
-                <w:sz w:val="28"/>
-                <w:szCs w:val="28"/>
-              </w:rPr>
-              <w:t xml:space="preserve"> разделены по задачам вместо одного большого </w:t>
-            </w:r>
-            <w:proofErr w:type="spellStart"/>
-            <w:r>
-              <w:rPr>
-                <w:rFonts w:ascii="Times New Roman" w:hAnsi="Times New Roman" w:cs="Times New Roman"/>
-                <w:sz w:val="28"/>
-                <w:szCs w:val="28"/>
-              </w:rPr>
-              <w:t>GameRepository</w:t>
-            </w:r>
-            <w:proofErr w:type="spellEnd"/>
-            <w:r>
-              <w:rPr>
-                <w:rFonts w:ascii="Times New Roman" w:hAnsi="Times New Roman" w:cs="Times New Roman"/>
-                <w:sz w:val="28"/>
-                <w:szCs w:val="28"/>
-              </w:rPr>
-              <w:t>.</w:t>
+              <w:t xml:space="preserve"> и не знает про диалоги и улики</w:t>
             </w:r>
           </w:p>
         </w:tc>
@@ -16667,15 +17126,42 @@
       <w:tr>
         <w:tc>
           <w:tcPr>
-            <w:tcW w:w="5112" w:type="dxa"/>
+            <w:tcW w:w="2991" w:type="dxa"/>
           </w:tcPr>
           <w:p>
             <w:pPr>
               <w:spacing w:line="240" w:lineRule="auto"/>
-              <w:rPr>
-                <w:rFonts w:ascii="Times New Roman" w:hAnsi="Times New Roman" w:cs="Times New Roman"/>
-                <w:sz w:val="28"/>
-                <w:szCs w:val="28"/>
+              <w:jc w:val="both"/>
+              <w:rPr>
+                <w:rFonts w:ascii="Times New Roman" w:hAnsi="Times New Roman" w:cs="Times New Roman"/>
+                <w:sz w:val="28"/>
+                <w:szCs w:val="28"/>
+              </w:rPr>
+            </w:pPr>
+            <w:r>
+              <w:rPr>
+                <w:rFonts w:ascii="Times New Roman" w:hAnsi="Times New Roman" w:cs="Times New Roman"/>
+                <w:sz w:val="28"/>
+                <w:szCs w:val="28"/>
+              </w:rPr>
+              <w:lastRenderedPageBreak/>
+              <w:t>D</w:t>
+            </w:r>
+          </w:p>
+        </w:tc>
+        <w:tc>
+          <w:tcPr>
+            <w:tcW w:w="4138" w:type="dxa"/>
+          </w:tcPr>
+          <w:p>
+            <w:pPr>
+              <w:spacing w:line="240" w:lineRule="auto"/>
+              <w:jc w:val="both"/>
+              <w:rPr>
+                <w:rFonts w:ascii="Times New Roman" w:hAnsi="Times New Roman" w:cs="Times New Roman"/>
+                <w:sz w:val="28"/>
+                <w:szCs w:val="28"/>
+                <w:lang w:val="en-US"/>
               </w:rPr>
             </w:pPr>
             <w:proofErr w:type="spellStart"/>
@@ -16685,9 +17171,43 @@
                 <w:sz w:val="28"/>
                 <w:szCs w:val="28"/>
               </w:rPr>
-              <w:t>Dependency</w:t>
+              <w:t>SendSuspectMessag</w:t>
+            </w:r>
+            <w:r>
+              <w:rPr>
+                <w:rFonts w:ascii="Times New Roman" w:hAnsi="Times New Roman" w:cs="Times New Roman"/>
+                <w:sz w:val="28"/>
+                <w:szCs w:val="28"/>
+              </w:rPr>
+              <w:t>eUseCase</w:t>
             </w:r>
             <w:proofErr w:type="spellEnd"/>
+          </w:p>
+        </w:tc>
+        <w:tc>
+          <w:tcPr>
+            <w:tcW w:w="2216" w:type="dxa"/>
+          </w:tcPr>
+          <w:p>
+            <w:pPr>
+              <w:spacing w:line="240" w:lineRule="auto"/>
+              <w:jc w:val="both"/>
+              <w:rPr>
+                <w:rFonts w:ascii="Times New Roman" w:hAnsi="Times New Roman" w:cs="Times New Roman"/>
+                <w:sz w:val="28"/>
+                <w:szCs w:val="28"/>
+              </w:rPr>
+            </w:pPr>
+            <w:proofErr w:type="spellStart"/>
+            <w:r>
+              <w:rPr>
+                <w:rFonts w:ascii="Times New Roman" w:hAnsi="Times New Roman" w:cs="Times New Roman"/>
+                <w:sz w:val="28"/>
+                <w:szCs w:val="28"/>
+              </w:rPr>
+              <w:t>Use</w:t>
+            </w:r>
+            <w:proofErr w:type="spellEnd"/>
             <w:r>
               <w:rPr>
                 <w:rFonts w:ascii="Times New Roman" w:hAnsi="Times New Roman" w:cs="Times New Roman"/>
@@ -16703,34 +17223,25 @@
                 <w:sz w:val="28"/>
                 <w:szCs w:val="28"/>
               </w:rPr>
-              <w:t>Inversion</w:t>
+              <w:t>case</w:t>
             </w:r>
             <w:proofErr w:type="spellEnd"/>
-          </w:p>
-        </w:tc>
-        <w:tc>
-          <w:tcPr>
-            <w:tcW w:w="5112" w:type="dxa"/>
-          </w:tcPr>
-          <w:p>
-            <w:pPr>
-              <w:spacing w:line="240" w:lineRule="auto"/>
-              <w:rPr>
-                <w:rFonts w:ascii="Times New Roman" w:hAnsi="Times New Roman" w:cs="Times New Roman"/>
-                <w:sz w:val="28"/>
-                <w:szCs w:val="28"/>
-                <w:lang w:val="en-US"/>
-              </w:rPr>
-            </w:pPr>
+            <w:r>
+              <w:rPr>
+                <w:rFonts w:ascii="Times New Roman" w:hAnsi="Times New Roman" w:cs="Times New Roman"/>
+                <w:sz w:val="28"/>
+                <w:szCs w:val="28"/>
+              </w:rPr>
+              <w:t xml:space="preserve"> из </w:t>
+            </w:r>
             <w:proofErr w:type="spellStart"/>
             <w:r>
               <w:rPr>
                 <w:rFonts w:ascii="Times New Roman" w:hAnsi="Times New Roman" w:cs="Times New Roman"/>
                 <w:sz w:val="28"/>
                 <w:szCs w:val="28"/>
-                <w:lang w:val="en-US"/>
-              </w:rPr>
-              <w:t>SendSuspectMessageUseCase</w:t>
+              </w:rPr>
+              <w:t>Domain</w:t>
             </w:r>
             <w:proofErr w:type="spellEnd"/>
             <w:r>
@@ -16738,7 +17249,78 @@
                 <w:rFonts w:ascii="Times New Roman" w:hAnsi="Times New Roman" w:cs="Times New Roman"/>
                 <w:sz w:val="28"/>
                 <w:szCs w:val="28"/>
-                <w:lang w:val="en-US"/>
+              </w:rPr>
+              <w:t xml:space="preserve"> зависит от интерфейса </w:t>
+            </w:r>
+            <w:proofErr w:type="spellStart"/>
+            <w:r>
+              <w:rPr>
+                <w:rFonts w:ascii="Times New Roman" w:hAnsi="Times New Roman" w:cs="Times New Roman"/>
+                <w:sz w:val="28"/>
+                <w:szCs w:val="28"/>
+              </w:rPr>
+              <w:t>DialogueRepository</w:t>
+            </w:r>
+            <w:proofErr w:type="spellEnd"/>
+            <w:r>
+              <w:rPr>
+                <w:rFonts w:ascii="Times New Roman" w:hAnsi="Times New Roman" w:cs="Times New Roman"/>
+                <w:sz w:val="28"/>
+                <w:szCs w:val="28"/>
+              </w:rPr>
+              <w:t xml:space="preserve">, который описан в самом </w:t>
+            </w:r>
+            <w:proofErr w:type="spellStart"/>
+            <w:r>
+              <w:rPr>
+                <w:rFonts w:ascii="Times New Roman" w:hAnsi="Times New Roman" w:cs="Times New Roman"/>
+                <w:sz w:val="28"/>
+                <w:szCs w:val="28"/>
+              </w:rPr>
+              <w:t>Domain</w:t>
+            </w:r>
+            <w:proofErr w:type="spellEnd"/>
+            <w:r>
+              <w:rPr>
+                <w:rFonts w:ascii="Times New Roman" w:hAnsi="Times New Roman" w:cs="Times New Roman"/>
+                <w:sz w:val="28"/>
+                <w:szCs w:val="28"/>
+              </w:rPr>
+              <w:t xml:space="preserve">, а не от </w:t>
+            </w:r>
+            <w:proofErr w:type="spellStart"/>
+            <w:r>
+              <w:rPr>
+                <w:rFonts w:ascii="Times New Roman" w:hAnsi="Times New Roman" w:cs="Times New Roman"/>
+                <w:sz w:val="28"/>
+                <w:szCs w:val="28"/>
+              </w:rPr>
+              <w:t>Supabase</w:t>
+            </w:r>
+            <w:proofErr w:type="spellEnd"/>
+            <w:r>
+              <w:rPr>
+                <w:rFonts w:ascii="Times New Roman" w:hAnsi="Times New Roman" w:cs="Times New Roman"/>
+                <w:sz w:val="28"/>
+                <w:szCs w:val="28"/>
+              </w:rPr>
+              <w:t xml:space="preserve">. Реализация из слоя </w:t>
+            </w:r>
+            <w:proofErr w:type="spellStart"/>
+            <w:r>
+              <w:rPr>
+                <w:rFonts w:ascii="Times New Roman" w:hAnsi="Times New Roman" w:cs="Times New Roman"/>
+                <w:sz w:val="28"/>
+                <w:szCs w:val="28"/>
+              </w:rPr>
+              <w:t>Data</w:t>
+            </w:r>
+            <w:proofErr w:type="spellEnd"/>
+            <w:r>
+              <w:rPr>
+                <w:rFonts w:ascii="Times New Roman" w:hAnsi="Times New Roman" w:cs="Times New Roman"/>
+                <w:sz w:val="28"/>
+                <w:szCs w:val="28"/>
               </w:rPr>
               <w:t xml:space="preserve"> </w:t>
             </w:r>
@@ -16748,33 +17330,7 @@
                 <w:sz w:val="28"/>
                 <w:szCs w:val="28"/>
               </w:rPr>
-              <w:t>зависит</w:t>
-            </w:r>
-            <w:r>
-              <w:rPr>
-                <w:rFonts w:ascii="Times New Roman" w:hAnsi="Times New Roman" w:cs="Times New Roman"/>
-                <w:sz w:val="28"/>
-                <w:szCs w:val="28"/>
-                <w:lang w:val="en-US"/>
-              </w:rPr>
-              <w:t xml:space="preserve"> </w:t>
-            </w:r>
-            <w:r>
-              <w:rPr>
-                <w:rFonts w:ascii="Times New Roman" w:hAnsi="Times New Roman" w:cs="Times New Roman"/>
-                <w:sz w:val="28"/>
-                <w:szCs w:val="28"/>
-              </w:rPr>
-              <w:t>от</w:t>
-            </w:r>
-            <w:r>
-              <w:rPr>
-                <w:rFonts w:ascii="Times New Roman" w:hAnsi="Times New Roman" w:cs="Times New Roman"/>
-                <w:sz w:val="28"/>
-                <w:szCs w:val="28"/>
-                <w:lang w:val="en-US"/>
-              </w:rPr>
-              <w:t xml:space="preserve"> </w:t>
+              <w:t xml:space="preserve">подставляется через </w:t>
             </w:r>
             <w:proofErr w:type="spellStart"/>
             <w:r>
@@ -16782,9 +17338,8 @@
                 <w:rFonts w:ascii="Times New Roman" w:hAnsi="Times New Roman" w:cs="Times New Roman"/>
                 <w:sz w:val="28"/>
                 <w:szCs w:val="28"/>
-                <w:lang w:val="en-US"/>
-              </w:rPr>
-              <w:t>DialogueRepository</w:t>
+              </w:rPr>
+              <w:t>Hilt</w:t>
             </w:r>
             <w:proofErr w:type="spellEnd"/>
             <w:r>
@@ -16792,97 +17347,8 @@
                 <w:rFonts w:ascii="Times New Roman" w:hAnsi="Times New Roman" w:cs="Times New Roman"/>
                 <w:sz w:val="28"/>
                 <w:szCs w:val="28"/>
-                <w:lang w:val="en-US"/>
-              </w:rPr>
-              <w:t xml:space="preserve"> </w:t>
-            </w:r>
-            <w:r>
-              <w:rPr>
-                <w:rFonts w:ascii="Times New Roman" w:hAnsi="Times New Roman" w:cs="Times New Roman"/>
-                <w:sz w:val="28"/>
-                <w:szCs w:val="28"/>
-              </w:rPr>
-              <w:t>из</w:t>
-            </w:r>
-            <w:r>
-              <w:rPr>
-                <w:rFonts w:ascii="Times New Roman" w:hAnsi="Times New Roman" w:cs="Times New Roman"/>
-                <w:sz w:val="28"/>
-                <w:szCs w:val="28"/>
-                <w:lang w:val="en-US"/>
-              </w:rPr>
-              <w:t xml:space="preserve"> Domain, </w:t>
-            </w:r>
-            <w:r>
-              <w:rPr>
-                <w:rFonts w:ascii="Times New Roman" w:hAnsi="Times New Roman" w:cs="Times New Roman"/>
-                <w:sz w:val="28"/>
-                <w:szCs w:val="28"/>
-              </w:rPr>
-              <w:t>а</w:t>
-            </w:r>
-            <w:r>
-              <w:rPr>
-                <w:rFonts w:ascii="Times New Roman" w:hAnsi="Times New Roman" w:cs="Times New Roman"/>
-                <w:sz w:val="28"/>
-                <w:szCs w:val="28"/>
-                <w:lang w:val="en-US"/>
-              </w:rPr>
-              <w:t xml:space="preserve"> </w:t>
-            </w:r>
-            <w:r>
-              <w:rPr>
-                <w:rFonts w:ascii="Times New Roman" w:hAnsi="Times New Roman" w:cs="Times New Roman"/>
-                <w:sz w:val="28"/>
-                <w:szCs w:val="28"/>
-              </w:rPr>
-              <w:t>не</w:t>
-            </w:r>
-            <w:r>
-              <w:rPr>
-                <w:rFonts w:ascii="Times New Roman" w:hAnsi="Times New Roman" w:cs="Times New Roman"/>
-                <w:sz w:val="28"/>
-                <w:szCs w:val="28"/>
-                <w:lang w:val="en-US"/>
-              </w:rPr>
-              <w:t xml:space="preserve"> </w:t>
-            </w:r>
-            <w:r>
-              <w:rPr>
-                <w:rFonts w:ascii="Times New Roman" w:hAnsi="Times New Roman" w:cs="Times New Roman"/>
-                <w:sz w:val="28"/>
-                <w:szCs w:val="28"/>
-              </w:rPr>
-              <w:t>от</w:t>
-            </w:r>
-            <w:r>
-              <w:rPr>
-                <w:rFonts w:ascii="Times New Roman" w:hAnsi="Times New Roman" w:cs="Times New Roman"/>
-                <w:sz w:val="28"/>
-                <w:szCs w:val="28"/>
-                <w:lang w:val="en-US"/>
-              </w:rPr>
-              <w:t xml:space="preserve"> </w:t>
-            </w:r>
-            <w:proofErr w:type="spellStart"/>
-            <w:r>
-              <w:rPr>
-                <w:rFonts w:ascii="Times New Roman" w:hAnsi="Times New Roman" w:cs="Times New Roman"/>
-                <w:sz w:val="28"/>
-                <w:szCs w:val="28"/>
-                <w:lang w:val="en-US"/>
-              </w:rPr>
-              <w:t>Supabase</w:t>
-            </w:r>
-            <w:proofErr w:type="spellEnd"/>
-            <w:r>
-              <w:rPr>
-                <w:rFonts w:ascii="Times New Roman" w:hAnsi="Times New Roman" w:cs="Times New Roman"/>
-                <w:sz w:val="28"/>
-                <w:szCs w:val="28"/>
-                <w:lang w:val="en-US"/>
-              </w:rPr>
-              <w:t xml:space="preserve"> </w:t>
+              </w:rPr>
+              <w:t>.</w:t>
             </w:r>
           </w:p>
         </w:tc>
@@ -16891,45 +17357,10 @@
     <w:p>
       <w:pPr>
         <w:pStyle w:val="a9"/>
+        <w:ind w:firstLine="0"/>
         <w:jc w:val="left"/>
         <w:rPr>
-          <w:lang w:val="en-US" w:eastAsia="ru-RU"/>
-        </w:rPr>
-      </w:pPr>
-    </w:p>
-    <w:p>
-      <w:pPr>
-        <w:pStyle w:val="a9"/>
-        <w:jc w:val="left"/>
-        <w:rPr>
-          <w:lang w:val="en-US" w:eastAsia="ru-RU"/>
-        </w:rPr>
-      </w:pPr>
-    </w:p>
-    <w:p>
-      <w:pPr>
-        <w:pStyle w:val="a9"/>
-        <w:jc w:val="left"/>
-        <w:rPr>
-          <w:lang w:val="en-US" w:eastAsia="ru-RU"/>
-        </w:rPr>
-      </w:pPr>
-    </w:p>
-    <w:p>
-      <w:pPr>
-        <w:pStyle w:val="a9"/>
-        <w:jc w:val="left"/>
-        <w:rPr>
-          <w:lang w:val="en-US" w:eastAsia="ru-RU"/>
-        </w:rPr>
-      </w:pPr>
-    </w:p>
-    <w:p>
-      <w:pPr>
-        <w:pStyle w:val="a9"/>
-        <w:jc w:val="left"/>
-        <w:rPr>
-          <w:lang w:val="en-US" w:eastAsia="ru-RU"/>
+          <w:lang w:eastAsia="ru-RU"/>
         </w:rPr>
       </w:pPr>
     </w:p>
@@ -16952,15 +17383,463 @@
         </w:rPr>
         <w:t xml:space="preserve">Решение по </w:t>
       </w:r>
+      <w:bookmarkEnd w:id="25"/>
+      <w:r>
+        <w:rPr>
+          <w:lang w:eastAsia="ru-RU"/>
+        </w:rPr>
+        <w:t>много модульности</w:t>
+      </w:r>
+    </w:p>
+    <w:p>
+      <w:pPr>
+        <w:pStyle w:val="a9"/>
+        <w:rPr>
+          <w:lang w:eastAsia="ru-RU"/>
+        </w:rPr>
+      </w:pPr>
+      <w:r>
+        <w:rPr>
+          <w:lang w:eastAsia="ru-RU"/>
+        </w:rPr>
+        <w:t>Для проекта было рассмотрено несколько вариантов реализации</w:t>
+      </w:r>
+      <w:r>
+        <w:rPr>
+          <w:lang w:eastAsia="ru-RU"/>
+        </w:rPr>
+        <w:t xml:space="preserve"> много модульности и приведены в таблице.</w:t>
+      </w:r>
+    </w:p>
+    <w:p>
+      <w:pPr>
+        <w:pStyle w:val="a9"/>
+        <w:spacing w:before="240"/>
+        <w:ind w:firstLine="0"/>
+        <w:contextualSpacing w:val="0"/>
+        <w:rPr>
+          <w:lang w:eastAsia="ru-RU"/>
+        </w:rPr>
+      </w:pPr>
+      <w:r>
+        <w:rPr>
+          <w:lang w:eastAsia="ru-RU"/>
+        </w:rPr>
+        <w:t>Таблица 10 – Варианты реализации много модульности.</w:t>
+      </w:r>
+    </w:p>
+    <w:tbl>
+      <w:tblPr>
+        <w:tblStyle w:val="a5"/>
+        <w:tblW w:w="0" w:type="auto"/>
+        <w:tblLook w:val="04A0" w:firstRow="1" w:lastRow="0" w:firstColumn="1" w:lastColumn="0" w:noHBand="0" w:noVBand="1"/>
+      </w:tblPr>
+      <w:tblGrid>
+        <w:gridCol w:w="3115"/>
+        <w:gridCol w:w="3115"/>
+        <w:gridCol w:w="3115"/>
+      </w:tblGrid>
+      <w:tr>
+        <w:tc>
+          <w:tcPr>
+            <w:tcW w:w="3115" w:type="dxa"/>
+          </w:tcPr>
+          <w:p>
+            <w:pPr>
+              <w:pStyle w:val="a9"/>
+              <w:ind w:firstLine="0"/>
+              <w:rPr>
+                <w:lang w:eastAsia="ru-RU"/>
+              </w:rPr>
+            </w:pPr>
+            <w:r>
+              <w:t>Вариант</w:t>
+            </w:r>
+          </w:p>
+        </w:tc>
+        <w:tc>
+          <w:tcPr>
+            <w:tcW w:w="3115" w:type="dxa"/>
+          </w:tcPr>
+          <w:p>
+            <w:pPr>
+              <w:pStyle w:val="a9"/>
+              <w:ind w:firstLine="0"/>
+              <w:rPr>
+                <w:lang w:eastAsia="ru-RU"/>
+              </w:rPr>
+            </w:pPr>
+            <w:r>
+              <w:t>Плюсы</w:t>
+            </w:r>
+          </w:p>
+        </w:tc>
+        <w:tc>
+          <w:tcPr>
+            <w:tcW w:w="3115" w:type="dxa"/>
+          </w:tcPr>
+          <w:p>
+            <w:pPr>
+              <w:pStyle w:val="a9"/>
+              <w:ind w:firstLine="0"/>
+              <w:rPr>
+                <w:lang w:eastAsia="ru-RU"/>
+              </w:rPr>
+            </w:pPr>
+            <w:r>
+              <w:t>Минусы</w:t>
+            </w:r>
+          </w:p>
+        </w:tc>
+      </w:tr>
+      <w:tr>
+        <w:tc>
+          <w:tcPr>
+            <w:tcW w:w="3115" w:type="dxa"/>
+          </w:tcPr>
+          <w:p>
+            <w:pPr>
+              <w:pStyle w:val="a9"/>
+              <w:ind w:firstLine="0"/>
+              <w:rPr>
+                <w:lang w:eastAsia="ru-RU"/>
+              </w:rPr>
+            </w:pPr>
+            <w:r>
+              <w:t>Пакетная много модульность: о</w:t>
+            </w:r>
+            <w:r>
+              <w:t>дин модуль :</w:t>
+            </w:r>
+            <w:proofErr w:type="spellStart"/>
+            <w:r>
+              <w:t>app</w:t>
+            </w:r>
+            <w:proofErr w:type="spellEnd"/>
+            <w:r>
+              <w:t xml:space="preserve"> с разделением на пакеты</w:t>
+            </w:r>
+          </w:p>
+        </w:tc>
+        <w:tc>
+          <w:tcPr>
+            <w:tcW w:w="3115" w:type="dxa"/>
+          </w:tcPr>
+          <w:p>
+            <w:pPr>
+              <w:pStyle w:val="a9"/>
+              <w:ind w:firstLine="0"/>
+              <w:rPr>
+                <w:lang w:eastAsia="ru-RU"/>
+              </w:rPr>
+            </w:pPr>
+            <w:r>
+              <w:t>Простая настройка, быстрая сборка, достаточно для проекта</w:t>
+            </w:r>
+          </w:p>
+        </w:tc>
+        <w:tc>
+          <w:tcPr>
+            <w:tcW w:w="3115" w:type="dxa"/>
+          </w:tcPr>
+          <w:p>
+            <w:pPr>
+              <w:pStyle w:val="a9"/>
+              <w:ind w:firstLine="0"/>
+              <w:rPr>
+                <w:lang w:eastAsia="ru-RU"/>
+              </w:rPr>
+            </w:pPr>
+            <w:r>
+              <w:t>Границы слоёв поддерживаются договорённостью, а не компилятором</w:t>
+            </w:r>
+          </w:p>
+        </w:tc>
+      </w:tr>
+      <w:tr>
+        <w:tc>
+          <w:tcPr>
+            <w:tcW w:w="3115" w:type="dxa"/>
+          </w:tcPr>
+          <w:p>
+            <w:pPr>
+              <w:pStyle w:val="a9"/>
+              <w:ind w:firstLine="0"/>
+              <w:rPr>
+                <w:lang w:eastAsia="ru-RU"/>
+              </w:rPr>
+            </w:pPr>
+            <w:r>
+              <w:t>Модули :</w:t>
+            </w:r>
+            <w:proofErr w:type="spellStart"/>
+            <w:r>
+              <w:t>app</w:t>
+            </w:r>
+            <w:proofErr w:type="spellEnd"/>
+            <w:r>
+              <w:t>, :</w:t>
+            </w:r>
+            <w:proofErr w:type="spellStart"/>
+            <w:r>
+              <w:t>domain</w:t>
+            </w:r>
+            <w:proofErr w:type="spellEnd"/>
+            <w:r>
+              <w:t>, :</w:t>
+            </w:r>
+            <w:proofErr w:type="spellStart"/>
+            <w:r>
+              <w:t>data</w:t>
+            </w:r>
+            <w:proofErr w:type="spellEnd"/>
+          </w:p>
+        </w:tc>
+        <w:tc>
+          <w:tcPr>
+            <w:tcW w:w="3115" w:type="dxa"/>
+          </w:tcPr>
+          <w:p>
+            <w:pPr>
+              <w:pStyle w:val="a9"/>
+              <w:ind w:firstLine="0"/>
+              <w:rPr>
+                <w:lang w:eastAsia="ru-RU"/>
+              </w:rPr>
+            </w:pPr>
+            <w:r>
+              <w:t xml:space="preserve">Компилятор запрещает </w:t>
+            </w:r>
+            <w:proofErr w:type="spellStart"/>
+            <w:r>
+              <w:t>Domain</w:t>
+            </w:r>
+            <w:proofErr w:type="spellEnd"/>
+            <w:r>
+              <w:t xml:space="preserve"> зависеть от </w:t>
+            </w:r>
+            <w:proofErr w:type="spellStart"/>
+            <w:r>
+              <w:t>Data</w:t>
+            </w:r>
+            <w:proofErr w:type="spellEnd"/>
+            <w:r>
+              <w:t xml:space="preserve"> и </w:t>
+            </w:r>
+            <w:proofErr w:type="spellStart"/>
+            <w:r>
+              <w:t>Android</w:t>
+            </w:r>
+            <w:proofErr w:type="spellEnd"/>
+          </w:p>
+        </w:tc>
+        <w:tc>
+          <w:tcPr>
+            <w:tcW w:w="3115" w:type="dxa"/>
+          </w:tcPr>
+          <w:p>
+            <w:pPr>
+              <w:pStyle w:val="a9"/>
+              <w:ind w:firstLine="0"/>
+              <w:rPr>
+                <w:lang w:eastAsia="ru-RU"/>
+              </w:rPr>
+            </w:pPr>
+            <w:r>
+              <w:t>Больше настр</w:t>
+            </w:r>
+            <w:r>
+              <w:t xml:space="preserve">оек, особенно для </w:t>
+            </w:r>
+            <w:proofErr w:type="spellStart"/>
+            <w:r>
+              <w:t>Hilt</w:t>
+            </w:r>
+            <w:proofErr w:type="spellEnd"/>
+            <w:r>
+              <w:t xml:space="preserve"> и тестов,</w:t>
+            </w:r>
+            <w:r>
+              <w:t xml:space="preserve"> дольше сборка</w:t>
+            </w:r>
+          </w:p>
+        </w:tc>
+      </w:tr>
+      <w:tr>
+        <w:tc>
+          <w:tcPr>
+            <w:tcW w:w="3115" w:type="dxa"/>
+          </w:tcPr>
+          <w:p>
+            <w:pPr>
+              <w:pStyle w:val="a9"/>
+              <w:ind w:firstLine="0"/>
+              <w:rPr>
+                <w:lang w:val="en-US" w:eastAsia="ru-RU"/>
+              </w:rPr>
+            </w:pPr>
+            <w:r>
+              <w:t>Модули</w:t>
+            </w:r>
+            <w:r>
+              <w:rPr>
+                <w:lang w:val="en-US"/>
+              </w:rPr>
+              <w:t xml:space="preserve"> </w:t>
+            </w:r>
+            <w:r>
+              <w:t>по</w:t>
+            </w:r>
+            <w:r>
+              <w:rPr>
+                <w:lang w:val="en-US"/>
+              </w:rPr>
+              <w:t xml:space="preserve"> </w:t>
+            </w:r>
+            <w:r>
+              <w:t>функциям</w:t>
+            </w:r>
+            <w:r>
+              <w:rPr>
+                <w:lang w:val="en-US"/>
+              </w:rPr>
+              <w:t xml:space="preserve"> (:feature-chat, :feature-scan</w:t>
+            </w:r>
+            <w:r>
+              <w:rPr>
+                <w:lang w:val="en-US"/>
+              </w:rPr>
+              <w:t>)</w:t>
+            </w:r>
+          </w:p>
+        </w:tc>
+        <w:tc>
+          <w:tcPr>
+            <w:tcW w:w="3115" w:type="dxa"/>
+          </w:tcPr>
+          <w:p>
+            <w:pPr>
+              <w:pStyle w:val="a9"/>
+              <w:ind w:firstLine="0"/>
+              <w:rPr>
+                <w:lang w:eastAsia="ru-RU"/>
+              </w:rPr>
+            </w:pPr>
+            <w:r>
+              <w:t>Удобно для больших команд, независимая сборка</w:t>
+            </w:r>
+            <w:r>
+              <w:t xml:space="preserve"> каждого модуля</w:t>
+            </w:r>
+          </w:p>
+        </w:tc>
+        <w:tc>
+          <w:tcPr>
+            <w:tcW w:w="3115" w:type="dxa"/>
+          </w:tcPr>
+          <w:p>
+            <w:pPr>
+              <w:pStyle w:val="a9"/>
+              <w:ind w:firstLine="0"/>
+              <w:rPr>
+                <w:lang w:eastAsia="ru-RU"/>
+              </w:rPr>
+            </w:pPr>
+            <w:r>
+              <w:t>Избыточно для проекта с одним разработчиком</w:t>
+            </w:r>
+            <w:r>
+              <w:t xml:space="preserve">, сложная настройка </w:t>
+            </w:r>
+            <w:proofErr w:type="spellStart"/>
+            <w:r>
+              <w:rPr>
+                <w:lang w:val="en-US"/>
+              </w:rPr>
+              <w:t>gradle</w:t>
+            </w:r>
+            <w:proofErr w:type="spellEnd"/>
+          </w:p>
+        </w:tc>
+      </w:tr>
+    </w:tbl>
+    <w:p>
+      <w:pPr>
+        <w:pStyle w:val="a9"/>
+        <w:rPr>
+          <w:lang w:eastAsia="ru-RU"/>
+        </w:rPr>
+      </w:pPr>
+    </w:p>
+    <w:p>
+      <w:pPr>
+        <w:pStyle w:val="a9"/>
+        <w:rPr>
+          <w:lang w:eastAsia="ru-RU"/>
+        </w:rPr>
+      </w:pPr>
+      <w:r>
+        <w:rPr>
+          <w:lang w:eastAsia="ru-RU"/>
+        </w:rPr>
+        <w:t>Н</w:t>
+      </w:r>
+      <w:r>
+        <w:rPr>
+          <w:lang w:eastAsia="ru-RU"/>
+        </w:rPr>
+        <w:t xml:space="preserve">а текущем этапе проект реализуется как один </w:t>
+      </w:r>
+      <w:proofErr w:type="gramStart"/>
+      <w:r>
+        <w:rPr>
+          <w:lang w:eastAsia="ru-RU"/>
+        </w:rPr>
+        <w:t>модуль :</w:t>
+      </w:r>
       <w:proofErr w:type="spellStart"/>
       <w:r>
         <w:rPr>
           <w:lang w:eastAsia="ru-RU"/>
         </w:rPr>
-        <w:t>многомодульности</w:t>
-      </w:r>
-      <w:bookmarkEnd w:id="25"/>
+        <w:t>app</w:t>
+      </w:r>
       <w:proofErr w:type="spellEnd"/>
+      <w:proofErr w:type="gramEnd"/>
+      <w:r>
+        <w:rPr>
+          <w:lang w:eastAsia="ru-RU"/>
+        </w:rPr>
+        <w:t xml:space="preserve"> с чётким разделением</w:t>
+      </w:r>
+      <w:r>
+        <w:rPr>
+          <w:lang w:eastAsia="ru-RU"/>
+        </w:rPr>
+        <w:t xml:space="preserve"> на пакеты </w:t>
+      </w:r>
+      <w:proofErr w:type="spellStart"/>
+      <w:r>
+        <w:rPr>
+          <w:lang w:eastAsia="ru-RU"/>
+        </w:rPr>
+        <w:t>presentation</w:t>
+      </w:r>
+      <w:proofErr w:type="spellEnd"/>
+      <w:r>
+        <w:rPr>
+          <w:lang w:eastAsia="ru-RU"/>
+        </w:rPr>
+        <w:t xml:space="preserve">, </w:t>
+      </w:r>
+      <w:proofErr w:type="spellStart"/>
+      <w:r>
+        <w:rPr>
+          <w:lang w:eastAsia="ru-RU"/>
+        </w:rPr>
+        <w:t>domain.</w:t>
+      </w:r>
+      <w:proofErr w:type="spellEnd"/>
     </w:p>
     <w:p>
       <w:pPr>
@@ -16969,6 +17848,70 @@
           <w:lang w:eastAsia="ru-RU"/>
         </w:rPr>
       </w:pPr>
+      <w:r>
+        <w:rPr>
+          <w:lang w:eastAsia="ru-RU"/>
+        </w:rPr>
+        <w:t>П</w:t>
+      </w:r>
+      <w:r>
+        <w:rPr>
+          <w:lang w:eastAsia="ru-RU"/>
+        </w:rPr>
+        <w:t>роект р</w:t>
+      </w:r>
+      <w:r>
+        <w:rPr>
+          <w:lang w:eastAsia="ru-RU"/>
+        </w:rPr>
+        <w:t>азрабатывается одним человеком</w:t>
+      </w:r>
+      <w:r>
+        <w:rPr>
+          <w:lang w:eastAsia="ru-RU"/>
+        </w:rPr>
+        <w:t xml:space="preserve">, а настройка </w:t>
+      </w:r>
+      <w:r>
+        <w:rPr>
+          <w:lang w:eastAsia="ru-RU"/>
+        </w:rPr>
+        <w:t>каждого модуля</w:t>
+      </w:r>
+      <w:r>
+        <w:rPr>
+          <w:lang w:eastAsia="ru-RU"/>
+        </w:rPr>
+        <w:t xml:space="preserve"> заняла бы время, которое лучше потратить на функциональность. При этом структура подготовлена к разделению: пакет </w:t>
+      </w:r>
+      <w:proofErr w:type="spellStart"/>
+      <w:r>
+        <w:rPr>
+          <w:lang w:eastAsia="ru-RU"/>
+        </w:rPr>
+        <w:t>domain</w:t>
+      </w:r>
+      <w:proofErr w:type="spellEnd"/>
+      <w:r>
+        <w:rPr>
+          <w:lang w:eastAsia="ru-RU"/>
+        </w:rPr>
+        <w:t xml:space="preserve"> не содержит импортов </w:t>
+      </w:r>
+      <w:proofErr w:type="spellStart"/>
+      <w:r>
+        <w:rPr>
+          <w:lang w:eastAsia="ru-RU"/>
+        </w:rPr>
+        <w:t>Android</w:t>
+      </w:r>
+      <w:proofErr w:type="spellEnd"/>
+      <w:r>
+        <w:rPr>
+          <w:lang w:eastAsia="ru-RU"/>
+        </w:rPr>
+        <w:t>, поэтому его можно вынести в отдельный модуль. Перейти на модули стоит при росте команды, увеличении времени сборки или необходимости использовать игровую логику в другом приложении.</w:t>
+      </w:r>
     </w:p>
     <w:p>
       <w:pPr>
@@ -20558,7 +21501,7 @@
 </file>
 
 <file path=customXml/itemProps1.xml><?xml version="1.0" encoding="utf-8"?>
-<ds:datastoreItem xmlns:ds="http://schemas.openxmlformats.org/officeDocument/2006/customXml" ds:itemID="{7E2856DF-D13D-4CE3-A44F-67C8B0B91462}">
+<ds:datastoreItem xmlns:ds="http://schemas.openxmlformats.org/officeDocument/2006/customXml" ds:itemID="{5C59E29F-60ED-4019-877B-B59BE2B152E2}">
   <ds:schemaRefs>
     <ds:schemaRef ds:uri="http://schemas.openxmlformats.org/officeDocument/2006/bibliography"/>
   </ds:schemaRefs>

</xml_diff>

<commit_message>
Add: 1.5: 1.5.1. 1.5.2.
</commit_message>
<xml_diff>
--- a/Documentation/Основной документ.docx
+++ b/Documentation/Основной документ.docx
@@ -14362,15 +14362,7 @@
         <w:rPr>
           <w:lang w:eastAsia="ru-RU"/>
         </w:rPr>
-        <w:t>репо</w:t>
-      </w:r>
-      <w:bookmarkStart w:id="23" w:name="_GoBack"/>
-      <w:bookmarkEnd w:id="23"/>
-      <w:r>
-        <w:rPr>
-          <w:lang w:eastAsia="ru-RU"/>
-        </w:rPr>
-        <w:t>зиториев</w:t>
+        <w:t>репозиториев</w:t>
       </w:r>
       <w:proofErr w:type="spellEnd"/>
       <w:r>
@@ -16238,7 +16230,7 @@
         <w:ind w:firstLine="0"/>
         <w:jc w:val="left"/>
         <w:rPr>
-          <w:lang w:val="en-US" w:eastAsia="ru-RU"/>
+          <w:lang w:eastAsia="ru-RU"/>
         </w:rPr>
       </w:pPr>
     </w:p>
@@ -16254,7 +16246,7 @@
           <w:lang w:val="en-US" w:eastAsia="ru-RU"/>
         </w:rPr>
       </w:pPr>
-      <w:bookmarkStart w:id="24" w:name="_Toc243599236"/>
+      <w:bookmarkStart w:id="23" w:name="_Toc243599236"/>
       <w:r>
         <w:rPr>
           <w:lang w:eastAsia="ru-RU"/>
@@ -16267,7 +16259,7 @@
         </w:rPr>
         <w:t>SOLID</w:t>
       </w:r>
-      <w:bookmarkEnd w:id="24"/>
+      <w:bookmarkEnd w:id="23"/>
     </w:p>
     <w:p>
       <w:pPr>
@@ -17376,14 +17368,14 @@
           <w:lang w:eastAsia="ru-RU"/>
         </w:rPr>
       </w:pPr>
-      <w:bookmarkStart w:id="25" w:name="_Toc243599237"/>
+      <w:bookmarkStart w:id="24" w:name="_Toc243599237"/>
       <w:r>
         <w:rPr>
           <w:lang w:eastAsia="ru-RU"/>
         </w:rPr>
         <w:t xml:space="preserve">Решение по </w:t>
       </w:r>
-      <w:bookmarkEnd w:id="25"/>
+      <w:bookmarkEnd w:id="24"/>
       <w:r>
         <w:rPr>
           <w:lang w:eastAsia="ru-RU"/>
@@ -17837,9 +17829,15 @@
         <w:rPr>
           <w:lang w:eastAsia="ru-RU"/>
         </w:rPr>
-        <w:t>domain.</w:t>
+        <w:t>domain</w:t>
       </w:r>
       <w:proofErr w:type="spellEnd"/>
+      <w:r>
+        <w:rPr>
+          <w:lang w:eastAsia="ru-RU"/>
+        </w:rPr>
+        <w:t>.</w:t>
+      </w:r>
     </w:p>
     <w:p>
       <w:pPr>
@@ -17915,11 +17913,3199 @@
     </w:p>
     <w:p>
       <w:pPr>
+        <w:pStyle w:val="2"/>
+        <w:numPr>
+          <w:ilvl w:val="1"/>
+          <w:numId w:val="1"/>
+        </w:numPr>
+        <w:rPr>
+          <w:lang w:eastAsia="ru-RU"/>
+        </w:rPr>
+      </w:pPr>
+      <w:r>
+        <w:rPr>
+          <w:lang w:eastAsia="ru-RU"/>
+        </w:rPr>
+        <w:t>Проектирование дизайна системы.</w:t>
+      </w:r>
+    </w:p>
+    <w:p>
+      <w:pPr>
+        <w:pStyle w:val="3"/>
+        <w:numPr>
+          <w:ilvl w:val="2"/>
+          <w:numId w:val="1"/>
+        </w:numPr>
+        <w:ind w:left="0" w:firstLine="698"/>
+        <w:rPr>
+          <w:lang w:eastAsia="ru-RU"/>
+        </w:rPr>
+      </w:pPr>
+      <w:r>
+        <w:rPr>
+          <w:lang w:eastAsia="ru-RU"/>
+        </w:rPr>
+        <w:t>Составление цветовой палитры.</w:t>
+      </w:r>
+    </w:p>
+    <w:p>
+      <w:pPr>
         <w:pStyle w:val="a9"/>
         <w:rPr>
           <w:lang w:eastAsia="ru-RU"/>
         </w:rPr>
       </w:pPr>
+      <w:r>
+        <w:rPr>
+          <w:lang w:eastAsia="ru-RU"/>
+        </w:rPr>
+        <w:t>Для приложения разработаны две цветовые схемы: светлая и тёмная.</w:t>
+      </w:r>
+    </w:p>
+    <w:p>
+      <w:pPr>
+        <w:pStyle w:val="a9"/>
+        <w:spacing w:before="240"/>
+        <w:ind w:firstLine="0"/>
+        <w:contextualSpacing w:val="0"/>
+        <w:rPr>
+          <w:lang w:eastAsia="ru-RU"/>
+        </w:rPr>
+      </w:pPr>
+      <w:r>
+        <w:rPr>
+          <w:lang w:eastAsia="ru-RU"/>
+        </w:rPr>
+        <w:t>Таблица 11 – Светлая</w:t>
+      </w:r>
+      <w:r>
+        <w:rPr>
+          <w:lang w:eastAsia="ru-RU"/>
+        </w:rPr>
+        <w:t xml:space="preserve"> и темные темы</w:t>
+      </w:r>
+      <w:r>
+        <w:rPr>
+          <w:lang w:eastAsia="ru-RU"/>
+        </w:rPr>
+        <w:t xml:space="preserve"> дизайна приложения.</w:t>
+      </w:r>
+    </w:p>
+    <w:tbl>
+      <w:tblPr>
+        <w:tblStyle w:val="a5"/>
+        <w:tblW w:w="0" w:type="auto"/>
+        <w:tblLook w:val="04A0" w:firstRow="1" w:lastRow="0" w:firstColumn="1" w:lastColumn="0" w:noHBand="0" w:noVBand="1"/>
+      </w:tblPr>
+      <w:tblGrid>
+        <w:gridCol w:w="2529"/>
+        <w:gridCol w:w="2401"/>
+        <w:gridCol w:w="2387"/>
+        <w:gridCol w:w="2028"/>
+      </w:tblGrid>
+      <w:tr>
+        <w:tc>
+          <w:tcPr>
+            <w:tcW w:w="2529" w:type="dxa"/>
+          </w:tcPr>
+          <w:p>
+            <w:pPr>
+              <w:pStyle w:val="a9"/>
+              <w:ind w:firstLine="0"/>
+              <w:rPr>
+                <w:rFonts w:cs="Times New Roman"/>
+                <w:sz w:val="24"/>
+                <w:szCs w:val="24"/>
+                <w:lang w:eastAsia="ru-RU"/>
+              </w:rPr>
+            </w:pPr>
+            <w:r>
+              <w:t>Назначение</w:t>
+            </w:r>
+          </w:p>
+        </w:tc>
+        <w:tc>
+          <w:tcPr>
+            <w:tcW w:w="2401" w:type="dxa"/>
+          </w:tcPr>
+          <w:p>
+            <w:pPr>
+              <w:pStyle w:val="a9"/>
+              <w:ind w:firstLine="0"/>
+              <w:rPr>
+                <w:rFonts w:cs="Times New Roman"/>
+                <w:sz w:val="24"/>
+                <w:szCs w:val="24"/>
+                <w:lang w:eastAsia="ru-RU"/>
+              </w:rPr>
+            </w:pPr>
+            <w:proofErr w:type="spellStart"/>
+            <w:r>
+              <w:t>Токен</w:t>
+            </w:r>
+            <w:proofErr w:type="spellEnd"/>
+          </w:p>
+        </w:tc>
+        <w:tc>
+          <w:tcPr>
+            <w:tcW w:w="2387" w:type="dxa"/>
+          </w:tcPr>
+          <w:p>
+            <w:pPr>
+              <w:pStyle w:val="a9"/>
+              <w:ind w:firstLine="0"/>
+              <w:rPr>
+                <w:rFonts w:cs="Times New Roman"/>
+                <w:sz w:val="24"/>
+                <w:szCs w:val="24"/>
+                <w:lang w:eastAsia="ru-RU"/>
+              </w:rPr>
+            </w:pPr>
+            <w:r>
+              <w:t>Тёмная тема</w:t>
+            </w:r>
+          </w:p>
+        </w:tc>
+        <w:tc>
+          <w:tcPr>
+            <w:tcW w:w="2028" w:type="dxa"/>
+          </w:tcPr>
+          <w:p>
+            <w:pPr>
+              <w:pStyle w:val="a9"/>
+              <w:ind w:firstLine="0"/>
+              <w:rPr>
+                <w:rFonts w:cs="Times New Roman"/>
+                <w:bCs/>
+                <w:sz w:val="24"/>
+                <w:szCs w:val="24"/>
+              </w:rPr>
+            </w:pPr>
+            <w:r>
+              <w:t>Светлая тема</w:t>
+            </w:r>
+          </w:p>
+        </w:tc>
+      </w:tr>
+      <w:tr>
+        <w:tc>
+          <w:tcPr>
+            <w:tcW w:w="2529" w:type="dxa"/>
+          </w:tcPr>
+          <w:p>
+            <w:pPr>
+              <w:pStyle w:val="a9"/>
+              <w:ind w:firstLine="0"/>
+              <w:rPr>
+                <w:rFonts w:cs="Times New Roman"/>
+                <w:sz w:val="24"/>
+                <w:szCs w:val="24"/>
+                <w:lang w:eastAsia="ru-RU"/>
+              </w:rPr>
+            </w:pPr>
+            <w:r>
+              <w:t>Основной фон</w:t>
+            </w:r>
+          </w:p>
+        </w:tc>
+        <w:tc>
+          <w:tcPr>
+            <w:tcW w:w="2401" w:type="dxa"/>
+          </w:tcPr>
+          <w:p>
+            <w:pPr>
+              <w:pStyle w:val="a9"/>
+              <w:ind w:firstLine="0"/>
+              <w:rPr>
+                <w:rFonts w:cs="Times New Roman"/>
+                <w:sz w:val="24"/>
+                <w:szCs w:val="24"/>
+                <w:lang w:eastAsia="ru-RU"/>
+              </w:rPr>
+            </w:pPr>
+            <w:proofErr w:type="spellStart"/>
+            <w:r>
+              <w:t>bg</w:t>
+            </w:r>
+            <w:proofErr w:type="spellEnd"/>
+          </w:p>
+        </w:tc>
+        <w:tc>
+          <w:tcPr>
+            <w:tcW w:w="2387" w:type="dxa"/>
+          </w:tcPr>
+          <w:p>
+            <w:pPr>
+              <w:pStyle w:val="a9"/>
+              <w:ind w:firstLine="0"/>
+              <w:rPr>
+                <w:rFonts w:cs="Times New Roman"/>
+                <w:sz w:val="24"/>
+                <w:szCs w:val="24"/>
+                <w:lang w:eastAsia="ru-RU"/>
+              </w:rPr>
+            </w:pPr>
+            <w:r>
+              <w:t>#211B16</w:t>
+            </w:r>
+          </w:p>
+        </w:tc>
+        <w:tc>
+          <w:tcPr>
+            <w:tcW w:w="2028" w:type="dxa"/>
+          </w:tcPr>
+          <w:p>
+            <w:pPr>
+              <w:pStyle w:val="a9"/>
+              <w:ind w:firstLine="0"/>
+              <w:rPr>
+                <w:rFonts w:cs="Times New Roman"/>
+                <w:sz w:val="24"/>
+                <w:szCs w:val="24"/>
+              </w:rPr>
+            </w:pPr>
+            <w:r>
+              <w:t>#F4F0E6</w:t>
+            </w:r>
+          </w:p>
+        </w:tc>
+      </w:tr>
+      <w:tr>
+        <w:tc>
+          <w:tcPr>
+            <w:tcW w:w="2529" w:type="dxa"/>
+          </w:tcPr>
+          <w:p>
+            <w:pPr>
+              <w:pStyle w:val="a9"/>
+              <w:ind w:firstLine="0"/>
+              <w:rPr>
+                <w:rFonts w:cs="Times New Roman"/>
+                <w:sz w:val="24"/>
+                <w:szCs w:val="24"/>
+                <w:lang w:eastAsia="ru-RU"/>
+              </w:rPr>
+            </w:pPr>
+            <w:r>
+              <w:t>Поверхности и карточки</w:t>
+            </w:r>
+          </w:p>
+        </w:tc>
+        <w:tc>
+          <w:tcPr>
+            <w:tcW w:w="2401" w:type="dxa"/>
+          </w:tcPr>
+          <w:p>
+            <w:pPr>
+              <w:pStyle w:val="a9"/>
+              <w:ind w:firstLine="0"/>
+              <w:rPr>
+                <w:rFonts w:cs="Times New Roman"/>
+                <w:sz w:val="24"/>
+                <w:szCs w:val="24"/>
+                <w:lang w:eastAsia="ru-RU"/>
+              </w:rPr>
+            </w:pPr>
+            <w:proofErr w:type="spellStart"/>
+            <w:r>
+              <w:t>surface</w:t>
+            </w:r>
+            <w:proofErr w:type="spellEnd"/>
+          </w:p>
+        </w:tc>
+        <w:tc>
+          <w:tcPr>
+            <w:tcW w:w="2387" w:type="dxa"/>
+          </w:tcPr>
+          <w:p>
+            <w:pPr>
+              <w:pStyle w:val="a9"/>
+              <w:ind w:firstLine="0"/>
+              <w:rPr>
+                <w:rFonts w:cs="Times New Roman"/>
+                <w:sz w:val="24"/>
+                <w:szCs w:val="24"/>
+                <w:lang w:eastAsia="ru-RU"/>
+              </w:rPr>
+            </w:pPr>
+            <w:r>
+              <w:t>#30271F</w:t>
+            </w:r>
+          </w:p>
+        </w:tc>
+        <w:tc>
+          <w:tcPr>
+            <w:tcW w:w="2028" w:type="dxa"/>
+          </w:tcPr>
+          <w:p>
+            <w:pPr>
+              <w:pStyle w:val="a9"/>
+              <w:ind w:firstLine="0"/>
+              <w:rPr>
+                <w:rFonts w:cs="Times New Roman"/>
+                <w:sz w:val="24"/>
+                <w:szCs w:val="24"/>
+              </w:rPr>
+            </w:pPr>
+            <w:r>
+              <w:t>#FFFCF5</w:t>
+            </w:r>
+          </w:p>
+        </w:tc>
+      </w:tr>
+      <w:tr>
+        <w:tc>
+          <w:tcPr>
+            <w:tcW w:w="2529" w:type="dxa"/>
+          </w:tcPr>
+          <w:p>
+            <w:pPr>
+              <w:pStyle w:val="a9"/>
+              <w:ind w:firstLine="0"/>
+              <w:rPr>
+                <w:rFonts w:cs="Times New Roman"/>
+                <w:sz w:val="24"/>
+                <w:szCs w:val="24"/>
+                <w:lang w:eastAsia="ru-RU"/>
+              </w:rPr>
+            </w:pPr>
+            <w:r>
+              <w:t>Вторичные поверхности</w:t>
+            </w:r>
+          </w:p>
+        </w:tc>
+        <w:tc>
+          <w:tcPr>
+            <w:tcW w:w="2401" w:type="dxa"/>
+          </w:tcPr>
+          <w:p>
+            <w:pPr>
+              <w:pStyle w:val="a9"/>
+              <w:ind w:firstLine="0"/>
+              <w:rPr>
+                <w:rFonts w:cs="Times New Roman"/>
+                <w:sz w:val="24"/>
+                <w:szCs w:val="24"/>
+                <w:lang w:eastAsia="ru-RU"/>
+              </w:rPr>
+            </w:pPr>
+            <w:r>
+              <w:rPr>
+                <w:lang w:val="en-US"/>
+              </w:rPr>
+              <w:t>s</w:t>
+            </w:r>
+            <w:r>
+              <w:t>urface2</w:t>
+            </w:r>
+          </w:p>
+        </w:tc>
+        <w:tc>
+          <w:tcPr>
+            <w:tcW w:w="2387" w:type="dxa"/>
+          </w:tcPr>
+          <w:p>
+            <w:pPr>
+              <w:pStyle w:val="a9"/>
+              <w:ind w:firstLine="0"/>
+              <w:rPr>
+                <w:rFonts w:cs="Times New Roman"/>
+                <w:sz w:val="24"/>
+                <w:szCs w:val="24"/>
+                <w:lang w:eastAsia="ru-RU"/>
+              </w:rPr>
+            </w:pPr>
+            <w:r>
+              <w:t>#403428</w:t>
+            </w:r>
+          </w:p>
+        </w:tc>
+        <w:tc>
+          <w:tcPr>
+            <w:tcW w:w="2028" w:type="dxa"/>
+          </w:tcPr>
+          <w:p>
+            <w:pPr>
+              <w:pStyle w:val="a9"/>
+              <w:ind w:firstLine="0"/>
+              <w:rPr>
+                <w:rFonts w:cs="Times New Roman"/>
+                <w:sz w:val="24"/>
+                <w:szCs w:val="24"/>
+                <w:lang w:val="en-US"/>
+              </w:rPr>
+            </w:pPr>
+            <w:r>
+              <w:t>#E6DAC3</w:t>
+            </w:r>
+          </w:p>
+        </w:tc>
+      </w:tr>
+      <w:tr>
+        <w:tc>
+          <w:tcPr>
+            <w:tcW w:w="2529" w:type="dxa"/>
+          </w:tcPr>
+          <w:p>
+            <w:pPr>
+              <w:pStyle w:val="a9"/>
+              <w:ind w:firstLine="0"/>
+              <w:rPr>
+                <w:rFonts w:cs="Times New Roman"/>
+                <w:sz w:val="24"/>
+                <w:szCs w:val="24"/>
+                <w:lang w:eastAsia="ru-RU"/>
+              </w:rPr>
+            </w:pPr>
+            <w:r>
+              <w:t>Основной цвет действий</w:t>
+            </w:r>
+          </w:p>
+        </w:tc>
+        <w:tc>
+          <w:tcPr>
+            <w:tcW w:w="2401" w:type="dxa"/>
+          </w:tcPr>
+          <w:p>
+            <w:pPr>
+              <w:pStyle w:val="a9"/>
+              <w:ind w:firstLine="0"/>
+              <w:rPr>
+                <w:rFonts w:cs="Times New Roman"/>
+                <w:sz w:val="24"/>
+                <w:szCs w:val="24"/>
+                <w:lang w:eastAsia="ru-RU"/>
+              </w:rPr>
+            </w:pPr>
+            <w:proofErr w:type="spellStart"/>
+            <w:r>
+              <w:t>primary</w:t>
+            </w:r>
+            <w:proofErr w:type="spellEnd"/>
+          </w:p>
+        </w:tc>
+        <w:tc>
+          <w:tcPr>
+            <w:tcW w:w="2387" w:type="dxa"/>
+          </w:tcPr>
+          <w:p>
+            <w:pPr>
+              <w:pStyle w:val="a9"/>
+              <w:ind w:firstLine="0"/>
+              <w:rPr>
+                <w:rFonts w:cs="Times New Roman"/>
+                <w:sz w:val="24"/>
+                <w:szCs w:val="24"/>
+                <w:lang w:eastAsia="ru-RU"/>
+              </w:rPr>
+            </w:pPr>
+            <w:r>
+              <w:t>#</w:t>
+            </w:r>
+            <w:r>
+              <w:t>8B7C5A</w:t>
+            </w:r>
+          </w:p>
+        </w:tc>
+        <w:tc>
+          <w:tcPr>
+            <w:tcW w:w="2028" w:type="dxa"/>
+          </w:tcPr>
+          <w:p>
+            <w:pPr>
+              <w:pStyle w:val="a9"/>
+              <w:ind w:firstLine="0"/>
+              <w:rPr>
+                <w:rFonts w:cs="Times New Roman"/>
+                <w:sz w:val="24"/>
+                <w:szCs w:val="24"/>
+              </w:rPr>
+            </w:pPr>
+            <w:r>
+              <w:t>#</w:t>
+            </w:r>
+            <w:r>
+              <w:t>84705C</w:t>
+            </w:r>
+          </w:p>
+        </w:tc>
+      </w:tr>
+      <w:tr>
+        <w:tc>
+          <w:tcPr>
+            <w:tcW w:w="2529" w:type="dxa"/>
+          </w:tcPr>
+          <w:p>
+            <w:pPr>
+              <w:pStyle w:val="a9"/>
+              <w:ind w:firstLine="0"/>
+              <w:rPr>
+                <w:rFonts w:cs="Times New Roman"/>
+                <w:sz w:val="24"/>
+                <w:szCs w:val="24"/>
+                <w:lang w:eastAsia="ru-RU"/>
+              </w:rPr>
+            </w:pPr>
+            <w:r>
+              <w:t>Акцентный цвет</w:t>
+            </w:r>
+          </w:p>
+        </w:tc>
+        <w:tc>
+          <w:tcPr>
+            <w:tcW w:w="2401" w:type="dxa"/>
+          </w:tcPr>
+          <w:p>
+            <w:pPr>
+              <w:pStyle w:val="a9"/>
+              <w:ind w:firstLine="0"/>
+              <w:rPr>
+                <w:rFonts w:cs="Times New Roman"/>
+                <w:sz w:val="24"/>
+                <w:szCs w:val="24"/>
+                <w:lang w:eastAsia="ru-RU"/>
+              </w:rPr>
+            </w:pPr>
+            <w:proofErr w:type="spellStart"/>
+            <w:r>
+              <w:t>accent</w:t>
+            </w:r>
+            <w:proofErr w:type="spellEnd"/>
+          </w:p>
+        </w:tc>
+        <w:tc>
+          <w:tcPr>
+            <w:tcW w:w="2387" w:type="dxa"/>
+          </w:tcPr>
+          <w:p>
+            <w:pPr>
+              <w:pStyle w:val="a9"/>
+              <w:ind w:firstLine="0"/>
+              <w:rPr>
+                <w:rFonts w:cs="Times New Roman"/>
+                <w:sz w:val="24"/>
+                <w:szCs w:val="24"/>
+                <w:lang w:eastAsia="ru-RU"/>
+              </w:rPr>
+            </w:pPr>
+            <w:r>
+              <w:t>#B58A45</w:t>
+            </w:r>
+          </w:p>
+        </w:tc>
+        <w:tc>
+          <w:tcPr>
+            <w:tcW w:w="2028" w:type="dxa"/>
+          </w:tcPr>
+          <w:p>
+            <w:pPr>
+              <w:pStyle w:val="a9"/>
+              <w:ind w:firstLine="0"/>
+              <w:rPr>
+                <w:rFonts w:cs="Times New Roman"/>
+                <w:sz w:val="24"/>
+                <w:szCs w:val="24"/>
+              </w:rPr>
+            </w:pPr>
+            <w:r>
+              <w:t>#</w:t>
+            </w:r>
+            <w:r>
+              <w:t>E0B570</w:t>
+            </w:r>
+          </w:p>
+        </w:tc>
+      </w:tr>
+      <w:tr>
+        <w:tc>
+          <w:tcPr>
+            <w:tcW w:w="2529" w:type="dxa"/>
+          </w:tcPr>
+          <w:p>
+            <w:pPr>
+              <w:pStyle w:val="a9"/>
+              <w:ind w:firstLine="0"/>
+              <w:rPr>
+                <w:rFonts w:cs="Times New Roman"/>
+                <w:sz w:val="24"/>
+                <w:szCs w:val="24"/>
+                <w:lang w:eastAsia="ru-RU"/>
+              </w:rPr>
+            </w:pPr>
+            <w:r>
+              <w:t>Текст на акценте</w:t>
+            </w:r>
+          </w:p>
+        </w:tc>
+        <w:tc>
+          <w:tcPr>
+            <w:tcW w:w="2401" w:type="dxa"/>
+          </w:tcPr>
+          <w:p>
+            <w:pPr>
+              <w:pStyle w:val="a9"/>
+              <w:ind w:firstLine="0"/>
+              <w:rPr>
+                <w:rFonts w:cs="Times New Roman"/>
+                <w:sz w:val="24"/>
+                <w:szCs w:val="24"/>
+                <w:lang w:eastAsia="ru-RU"/>
+              </w:rPr>
+            </w:pPr>
+            <w:proofErr w:type="spellStart"/>
+            <w:r>
+              <w:t>onaccent</w:t>
+            </w:r>
+            <w:proofErr w:type="spellEnd"/>
+          </w:p>
+        </w:tc>
+        <w:tc>
+          <w:tcPr>
+            <w:tcW w:w="2387" w:type="dxa"/>
+          </w:tcPr>
+          <w:p>
+            <w:pPr>
+              <w:pStyle w:val="a9"/>
+              <w:ind w:firstLine="0"/>
+              <w:rPr>
+                <w:rFonts w:cs="Times New Roman"/>
+                <w:sz w:val="24"/>
+                <w:szCs w:val="24"/>
+                <w:lang w:eastAsia="ru-RU"/>
+              </w:rPr>
+            </w:pPr>
+            <w:r>
+              <w:t>#</w:t>
+            </w:r>
+            <w:r>
+              <w:t>FFF0D8</w:t>
+            </w:r>
+          </w:p>
+        </w:tc>
+        <w:tc>
+          <w:tcPr>
+            <w:tcW w:w="2028" w:type="dxa"/>
+          </w:tcPr>
+          <w:p>
+            <w:pPr>
+              <w:pStyle w:val="a9"/>
+              <w:ind w:firstLine="0"/>
+              <w:rPr>
+                <w:rFonts w:cs="Times New Roman"/>
+                <w:sz w:val="24"/>
+                <w:szCs w:val="24"/>
+              </w:rPr>
+            </w:pPr>
+            <w:r>
+              <w:t>#</w:t>
+            </w:r>
+            <w:r>
+              <w:t>2A1A00</w:t>
+            </w:r>
+          </w:p>
+        </w:tc>
+      </w:tr>
+      <w:tr>
+        <w:tc>
+          <w:tcPr>
+            <w:tcW w:w="2529" w:type="dxa"/>
+          </w:tcPr>
+          <w:p>
+            <w:pPr>
+              <w:pStyle w:val="a9"/>
+              <w:ind w:firstLine="0"/>
+              <w:rPr>
+                <w:rFonts w:cs="Times New Roman"/>
+                <w:sz w:val="24"/>
+                <w:szCs w:val="24"/>
+                <w:lang w:eastAsia="ru-RU"/>
+              </w:rPr>
+            </w:pPr>
+            <w:r>
+              <w:t>Основной текст</w:t>
+            </w:r>
+          </w:p>
+        </w:tc>
+        <w:tc>
+          <w:tcPr>
+            <w:tcW w:w="2401" w:type="dxa"/>
+          </w:tcPr>
+          <w:p>
+            <w:pPr>
+              <w:pStyle w:val="a9"/>
+              <w:ind w:firstLine="0"/>
+              <w:rPr>
+                <w:rFonts w:cs="Times New Roman"/>
+                <w:sz w:val="24"/>
+                <w:szCs w:val="24"/>
+                <w:lang w:eastAsia="ru-RU"/>
+              </w:rPr>
+            </w:pPr>
+            <w:proofErr w:type="spellStart"/>
+            <w:r>
+              <w:t>text</w:t>
+            </w:r>
+            <w:proofErr w:type="spellEnd"/>
+          </w:p>
+        </w:tc>
+        <w:tc>
+          <w:tcPr>
+            <w:tcW w:w="2387" w:type="dxa"/>
+          </w:tcPr>
+          <w:p>
+            <w:pPr>
+              <w:pStyle w:val="a9"/>
+              <w:ind w:firstLine="0"/>
+              <w:rPr>
+                <w:rFonts w:cs="Times New Roman"/>
+                <w:sz w:val="24"/>
+                <w:szCs w:val="24"/>
+                <w:lang w:eastAsia="ru-RU"/>
+              </w:rPr>
+            </w:pPr>
+            <w:r>
+              <w:t>#F1E6CF</w:t>
+            </w:r>
+          </w:p>
+        </w:tc>
+        <w:tc>
+          <w:tcPr>
+            <w:tcW w:w="2028" w:type="dxa"/>
+          </w:tcPr>
+          <w:p>
+            <w:pPr>
+              <w:pStyle w:val="a9"/>
+              <w:ind w:firstLine="0"/>
+              <w:rPr>
+                <w:rFonts w:cs="Times New Roman"/>
+                <w:sz w:val="24"/>
+                <w:szCs w:val="24"/>
+              </w:rPr>
+            </w:pPr>
+            <w:r>
+              <w:t>#34291F</w:t>
+            </w:r>
+          </w:p>
+        </w:tc>
+      </w:tr>
+      <w:tr>
+        <w:tc>
+          <w:tcPr>
+            <w:tcW w:w="2529" w:type="dxa"/>
+          </w:tcPr>
+          <w:p>
+            <w:pPr>
+              <w:pStyle w:val="a9"/>
+              <w:ind w:firstLine="0"/>
+              <w:rPr>
+                <w:rFonts w:cs="Times New Roman"/>
+                <w:sz w:val="24"/>
+                <w:szCs w:val="24"/>
+                <w:lang w:eastAsia="ru-RU"/>
+              </w:rPr>
+            </w:pPr>
+            <w:r>
+              <w:t>Вторичный текст</w:t>
+            </w:r>
+          </w:p>
+        </w:tc>
+        <w:tc>
+          <w:tcPr>
+            <w:tcW w:w="2401" w:type="dxa"/>
+          </w:tcPr>
+          <w:p>
+            <w:pPr>
+              <w:pStyle w:val="a9"/>
+              <w:ind w:firstLine="0"/>
+              <w:rPr>
+                <w:rFonts w:cs="Times New Roman"/>
+                <w:sz w:val="24"/>
+                <w:szCs w:val="24"/>
+                <w:lang w:eastAsia="ru-RU"/>
+              </w:rPr>
+            </w:pPr>
+            <w:r>
+              <w:t>text2</w:t>
+            </w:r>
+          </w:p>
+        </w:tc>
+        <w:tc>
+          <w:tcPr>
+            <w:tcW w:w="2387" w:type="dxa"/>
+          </w:tcPr>
+          <w:p>
+            <w:pPr>
+              <w:pStyle w:val="a9"/>
+              <w:ind w:firstLine="0"/>
+              <w:rPr>
+                <w:rFonts w:cs="Times New Roman"/>
+                <w:sz w:val="24"/>
+                <w:szCs w:val="24"/>
+                <w:lang w:eastAsia="ru-RU"/>
+              </w:rPr>
+            </w:pPr>
+            <w:r>
+              <w:t>#C7B9A1</w:t>
+            </w:r>
+          </w:p>
+        </w:tc>
+        <w:tc>
+          <w:tcPr>
+            <w:tcW w:w="2028" w:type="dxa"/>
+          </w:tcPr>
+          <w:p>
+            <w:pPr>
+              <w:pStyle w:val="a9"/>
+              <w:ind w:firstLine="0"/>
+              <w:rPr>
+                <w:rFonts w:cs="Times New Roman"/>
+                <w:sz w:val="24"/>
+                <w:szCs w:val="24"/>
+              </w:rPr>
+            </w:pPr>
+            <w:r>
+              <w:t>#</w:t>
+            </w:r>
+            <w:r>
+              <w:t>96826C</w:t>
+            </w:r>
+          </w:p>
+        </w:tc>
+      </w:tr>
+      <w:tr>
+        <w:tc>
+          <w:tcPr>
+            <w:tcW w:w="2529" w:type="dxa"/>
+          </w:tcPr>
+          <w:p>
+            <w:pPr>
+              <w:pStyle w:val="a9"/>
+              <w:ind w:firstLine="0"/>
+              <w:rPr>
+                <w:rFonts w:cs="Times New Roman"/>
+                <w:sz w:val="24"/>
+                <w:szCs w:val="24"/>
+                <w:lang w:eastAsia="ru-RU"/>
+              </w:rPr>
+            </w:pPr>
+            <w:r>
+              <w:t>Ошибка</w:t>
+            </w:r>
+            <w:r>
+              <w:rPr>
+                <w:lang w:val="en-US"/>
+              </w:rPr>
+              <w:t xml:space="preserve"> </w:t>
+            </w:r>
+            <w:r>
+              <w:t>и кнопка</w:t>
+            </w:r>
+          </w:p>
+        </w:tc>
+        <w:tc>
+          <w:tcPr>
+            <w:tcW w:w="2401" w:type="dxa"/>
+          </w:tcPr>
+          <w:p>
+            <w:pPr>
+              <w:pStyle w:val="a9"/>
+              <w:ind w:firstLine="0"/>
+              <w:rPr>
+                <w:rFonts w:cs="Times New Roman"/>
+                <w:sz w:val="24"/>
+                <w:szCs w:val="24"/>
+                <w:lang w:eastAsia="ru-RU"/>
+              </w:rPr>
+            </w:pPr>
+            <w:proofErr w:type="spellStart"/>
+            <w:r>
+              <w:t>error</w:t>
+            </w:r>
+            <w:proofErr w:type="spellEnd"/>
+          </w:p>
+        </w:tc>
+        <w:tc>
+          <w:tcPr>
+            <w:tcW w:w="2387" w:type="dxa"/>
+          </w:tcPr>
+          <w:p>
+            <w:pPr>
+              <w:pStyle w:val="a9"/>
+              <w:ind w:firstLine="0"/>
+              <w:rPr>
+                <w:rFonts w:cs="Times New Roman"/>
+                <w:sz w:val="24"/>
+                <w:szCs w:val="24"/>
+                <w:lang w:eastAsia="ru-RU"/>
+              </w:rPr>
+            </w:pPr>
+            <w:r>
+              <w:t>#F2B8B5</w:t>
+            </w:r>
+          </w:p>
+        </w:tc>
+        <w:tc>
+          <w:tcPr>
+            <w:tcW w:w="2028" w:type="dxa"/>
+          </w:tcPr>
+          <w:p>
+            <w:pPr>
+              <w:pStyle w:val="a9"/>
+              <w:ind w:firstLine="0"/>
+              <w:rPr>
+                <w:rFonts w:cs="Times New Roman"/>
+                <w:sz w:val="24"/>
+                <w:szCs w:val="24"/>
+              </w:rPr>
+            </w:pPr>
+            <w:r>
+              <w:t>#A8322A</w:t>
+            </w:r>
+          </w:p>
+        </w:tc>
+      </w:tr>
+      <w:tr>
+        <w:tc>
+          <w:tcPr>
+            <w:tcW w:w="2529" w:type="dxa"/>
+          </w:tcPr>
+          <w:p>
+            <w:pPr>
+              <w:pStyle w:val="a9"/>
+              <w:ind w:firstLine="0"/>
+              <w:rPr>
+                <w:rFonts w:cs="Times New Roman"/>
+                <w:sz w:val="24"/>
+                <w:szCs w:val="24"/>
+                <w:lang w:eastAsia="ru-RU"/>
+              </w:rPr>
+            </w:pPr>
+            <w:r>
+              <w:t>Успешное действие</w:t>
+            </w:r>
+          </w:p>
+        </w:tc>
+        <w:tc>
+          <w:tcPr>
+            <w:tcW w:w="2401" w:type="dxa"/>
+          </w:tcPr>
+          <w:p>
+            <w:pPr>
+              <w:pStyle w:val="a9"/>
+              <w:ind w:firstLine="0"/>
+              <w:rPr>
+                <w:rFonts w:cs="Times New Roman"/>
+                <w:sz w:val="24"/>
+                <w:szCs w:val="24"/>
+                <w:lang w:eastAsia="ru-RU"/>
+              </w:rPr>
+            </w:pPr>
+            <w:proofErr w:type="spellStart"/>
+            <w:r>
+              <w:t>success</w:t>
+            </w:r>
+            <w:proofErr w:type="spellEnd"/>
+          </w:p>
+        </w:tc>
+        <w:tc>
+          <w:tcPr>
+            <w:tcW w:w="2387" w:type="dxa"/>
+          </w:tcPr>
+          <w:p>
+            <w:pPr>
+              <w:pStyle w:val="a9"/>
+              <w:ind w:firstLine="0"/>
+              <w:rPr>
+                <w:rFonts w:cs="Times New Roman"/>
+                <w:sz w:val="24"/>
+                <w:szCs w:val="24"/>
+                <w:lang w:eastAsia="ru-RU"/>
+              </w:rPr>
+            </w:pPr>
+            <w:r>
+              <w:t>#A4C98D</w:t>
+            </w:r>
+          </w:p>
+        </w:tc>
+        <w:tc>
+          <w:tcPr>
+            <w:tcW w:w="2028" w:type="dxa"/>
+          </w:tcPr>
+          <w:p>
+            <w:pPr>
+              <w:pStyle w:val="a9"/>
+              <w:ind w:firstLine="0"/>
+              <w:rPr>
+                <w:rFonts w:cs="Times New Roman"/>
+                <w:sz w:val="24"/>
+                <w:szCs w:val="24"/>
+              </w:rPr>
+            </w:pPr>
+            <w:r>
+              <w:t>#426638</w:t>
+            </w:r>
+          </w:p>
+        </w:tc>
+      </w:tr>
+      <w:tr>
+        <w:tc>
+          <w:tcPr>
+            <w:tcW w:w="2529" w:type="dxa"/>
+          </w:tcPr>
+          <w:p>
+            <w:pPr>
+              <w:pStyle w:val="a9"/>
+              <w:ind w:firstLine="0"/>
+              <w:rPr>
+                <w:rFonts w:cs="Times New Roman"/>
+                <w:sz w:val="24"/>
+                <w:szCs w:val="24"/>
+              </w:rPr>
+            </w:pPr>
+            <w:r>
+              <w:lastRenderedPageBreak/>
+              <w:t>Контуры и границы</w:t>
+            </w:r>
+          </w:p>
+        </w:tc>
+        <w:tc>
+          <w:tcPr>
+            <w:tcW w:w="2401" w:type="dxa"/>
+          </w:tcPr>
+          <w:p>
+            <w:pPr>
+              <w:pStyle w:val="a9"/>
+              <w:ind w:firstLine="0"/>
+              <w:rPr>
+                <w:rFonts w:cs="Times New Roman"/>
+                <w:sz w:val="24"/>
+                <w:szCs w:val="24"/>
+              </w:rPr>
+            </w:pPr>
+            <w:proofErr w:type="spellStart"/>
+            <w:r>
+              <w:t>outline</w:t>
+            </w:r>
+            <w:proofErr w:type="spellEnd"/>
+          </w:p>
+        </w:tc>
+        <w:tc>
+          <w:tcPr>
+            <w:tcW w:w="2387" w:type="dxa"/>
+          </w:tcPr>
+          <w:p>
+            <w:pPr>
+              <w:pStyle w:val="a9"/>
+              <w:ind w:firstLine="0"/>
+              <w:rPr>
+                <w:rFonts w:cs="Times New Roman"/>
+                <w:sz w:val="24"/>
+                <w:szCs w:val="24"/>
+              </w:rPr>
+            </w:pPr>
+            <w:r>
+              <w:t>#8A7659</w:t>
+            </w:r>
+          </w:p>
+        </w:tc>
+        <w:tc>
+          <w:tcPr>
+            <w:tcW w:w="2028" w:type="dxa"/>
+          </w:tcPr>
+          <w:p>
+            <w:pPr>
+              <w:pStyle w:val="a9"/>
+              <w:ind w:firstLine="0"/>
+              <w:rPr>
+                <w:rFonts w:cs="Times New Roman"/>
+                <w:sz w:val="24"/>
+                <w:szCs w:val="24"/>
+              </w:rPr>
+            </w:pPr>
+            <w:bookmarkStart w:id="25" w:name="_GoBack"/>
+            <w:r>
+              <w:t>#8A7659</w:t>
+            </w:r>
+            <w:bookmarkEnd w:id="25"/>
+          </w:p>
+        </w:tc>
+      </w:tr>
+      <w:tr>
+        <w:tc>
+          <w:tcPr>
+            <w:tcW w:w="2529" w:type="dxa"/>
+          </w:tcPr>
+          <w:p>
+            <w:pPr>
+              <w:pStyle w:val="a9"/>
+              <w:ind w:firstLine="0"/>
+            </w:pPr>
+            <w:r>
+              <w:t>Кнопки действия</w:t>
+            </w:r>
+          </w:p>
+        </w:tc>
+        <w:tc>
+          <w:tcPr>
+            <w:tcW w:w="2401" w:type="dxa"/>
+          </w:tcPr>
+          <w:p>
+            <w:pPr>
+              <w:pStyle w:val="a9"/>
+              <w:ind w:firstLine="0"/>
+              <w:rPr>
+                <w:lang w:val="en-US"/>
+              </w:rPr>
+            </w:pPr>
+            <w:r>
+              <w:rPr>
+                <w:lang w:val="en-US"/>
+              </w:rPr>
+              <w:t>button</w:t>
+            </w:r>
+          </w:p>
+        </w:tc>
+        <w:tc>
+          <w:tcPr>
+            <w:tcW w:w="2387" w:type="dxa"/>
+          </w:tcPr>
+          <w:p>
+            <w:pPr>
+              <w:pStyle w:val="a9"/>
+              <w:ind w:firstLine="0"/>
+            </w:pPr>
+            <w:r>
+              <w:rPr>
+                <w:lang w:val="en-US"/>
+              </w:rPr>
+              <w:t>#</w:t>
+            </w:r>
+            <w:r>
+              <w:t>6A75BD</w:t>
+            </w:r>
+          </w:p>
+        </w:tc>
+        <w:tc>
+          <w:tcPr>
+            <w:tcW w:w="2028" w:type="dxa"/>
+          </w:tcPr>
+          <w:p>
+            <w:pPr>
+              <w:pStyle w:val="a9"/>
+              <w:ind w:firstLine="0"/>
+              <w:rPr>
+                <w:lang w:val="en-US"/>
+              </w:rPr>
+            </w:pPr>
+            <w:r>
+              <w:rPr>
+                <w:lang w:val="en-US"/>
+              </w:rPr>
+              <w:t>#</w:t>
+            </w:r>
+            <w:r>
+              <w:rPr>
+                <w:lang w:val="en-US"/>
+              </w:rPr>
+              <w:t>39427D</w:t>
+            </w:r>
+          </w:p>
+        </w:tc>
+      </w:tr>
+    </w:tbl>
+    <w:p>
+      <w:pPr>
+        <w:pStyle w:val="a9"/>
+        <w:rPr>
+          <w:lang w:eastAsia="ru-RU"/>
+        </w:rPr>
+      </w:pPr>
+    </w:p>
+    <w:p>
+      <w:pPr>
+        <w:pStyle w:val="a9"/>
+        <w:rPr>
+          <w:lang w:eastAsia="ru-RU"/>
+        </w:rPr>
+      </w:pPr>
+      <w:r>
+        <w:rPr>
+          <w:lang w:eastAsia="ru-RU"/>
+        </w:rPr>
+        <w:t>Светлая тема предназначена для комфортного использования приложения при обычном освещении. Тёплый фон уменьшает визуальную резкость по сравнению с чисто белым фоном, а тёмно-синий основной цвет используется для ключевых кнопок и активных состояний.</w:t>
+      </w:r>
+    </w:p>
+    <w:p>
+      <w:pPr>
+        <w:pStyle w:val="a9"/>
+        <w:rPr>
+          <w:lang w:eastAsia="ru-RU"/>
+        </w:rPr>
+      </w:pPr>
+      <w:r>
+        <w:rPr>
+          <w:lang w:eastAsia="ru-RU"/>
+        </w:rPr>
+        <w:t>Так же для продукта была подобрана основная цветовая палитра темной темы системы.</w:t>
+      </w:r>
+    </w:p>
+    <w:p>
+      <w:pPr>
+        <w:pStyle w:val="3"/>
+        <w:numPr>
+          <w:ilvl w:val="2"/>
+          <w:numId w:val="1"/>
+        </w:numPr>
+        <w:ind w:left="1701" w:hanging="861"/>
+        <w:rPr>
+          <w:lang w:eastAsia="ru-RU"/>
+        </w:rPr>
+      </w:pPr>
+      <w:r>
+        <w:rPr>
+          <w:lang w:eastAsia="ru-RU"/>
+        </w:rPr>
+        <w:t xml:space="preserve">Выбор шрифтов, </w:t>
+      </w:r>
+      <w:r>
+        <w:rPr>
+          <w:lang w:eastAsia="ru-RU"/>
+        </w:rPr>
+        <w:t>размеров</w:t>
+      </w:r>
+      <w:r>
+        <w:rPr>
+          <w:lang w:eastAsia="ru-RU"/>
+        </w:rPr>
+        <w:t xml:space="preserve"> и величины отступов</w:t>
+      </w:r>
+      <w:r>
+        <w:rPr>
+          <w:lang w:eastAsia="ru-RU"/>
+        </w:rPr>
+        <w:t>.</w:t>
+      </w:r>
+    </w:p>
+    <w:p>
+      <w:pPr>
+        <w:pStyle w:val="a9"/>
+        <w:rPr>
+          <w:lang w:eastAsia="ru-RU"/>
+        </w:rPr>
+      </w:pPr>
+      <w:r>
+        <w:rPr>
+          <w:lang w:eastAsia="ru-RU"/>
+        </w:rPr>
+        <w:t xml:space="preserve">В дизайн-системе используются два шрифта: </w:t>
+      </w:r>
+      <w:proofErr w:type="spellStart"/>
+      <w:r>
+        <w:rPr>
+          <w:lang w:eastAsia="ru-RU"/>
+        </w:rPr>
+        <w:t>Playfair</w:t>
+      </w:r>
+      <w:proofErr w:type="spellEnd"/>
+      <w:r>
+        <w:rPr>
+          <w:lang w:eastAsia="ru-RU"/>
+        </w:rPr>
+        <w:t xml:space="preserve"> </w:t>
+      </w:r>
+      <w:proofErr w:type="spellStart"/>
+      <w:r>
+        <w:rPr>
+          <w:lang w:eastAsia="ru-RU"/>
+        </w:rPr>
+        <w:t>Display</w:t>
+      </w:r>
+      <w:proofErr w:type="spellEnd"/>
+      <w:r>
+        <w:rPr>
+          <w:lang w:eastAsia="ru-RU"/>
+        </w:rPr>
+        <w:t xml:space="preserve"> и </w:t>
+      </w:r>
+      <w:proofErr w:type="spellStart"/>
+      <w:r>
+        <w:rPr>
+          <w:lang w:eastAsia="ru-RU"/>
+        </w:rPr>
+        <w:t>Inter</w:t>
+      </w:r>
+      <w:proofErr w:type="spellEnd"/>
+      <w:r>
+        <w:rPr>
+          <w:lang w:eastAsia="ru-RU"/>
+        </w:rPr>
+        <w:t>.</w:t>
+      </w:r>
+    </w:p>
+    <w:p>
+      <w:pPr>
+        <w:pStyle w:val="a9"/>
+        <w:rPr>
+          <w:lang w:eastAsia="ru-RU"/>
+        </w:rPr>
+      </w:pPr>
+      <w:proofErr w:type="spellStart"/>
+      <w:r>
+        <w:rPr>
+          <w:lang w:eastAsia="ru-RU"/>
+        </w:rPr>
+        <w:t>Playfair</w:t>
+      </w:r>
+      <w:proofErr w:type="spellEnd"/>
+      <w:r>
+        <w:rPr>
+          <w:lang w:eastAsia="ru-RU"/>
+        </w:rPr>
+        <w:t xml:space="preserve"> </w:t>
+      </w:r>
+      <w:proofErr w:type="spellStart"/>
+      <w:r>
+        <w:rPr>
+          <w:lang w:eastAsia="ru-RU"/>
+        </w:rPr>
+        <w:t>Display</w:t>
+      </w:r>
+      <w:proofErr w:type="spellEnd"/>
+      <w:r>
+        <w:rPr>
+          <w:lang w:eastAsia="ru-RU"/>
+        </w:rPr>
+        <w:t xml:space="preserve"> применяется для крупных заголовков и названий дел. Он создаёт ассоциацию с печатными детективными произведениями и подчёркивает жанр игры.</w:t>
+      </w:r>
+    </w:p>
+    <w:p>
+      <w:pPr>
+        <w:pStyle w:val="a9"/>
+        <w:rPr>
+          <w:lang w:eastAsia="ru-RU"/>
+        </w:rPr>
+      </w:pPr>
+      <w:proofErr w:type="spellStart"/>
+      <w:r>
+        <w:rPr>
+          <w:lang w:eastAsia="ru-RU"/>
+        </w:rPr>
+        <w:t>Inter</w:t>
+      </w:r>
+      <w:proofErr w:type="spellEnd"/>
+      <w:r>
+        <w:rPr>
+          <w:lang w:eastAsia="ru-RU"/>
+        </w:rPr>
+        <w:t xml:space="preserve"> используется для основного текста, описаний, диалогов, подписей и элементов управления. Он обеспечивает хорошую читаемость на мобильных экранах.</w:t>
+      </w:r>
+    </w:p>
+    <w:p>
+      <w:pPr>
+        <w:pStyle w:val="a9"/>
+        <w:spacing w:before="240"/>
+        <w:ind w:firstLine="0"/>
+        <w:contextualSpacing w:val="0"/>
+        <w:rPr>
+          <w:lang w:eastAsia="ru-RU"/>
+        </w:rPr>
+      </w:pPr>
+      <w:r>
+        <w:rPr>
+          <w:lang w:eastAsia="ru-RU"/>
+        </w:rPr>
+        <w:t>Таблица 12</w:t>
+      </w:r>
+      <w:r>
+        <w:rPr>
+          <w:lang w:eastAsia="ru-RU"/>
+        </w:rPr>
+        <w:t xml:space="preserve"> </w:t>
+      </w:r>
+      <w:r>
+        <w:rPr>
+          <w:lang w:eastAsia="ru-RU"/>
+        </w:rPr>
+        <w:t>–</w:t>
+      </w:r>
+      <w:r>
+        <w:rPr>
+          <w:lang w:eastAsia="ru-RU"/>
+        </w:rPr>
+        <w:t xml:space="preserve"> Размеры</w:t>
+      </w:r>
+      <w:r>
+        <w:rPr>
+          <w:lang w:eastAsia="ru-RU"/>
+        </w:rPr>
+        <w:t xml:space="preserve"> шрифтов системы.</w:t>
+      </w:r>
+    </w:p>
+    <w:tbl>
+      <w:tblPr>
+        <w:tblStyle w:val="a5"/>
+        <w:tblW w:w="0" w:type="auto"/>
+        <w:tblLook w:val="04A0" w:firstRow="1" w:lastRow="0" w:firstColumn="1" w:lastColumn="0" w:noHBand="0" w:noVBand="1"/>
+      </w:tblPr>
+      <w:tblGrid>
+        <w:gridCol w:w="1675"/>
+        <w:gridCol w:w="1692"/>
+        <w:gridCol w:w="1677"/>
+        <w:gridCol w:w="2065"/>
+        <w:gridCol w:w="2236"/>
+      </w:tblGrid>
+      <w:tr>
+        <w:tc>
+          <w:tcPr>
+            <w:tcW w:w="1675" w:type="dxa"/>
+            <w:vAlign w:val="center"/>
+          </w:tcPr>
+          <w:p>
+            <w:pPr>
+              <w:pStyle w:val="a9"/>
+              <w:ind w:firstLine="0"/>
+              <w:rPr>
+                <w:rFonts w:cs="Times New Roman"/>
+                <w:sz w:val="24"/>
+                <w:szCs w:val="24"/>
+                <w:lang w:eastAsia="ru-RU"/>
+              </w:rPr>
+            </w:pPr>
+            <w:r>
+              <w:rPr>
+                <w:rFonts w:cs="Times New Roman"/>
+                <w:bCs/>
+                <w:sz w:val="24"/>
+                <w:szCs w:val="24"/>
+              </w:rPr>
+              <w:t>Стиль</w:t>
+            </w:r>
+          </w:p>
+        </w:tc>
+        <w:tc>
+          <w:tcPr>
+            <w:tcW w:w="1692" w:type="dxa"/>
+            <w:vAlign w:val="center"/>
+          </w:tcPr>
+          <w:p>
+            <w:pPr>
+              <w:pStyle w:val="a9"/>
+              <w:ind w:firstLine="0"/>
+              <w:rPr>
+                <w:rFonts w:cs="Times New Roman"/>
+                <w:sz w:val="24"/>
+                <w:szCs w:val="24"/>
+                <w:lang w:eastAsia="ru-RU"/>
+              </w:rPr>
+            </w:pPr>
+            <w:r>
+              <w:rPr>
+                <w:rFonts w:cs="Times New Roman"/>
+                <w:bCs/>
+                <w:sz w:val="24"/>
+                <w:szCs w:val="24"/>
+              </w:rPr>
+              <w:t>Шрифт</w:t>
+            </w:r>
+          </w:p>
+        </w:tc>
+        <w:tc>
+          <w:tcPr>
+            <w:tcW w:w="1677" w:type="dxa"/>
+            <w:vAlign w:val="center"/>
+          </w:tcPr>
+          <w:p>
+            <w:pPr>
+              <w:pStyle w:val="a9"/>
+              <w:ind w:firstLine="0"/>
+              <w:rPr>
+                <w:rFonts w:cs="Times New Roman"/>
+                <w:sz w:val="24"/>
+                <w:szCs w:val="24"/>
+                <w:lang w:eastAsia="ru-RU"/>
+              </w:rPr>
+            </w:pPr>
+            <w:r>
+              <w:rPr>
+                <w:rFonts w:cs="Times New Roman"/>
+                <w:bCs/>
+                <w:sz w:val="24"/>
+                <w:szCs w:val="24"/>
+              </w:rPr>
+              <w:t>Размер</w:t>
+            </w:r>
+          </w:p>
+        </w:tc>
+        <w:tc>
+          <w:tcPr>
+            <w:tcW w:w="2065" w:type="dxa"/>
+            <w:vAlign w:val="center"/>
+          </w:tcPr>
+          <w:p>
+            <w:pPr>
+              <w:pStyle w:val="a9"/>
+              <w:ind w:firstLine="0"/>
+              <w:rPr>
+                <w:rFonts w:cs="Times New Roman"/>
+                <w:sz w:val="24"/>
+                <w:szCs w:val="24"/>
+                <w:lang w:eastAsia="ru-RU"/>
+              </w:rPr>
+            </w:pPr>
+            <w:r>
+              <w:rPr>
+                <w:rFonts w:cs="Times New Roman"/>
+                <w:bCs/>
+                <w:sz w:val="24"/>
+                <w:szCs w:val="24"/>
+              </w:rPr>
+              <w:t>Межстрочный интервал</w:t>
+            </w:r>
+          </w:p>
+        </w:tc>
+        <w:tc>
+          <w:tcPr>
+            <w:tcW w:w="2236" w:type="dxa"/>
+            <w:vAlign w:val="center"/>
+          </w:tcPr>
+          <w:p>
+            <w:pPr>
+              <w:pStyle w:val="a9"/>
+              <w:ind w:firstLine="0"/>
+              <w:rPr>
+                <w:rFonts w:cs="Times New Roman"/>
+                <w:sz w:val="24"/>
+                <w:szCs w:val="24"/>
+                <w:lang w:eastAsia="ru-RU"/>
+              </w:rPr>
+            </w:pPr>
+            <w:r>
+              <w:rPr>
+                <w:rFonts w:cs="Times New Roman"/>
+                <w:bCs/>
+                <w:sz w:val="24"/>
+                <w:szCs w:val="24"/>
+              </w:rPr>
+              <w:t>Применение</w:t>
+            </w:r>
+          </w:p>
+        </w:tc>
+      </w:tr>
+      <w:tr>
+        <w:tc>
+          <w:tcPr>
+            <w:tcW w:w="1675" w:type="dxa"/>
+            <w:vAlign w:val="center"/>
+          </w:tcPr>
+          <w:p>
+            <w:pPr>
+              <w:pStyle w:val="a9"/>
+              <w:ind w:firstLine="0"/>
+              <w:rPr>
+                <w:rFonts w:cs="Times New Roman"/>
+                <w:sz w:val="24"/>
+                <w:szCs w:val="24"/>
+                <w:lang w:eastAsia="ru-RU"/>
+              </w:rPr>
+            </w:pPr>
+            <w:proofErr w:type="spellStart"/>
+            <w:r>
+              <w:rPr>
+                <w:rFonts w:cs="Times New Roman"/>
+                <w:sz w:val="24"/>
+                <w:szCs w:val="24"/>
+              </w:rPr>
+              <w:t>Display</w:t>
+            </w:r>
+            <w:proofErr w:type="spellEnd"/>
+          </w:p>
+        </w:tc>
+        <w:tc>
+          <w:tcPr>
+            <w:tcW w:w="1692" w:type="dxa"/>
+            <w:vAlign w:val="center"/>
+          </w:tcPr>
+          <w:p>
+            <w:pPr>
+              <w:pStyle w:val="a9"/>
+              <w:ind w:firstLine="0"/>
+              <w:rPr>
+                <w:rFonts w:cs="Times New Roman"/>
+                <w:sz w:val="24"/>
+                <w:szCs w:val="24"/>
+                <w:lang w:eastAsia="ru-RU"/>
+              </w:rPr>
+            </w:pPr>
+            <w:proofErr w:type="spellStart"/>
+            <w:r>
+              <w:rPr>
+                <w:rFonts w:cs="Times New Roman"/>
+                <w:sz w:val="24"/>
+                <w:szCs w:val="24"/>
+              </w:rPr>
+              <w:t>Playfair</w:t>
+            </w:r>
+            <w:proofErr w:type="spellEnd"/>
+            <w:r>
+              <w:rPr>
+                <w:rFonts w:cs="Times New Roman"/>
+                <w:sz w:val="24"/>
+                <w:szCs w:val="24"/>
+              </w:rPr>
+              <w:t xml:space="preserve"> </w:t>
+            </w:r>
+            <w:proofErr w:type="spellStart"/>
+            <w:r>
+              <w:rPr>
+                <w:rFonts w:cs="Times New Roman"/>
+                <w:sz w:val="24"/>
+                <w:szCs w:val="24"/>
+              </w:rPr>
+              <w:t>Display</w:t>
+            </w:r>
+            <w:proofErr w:type="spellEnd"/>
+            <w:r>
+              <w:rPr>
+                <w:rFonts w:cs="Times New Roman"/>
+                <w:sz w:val="24"/>
+                <w:szCs w:val="24"/>
+              </w:rPr>
+              <w:t xml:space="preserve"> </w:t>
+            </w:r>
+            <w:proofErr w:type="spellStart"/>
+            <w:r>
+              <w:rPr>
+                <w:rFonts w:cs="Times New Roman"/>
+                <w:sz w:val="24"/>
+                <w:szCs w:val="24"/>
+              </w:rPr>
+              <w:t>Bold</w:t>
+            </w:r>
+            <w:proofErr w:type="spellEnd"/>
+          </w:p>
+        </w:tc>
+        <w:tc>
+          <w:tcPr>
+            <w:tcW w:w="1677" w:type="dxa"/>
+            <w:vAlign w:val="center"/>
+          </w:tcPr>
+          <w:p>
+            <w:pPr>
+              <w:pStyle w:val="a9"/>
+              <w:ind w:firstLine="0"/>
+              <w:rPr>
+                <w:rFonts w:cs="Times New Roman"/>
+                <w:sz w:val="24"/>
+                <w:szCs w:val="24"/>
+                <w:lang w:eastAsia="ru-RU"/>
+              </w:rPr>
+            </w:pPr>
+            <w:r>
+              <w:rPr>
+                <w:rFonts w:cs="Times New Roman"/>
+                <w:sz w:val="24"/>
+                <w:szCs w:val="24"/>
+              </w:rPr>
+              <w:t xml:space="preserve">32 </w:t>
+            </w:r>
+            <w:proofErr w:type="spellStart"/>
+            <w:r>
+              <w:rPr>
+                <w:rFonts w:cs="Times New Roman"/>
+                <w:sz w:val="24"/>
+                <w:szCs w:val="24"/>
+              </w:rPr>
+              <w:t>px</w:t>
+            </w:r>
+            <w:proofErr w:type="spellEnd"/>
+          </w:p>
+        </w:tc>
+        <w:tc>
+          <w:tcPr>
+            <w:tcW w:w="2065" w:type="dxa"/>
+            <w:vAlign w:val="center"/>
+          </w:tcPr>
+          <w:p>
+            <w:pPr>
+              <w:pStyle w:val="a9"/>
+              <w:ind w:firstLine="0"/>
+              <w:rPr>
+                <w:rFonts w:cs="Times New Roman"/>
+                <w:sz w:val="24"/>
+                <w:szCs w:val="24"/>
+                <w:lang w:eastAsia="ru-RU"/>
+              </w:rPr>
+            </w:pPr>
+            <w:r>
+              <w:rPr>
+                <w:rFonts w:cs="Times New Roman"/>
+                <w:sz w:val="24"/>
+                <w:szCs w:val="24"/>
+              </w:rPr>
+              <w:t xml:space="preserve">40 </w:t>
+            </w:r>
+            <w:proofErr w:type="spellStart"/>
+            <w:r>
+              <w:rPr>
+                <w:rFonts w:cs="Times New Roman"/>
+                <w:sz w:val="24"/>
+                <w:szCs w:val="24"/>
+              </w:rPr>
+              <w:t>px</w:t>
+            </w:r>
+            <w:proofErr w:type="spellEnd"/>
+          </w:p>
+        </w:tc>
+        <w:tc>
+          <w:tcPr>
+            <w:tcW w:w="2236" w:type="dxa"/>
+            <w:vAlign w:val="center"/>
+          </w:tcPr>
+          <w:p>
+            <w:pPr>
+              <w:pStyle w:val="a9"/>
+              <w:ind w:firstLine="0"/>
+              <w:rPr>
+                <w:rFonts w:cs="Times New Roman"/>
+                <w:sz w:val="24"/>
+                <w:szCs w:val="24"/>
+                <w:lang w:eastAsia="ru-RU"/>
+              </w:rPr>
+            </w:pPr>
+            <w:r>
+              <w:rPr>
+                <w:rFonts w:cs="Times New Roman"/>
+                <w:sz w:val="24"/>
+                <w:szCs w:val="24"/>
+              </w:rPr>
+              <w:t>Название игры, крупные заголовки</w:t>
+            </w:r>
+          </w:p>
+        </w:tc>
+      </w:tr>
+      <w:tr>
+        <w:tc>
+          <w:tcPr>
+            <w:tcW w:w="1675" w:type="dxa"/>
+            <w:vAlign w:val="center"/>
+          </w:tcPr>
+          <w:p>
+            <w:pPr>
+              <w:pStyle w:val="a9"/>
+              <w:ind w:firstLine="0"/>
+              <w:rPr>
+                <w:rFonts w:cs="Times New Roman"/>
+                <w:sz w:val="24"/>
+                <w:szCs w:val="24"/>
+                <w:lang w:eastAsia="ru-RU"/>
+              </w:rPr>
+            </w:pPr>
+            <w:r>
+              <w:rPr>
+                <w:rFonts w:cs="Times New Roman"/>
+                <w:sz w:val="24"/>
+                <w:szCs w:val="24"/>
+              </w:rPr>
+              <w:t>H1</w:t>
+            </w:r>
+          </w:p>
+        </w:tc>
+        <w:tc>
+          <w:tcPr>
+            <w:tcW w:w="1692" w:type="dxa"/>
+            <w:vAlign w:val="center"/>
+          </w:tcPr>
+          <w:p>
+            <w:pPr>
+              <w:pStyle w:val="a9"/>
+              <w:ind w:firstLine="0"/>
+              <w:rPr>
+                <w:rFonts w:cs="Times New Roman"/>
+                <w:sz w:val="24"/>
+                <w:szCs w:val="24"/>
+                <w:lang w:eastAsia="ru-RU"/>
+              </w:rPr>
+            </w:pPr>
+            <w:proofErr w:type="spellStart"/>
+            <w:r>
+              <w:rPr>
+                <w:rFonts w:cs="Times New Roman"/>
+                <w:sz w:val="24"/>
+                <w:szCs w:val="24"/>
+              </w:rPr>
+              <w:t>Playfair</w:t>
+            </w:r>
+            <w:proofErr w:type="spellEnd"/>
+            <w:r>
+              <w:rPr>
+                <w:rFonts w:cs="Times New Roman"/>
+                <w:sz w:val="24"/>
+                <w:szCs w:val="24"/>
+              </w:rPr>
+              <w:t xml:space="preserve"> </w:t>
+            </w:r>
+            <w:proofErr w:type="spellStart"/>
+            <w:r>
+              <w:rPr>
+                <w:rFonts w:cs="Times New Roman"/>
+                <w:sz w:val="24"/>
+                <w:szCs w:val="24"/>
+              </w:rPr>
+              <w:t>Display</w:t>
+            </w:r>
+            <w:proofErr w:type="spellEnd"/>
+            <w:r>
+              <w:rPr>
+                <w:rFonts w:cs="Times New Roman"/>
+                <w:sz w:val="24"/>
+                <w:szCs w:val="24"/>
+              </w:rPr>
+              <w:t xml:space="preserve"> </w:t>
+            </w:r>
+            <w:proofErr w:type="spellStart"/>
+            <w:r>
+              <w:rPr>
+                <w:rFonts w:cs="Times New Roman"/>
+                <w:sz w:val="24"/>
+                <w:szCs w:val="24"/>
+              </w:rPr>
+              <w:t>Bold</w:t>
+            </w:r>
+            <w:proofErr w:type="spellEnd"/>
+          </w:p>
+        </w:tc>
+        <w:tc>
+          <w:tcPr>
+            <w:tcW w:w="1677" w:type="dxa"/>
+            <w:vAlign w:val="center"/>
+          </w:tcPr>
+          <w:p>
+            <w:pPr>
+              <w:pStyle w:val="a9"/>
+              <w:ind w:firstLine="0"/>
+              <w:rPr>
+                <w:rFonts w:cs="Times New Roman"/>
+                <w:sz w:val="24"/>
+                <w:szCs w:val="24"/>
+                <w:lang w:eastAsia="ru-RU"/>
+              </w:rPr>
+            </w:pPr>
+            <w:r>
+              <w:rPr>
+                <w:rFonts w:cs="Times New Roman"/>
+                <w:sz w:val="24"/>
+                <w:szCs w:val="24"/>
+              </w:rPr>
+              <w:t xml:space="preserve">24 </w:t>
+            </w:r>
+            <w:proofErr w:type="spellStart"/>
+            <w:r>
+              <w:rPr>
+                <w:rFonts w:cs="Times New Roman"/>
+                <w:sz w:val="24"/>
+                <w:szCs w:val="24"/>
+              </w:rPr>
+              <w:t>px</w:t>
+            </w:r>
+            <w:proofErr w:type="spellEnd"/>
+          </w:p>
+        </w:tc>
+        <w:tc>
+          <w:tcPr>
+            <w:tcW w:w="2065" w:type="dxa"/>
+            <w:vAlign w:val="center"/>
+          </w:tcPr>
+          <w:p>
+            <w:pPr>
+              <w:pStyle w:val="a9"/>
+              <w:ind w:firstLine="0"/>
+              <w:rPr>
+                <w:rFonts w:cs="Times New Roman"/>
+                <w:sz w:val="24"/>
+                <w:szCs w:val="24"/>
+                <w:lang w:eastAsia="ru-RU"/>
+              </w:rPr>
+            </w:pPr>
+            <w:r>
+              <w:rPr>
+                <w:rFonts w:cs="Times New Roman"/>
+                <w:sz w:val="24"/>
+                <w:szCs w:val="24"/>
+              </w:rPr>
+              <w:t xml:space="preserve">32 </w:t>
+            </w:r>
+            <w:proofErr w:type="spellStart"/>
+            <w:r>
+              <w:rPr>
+                <w:rFonts w:cs="Times New Roman"/>
+                <w:sz w:val="24"/>
+                <w:szCs w:val="24"/>
+              </w:rPr>
+              <w:t>px</w:t>
+            </w:r>
+            <w:proofErr w:type="spellEnd"/>
+          </w:p>
+        </w:tc>
+        <w:tc>
+          <w:tcPr>
+            <w:tcW w:w="2236" w:type="dxa"/>
+            <w:vAlign w:val="center"/>
+          </w:tcPr>
+          <w:p>
+            <w:pPr>
+              <w:pStyle w:val="a9"/>
+              <w:ind w:firstLine="0"/>
+              <w:rPr>
+                <w:rFonts w:cs="Times New Roman"/>
+                <w:sz w:val="24"/>
+                <w:szCs w:val="24"/>
+                <w:lang w:eastAsia="ru-RU"/>
+              </w:rPr>
+            </w:pPr>
+            <w:r>
+              <w:rPr>
+                <w:rFonts w:cs="Times New Roman"/>
+                <w:sz w:val="24"/>
+                <w:szCs w:val="24"/>
+              </w:rPr>
+              <w:t>Заголовки экранов</w:t>
+            </w:r>
+          </w:p>
+        </w:tc>
+      </w:tr>
+      <w:tr>
+        <w:tc>
+          <w:tcPr>
+            <w:tcW w:w="1675" w:type="dxa"/>
+            <w:vAlign w:val="center"/>
+          </w:tcPr>
+          <w:p>
+            <w:pPr>
+              <w:pStyle w:val="a9"/>
+              <w:ind w:firstLine="0"/>
+              <w:rPr>
+                <w:rFonts w:cs="Times New Roman"/>
+                <w:sz w:val="24"/>
+                <w:szCs w:val="24"/>
+                <w:lang w:eastAsia="ru-RU"/>
+              </w:rPr>
+            </w:pPr>
+            <w:r>
+              <w:rPr>
+                <w:rFonts w:cs="Times New Roman"/>
+                <w:sz w:val="24"/>
+                <w:szCs w:val="24"/>
+              </w:rPr>
+              <w:t>H2</w:t>
+            </w:r>
+          </w:p>
+        </w:tc>
+        <w:tc>
+          <w:tcPr>
+            <w:tcW w:w="1692" w:type="dxa"/>
+            <w:vAlign w:val="center"/>
+          </w:tcPr>
+          <w:p>
+            <w:pPr>
+              <w:pStyle w:val="a9"/>
+              <w:ind w:firstLine="0"/>
+              <w:rPr>
+                <w:rFonts w:cs="Times New Roman"/>
+                <w:sz w:val="24"/>
+                <w:szCs w:val="24"/>
+                <w:lang w:eastAsia="ru-RU"/>
+              </w:rPr>
+            </w:pPr>
+            <w:proofErr w:type="spellStart"/>
+            <w:r>
+              <w:rPr>
+                <w:rFonts w:cs="Times New Roman"/>
+                <w:sz w:val="24"/>
+                <w:szCs w:val="24"/>
+              </w:rPr>
+              <w:t>Playfair</w:t>
+            </w:r>
+            <w:proofErr w:type="spellEnd"/>
+            <w:r>
+              <w:rPr>
+                <w:rFonts w:cs="Times New Roman"/>
+                <w:sz w:val="24"/>
+                <w:szCs w:val="24"/>
+              </w:rPr>
+              <w:t xml:space="preserve"> </w:t>
+            </w:r>
+            <w:proofErr w:type="spellStart"/>
+            <w:r>
+              <w:rPr>
+                <w:rFonts w:cs="Times New Roman"/>
+                <w:sz w:val="24"/>
+                <w:szCs w:val="24"/>
+              </w:rPr>
+              <w:t>Display</w:t>
+            </w:r>
+            <w:proofErr w:type="spellEnd"/>
+            <w:r>
+              <w:rPr>
+                <w:rFonts w:cs="Times New Roman"/>
+                <w:sz w:val="24"/>
+                <w:szCs w:val="24"/>
+              </w:rPr>
+              <w:t xml:space="preserve"> </w:t>
+            </w:r>
+            <w:proofErr w:type="spellStart"/>
+            <w:r>
+              <w:rPr>
+                <w:rFonts w:cs="Times New Roman"/>
+                <w:sz w:val="24"/>
+                <w:szCs w:val="24"/>
+              </w:rPr>
+              <w:t>Bold</w:t>
+            </w:r>
+            <w:proofErr w:type="spellEnd"/>
+          </w:p>
+        </w:tc>
+        <w:tc>
+          <w:tcPr>
+            <w:tcW w:w="1677" w:type="dxa"/>
+            <w:vAlign w:val="center"/>
+          </w:tcPr>
+          <w:p>
+            <w:pPr>
+              <w:pStyle w:val="a9"/>
+              <w:ind w:firstLine="0"/>
+              <w:rPr>
+                <w:rFonts w:cs="Times New Roman"/>
+                <w:sz w:val="24"/>
+                <w:szCs w:val="24"/>
+                <w:lang w:eastAsia="ru-RU"/>
+              </w:rPr>
+            </w:pPr>
+            <w:r>
+              <w:rPr>
+                <w:rFonts w:cs="Times New Roman"/>
+                <w:sz w:val="24"/>
+                <w:szCs w:val="24"/>
+              </w:rPr>
+              <w:t xml:space="preserve">20 </w:t>
+            </w:r>
+            <w:proofErr w:type="spellStart"/>
+            <w:r>
+              <w:rPr>
+                <w:rFonts w:cs="Times New Roman"/>
+                <w:sz w:val="24"/>
+                <w:szCs w:val="24"/>
+              </w:rPr>
+              <w:t>px</w:t>
+            </w:r>
+            <w:proofErr w:type="spellEnd"/>
+          </w:p>
+        </w:tc>
+        <w:tc>
+          <w:tcPr>
+            <w:tcW w:w="2065" w:type="dxa"/>
+            <w:vAlign w:val="center"/>
+          </w:tcPr>
+          <w:p>
+            <w:pPr>
+              <w:pStyle w:val="a9"/>
+              <w:ind w:firstLine="0"/>
+              <w:rPr>
+                <w:rFonts w:cs="Times New Roman"/>
+                <w:sz w:val="24"/>
+                <w:szCs w:val="24"/>
+                <w:lang w:eastAsia="ru-RU"/>
+              </w:rPr>
+            </w:pPr>
+            <w:r>
+              <w:rPr>
+                <w:rFonts w:cs="Times New Roman"/>
+                <w:sz w:val="24"/>
+                <w:szCs w:val="24"/>
+              </w:rPr>
+              <w:t xml:space="preserve">28 </w:t>
+            </w:r>
+            <w:proofErr w:type="spellStart"/>
+            <w:r>
+              <w:rPr>
+                <w:rFonts w:cs="Times New Roman"/>
+                <w:sz w:val="24"/>
+                <w:szCs w:val="24"/>
+              </w:rPr>
+              <w:t>px</w:t>
+            </w:r>
+            <w:proofErr w:type="spellEnd"/>
+          </w:p>
+        </w:tc>
+        <w:tc>
+          <w:tcPr>
+            <w:tcW w:w="2236" w:type="dxa"/>
+            <w:vAlign w:val="center"/>
+          </w:tcPr>
+          <w:p>
+            <w:pPr>
+              <w:pStyle w:val="a9"/>
+              <w:ind w:firstLine="0"/>
+              <w:rPr>
+                <w:rFonts w:cs="Times New Roman"/>
+                <w:sz w:val="24"/>
+                <w:szCs w:val="24"/>
+                <w:lang w:eastAsia="ru-RU"/>
+              </w:rPr>
+            </w:pPr>
+            <w:r>
+              <w:rPr>
+                <w:rFonts w:cs="Times New Roman"/>
+                <w:sz w:val="24"/>
+                <w:szCs w:val="24"/>
+              </w:rPr>
+              <w:t>Названия дел и разделов</w:t>
+            </w:r>
+          </w:p>
+        </w:tc>
+      </w:tr>
+      <w:tr>
+        <w:tc>
+          <w:tcPr>
+            <w:tcW w:w="1675" w:type="dxa"/>
+            <w:vAlign w:val="center"/>
+          </w:tcPr>
+          <w:p>
+            <w:pPr>
+              <w:pStyle w:val="a9"/>
+              <w:ind w:firstLine="0"/>
+              <w:rPr>
+                <w:rFonts w:cs="Times New Roman"/>
+                <w:sz w:val="24"/>
+                <w:szCs w:val="24"/>
+                <w:lang w:eastAsia="ru-RU"/>
+              </w:rPr>
+            </w:pPr>
+            <w:proofErr w:type="spellStart"/>
+            <w:r>
+              <w:rPr>
+                <w:rFonts w:cs="Times New Roman"/>
+                <w:sz w:val="24"/>
+                <w:szCs w:val="24"/>
+              </w:rPr>
+              <w:t>Body</w:t>
+            </w:r>
+            <w:proofErr w:type="spellEnd"/>
+          </w:p>
+        </w:tc>
+        <w:tc>
+          <w:tcPr>
+            <w:tcW w:w="1692" w:type="dxa"/>
+            <w:vAlign w:val="center"/>
+          </w:tcPr>
+          <w:p>
+            <w:pPr>
+              <w:pStyle w:val="a9"/>
+              <w:ind w:firstLine="0"/>
+              <w:rPr>
+                <w:rFonts w:cs="Times New Roman"/>
+                <w:sz w:val="24"/>
+                <w:szCs w:val="24"/>
+                <w:lang w:eastAsia="ru-RU"/>
+              </w:rPr>
+            </w:pPr>
+            <w:proofErr w:type="spellStart"/>
+            <w:r>
+              <w:rPr>
+                <w:rFonts w:cs="Times New Roman"/>
+                <w:sz w:val="24"/>
+                <w:szCs w:val="24"/>
+              </w:rPr>
+              <w:t>Inter</w:t>
+            </w:r>
+            <w:proofErr w:type="spellEnd"/>
+            <w:r>
+              <w:rPr>
+                <w:rFonts w:cs="Times New Roman"/>
+                <w:sz w:val="24"/>
+                <w:szCs w:val="24"/>
+              </w:rPr>
+              <w:t xml:space="preserve"> </w:t>
+            </w:r>
+            <w:proofErr w:type="spellStart"/>
+            <w:r>
+              <w:rPr>
+                <w:rFonts w:cs="Times New Roman"/>
+                <w:sz w:val="24"/>
+                <w:szCs w:val="24"/>
+              </w:rPr>
+              <w:t>Regular</w:t>
+            </w:r>
+            <w:proofErr w:type="spellEnd"/>
+          </w:p>
+        </w:tc>
+        <w:tc>
+          <w:tcPr>
+            <w:tcW w:w="1677" w:type="dxa"/>
+            <w:vAlign w:val="center"/>
+          </w:tcPr>
+          <w:p>
+            <w:pPr>
+              <w:pStyle w:val="a9"/>
+              <w:ind w:firstLine="0"/>
+              <w:rPr>
+                <w:rFonts w:cs="Times New Roman"/>
+                <w:sz w:val="24"/>
+                <w:szCs w:val="24"/>
+                <w:lang w:eastAsia="ru-RU"/>
+              </w:rPr>
+            </w:pPr>
+            <w:r>
+              <w:rPr>
+                <w:rFonts w:cs="Times New Roman"/>
+                <w:sz w:val="24"/>
+                <w:szCs w:val="24"/>
+              </w:rPr>
+              <w:t xml:space="preserve">16 </w:t>
+            </w:r>
+            <w:proofErr w:type="spellStart"/>
+            <w:r>
+              <w:rPr>
+                <w:rFonts w:cs="Times New Roman"/>
+                <w:sz w:val="24"/>
+                <w:szCs w:val="24"/>
+              </w:rPr>
+              <w:t>px</w:t>
+            </w:r>
+            <w:proofErr w:type="spellEnd"/>
+          </w:p>
+        </w:tc>
+        <w:tc>
+          <w:tcPr>
+            <w:tcW w:w="2065" w:type="dxa"/>
+            <w:vAlign w:val="center"/>
+          </w:tcPr>
+          <w:p>
+            <w:pPr>
+              <w:pStyle w:val="a9"/>
+              <w:ind w:firstLine="0"/>
+              <w:rPr>
+                <w:rFonts w:cs="Times New Roman"/>
+                <w:sz w:val="24"/>
+                <w:szCs w:val="24"/>
+                <w:lang w:eastAsia="ru-RU"/>
+              </w:rPr>
+            </w:pPr>
+            <w:r>
+              <w:rPr>
+                <w:rFonts w:cs="Times New Roman"/>
+                <w:sz w:val="24"/>
+                <w:szCs w:val="24"/>
+              </w:rPr>
+              <w:t xml:space="preserve">24 </w:t>
+            </w:r>
+            <w:proofErr w:type="spellStart"/>
+            <w:r>
+              <w:rPr>
+                <w:rFonts w:cs="Times New Roman"/>
+                <w:sz w:val="24"/>
+                <w:szCs w:val="24"/>
+              </w:rPr>
+              <w:t>px</w:t>
+            </w:r>
+            <w:proofErr w:type="spellEnd"/>
+          </w:p>
+        </w:tc>
+        <w:tc>
+          <w:tcPr>
+            <w:tcW w:w="2236" w:type="dxa"/>
+            <w:vAlign w:val="center"/>
+          </w:tcPr>
+          <w:p>
+            <w:pPr>
+              <w:pStyle w:val="a9"/>
+              <w:ind w:firstLine="0"/>
+              <w:rPr>
+                <w:rFonts w:cs="Times New Roman"/>
+                <w:sz w:val="24"/>
+                <w:szCs w:val="24"/>
+                <w:lang w:eastAsia="ru-RU"/>
+              </w:rPr>
+            </w:pPr>
+            <w:r>
+              <w:rPr>
+                <w:rFonts w:cs="Times New Roman"/>
+                <w:sz w:val="24"/>
+                <w:szCs w:val="24"/>
+              </w:rPr>
+              <w:t>Основной текст, описания</w:t>
+            </w:r>
+          </w:p>
+        </w:tc>
+      </w:tr>
+      <w:tr>
+        <w:tc>
+          <w:tcPr>
+            <w:tcW w:w="1675" w:type="dxa"/>
+            <w:vAlign w:val="center"/>
+          </w:tcPr>
+          <w:p>
+            <w:pPr>
+              <w:pStyle w:val="a9"/>
+              <w:ind w:firstLine="0"/>
+              <w:rPr>
+                <w:rFonts w:cs="Times New Roman"/>
+                <w:sz w:val="24"/>
+                <w:szCs w:val="24"/>
+                <w:lang w:eastAsia="ru-RU"/>
+              </w:rPr>
+            </w:pPr>
+            <w:proofErr w:type="spellStart"/>
+            <w:r>
+              <w:rPr>
+                <w:rFonts w:cs="Times New Roman"/>
+                <w:sz w:val="24"/>
+                <w:szCs w:val="24"/>
+              </w:rPr>
+              <w:lastRenderedPageBreak/>
+              <w:t>Body</w:t>
+            </w:r>
+            <w:proofErr w:type="spellEnd"/>
+            <w:r>
+              <w:rPr>
+                <w:rFonts w:cs="Times New Roman"/>
+                <w:sz w:val="24"/>
+                <w:szCs w:val="24"/>
+              </w:rPr>
+              <w:t xml:space="preserve"> </w:t>
+            </w:r>
+            <w:proofErr w:type="spellStart"/>
+            <w:r>
+              <w:rPr>
+                <w:rFonts w:cs="Times New Roman"/>
+                <w:sz w:val="24"/>
+                <w:szCs w:val="24"/>
+              </w:rPr>
+              <w:t>Small</w:t>
+            </w:r>
+            <w:proofErr w:type="spellEnd"/>
+          </w:p>
+        </w:tc>
+        <w:tc>
+          <w:tcPr>
+            <w:tcW w:w="1692" w:type="dxa"/>
+            <w:vAlign w:val="center"/>
+          </w:tcPr>
+          <w:p>
+            <w:pPr>
+              <w:pStyle w:val="a9"/>
+              <w:ind w:firstLine="0"/>
+              <w:rPr>
+                <w:rFonts w:cs="Times New Roman"/>
+                <w:sz w:val="24"/>
+                <w:szCs w:val="24"/>
+                <w:lang w:eastAsia="ru-RU"/>
+              </w:rPr>
+            </w:pPr>
+            <w:proofErr w:type="spellStart"/>
+            <w:r>
+              <w:rPr>
+                <w:rFonts w:cs="Times New Roman"/>
+                <w:sz w:val="24"/>
+                <w:szCs w:val="24"/>
+              </w:rPr>
+              <w:t>Inter</w:t>
+            </w:r>
+            <w:proofErr w:type="spellEnd"/>
+            <w:r>
+              <w:rPr>
+                <w:rFonts w:cs="Times New Roman"/>
+                <w:sz w:val="24"/>
+                <w:szCs w:val="24"/>
+              </w:rPr>
+              <w:t xml:space="preserve"> </w:t>
+            </w:r>
+            <w:proofErr w:type="spellStart"/>
+            <w:r>
+              <w:rPr>
+                <w:rFonts w:cs="Times New Roman"/>
+                <w:sz w:val="24"/>
+                <w:szCs w:val="24"/>
+              </w:rPr>
+              <w:t>Regular</w:t>
+            </w:r>
+            <w:proofErr w:type="spellEnd"/>
+          </w:p>
+        </w:tc>
+        <w:tc>
+          <w:tcPr>
+            <w:tcW w:w="1677" w:type="dxa"/>
+            <w:vAlign w:val="center"/>
+          </w:tcPr>
+          <w:p>
+            <w:pPr>
+              <w:pStyle w:val="a9"/>
+              <w:ind w:firstLine="0"/>
+              <w:rPr>
+                <w:rFonts w:cs="Times New Roman"/>
+                <w:sz w:val="24"/>
+                <w:szCs w:val="24"/>
+                <w:lang w:eastAsia="ru-RU"/>
+              </w:rPr>
+            </w:pPr>
+            <w:r>
+              <w:rPr>
+                <w:rFonts w:cs="Times New Roman"/>
+                <w:sz w:val="24"/>
+                <w:szCs w:val="24"/>
+              </w:rPr>
+              <w:t xml:space="preserve">14 </w:t>
+            </w:r>
+            <w:proofErr w:type="spellStart"/>
+            <w:r>
+              <w:rPr>
+                <w:rFonts w:cs="Times New Roman"/>
+                <w:sz w:val="24"/>
+                <w:szCs w:val="24"/>
+              </w:rPr>
+              <w:t>px</w:t>
+            </w:r>
+            <w:proofErr w:type="spellEnd"/>
+          </w:p>
+        </w:tc>
+        <w:tc>
+          <w:tcPr>
+            <w:tcW w:w="2065" w:type="dxa"/>
+            <w:vAlign w:val="center"/>
+          </w:tcPr>
+          <w:p>
+            <w:pPr>
+              <w:pStyle w:val="a9"/>
+              <w:ind w:firstLine="0"/>
+              <w:rPr>
+                <w:rFonts w:cs="Times New Roman"/>
+                <w:sz w:val="24"/>
+                <w:szCs w:val="24"/>
+                <w:lang w:eastAsia="ru-RU"/>
+              </w:rPr>
+            </w:pPr>
+            <w:r>
+              <w:rPr>
+                <w:rFonts w:cs="Times New Roman"/>
+                <w:sz w:val="24"/>
+                <w:szCs w:val="24"/>
+              </w:rPr>
+              <w:t xml:space="preserve">20 </w:t>
+            </w:r>
+            <w:proofErr w:type="spellStart"/>
+            <w:r>
+              <w:rPr>
+                <w:rFonts w:cs="Times New Roman"/>
+                <w:sz w:val="24"/>
+                <w:szCs w:val="24"/>
+              </w:rPr>
+              <w:t>px</w:t>
+            </w:r>
+            <w:proofErr w:type="spellEnd"/>
+          </w:p>
+        </w:tc>
+        <w:tc>
+          <w:tcPr>
+            <w:tcW w:w="2236" w:type="dxa"/>
+            <w:vAlign w:val="center"/>
+          </w:tcPr>
+          <w:p>
+            <w:pPr>
+              <w:pStyle w:val="a9"/>
+              <w:ind w:firstLine="0"/>
+              <w:rPr>
+                <w:rFonts w:cs="Times New Roman"/>
+                <w:sz w:val="24"/>
+                <w:szCs w:val="24"/>
+                <w:lang w:eastAsia="ru-RU"/>
+              </w:rPr>
+            </w:pPr>
+            <w:r>
+              <w:rPr>
+                <w:rFonts w:cs="Times New Roman"/>
+                <w:sz w:val="24"/>
+                <w:szCs w:val="24"/>
+              </w:rPr>
+              <w:t>Диалоги, вторичные описания</w:t>
+            </w:r>
+          </w:p>
+        </w:tc>
+      </w:tr>
+      <w:tr>
+        <w:tc>
+          <w:tcPr>
+            <w:tcW w:w="1675" w:type="dxa"/>
+            <w:vAlign w:val="center"/>
+          </w:tcPr>
+          <w:p>
+            <w:pPr>
+              <w:pStyle w:val="a9"/>
+              <w:ind w:firstLine="0"/>
+              <w:rPr>
+                <w:rFonts w:cs="Times New Roman"/>
+                <w:sz w:val="24"/>
+                <w:szCs w:val="24"/>
+                <w:lang w:eastAsia="ru-RU"/>
+              </w:rPr>
+            </w:pPr>
+            <w:proofErr w:type="spellStart"/>
+            <w:r>
+              <w:rPr>
+                <w:rFonts w:cs="Times New Roman"/>
+                <w:sz w:val="24"/>
+                <w:szCs w:val="24"/>
+              </w:rPr>
+              <w:t>Caption</w:t>
+            </w:r>
+            <w:proofErr w:type="spellEnd"/>
+          </w:p>
+        </w:tc>
+        <w:tc>
+          <w:tcPr>
+            <w:tcW w:w="1692" w:type="dxa"/>
+            <w:vAlign w:val="center"/>
+          </w:tcPr>
+          <w:p>
+            <w:pPr>
+              <w:pStyle w:val="a9"/>
+              <w:ind w:firstLine="0"/>
+              <w:rPr>
+                <w:rFonts w:cs="Times New Roman"/>
+                <w:sz w:val="24"/>
+                <w:szCs w:val="24"/>
+                <w:lang w:eastAsia="ru-RU"/>
+              </w:rPr>
+            </w:pPr>
+            <w:proofErr w:type="spellStart"/>
+            <w:r>
+              <w:rPr>
+                <w:rFonts w:cs="Times New Roman"/>
+                <w:sz w:val="24"/>
+                <w:szCs w:val="24"/>
+              </w:rPr>
+              <w:t>Inter</w:t>
+            </w:r>
+            <w:proofErr w:type="spellEnd"/>
+            <w:r>
+              <w:rPr>
+                <w:rFonts w:cs="Times New Roman"/>
+                <w:sz w:val="24"/>
+                <w:szCs w:val="24"/>
+              </w:rPr>
+              <w:t xml:space="preserve"> </w:t>
+            </w:r>
+            <w:proofErr w:type="spellStart"/>
+            <w:r>
+              <w:rPr>
+                <w:rFonts w:cs="Times New Roman"/>
+                <w:sz w:val="24"/>
+                <w:szCs w:val="24"/>
+              </w:rPr>
+              <w:t>Regular</w:t>
+            </w:r>
+            <w:proofErr w:type="spellEnd"/>
+          </w:p>
+        </w:tc>
+        <w:tc>
+          <w:tcPr>
+            <w:tcW w:w="1677" w:type="dxa"/>
+            <w:vAlign w:val="center"/>
+          </w:tcPr>
+          <w:p>
+            <w:pPr>
+              <w:pStyle w:val="a9"/>
+              <w:ind w:firstLine="0"/>
+              <w:rPr>
+                <w:rFonts w:cs="Times New Roman"/>
+                <w:sz w:val="24"/>
+                <w:szCs w:val="24"/>
+                <w:lang w:eastAsia="ru-RU"/>
+              </w:rPr>
+            </w:pPr>
+            <w:r>
+              <w:rPr>
+                <w:rFonts w:cs="Times New Roman"/>
+                <w:sz w:val="24"/>
+                <w:szCs w:val="24"/>
+              </w:rPr>
+              <w:t xml:space="preserve">12 </w:t>
+            </w:r>
+            <w:proofErr w:type="spellStart"/>
+            <w:r>
+              <w:rPr>
+                <w:rFonts w:cs="Times New Roman"/>
+                <w:sz w:val="24"/>
+                <w:szCs w:val="24"/>
+              </w:rPr>
+              <w:t>px</w:t>
+            </w:r>
+            <w:proofErr w:type="spellEnd"/>
+          </w:p>
+        </w:tc>
+        <w:tc>
+          <w:tcPr>
+            <w:tcW w:w="2065" w:type="dxa"/>
+            <w:vAlign w:val="center"/>
+          </w:tcPr>
+          <w:p>
+            <w:pPr>
+              <w:pStyle w:val="a9"/>
+              <w:ind w:firstLine="0"/>
+              <w:rPr>
+                <w:rFonts w:cs="Times New Roman"/>
+                <w:sz w:val="24"/>
+                <w:szCs w:val="24"/>
+                <w:lang w:eastAsia="ru-RU"/>
+              </w:rPr>
+            </w:pPr>
+            <w:r>
+              <w:rPr>
+                <w:rFonts w:cs="Times New Roman"/>
+                <w:sz w:val="24"/>
+                <w:szCs w:val="24"/>
+              </w:rPr>
+              <w:t xml:space="preserve">16 </w:t>
+            </w:r>
+            <w:proofErr w:type="spellStart"/>
+            <w:r>
+              <w:rPr>
+                <w:rFonts w:cs="Times New Roman"/>
+                <w:sz w:val="24"/>
+                <w:szCs w:val="24"/>
+              </w:rPr>
+              <w:t>px</w:t>
+            </w:r>
+            <w:proofErr w:type="spellEnd"/>
+          </w:p>
+        </w:tc>
+        <w:tc>
+          <w:tcPr>
+            <w:tcW w:w="2236" w:type="dxa"/>
+            <w:vAlign w:val="center"/>
+          </w:tcPr>
+          <w:p>
+            <w:pPr>
+              <w:pStyle w:val="a9"/>
+              <w:ind w:firstLine="0"/>
+              <w:rPr>
+                <w:rFonts w:cs="Times New Roman"/>
+                <w:sz w:val="24"/>
+                <w:szCs w:val="24"/>
+                <w:lang w:eastAsia="ru-RU"/>
+              </w:rPr>
+            </w:pPr>
+            <w:r>
+              <w:rPr>
+                <w:rFonts w:cs="Times New Roman"/>
+                <w:sz w:val="24"/>
+                <w:szCs w:val="24"/>
+              </w:rPr>
+              <w:t>Подписи, вспомогательная информация</w:t>
+            </w:r>
+          </w:p>
+        </w:tc>
+      </w:tr>
+    </w:tbl>
+    <w:p>
+      <w:pPr>
+        <w:pStyle w:val="a9"/>
+        <w:rPr>
+          <w:lang w:eastAsia="ru-RU"/>
+        </w:rPr>
+      </w:pPr>
+    </w:p>
+    <w:p>
+      <w:pPr>
+        <w:pStyle w:val="a9"/>
+        <w:rPr>
+          <w:lang w:eastAsia="ru-RU"/>
+        </w:rPr>
+      </w:pPr>
+      <w:r>
+        <w:rPr>
+          <w:lang w:eastAsia="ru-RU"/>
+        </w:rPr>
+        <w:t xml:space="preserve">Размеры шрифтов и межстрочные интервалы указаны в пикселях макета </w:t>
+      </w:r>
+      <w:proofErr w:type="spellStart"/>
+      <w:r>
+        <w:rPr>
+          <w:lang w:eastAsia="ru-RU"/>
+        </w:rPr>
+        <w:t>Figma</w:t>
+      </w:r>
+      <w:proofErr w:type="spellEnd"/>
+      <w:r>
+        <w:rPr>
+          <w:lang w:eastAsia="ru-RU"/>
+        </w:rPr>
+        <w:t xml:space="preserve">. При реализации </w:t>
+      </w:r>
+      <w:proofErr w:type="spellStart"/>
+      <w:r>
+        <w:rPr>
+          <w:lang w:eastAsia="ru-RU"/>
+        </w:rPr>
+        <w:t>Android</w:t>
+      </w:r>
+      <w:proofErr w:type="spellEnd"/>
+      <w:r>
+        <w:rPr>
+          <w:lang w:eastAsia="ru-RU"/>
+        </w:rPr>
+        <w:t>-интерфейса размеры должны быть адаптированы к используемым единицам измерения.</w:t>
+      </w:r>
+    </w:p>
+    <w:p>
+      <w:pPr>
+        <w:pStyle w:val="a9"/>
+        <w:rPr>
+          <w:lang w:eastAsia="ru-RU"/>
+        </w:rPr>
+      </w:pPr>
+      <w:r>
+        <w:rPr>
+          <w:lang w:eastAsia="ru-RU"/>
+        </w:rPr>
+        <w:t>Для основного текста предпочтительно использовать обычное начертание, а полужирное - для названий, выделения важных сведений и интерактивных элементов.</w:t>
+      </w:r>
+    </w:p>
+    <w:p>
+      <w:pPr>
+        <w:pStyle w:val="a9"/>
+        <w:rPr>
+          <w:lang w:eastAsia="ru-RU"/>
+        </w:rPr>
+      </w:pPr>
+      <w:r>
+        <w:rPr>
+          <w:lang w:eastAsia="ru-RU"/>
+        </w:rPr>
+        <w:t>Так же в</w:t>
+      </w:r>
+      <w:r>
+        <w:rPr>
+          <w:lang w:eastAsia="ru-RU"/>
+        </w:rPr>
+        <w:t xml:space="preserve"> основе макетов используется сетка с шагом 8 </w:t>
+      </w:r>
+      <w:proofErr w:type="spellStart"/>
+      <w:r>
+        <w:rPr>
+          <w:lang w:eastAsia="ru-RU"/>
+        </w:rPr>
+        <w:t>dp</w:t>
+      </w:r>
+      <w:proofErr w:type="spellEnd"/>
+      <w:r>
+        <w:rPr>
+          <w:lang w:eastAsia="ru-RU"/>
+        </w:rPr>
+        <w:t xml:space="preserve">. Для небольших расстояний допускается использование шага 4 </w:t>
+      </w:r>
+      <w:proofErr w:type="spellStart"/>
+      <w:r>
+        <w:rPr>
+          <w:lang w:eastAsia="ru-RU"/>
+        </w:rPr>
+        <w:t>dp</w:t>
+      </w:r>
+      <w:proofErr w:type="spellEnd"/>
+      <w:r>
+        <w:rPr>
+          <w:lang w:eastAsia="ru-RU"/>
+        </w:rPr>
+        <w:t>.</w:t>
+      </w:r>
+      <w:r>
+        <w:rPr>
+          <w:lang w:eastAsia="ru-RU"/>
+        </w:rPr>
+        <w:t xml:space="preserve"> </w:t>
+      </w:r>
+      <w:r>
+        <w:rPr>
+          <w:lang w:eastAsia="ru-RU"/>
+        </w:rPr>
+        <w:t xml:space="preserve">Горизонтальные отступы от краёв экрана составляют 16 </w:t>
+      </w:r>
+      <w:proofErr w:type="spellStart"/>
+      <w:r>
+        <w:rPr>
+          <w:lang w:eastAsia="ru-RU"/>
+        </w:rPr>
+        <w:t>dp</w:t>
+      </w:r>
+      <w:proofErr w:type="spellEnd"/>
+      <w:r>
+        <w:rPr>
+          <w:lang w:eastAsia="ru-RU"/>
+        </w:rPr>
+        <w:t>.</w:t>
+      </w:r>
+    </w:p>
+    <w:p>
+      <w:pPr>
+        <w:pStyle w:val="a9"/>
+        <w:rPr>
+          <w:lang w:eastAsia="ru-RU"/>
+        </w:rPr>
+      </w:pPr>
+      <w:r>
+        <w:rPr>
+          <w:lang w:eastAsia="ru-RU"/>
+        </w:rPr>
+        <w:t>Основные правила:</w:t>
+      </w:r>
+    </w:p>
+    <w:p>
+      <w:pPr>
+        <w:pStyle w:val="a9"/>
+        <w:numPr>
+          <w:ilvl w:val="0"/>
+          <w:numId w:val="23"/>
+        </w:numPr>
+        <w:ind w:left="0" w:firstLine="709"/>
+        <w:rPr>
+          <w:lang w:eastAsia="ru-RU"/>
+        </w:rPr>
+      </w:pPr>
+      <w:r>
+        <w:rPr>
+          <w:lang w:eastAsia="ru-RU"/>
+        </w:rPr>
+        <w:t xml:space="preserve">кнопки и поля ввода имеют высоту 48 </w:t>
+      </w:r>
+      <w:proofErr w:type="spellStart"/>
+      <w:r>
+        <w:rPr>
+          <w:lang w:eastAsia="ru-RU"/>
+        </w:rPr>
+        <w:t>dp</w:t>
+      </w:r>
+      <w:proofErr w:type="spellEnd"/>
+      <w:r>
+        <w:rPr>
+          <w:lang w:eastAsia="ru-RU"/>
+        </w:rPr>
+        <w:t>;</w:t>
+      </w:r>
+    </w:p>
+    <w:p>
+      <w:pPr>
+        <w:pStyle w:val="a9"/>
+        <w:numPr>
+          <w:ilvl w:val="0"/>
+          <w:numId w:val="23"/>
+        </w:numPr>
+        <w:ind w:left="0" w:firstLine="709"/>
+        <w:rPr>
+          <w:lang w:eastAsia="ru-RU"/>
+        </w:rPr>
+      </w:pPr>
+      <w:r>
+        <w:rPr>
+          <w:lang w:eastAsia="ru-RU"/>
+        </w:rPr>
+        <w:t xml:space="preserve">радиус </w:t>
+      </w:r>
+      <w:proofErr w:type="spellStart"/>
+      <w:r>
+        <w:rPr>
+          <w:lang w:eastAsia="ru-RU"/>
+        </w:rPr>
+        <w:t>скругления</w:t>
+      </w:r>
+      <w:proofErr w:type="spellEnd"/>
+      <w:r>
+        <w:rPr>
+          <w:lang w:eastAsia="ru-RU"/>
+        </w:rPr>
+        <w:t xml:space="preserve"> кнопок и полей составляет 12 </w:t>
+      </w:r>
+      <w:proofErr w:type="spellStart"/>
+      <w:r>
+        <w:rPr>
+          <w:lang w:eastAsia="ru-RU"/>
+        </w:rPr>
+        <w:t>dp</w:t>
+      </w:r>
+      <w:proofErr w:type="spellEnd"/>
+      <w:r>
+        <w:rPr>
+          <w:lang w:eastAsia="ru-RU"/>
+        </w:rPr>
+        <w:t>;</w:t>
+      </w:r>
+    </w:p>
+    <w:p>
+      <w:pPr>
+        <w:pStyle w:val="a9"/>
+        <w:numPr>
+          <w:ilvl w:val="0"/>
+          <w:numId w:val="23"/>
+        </w:numPr>
+        <w:ind w:left="0" w:firstLine="709"/>
+        <w:rPr>
+          <w:lang w:eastAsia="ru-RU"/>
+        </w:rPr>
+      </w:pPr>
+      <w:r>
+        <w:rPr>
+          <w:lang w:eastAsia="ru-RU"/>
+        </w:rPr>
+        <w:t xml:space="preserve">радиус </w:t>
+      </w:r>
+      <w:proofErr w:type="spellStart"/>
+      <w:r>
+        <w:rPr>
+          <w:lang w:eastAsia="ru-RU"/>
+        </w:rPr>
+        <w:t>скругления</w:t>
+      </w:r>
+      <w:proofErr w:type="spellEnd"/>
+      <w:r>
+        <w:rPr>
+          <w:lang w:eastAsia="ru-RU"/>
+        </w:rPr>
+        <w:t xml:space="preserve"> карточек составляет 16 </w:t>
+      </w:r>
+      <w:proofErr w:type="spellStart"/>
+      <w:r>
+        <w:rPr>
+          <w:lang w:eastAsia="ru-RU"/>
+        </w:rPr>
+        <w:t>dp</w:t>
+      </w:r>
+      <w:proofErr w:type="spellEnd"/>
+      <w:r>
+        <w:rPr>
+          <w:lang w:eastAsia="ru-RU"/>
+        </w:rPr>
+        <w:t>;</w:t>
+      </w:r>
+    </w:p>
+    <w:p>
+      <w:pPr>
+        <w:pStyle w:val="a9"/>
+        <w:numPr>
+          <w:ilvl w:val="0"/>
+          <w:numId w:val="23"/>
+        </w:numPr>
+        <w:ind w:left="0" w:firstLine="709"/>
+        <w:rPr>
+          <w:lang w:eastAsia="ru-RU"/>
+        </w:rPr>
+      </w:pPr>
+      <w:r>
+        <w:rPr>
+          <w:lang w:eastAsia="ru-RU"/>
+        </w:rPr>
+        <w:t xml:space="preserve">внутренние отступы карточек составляют 16 </w:t>
+      </w:r>
+      <w:proofErr w:type="spellStart"/>
+      <w:r>
+        <w:rPr>
+          <w:lang w:eastAsia="ru-RU"/>
+        </w:rPr>
+        <w:t>dp</w:t>
+      </w:r>
+      <w:proofErr w:type="spellEnd"/>
+    </w:p>
+    <w:p>
+      <w:pPr>
+        <w:pStyle w:val="a9"/>
+        <w:numPr>
+          <w:ilvl w:val="0"/>
+          <w:numId w:val="23"/>
+        </w:numPr>
+        <w:ind w:left="0" w:firstLine="709"/>
+        <w:rPr>
+          <w:lang w:eastAsia="ru-RU"/>
+        </w:rPr>
+      </w:pPr>
+      <w:r>
+        <w:rPr>
+          <w:lang w:eastAsia="ru-RU"/>
+        </w:rPr>
+        <w:t xml:space="preserve">между крупными блоками используется расстояние 24–32 </w:t>
+      </w:r>
+      <w:proofErr w:type="spellStart"/>
+      <w:r>
+        <w:rPr>
+          <w:lang w:eastAsia="ru-RU"/>
+        </w:rPr>
+        <w:t>dp</w:t>
+      </w:r>
+      <w:proofErr w:type="spellEnd"/>
+      <w:r>
+        <w:rPr>
+          <w:lang w:eastAsia="ru-RU"/>
+        </w:rPr>
+        <w:t>;</w:t>
+      </w:r>
+    </w:p>
+    <w:p>
+      <w:pPr>
+        <w:pStyle w:val="a9"/>
+        <w:numPr>
+          <w:ilvl w:val="0"/>
+          <w:numId w:val="23"/>
+        </w:numPr>
+        <w:ind w:left="0" w:firstLine="709"/>
+        <w:rPr>
+          <w:lang w:eastAsia="ru-RU"/>
+        </w:rPr>
+      </w:pPr>
+      <w:r>
+        <w:rPr>
+          <w:lang w:eastAsia="ru-RU"/>
+        </w:rPr>
+        <w:t>элементы одной функциональной группы располагаются ближе друг к другу, чем элементы разных групп.</w:t>
+      </w:r>
+    </w:p>
+    <w:p>
+      <w:pPr>
+        <w:pStyle w:val="a9"/>
+        <w:rPr>
+          <w:lang w:eastAsia="ru-RU"/>
+        </w:rPr>
+      </w:pPr>
+      <w:r>
+        <w:rPr>
+          <w:lang w:eastAsia="ru-RU"/>
+        </w:rPr>
+        <w:t xml:space="preserve">При создании реальных экранов </w:t>
+      </w:r>
+      <w:r>
+        <w:rPr>
+          <w:lang w:eastAsia="ru-RU"/>
+        </w:rPr>
+        <w:t xml:space="preserve">размеры и отступы </w:t>
+      </w:r>
+      <w:r>
+        <w:rPr>
+          <w:lang w:eastAsia="ru-RU"/>
+        </w:rPr>
+        <w:t xml:space="preserve">могут корректироваться с учётом содержимого </w:t>
+      </w:r>
+      <w:proofErr w:type="spellStart"/>
+      <w:r>
+        <w:rPr>
+          <w:lang w:eastAsia="ru-RU"/>
+        </w:rPr>
+        <w:t>Android</w:t>
+      </w:r>
+      <w:proofErr w:type="spellEnd"/>
+      <w:r>
+        <w:rPr>
+          <w:lang w:eastAsia="ru-RU"/>
+        </w:rPr>
+        <w:t>.</w:t>
+      </w:r>
+    </w:p>
+    <w:p>
+      <w:pPr>
+        <w:pStyle w:val="3"/>
+        <w:numPr>
+          <w:ilvl w:val="2"/>
+          <w:numId w:val="1"/>
+        </w:numPr>
+        <w:ind w:left="0" w:firstLine="709"/>
+        <w:rPr>
+          <w:lang w:eastAsia="ru-RU"/>
+        </w:rPr>
+      </w:pPr>
+      <w:r>
+        <w:rPr>
+          <w:lang w:eastAsia="ru-RU"/>
+        </w:rPr>
+        <w:t>Библиотека компонентов</w:t>
+      </w:r>
+    </w:p>
+    <w:p>
+      <w:pPr>
+        <w:pStyle w:val="a9"/>
+        <w:rPr>
+          <w:lang w:eastAsia="ru-RU"/>
+        </w:rPr>
+      </w:pPr>
+      <w:r>
+        <w:rPr>
+          <w:lang w:eastAsia="ru-RU"/>
+        </w:rPr>
+        <w:t xml:space="preserve">Для дизайна системы была разработана библиотека компонентов и представлена на макете </w:t>
+      </w:r>
+      <w:proofErr w:type="spellStart"/>
+      <w:r>
+        <w:rPr>
+          <w:lang w:val="en-US" w:eastAsia="ru-RU"/>
+        </w:rPr>
+        <w:t>Figma</w:t>
+      </w:r>
+      <w:proofErr w:type="spellEnd"/>
+      <w:r>
+        <w:rPr>
+          <w:lang w:eastAsia="ru-RU"/>
+        </w:rPr>
+        <w:t>. Он включает в себя:</w:t>
+      </w:r>
+    </w:p>
+    <w:p>
+      <w:pPr>
+        <w:pStyle w:val="a9"/>
+        <w:rPr>
+          <w:lang w:eastAsia="ru-RU"/>
+        </w:rPr>
+      </w:pPr>
+    </w:p>
+    <w:p>
+      <w:pPr>
+        <w:pStyle w:val="a9"/>
+        <w:rPr>
+          <w:lang w:eastAsia="ru-RU"/>
+        </w:rPr>
+      </w:pPr>
+    </w:p>
+    <w:p>
+      <w:pPr>
+        <w:pStyle w:val="a9"/>
+        <w:rPr>
+          <w:lang w:eastAsia="ru-RU"/>
+        </w:rPr>
+      </w:pPr>
+    </w:p>
+    <w:p>
+      <w:pPr>
+        <w:pStyle w:val="a9"/>
+        <w:rPr>
+          <w:lang w:eastAsia="ru-RU"/>
+        </w:rPr>
+      </w:pPr>
+    </w:p>
+    <w:p>
+      <w:pPr>
+        <w:pStyle w:val="3"/>
+        <w:numPr>
+          <w:ilvl w:val="2"/>
+          <w:numId w:val="1"/>
+        </w:numPr>
+        <w:ind w:left="0" w:firstLine="698"/>
+        <w:rPr>
+          <w:lang w:eastAsia="ru-RU"/>
+        </w:rPr>
+      </w:pPr>
+      <w:r>
+        <w:rPr>
+          <w:lang w:eastAsia="ru-RU"/>
+        </w:rPr>
+        <w:t xml:space="preserve">Проверка контрастности по </w:t>
+      </w:r>
+      <w:r>
+        <w:rPr>
+          <w:lang w:eastAsia="ru-RU"/>
+        </w:rPr>
+        <w:t>WCAG AA</w:t>
+      </w:r>
     </w:p>
     <w:p>
       <w:pPr>
@@ -18749,9 +21935,9 @@
     </w:lvl>
   </w:abstractNum>
   <w:abstractNum w:abstractNumId="7" w15:restartNumberingAfterBreak="0">
-    <w:nsid w:val="44F22ECF"/>
+    <w:nsid w:val="411F00C2"/>
     <w:multiLevelType w:val="hybridMultilevel"/>
-    <w:tmpl w:val="10029DFC"/>
+    <w:tmpl w:val="9582019E"/>
     <w:lvl w:ilvl="0" w:tplc="7F6028E6">
       <w:start w:val="1"/>
       <w:numFmt w:val="bullet"/>
@@ -18862,9 +22048,9 @@
     </w:lvl>
   </w:abstractNum>
   <w:abstractNum w:abstractNumId="8" w15:restartNumberingAfterBreak="0">
-    <w:nsid w:val="497271AE"/>
+    <w:nsid w:val="44F22ECF"/>
     <w:multiLevelType w:val="hybridMultilevel"/>
-    <w:tmpl w:val="C370258E"/>
+    <w:tmpl w:val="10029DFC"/>
     <w:lvl w:ilvl="0" w:tplc="7F6028E6">
       <w:start w:val="1"/>
       <w:numFmt w:val="bullet"/>
@@ -18975,6 +22161,119 @@
     </w:lvl>
   </w:abstractNum>
   <w:abstractNum w:abstractNumId="9" w15:restartNumberingAfterBreak="0">
+    <w:nsid w:val="497271AE"/>
+    <w:multiLevelType w:val="hybridMultilevel"/>
+    <w:tmpl w:val="C370258E"/>
+    <w:lvl w:ilvl="0" w:tplc="7F6028E6">
+      <w:start w:val="1"/>
+      <w:numFmt w:val="bullet"/>
+      <w:lvlText w:val=""/>
+      <w:lvlJc w:val="left"/>
+      <w:pPr>
+        <w:ind w:left="1429" w:hanging="360"/>
+      </w:pPr>
+      <w:rPr>
+        <w:rFonts w:ascii="Symbol" w:hAnsi="Symbol" w:hint="default"/>
+      </w:rPr>
+    </w:lvl>
+    <w:lvl w:ilvl="1" w:tplc="04190003" w:tentative="1">
+      <w:start w:val="1"/>
+      <w:numFmt w:val="bullet"/>
+      <w:lvlText w:val="o"/>
+      <w:lvlJc w:val="left"/>
+      <w:pPr>
+        <w:ind w:left="2149" w:hanging="360"/>
+      </w:pPr>
+      <w:rPr>
+        <w:rFonts w:ascii="Courier New" w:hAnsi="Courier New" w:cs="Courier New" w:hint="default"/>
+      </w:rPr>
+    </w:lvl>
+    <w:lvl w:ilvl="2" w:tplc="04190005" w:tentative="1">
+      <w:start w:val="1"/>
+      <w:numFmt w:val="bullet"/>
+      <w:lvlText w:val=""/>
+      <w:lvlJc w:val="left"/>
+      <w:pPr>
+        <w:ind w:left="2869" w:hanging="360"/>
+      </w:pPr>
+      <w:rPr>
+        <w:rFonts w:ascii="Wingdings" w:hAnsi="Wingdings" w:hint="default"/>
+      </w:rPr>
+    </w:lvl>
+    <w:lvl w:ilvl="3" w:tplc="04190001" w:tentative="1">
+      <w:start w:val="1"/>
+      <w:numFmt w:val="bullet"/>
+      <w:lvlText w:val=""/>
+      <w:lvlJc w:val="left"/>
+      <w:pPr>
+        <w:ind w:left="3589" w:hanging="360"/>
+      </w:pPr>
+      <w:rPr>
+        <w:rFonts w:ascii="Symbol" w:hAnsi="Symbol" w:hint="default"/>
+      </w:rPr>
+    </w:lvl>
+    <w:lvl w:ilvl="4" w:tplc="04190003" w:tentative="1">
+      <w:start w:val="1"/>
+      <w:numFmt w:val="bullet"/>
+      <w:lvlText w:val="o"/>
+      <w:lvlJc w:val="left"/>
+      <w:pPr>
+        <w:ind w:left="4309" w:hanging="360"/>
+      </w:pPr>
+      <w:rPr>
+        <w:rFonts w:ascii="Courier New" w:hAnsi="Courier New" w:cs="Courier New" w:hint="default"/>
+      </w:rPr>
+    </w:lvl>
+    <w:lvl w:ilvl="5" w:tplc="04190005" w:tentative="1">
+      <w:start w:val="1"/>
+      <w:numFmt w:val="bullet"/>
+      <w:lvlText w:val=""/>
+      <w:lvlJc w:val="left"/>
+      <w:pPr>
+        <w:ind w:left="5029" w:hanging="360"/>
+      </w:pPr>
+      <w:rPr>
+        <w:rFonts w:ascii="Wingdings" w:hAnsi="Wingdings" w:hint="default"/>
+      </w:rPr>
+    </w:lvl>
+    <w:lvl w:ilvl="6" w:tplc="04190001" w:tentative="1">
+      <w:start w:val="1"/>
+      <w:numFmt w:val="bullet"/>
+      <w:lvlText w:val=""/>
+      <w:lvlJc w:val="left"/>
+      <w:pPr>
+        <w:ind w:left="5749" w:hanging="360"/>
+      </w:pPr>
+      <w:rPr>
+        <w:rFonts w:ascii="Symbol" w:hAnsi="Symbol" w:hint="default"/>
+      </w:rPr>
+    </w:lvl>
+    <w:lvl w:ilvl="7" w:tplc="04190003" w:tentative="1">
+      <w:start w:val="1"/>
+      <w:numFmt w:val="bullet"/>
+      <w:lvlText w:val="o"/>
+      <w:lvlJc w:val="left"/>
+      <w:pPr>
+        <w:ind w:left="6469" w:hanging="360"/>
+      </w:pPr>
+      <w:rPr>
+        <w:rFonts w:ascii="Courier New" w:hAnsi="Courier New" w:cs="Courier New" w:hint="default"/>
+      </w:rPr>
+    </w:lvl>
+    <w:lvl w:ilvl="8" w:tplc="04190005" w:tentative="1">
+      <w:start w:val="1"/>
+      <w:numFmt w:val="bullet"/>
+      <w:lvlText w:val=""/>
+      <w:lvlJc w:val="left"/>
+      <w:pPr>
+        <w:ind w:left="7189" w:hanging="360"/>
+      </w:pPr>
+      <w:rPr>
+        <w:rFonts w:ascii="Wingdings" w:hAnsi="Wingdings" w:hint="default"/>
+      </w:rPr>
+    </w:lvl>
+  </w:abstractNum>
+  <w:abstractNum w:abstractNumId="10" w15:restartNumberingAfterBreak="0">
     <w:nsid w:val="4D2418F4"/>
     <w:multiLevelType w:val="multilevel"/>
     <w:tmpl w:val="E1DC77AA"/>
@@ -19087,7 +22386,7 @@
       </w:rPr>
     </w:lvl>
   </w:abstractNum>
-  <w:abstractNum w:abstractNumId="10" w15:restartNumberingAfterBreak="0">
+  <w:abstractNum w:abstractNumId="11" w15:restartNumberingAfterBreak="0">
     <w:nsid w:val="4FD318BF"/>
     <w:multiLevelType w:val="hybridMultilevel"/>
     <w:tmpl w:val="1B1AF7A4"/>
@@ -19200,7 +22499,7 @@
       </w:rPr>
     </w:lvl>
   </w:abstractNum>
-  <w:abstractNum w:abstractNumId="11" w15:restartNumberingAfterBreak="0">
+  <w:abstractNum w:abstractNumId="12" w15:restartNumberingAfterBreak="0">
     <w:nsid w:val="50517234"/>
     <w:multiLevelType w:val="hybridMultilevel"/>
     <w:tmpl w:val="FC921BF0"/>
@@ -19313,7 +22612,7 @@
       </w:rPr>
     </w:lvl>
   </w:abstractNum>
-  <w:abstractNum w:abstractNumId="12" w15:restartNumberingAfterBreak="0">
+  <w:abstractNum w:abstractNumId="13" w15:restartNumberingAfterBreak="0">
     <w:nsid w:val="546622A5"/>
     <w:multiLevelType w:val="hybridMultilevel"/>
     <w:tmpl w:val="60A892C2"/>
@@ -19399,7 +22698,7 @@
       </w:pPr>
     </w:lvl>
   </w:abstractNum>
-  <w:abstractNum w:abstractNumId="13" w15:restartNumberingAfterBreak="0">
+  <w:abstractNum w:abstractNumId="14" w15:restartNumberingAfterBreak="0">
     <w:nsid w:val="552D6126"/>
     <w:multiLevelType w:val="hybridMultilevel"/>
     <w:tmpl w:val="9434360E"/>
@@ -19485,7 +22784,7 @@
       </w:pPr>
     </w:lvl>
   </w:abstractNum>
-  <w:abstractNum w:abstractNumId="14" w15:restartNumberingAfterBreak="0">
+  <w:abstractNum w:abstractNumId="15" w15:restartNumberingAfterBreak="0">
     <w:nsid w:val="5C7F40D6"/>
     <w:multiLevelType w:val="hybridMultilevel"/>
     <w:tmpl w:val="17743BC8"/>
@@ -19598,7 +22897,7 @@
       </w:rPr>
     </w:lvl>
   </w:abstractNum>
-  <w:abstractNum w:abstractNumId="15" w15:restartNumberingAfterBreak="0">
+  <w:abstractNum w:abstractNumId="16" w15:restartNumberingAfterBreak="0">
     <w:nsid w:val="5D0A221A"/>
     <w:multiLevelType w:val="hybridMultilevel"/>
     <w:tmpl w:val="D07CC9A0"/>
@@ -19711,7 +23010,7 @@
       </w:rPr>
     </w:lvl>
   </w:abstractNum>
-  <w:abstractNum w:abstractNumId="16" w15:restartNumberingAfterBreak="0">
+  <w:abstractNum w:abstractNumId="17" w15:restartNumberingAfterBreak="0">
     <w:nsid w:val="62005D86"/>
     <w:multiLevelType w:val="hybridMultilevel"/>
     <w:tmpl w:val="6E14702E"/>
@@ -19824,7 +23123,7 @@
       </w:rPr>
     </w:lvl>
   </w:abstractNum>
-  <w:abstractNum w:abstractNumId="17" w15:restartNumberingAfterBreak="0">
+  <w:abstractNum w:abstractNumId="18" w15:restartNumberingAfterBreak="0">
     <w:nsid w:val="62603B02"/>
     <w:multiLevelType w:val="hybridMultilevel"/>
     <w:tmpl w:val="EC10A5F6"/>
@@ -19937,7 +23236,7 @@
       </w:rPr>
     </w:lvl>
   </w:abstractNum>
-  <w:abstractNum w:abstractNumId="18" w15:restartNumberingAfterBreak="0">
+  <w:abstractNum w:abstractNumId="19" w15:restartNumberingAfterBreak="0">
     <w:nsid w:val="63D40C2F"/>
     <w:multiLevelType w:val="hybridMultilevel"/>
     <w:tmpl w:val="4DBCA470"/>
@@ -20050,7 +23349,7 @@
       </w:rPr>
     </w:lvl>
   </w:abstractNum>
-  <w:abstractNum w:abstractNumId="19" w15:restartNumberingAfterBreak="0">
+  <w:abstractNum w:abstractNumId="20" w15:restartNumberingAfterBreak="0">
     <w:nsid w:val="67A03DF0"/>
     <w:multiLevelType w:val="multilevel"/>
     <w:tmpl w:val="E1DC77AA"/>
@@ -20163,7 +23462,7 @@
       </w:rPr>
     </w:lvl>
   </w:abstractNum>
-  <w:abstractNum w:abstractNumId="20" w15:restartNumberingAfterBreak="0">
+  <w:abstractNum w:abstractNumId="21" w15:restartNumberingAfterBreak="0">
     <w:nsid w:val="76E15ECA"/>
     <w:multiLevelType w:val="hybridMultilevel"/>
     <w:tmpl w:val="19F8A95A"/>
@@ -20276,7 +23575,7 @@
       </w:rPr>
     </w:lvl>
   </w:abstractNum>
-  <w:abstractNum w:abstractNumId="21" w15:restartNumberingAfterBreak="0">
+  <w:abstractNum w:abstractNumId="22" w15:restartNumberingAfterBreak="0">
     <w:nsid w:val="7E5441D8"/>
     <w:multiLevelType w:val="hybridMultilevel"/>
     <w:tmpl w:val="9BC449AC"/>
@@ -20396,55 +23695,55 @@
     <w:abstractNumId w:val="2"/>
   </w:num>
   <w:num w:numId="3">
-    <w:abstractNumId w:val="13"/>
+    <w:abstractNumId w:val="14"/>
   </w:num>
   <w:num w:numId="4">
-    <w:abstractNumId w:val="10"/>
+    <w:abstractNumId w:val="11"/>
   </w:num>
   <w:num w:numId="5">
-    <w:abstractNumId w:val="11"/>
+    <w:abstractNumId w:val="12"/>
   </w:num>
   <w:num w:numId="6">
-    <w:abstractNumId w:val="20"/>
+    <w:abstractNumId w:val="21"/>
   </w:num>
   <w:num w:numId="7">
     <w:abstractNumId w:val="1"/>
   </w:num>
   <w:num w:numId="8">
-    <w:abstractNumId w:val="12"/>
+    <w:abstractNumId w:val="13"/>
   </w:num>
   <w:num w:numId="9">
-    <w:abstractNumId w:val="16"/>
+    <w:abstractNumId w:val="17"/>
   </w:num>
   <w:num w:numId="10">
-    <w:abstractNumId w:val="8"/>
+    <w:abstractNumId w:val="9"/>
   </w:num>
   <w:num w:numId="11">
-    <w:abstractNumId w:val="21"/>
+    <w:abstractNumId w:val="22"/>
   </w:num>
   <w:num w:numId="12">
-    <w:abstractNumId w:val="17"/>
+    <w:abstractNumId w:val="18"/>
   </w:num>
   <w:num w:numId="13">
     <w:abstractNumId w:val="0"/>
   </w:num>
   <w:num w:numId="14">
-    <w:abstractNumId w:val="7"/>
+    <w:abstractNumId w:val="8"/>
   </w:num>
   <w:num w:numId="15">
+    <w:abstractNumId w:val="16"/>
+  </w:num>
+  <w:num w:numId="16">
+    <w:abstractNumId w:val="19"/>
+  </w:num>
+  <w:num w:numId="17">
     <w:abstractNumId w:val="15"/>
   </w:num>
-  <w:num w:numId="16">
-    <w:abstractNumId w:val="18"/>
-  </w:num>
-  <w:num w:numId="17">
-    <w:abstractNumId w:val="14"/>
-  </w:num>
   <w:num w:numId="18">
-    <w:abstractNumId w:val="9"/>
+    <w:abstractNumId w:val="10"/>
   </w:num>
   <w:num w:numId="19">
-    <w:abstractNumId w:val="19"/>
+    <w:abstractNumId w:val="20"/>
   </w:num>
   <w:num w:numId="20">
     <w:abstractNumId w:val="5"/>
@@ -20454,6 +23753,9 @@
   </w:num>
   <w:num w:numId="22">
     <w:abstractNumId w:val="3"/>
+  </w:num>
+  <w:num w:numId="23">
+    <w:abstractNumId w:val="7"/>
   </w:num>
   <w:numIdMacAtCleanup w:val="22"/>
 </w:numbering>
@@ -20852,7 +24154,7 @@
   <w:style w:type="paragraph" w:default="1" w:styleId="a">
     <w:name w:val="Normal"/>
     <w:qFormat/>
-    <w:rsid w:val="00552194"/>
+    <w:rsid w:val="00687696"/>
     <w:pPr>
       <w:spacing w:after="200" w:line="276" w:lineRule="auto"/>
     </w:pPr>
@@ -21198,6 +24500,19 @@
       <w:ind w:left="440"/>
     </w:pPr>
   </w:style>
+  <w:style w:type="character" w:styleId="HTML1">
+    <w:name w:val="HTML Code"/>
+    <w:basedOn w:val="a0"/>
+    <w:uiPriority w:val="99"/>
+    <w:semiHidden/>
+    <w:unhideWhenUsed/>
+    <w:rsid w:val="00C37674"/>
+    <w:rPr>
+      <w:rFonts w:ascii="Courier New" w:eastAsia="Times New Roman" w:hAnsi="Courier New" w:cs="Courier New"/>
+      <w:sz w:val="20"/>
+      <w:szCs w:val="20"/>
+    </w:rPr>
+  </w:style>
 </w:styles>
 </file>
 
@@ -21501,7 +24816,7 @@
 </file>
 
 <file path=customXml/itemProps1.xml><?xml version="1.0" encoding="utf-8"?>
-<ds:datastoreItem xmlns:ds="http://schemas.openxmlformats.org/officeDocument/2006/customXml" ds:itemID="{5C59E29F-60ED-4019-877B-B59BE2B152E2}">
+<ds:datastoreItem xmlns:ds="http://schemas.openxmlformats.org/officeDocument/2006/customXml" ds:itemID="{E61FBDD6-33E4-4712-A7FD-B0D9424F5DD1}">
   <ds:schemaRefs>
     <ds:schemaRef ds:uri="http://schemas.openxmlformats.org/officeDocument/2006/bibliography"/>
   </ds:schemaRefs>

</xml_diff>

<commit_message>
Add: add 1.5.3. 1.5.4 in main document
</commit_message>
<xml_diff>
--- a/Documentation/Основной документ.docx
+++ b/Documentation/Основной документ.docx
@@ -18039,11 +18039,9 @@
                 <w:lang w:eastAsia="ru-RU"/>
               </w:rPr>
             </w:pPr>
-            <w:proofErr w:type="spellStart"/>
-            <w:r>
-              <w:t>Токен</w:t>
-            </w:r>
-            <w:proofErr w:type="spellEnd"/>
+            <w:r>
+              <w:t>Наименование</w:t>
+            </w:r>
           </w:p>
         </w:tc>
         <w:tc>
@@ -18183,11 +18181,14 @@
                 <w:rFonts w:cs="Times New Roman"/>
                 <w:sz w:val="24"/>
                 <w:szCs w:val="24"/>
-                <w:lang w:eastAsia="ru-RU"/>
+                <w:lang w:val="en-US" w:eastAsia="ru-RU"/>
               </w:rPr>
             </w:pPr>
             <w:r>
               <w:t>Поверхности и карточки</w:t>
+            </w:r>
+            <w:r>
+              <w:t>, иногда текст</w:t>
             </w:r>
           </w:p>
         </w:tc>
@@ -18396,14 +18397,14 @@
                 <w:rFonts w:cs="Times New Roman"/>
                 <w:sz w:val="24"/>
                 <w:szCs w:val="24"/>
-                <w:lang w:eastAsia="ru-RU"/>
+                <w:lang w:val="en-US" w:eastAsia="ru-RU"/>
               </w:rPr>
             </w:pPr>
             <w:r>
               <w:t>#</w:t>
             </w:r>
             <w:r>
-              <w:t>8B7C5A</w:t>
+              <w:t>7F6B53</w:t>
             </w:r>
           </w:p>
         </w:tc>
@@ -18425,7 +18426,7 @@
               <w:t>#</w:t>
             </w:r>
             <w:r>
-              <w:t>84705C</w:t>
+              <w:t>34291F</w:t>
             </w:r>
           </w:p>
         </w:tc>
@@ -18489,7 +18490,10 @@
               </w:rPr>
             </w:pPr>
             <w:r>
-              <w:t>#B58A45</w:t>
+              <w:t>#</w:t>
+            </w:r>
+            <w:r>
+              <w:t>8A6833</w:t>
             </w:r>
           </w:p>
         </w:tc>
@@ -18745,7 +18749,13 @@
               </w:rPr>
             </w:pPr>
             <w:r>
-              <w:t>#C7B9A1</w:t>
+              <w:t>#</w:t>
+            </w:r>
+            <w:r>
+              <w:t xml:space="preserve"> </w:t>
+            </w:r>
+            <w:r>
+              <w:t>E6DFD6</w:t>
             </w:r>
           </w:p>
         </w:tc>
@@ -18767,7 +18777,7 @@
               <w:t>#</w:t>
             </w:r>
             <w:r>
-              <w:t>96826C</w:t>
+              <w:t>75634E</w:t>
             </w:r>
           </w:p>
         </w:tc>
@@ -18881,6 +18891,7 @@
               </w:rPr>
             </w:pPr>
             <w:r>
+              <w:lastRenderedPageBreak/>
               <w:t>Успешное действие</w:t>
             </w:r>
           </w:p>
@@ -18963,7 +18974,6 @@
               </w:rPr>
             </w:pPr>
             <w:r>
-              <w:lastRenderedPageBreak/>
               <w:t>Контуры и границы</w:t>
             </w:r>
           </w:p>
@@ -19004,7 +19014,10 @@
               </w:rPr>
             </w:pPr>
             <w:r>
-              <w:t>#8A7659</w:t>
+              <w:t>#</w:t>
+            </w:r>
+            <w:r>
+              <w:t>9C8663</w:t>
             </w:r>
           </w:p>
         </w:tc>
@@ -19022,11 +19035,12 @@
                 <w:szCs w:val="24"/>
               </w:rPr>
             </w:pPr>
-            <w:bookmarkStart w:id="25" w:name="_GoBack"/>
-            <w:r>
-              <w:t>#8A7659</w:t>
-            </w:r>
-            <w:bookmarkEnd w:id="25"/>
+            <w:r>
+              <w:t>#</w:t>
+            </w:r>
+            <w:r>
+              <w:t>79664E</w:t>
+            </w:r>
           </w:p>
         </w:tc>
       </w:tr>
@@ -19081,7 +19095,10 @@
               <w:t>#</w:t>
             </w:r>
             <w:r>
-              <w:t>6A75BD</w:t>
+              <w:t xml:space="preserve"> </w:t>
+            </w:r>
+            <w:r>
+              <w:t>5162B3</w:t>
             </w:r>
           </w:p>
         </w:tc>
@@ -20087,6 +20104,7 @@
                 <w:sz w:val="24"/>
                 <w:szCs w:val="24"/>
               </w:rPr>
+              <w:lastRenderedPageBreak/>
               <w:t>Body</w:t>
             </w:r>
             <w:proofErr w:type="spellEnd"/>
@@ -20261,7 +20279,6 @@
                 <w:sz w:val="24"/>
                 <w:szCs w:val="24"/>
               </w:rPr>
-              <w:lastRenderedPageBreak/>
               <w:t>Body</w:t>
             </w:r>
             <w:proofErr w:type="spellEnd"/>
@@ -21019,6 +21036,7 @@
         <w:rPr>
           <w:lang w:eastAsia="ru-RU"/>
         </w:rPr>
+        <w:lastRenderedPageBreak/>
         <w:t>Библиотека компонентов</w:t>
       </w:r>
     </w:p>
@@ -21053,34 +21071,294 @@
     <w:p>
       <w:pPr>
         <w:pStyle w:val="a9"/>
-        <w:rPr>
-          <w:lang w:eastAsia="ru-RU"/>
-        </w:rPr>
-      </w:pPr>
+        <w:numPr>
+          <w:ilvl w:val="0"/>
+          <w:numId w:val="24"/>
+        </w:numPr>
+        <w:ind w:left="0" w:firstLine="709"/>
+        <w:rPr>
+          <w:lang w:eastAsia="ru-RU"/>
+        </w:rPr>
+      </w:pPr>
+      <w:r>
+        <w:rPr>
+          <w:lang w:eastAsia="ru-RU"/>
+        </w:rPr>
+        <w:t>Цветовые палитры (две темы). Набор HEX-кодов для темной и светлой темы: цвета фона, поверхностей (карточек), ос</w:t>
+      </w:r>
+      <w:r>
+        <w:rPr>
+          <w:lang w:eastAsia="ru-RU"/>
+        </w:rPr>
+        <w:t>новного текста, акцентные цвета.</w:t>
+      </w:r>
     </w:p>
     <w:p>
       <w:pPr>
         <w:pStyle w:val="a9"/>
-        <w:rPr>
-          <w:lang w:eastAsia="ru-RU"/>
-        </w:rPr>
-      </w:pPr>
+        <w:numPr>
+          <w:ilvl w:val="0"/>
+          <w:numId w:val="24"/>
+        </w:numPr>
+        <w:ind w:left="0" w:firstLine="709"/>
+        <w:rPr>
+          <w:lang w:eastAsia="ru-RU"/>
+        </w:rPr>
+      </w:pPr>
+      <w:r>
+        <w:rPr>
+          <w:lang w:eastAsia="ru-RU"/>
+        </w:rPr>
+        <w:t>Примеры текста. Визуализация заголовков и основного текста для оценки читаемости и иерархии.</w:t>
+      </w:r>
     </w:p>
     <w:p>
       <w:pPr>
         <w:pStyle w:val="a9"/>
-        <w:rPr>
-          <w:lang w:eastAsia="ru-RU"/>
-        </w:rPr>
-      </w:pPr>
+        <w:numPr>
+          <w:ilvl w:val="0"/>
+          <w:numId w:val="24"/>
+        </w:numPr>
+        <w:ind w:left="0" w:firstLine="709"/>
+        <w:rPr>
+          <w:lang w:eastAsia="ru-RU"/>
+        </w:rPr>
+      </w:pPr>
+      <w:r>
+        <w:rPr>
+          <w:lang w:eastAsia="ru-RU"/>
+        </w:rPr>
+        <w:t xml:space="preserve">Поля ввода. Два состояния полей для ввода текста (пустое с </w:t>
+      </w:r>
+      <w:proofErr w:type="spellStart"/>
+      <w:r>
+        <w:rPr>
+          <w:lang w:eastAsia="ru-RU"/>
+        </w:rPr>
+        <w:t>плейсхолдером</w:t>
+      </w:r>
+      <w:proofErr w:type="spellEnd"/>
+      <w:r>
+        <w:rPr>
+          <w:lang w:eastAsia="ru-RU"/>
+        </w:rPr>
+        <w:t xml:space="preserve"> и заполненное)</w:t>
+      </w:r>
+      <w:r>
+        <w:rPr>
+          <w:lang w:eastAsia="ru-RU"/>
+        </w:rPr>
+        <w:t>.</w:t>
+      </w:r>
     </w:p>
     <w:p>
       <w:pPr>
         <w:pStyle w:val="a9"/>
-        <w:rPr>
-          <w:lang w:eastAsia="ru-RU"/>
-        </w:rPr>
-      </w:pPr>
+        <w:numPr>
+          <w:ilvl w:val="0"/>
+          <w:numId w:val="24"/>
+        </w:numPr>
+        <w:ind w:left="0" w:firstLine="709"/>
+        <w:rPr>
+          <w:lang w:eastAsia="ru-RU"/>
+        </w:rPr>
+      </w:pPr>
+      <w:r>
+        <w:rPr>
+          <w:lang w:eastAsia="ru-RU"/>
+        </w:rPr>
+        <w:t>Кнопки. Три типа кнопок для светлой и темной темы.</w:t>
+      </w:r>
+    </w:p>
+    <w:p>
+      <w:pPr>
+        <w:pStyle w:val="a9"/>
+        <w:numPr>
+          <w:ilvl w:val="0"/>
+          <w:numId w:val="24"/>
+        </w:numPr>
+        <w:ind w:left="0" w:firstLine="709"/>
+        <w:rPr>
+          <w:lang w:eastAsia="ru-RU"/>
+        </w:rPr>
+      </w:pPr>
+      <w:r>
+        <w:rPr>
+          <w:lang w:eastAsia="ru-RU"/>
+        </w:rPr>
+        <w:t>Статусные плашки. Индикаторы состояний («Улика найдена», «До</w:t>
+      </w:r>
+      <w:r>
+        <w:rPr>
+          <w:lang w:eastAsia="ru-RU"/>
+        </w:rPr>
+        <w:t>ступно», «Выполнено», «Ошибка»).</w:t>
+      </w:r>
+    </w:p>
+    <w:p>
+      <w:pPr>
+        <w:pStyle w:val="a9"/>
+        <w:numPr>
+          <w:ilvl w:val="0"/>
+          <w:numId w:val="24"/>
+        </w:numPr>
+        <w:ind w:left="0" w:firstLine="709"/>
+        <w:rPr>
+          <w:lang w:eastAsia="ru-RU"/>
+        </w:rPr>
+      </w:pPr>
+      <w:r>
+        <w:rPr>
+          <w:lang w:eastAsia="ru-RU"/>
+        </w:rPr>
+        <w:t xml:space="preserve">Карточка подозреваемого. Компонент с </w:t>
+      </w:r>
+      <w:proofErr w:type="spellStart"/>
+      <w:r>
+        <w:rPr>
+          <w:lang w:eastAsia="ru-RU"/>
+        </w:rPr>
+        <w:t>аватаром</w:t>
+      </w:r>
+      <w:proofErr w:type="spellEnd"/>
+      <w:r>
+        <w:rPr>
+          <w:lang w:eastAsia="ru-RU"/>
+        </w:rPr>
+        <w:t>, именем, статусом/описанием и кнопкой перехода к допросу.</w:t>
+      </w:r>
+    </w:p>
+    <w:p>
+      <w:pPr>
+        <w:pStyle w:val="a9"/>
+        <w:numPr>
+          <w:ilvl w:val="0"/>
+          <w:numId w:val="24"/>
+        </w:numPr>
+        <w:ind w:left="0" w:firstLine="709"/>
+        <w:rPr>
+          <w:lang w:eastAsia="ru-RU"/>
+        </w:rPr>
+      </w:pPr>
+      <w:r>
+        <w:rPr>
+          <w:lang w:eastAsia="ru-RU"/>
+        </w:rPr>
+        <w:t>Карточка улики. Компонент с изображением предмета, названием, описанием</w:t>
+      </w:r>
+      <w:r>
+        <w:rPr>
+          <w:lang w:eastAsia="ru-RU"/>
+        </w:rPr>
+        <w:t>.</w:t>
+      </w:r>
+    </w:p>
+    <w:p>
+      <w:pPr>
+        <w:pStyle w:val="a9"/>
+        <w:numPr>
+          <w:ilvl w:val="0"/>
+          <w:numId w:val="24"/>
+        </w:numPr>
+        <w:ind w:left="0" w:firstLine="709"/>
+        <w:rPr>
+          <w:lang w:eastAsia="ru-RU"/>
+        </w:rPr>
+      </w:pPr>
+      <w:r>
+        <w:rPr>
+          <w:lang w:eastAsia="ru-RU"/>
+        </w:rPr>
+        <w:t>Карточка дела. Крупный компонент с заголовком дела, вступительным текстом и кнопкой запуска расследования.</w:t>
+      </w:r>
+    </w:p>
+    <w:p>
+      <w:pPr>
+        <w:pStyle w:val="a9"/>
+        <w:numPr>
+          <w:ilvl w:val="0"/>
+          <w:numId w:val="24"/>
+        </w:numPr>
+        <w:ind w:left="0" w:firstLine="709"/>
+        <w:rPr>
+          <w:lang w:eastAsia="ru-RU"/>
+        </w:rPr>
+      </w:pPr>
+      <w:r>
+        <w:rPr>
+          <w:lang w:eastAsia="ru-RU"/>
+        </w:rPr>
+        <w:t xml:space="preserve">Экран допроса в темной </w:t>
+      </w:r>
+      <w:r>
+        <w:rPr>
+          <w:lang w:eastAsia="ru-RU"/>
+        </w:rPr>
+        <w:t>и светлой темах</w:t>
+      </w:r>
+      <w:r>
+        <w:rPr>
+          <w:lang w:eastAsia="ru-RU"/>
+        </w:rPr>
+        <w:t xml:space="preserve">. Интерфейс диалога с NPC: </w:t>
+      </w:r>
+      <w:r>
+        <w:rPr>
+          <w:lang w:eastAsia="ru-RU"/>
+        </w:rPr>
+        <w:t xml:space="preserve">сообщения </w:t>
+      </w:r>
+      <w:r>
+        <w:rPr>
+          <w:lang w:eastAsia="ru-RU"/>
+        </w:rPr>
+        <w:t>персонажа и игрока, время отправки, поле ввода.</w:t>
+      </w:r>
+    </w:p>
+    <w:p>
+      <w:pPr>
+        <w:pStyle w:val="a9"/>
+        <w:rPr>
+          <w:lang w:eastAsia="ru-RU"/>
+        </w:rPr>
+      </w:pPr>
+      <w:r>
+        <w:rPr>
+          <w:lang w:eastAsia="ru-RU"/>
+        </w:rPr>
+        <w:t xml:space="preserve">Боле подробно с макетом дизайна элементов системы можно ознакомиться по ссылке: </w:t>
+      </w:r>
+    </w:p>
+    <w:p>
+      <w:pPr>
+        <w:pStyle w:val="a9"/>
+        <w:rPr>
+          <w:lang w:eastAsia="ru-RU"/>
+        </w:rPr>
+      </w:pPr>
+      <w:hyperlink r:id="rId9" w:history="1">
+        <w:r>
+          <w:rPr>
+            <w:rStyle w:val="a6"/>
+            <w:lang w:eastAsia="ru-RU"/>
+          </w:rPr>
+          <w:t>https://www.figma.</w:t>
+        </w:r>
+        <w:r>
+          <w:rPr>
+            <w:rStyle w:val="a6"/>
+            <w:lang w:eastAsia="ru-RU"/>
+          </w:rPr>
+          <w:t>c</w:t>
+        </w:r>
+        <w:r>
+          <w:rPr>
+            <w:rStyle w:val="a6"/>
+            <w:lang w:eastAsia="ru-RU"/>
+          </w:rPr>
+          <w:t>om/design/G4p5PalgXFhdN4fEIbo5ie/ColdTrail?node-id=0-1&amp;p=f&amp;t=764HDufG8wXUSKtE-0</w:t>
+        </w:r>
+      </w:hyperlink>
     </w:p>
     <w:p>
       <w:pPr>
@@ -21114,6 +21392,51 @@
           <w:lang w:eastAsia="ru-RU"/>
         </w:rPr>
       </w:pPr>
+      <w:r>
+        <w:rPr>
+          <w:lang w:eastAsia="ru-RU"/>
+        </w:rPr>
+        <w:t xml:space="preserve">Для оценки доступности цветовой палитры был проведён анализ контрастности цветовых </w:t>
+      </w:r>
+      <w:proofErr w:type="spellStart"/>
+      <w:r>
+        <w:rPr>
+          <w:lang w:eastAsia="ru-RU"/>
+        </w:rPr>
+        <w:t>токенов</w:t>
+      </w:r>
+      <w:proofErr w:type="spellEnd"/>
+      <w:r>
+        <w:rPr>
+          <w:lang w:eastAsia="ru-RU"/>
+        </w:rPr>
+        <w:t xml:space="preserve"> тёмной и светлой тем. Проверка выполнялась на основе требований WCAG AA, согласно которым </w:t>
+      </w:r>
+      <w:r>
+        <w:rPr>
+          <w:lang w:eastAsia="ru-RU"/>
+        </w:rPr>
+        <w:lastRenderedPageBreak/>
+        <w:t xml:space="preserve">коэффициент контрастности обычного текста и фона должен составлять не менее 4,5:1, а крупного текста </w:t>
+      </w:r>
+      <w:r>
+        <w:rPr>
+          <w:lang w:eastAsia="ru-RU"/>
+        </w:rPr>
+        <w:t>-</w:t>
+      </w:r>
+      <w:r>
+        <w:rPr>
+          <w:lang w:eastAsia="ru-RU"/>
+        </w:rPr>
+        <w:t xml:space="preserve"> не менее 3:1. Для значимых графических элементов и границ компонентов интерфейса минимальный коэффициент составляет 3:</w:t>
+      </w:r>
+      <w:r>
+        <w:rPr>
+          <w:lang w:eastAsia="ru-RU"/>
+        </w:rPr>
+        <w:t>1 относительно соседнего цвета.</w:t>
+      </w:r>
     </w:p>
     <w:p>
       <w:pPr>
@@ -21122,14 +21445,1282 @@
           <w:lang w:eastAsia="ru-RU"/>
         </w:rPr>
       </w:pPr>
+      <w:r>
+        <w:rPr>
+          <w:lang w:eastAsia="ru-RU"/>
+        </w:rPr>
+        <w:t xml:space="preserve">В ходе анализа были рассмотрены сочетания </w:t>
+      </w:r>
+      <w:r>
+        <w:rPr>
+          <w:lang w:eastAsia="ru-RU"/>
+        </w:rPr>
+        <w:t>цветов</w:t>
+      </w:r>
+      <w:r>
+        <w:rPr>
+          <w:lang w:eastAsia="ru-RU"/>
+        </w:rPr>
+        <w:t xml:space="preserve"> </w:t>
+      </w:r>
+      <w:proofErr w:type="spellStart"/>
+      <w:r>
+        <w:rPr>
+          <w:lang w:eastAsia="ru-RU"/>
+        </w:rPr>
+        <w:t>text</w:t>
+      </w:r>
+      <w:proofErr w:type="spellEnd"/>
+      <w:r>
+        <w:rPr>
+          <w:lang w:eastAsia="ru-RU"/>
+        </w:rPr>
+        <w:t xml:space="preserve"> и text2 с </w:t>
+      </w:r>
+      <w:proofErr w:type="spellStart"/>
+      <w:r>
+        <w:rPr>
+          <w:lang w:eastAsia="ru-RU"/>
+        </w:rPr>
+        <w:t>bg</w:t>
+      </w:r>
+      <w:proofErr w:type="spellEnd"/>
+      <w:r>
+        <w:rPr>
+          <w:lang w:eastAsia="ru-RU"/>
+        </w:rPr>
+        <w:t xml:space="preserve"> и </w:t>
+      </w:r>
+      <w:proofErr w:type="spellStart"/>
+      <w:r>
+        <w:rPr>
+          <w:lang w:eastAsia="ru-RU"/>
+        </w:rPr>
+        <w:t>surface</w:t>
+      </w:r>
+      <w:proofErr w:type="spellEnd"/>
+      <w:r>
+        <w:rPr>
+          <w:lang w:eastAsia="ru-RU"/>
+        </w:rPr>
+        <w:t xml:space="preserve">, </w:t>
+      </w:r>
+      <w:proofErr w:type="spellStart"/>
+      <w:r>
+        <w:rPr>
+          <w:lang w:eastAsia="ru-RU"/>
+        </w:rPr>
+        <w:t>токена</w:t>
+      </w:r>
+      <w:proofErr w:type="spellEnd"/>
+      <w:r>
+        <w:rPr>
+          <w:lang w:eastAsia="ru-RU"/>
+        </w:rPr>
+        <w:t xml:space="preserve"> </w:t>
+      </w:r>
+      <w:proofErr w:type="spellStart"/>
+      <w:r>
+        <w:rPr>
+          <w:lang w:eastAsia="ru-RU"/>
+        </w:rPr>
+        <w:t>onaccent</w:t>
+      </w:r>
+      <w:proofErr w:type="spellEnd"/>
+      <w:r>
+        <w:rPr>
+          <w:lang w:eastAsia="ru-RU"/>
+        </w:rPr>
+        <w:t xml:space="preserve"> с </w:t>
+      </w:r>
+      <w:proofErr w:type="spellStart"/>
+      <w:r>
+        <w:rPr>
+          <w:lang w:eastAsia="ru-RU"/>
+        </w:rPr>
+        <w:t>accent</w:t>
+      </w:r>
+      <w:proofErr w:type="spellEnd"/>
+      <w:r>
+        <w:rPr>
+          <w:lang w:eastAsia="ru-RU"/>
+        </w:rPr>
+        <w:t xml:space="preserve">, а также </w:t>
+      </w:r>
+      <w:proofErr w:type="spellStart"/>
+      <w:r>
+        <w:rPr>
+          <w:lang w:eastAsia="ru-RU"/>
+        </w:rPr>
+        <w:t>токенов</w:t>
+      </w:r>
+      <w:proofErr w:type="spellEnd"/>
+      <w:r>
+        <w:rPr>
+          <w:lang w:eastAsia="ru-RU"/>
+        </w:rPr>
+        <w:t xml:space="preserve"> </w:t>
+      </w:r>
+      <w:proofErr w:type="spellStart"/>
+      <w:r>
+        <w:rPr>
+          <w:lang w:eastAsia="ru-RU"/>
+        </w:rPr>
+        <w:t>outline</w:t>
+      </w:r>
+      <w:proofErr w:type="spellEnd"/>
+      <w:r>
+        <w:rPr>
+          <w:lang w:eastAsia="ru-RU"/>
+        </w:rPr>
+        <w:t xml:space="preserve">, </w:t>
+      </w:r>
+      <w:proofErr w:type="spellStart"/>
+      <w:r>
+        <w:rPr>
+          <w:lang w:eastAsia="ru-RU"/>
+        </w:rPr>
+        <w:t>primary</w:t>
+      </w:r>
+      <w:proofErr w:type="spellEnd"/>
+      <w:r>
+        <w:rPr>
+          <w:lang w:eastAsia="ru-RU"/>
+        </w:rPr>
+        <w:t xml:space="preserve"> и </w:t>
+      </w:r>
+      <w:proofErr w:type="spellStart"/>
+      <w:r>
+        <w:rPr>
+          <w:lang w:eastAsia="ru-RU"/>
+        </w:rPr>
+        <w:t>button</w:t>
+      </w:r>
+      <w:proofErr w:type="spellEnd"/>
+      <w:r>
+        <w:rPr>
+          <w:lang w:eastAsia="ru-RU"/>
+        </w:rPr>
+        <w:t xml:space="preserve"> с соответствующими фоновыми цветами.</w:t>
+      </w:r>
     </w:p>
     <w:p>
       <w:pPr>
         <w:pStyle w:val="a9"/>
-        <w:rPr>
-          <w:lang w:eastAsia="ru-RU"/>
-        </w:rPr>
-      </w:pPr>
+        <w:spacing w:before="240"/>
+        <w:ind w:firstLine="0"/>
+        <w:contextualSpacing w:val="0"/>
+        <w:rPr>
+          <w:lang w:eastAsia="ru-RU"/>
+        </w:rPr>
+      </w:pPr>
+      <w:r>
+        <w:rPr>
+          <w:lang w:eastAsia="ru-RU"/>
+        </w:rPr>
+        <w:t xml:space="preserve">Таблица 13 – Проверка соответствия контрастности по системе </w:t>
+      </w:r>
+      <w:r>
+        <w:rPr>
+          <w:lang w:eastAsia="ru-RU"/>
+        </w:rPr>
+        <w:t>WCAG AA</w:t>
+      </w:r>
+      <w:r>
+        <w:rPr>
+          <w:lang w:eastAsia="ru-RU"/>
+        </w:rPr>
+        <w:t>.</w:t>
+      </w:r>
+    </w:p>
+    <w:tbl>
+      <w:tblPr>
+        <w:tblStyle w:val="a5"/>
+        <w:tblW w:w="0" w:type="auto"/>
+        <w:tblLook w:val="04A0" w:firstRow="1" w:lastRow="0" w:firstColumn="1" w:lastColumn="0" w:noHBand="0" w:noVBand="1"/>
+      </w:tblPr>
+      <w:tblGrid>
+        <w:gridCol w:w="2336"/>
+        <w:gridCol w:w="2336"/>
+        <w:gridCol w:w="2336"/>
+        <w:gridCol w:w="2337"/>
+      </w:tblGrid>
+      <w:tr>
+        <w:tc>
+          <w:tcPr>
+            <w:tcW w:w="2336" w:type="dxa"/>
+            <w:vAlign w:val="center"/>
+          </w:tcPr>
+          <w:p>
+            <w:pPr>
+              <w:pStyle w:val="a9"/>
+              <w:ind w:firstLine="0"/>
+              <w:rPr>
+                <w:rFonts w:cs="Times New Roman"/>
+                <w:sz w:val="24"/>
+                <w:szCs w:val="24"/>
+                <w:lang w:eastAsia="ru-RU"/>
+              </w:rPr>
+            </w:pPr>
+            <w:r>
+              <w:rPr>
+                <w:rFonts w:cs="Times New Roman"/>
+                <w:bCs/>
+                <w:sz w:val="24"/>
+                <w:szCs w:val="24"/>
+              </w:rPr>
+              <w:t xml:space="preserve">Сочетание </w:t>
+            </w:r>
+            <w:proofErr w:type="spellStart"/>
+            <w:r>
+              <w:rPr>
+                <w:rFonts w:cs="Times New Roman"/>
+                <w:bCs/>
+                <w:sz w:val="24"/>
+                <w:szCs w:val="24"/>
+              </w:rPr>
+              <w:t>токенов</w:t>
+            </w:r>
+            <w:proofErr w:type="spellEnd"/>
+          </w:p>
+        </w:tc>
+        <w:tc>
+          <w:tcPr>
+            <w:tcW w:w="2336" w:type="dxa"/>
+            <w:vAlign w:val="center"/>
+          </w:tcPr>
+          <w:p>
+            <w:pPr>
+              <w:pStyle w:val="a9"/>
+              <w:ind w:firstLine="0"/>
+              <w:rPr>
+                <w:rFonts w:cs="Times New Roman"/>
+                <w:sz w:val="24"/>
+                <w:szCs w:val="24"/>
+                <w:lang w:eastAsia="ru-RU"/>
+              </w:rPr>
+            </w:pPr>
+            <w:r>
+              <w:rPr>
+                <w:rFonts w:cs="Times New Roman"/>
+                <w:bCs/>
+                <w:sz w:val="24"/>
+                <w:szCs w:val="24"/>
+              </w:rPr>
+              <w:t>Тёмная тема</w:t>
+            </w:r>
+          </w:p>
+        </w:tc>
+        <w:tc>
+          <w:tcPr>
+            <w:tcW w:w="2336" w:type="dxa"/>
+            <w:vAlign w:val="center"/>
+          </w:tcPr>
+          <w:p>
+            <w:pPr>
+              <w:pStyle w:val="a9"/>
+              <w:ind w:firstLine="0"/>
+              <w:rPr>
+                <w:rFonts w:cs="Times New Roman"/>
+                <w:sz w:val="24"/>
+                <w:szCs w:val="24"/>
+                <w:lang w:eastAsia="ru-RU"/>
+              </w:rPr>
+            </w:pPr>
+            <w:r>
+              <w:rPr>
+                <w:rFonts w:cs="Times New Roman"/>
+                <w:bCs/>
+                <w:sz w:val="24"/>
+                <w:szCs w:val="24"/>
+              </w:rPr>
+              <w:t>Светлая тема</w:t>
+            </w:r>
+          </w:p>
+        </w:tc>
+        <w:tc>
+          <w:tcPr>
+            <w:tcW w:w="2337" w:type="dxa"/>
+            <w:vAlign w:val="center"/>
+          </w:tcPr>
+          <w:p>
+            <w:pPr>
+              <w:pStyle w:val="a9"/>
+              <w:ind w:firstLine="0"/>
+              <w:rPr>
+                <w:rFonts w:cs="Times New Roman"/>
+                <w:sz w:val="24"/>
+                <w:szCs w:val="24"/>
+                <w:lang w:eastAsia="ru-RU"/>
+              </w:rPr>
+            </w:pPr>
+            <w:r>
+              <w:rPr>
+                <w:rFonts w:cs="Times New Roman"/>
+                <w:bCs/>
+                <w:sz w:val="24"/>
+                <w:szCs w:val="24"/>
+              </w:rPr>
+              <w:t>Соответствие WCAG AA</w:t>
+            </w:r>
+          </w:p>
+        </w:tc>
+      </w:tr>
+      <w:tr>
+        <w:tc>
+          <w:tcPr>
+            <w:tcW w:w="2336" w:type="dxa"/>
+            <w:vAlign w:val="center"/>
+          </w:tcPr>
+          <w:p>
+            <w:pPr>
+              <w:pStyle w:val="a9"/>
+              <w:ind w:firstLine="0"/>
+              <w:rPr>
+                <w:rFonts w:cs="Times New Roman"/>
+                <w:sz w:val="24"/>
+                <w:szCs w:val="24"/>
+                <w:lang w:eastAsia="ru-RU"/>
+              </w:rPr>
+            </w:pPr>
+            <w:proofErr w:type="spellStart"/>
+            <w:r>
+              <w:rPr>
+                <w:rStyle w:val="HTML1"/>
+                <w:rFonts w:ascii="Times New Roman" w:eastAsiaTheme="minorHAnsi" w:hAnsi="Times New Roman" w:cs="Times New Roman"/>
+                <w:sz w:val="24"/>
+                <w:szCs w:val="24"/>
+              </w:rPr>
+              <w:t>text</w:t>
+            </w:r>
+            <w:proofErr w:type="spellEnd"/>
+            <w:r>
+              <w:rPr>
+                <w:rFonts w:cs="Times New Roman"/>
+                <w:sz w:val="24"/>
+                <w:szCs w:val="24"/>
+              </w:rPr>
+              <w:t xml:space="preserve"> + </w:t>
+            </w:r>
+            <w:proofErr w:type="spellStart"/>
+            <w:r>
+              <w:rPr>
+                <w:rStyle w:val="HTML1"/>
+                <w:rFonts w:ascii="Times New Roman" w:eastAsiaTheme="minorHAnsi" w:hAnsi="Times New Roman" w:cs="Times New Roman"/>
+                <w:sz w:val="24"/>
+                <w:szCs w:val="24"/>
+              </w:rPr>
+              <w:t>bg</w:t>
+            </w:r>
+            <w:proofErr w:type="spellEnd"/>
+          </w:p>
+        </w:tc>
+        <w:tc>
+          <w:tcPr>
+            <w:tcW w:w="2336" w:type="dxa"/>
+            <w:vAlign w:val="center"/>
+          </w:tcPr>
+          <w:p>
+            <w:pPr>
+              <w:pStyle w:val="a9"/>
+              <w:ind w:firstLine="0"/>
+              <w:rPr>
+                <w:rFonts w:cs="Times New Roman"/>
+                <w:sz w:val="24"/>
+                <w:szCs w:val="24"/>
+                <w:lang w:eastAsia="ru-RU"/>
+              </w:rPr>
+            </w:pPr>
+            <w:r>
+              <w:rPr>
+                <w:rFonts w:cs="Times New Roman"/>
+                <w:sz w:val="24"/>
+                <w:szCs w:val="24"/>
+              </w:rPr>
+              <w:t>13,75:1</w:t>
+            </w:r>
+          </w:p>
+        </w:tc>
+        <w:tc>
+          <w:tcPr>
+            <w:tcW w:w="2336" w:type="dxa"/>
+            <w:vAlign w:val="center"/>
+          </w:tcPr>
+          <w:p>
+            <w:pPr>
+              <w:pStyle w:val="a9"/>
+              <w:ind w:firstLine="0"/>
+              <w:rPr>
+                <w:rFonts w:cs="Times New Roman"/>
+                <w:sz w:val="24"/>
+                <w:szCs w:val="24"/>
+                <w:lang w:eastAsia="ru-RU"/>
+              </w:rPr>
+            </w:pPr>
+            <w:r>
+              <w:rPr>
+                <w:rFonts w:cs="Times New Roman"/>
+                <w:sz w:val="24"/>
+                <w:szCs w:val="24"/>
+              </w:rPr>
+              <w:t>12,44:1</w:t>
+            </w:r>
+          </w:p>
+        </w:tc>
+        <w:tc>
+          <w:tcPr>
+            <w:tcW w:w="2337" w:type="dxa"/>
+            <w:vAlign w:val="center"/>
+          </w:tcPr>
+          <w:p>
+            <w:pPr>
+              <w:pStyle w:val="a9"/>
+              <w:ind w:firstLine="0"/>
+              <w:rPr>
+                <w:rFonts w:cs="Times New Roman"/>
+                <w:sz w:val="24"/>
+                <w:szCs w:val="24"/>
+                <w:lang w:eastAsia="ru-RU"/>
+              </w:rPr>
+            </w:pPr>
+            <w:r>
+              <w:rPr>
+                <w:rFonts w:cs="Times New Roman"/>
+                <w:sz w:val="24"/>
+                <w:szCs w:val="24"/>
+              </w:rPr>
+              <w:t>Соответствует</w:t>
+            </w:r>
+          </w:p>
+        </w:tc>
+      </w:tr>
+      <w:tr>
+        <w:tc>
+          <w:tcPr>
+            <w:tcW w:w="2336" w:type="dxa"/>
+            <w:vAlign w:val="center"/>
+          </w:tcPr>
+          <w:p>
+            <w:pPr>
+              <w:pStyle w:val="a9"/>
+              <w:ind w:firstLine="0"/>
+              <w:rPr>
+                <w:rFonts w:cs="Times New Roman"/>
+                <w:sz w:val="24"/>
+                <w:szCs w:val="24"/>
+                <w:lang w:eastAsia="ru-RU"/>
+              </w:rPr>
+            </w:pPr>
+            <w:proofErr w:type="spellStart"/>
+            <w:r>
+              <w:rPr>
+                <w:rStyle w:val="HTML1"/>
+                <w:rFonts w:ascii="Times New Roman" w:eastAsiaTheme="minorHAnsi" w:hAnsi="Times New Roman" w:cs="Times New Roman"/>
+                <w:sz w:val="24"/>
+                <w:szCs w:val="24"/>
+              </w:rPr>
+              <w:t>text</w:t>
+            </w:r>
+            <w:proofErr w:type="spellEnd"/>
+            <w:r>
+              <w:rPr>
+                <w:rFonts w:cs="Times New Roman"/>
+                <w:sz w:val="24"/>
+                <w:szCs w:val="24"/>
+              </w:rPr>
+              <w:t xml:space="preserve"> + </w:t>
+            </w:r>
+            <w:proofErr w:type="spellStart"/>
+            <w:r>
+              <w:rPr>
+                <w:rStyle w:val="HTML1"/>
+                <w:rFonts w:ascii="Times New Roman" w:eastAsiaTheme="minorHAnsi" w:hAnsi="Times New Roman" w:cs="Times New Roman"/>
+                <w:sz w:val="24"/>
+                <w:szCs w:val="24"/>
+              </w:rPr>
+              <w:t>surface</w:t>
+            </w:r>
+            <w:proofErr w:type="spellEnd"/>
+          </w:p>
+        </w:tc>
+        <w:tc>
+          <w:tcPr>
+            <w:tcW w:w="2336" w:type="dxa"/>
+            <w:vAlign w:val="center"/>
+          </w:tcPr>
+          <w:p>
+            <w:pPr>
+              <w:pStyle w:val="a9"/>
+              <w:ind w:firstLine="0"/>
+              <w:rPr>
+                <w:rFonts w:cs="Times New Roman"/>
+                <w:sz w:val="24"/>
+                <w:szCs w:val="24"/>
+                <w:lang w:eastAsia="ru-RU"/>
+              </w:rPr>
+            </w:pPr>
+            <w:r>
+              <w:rPr>
+                <w:rFonts w:cs="Times New Roman"/>
+                <w:sz w:val="24"/>
+                <w:szCs w:val="24"/>
+              </w:rPr>
+              <w:t>11,81:1</w:t>
+            </w:r>
+          </w:p>
+        </w:tc>
+        <w:tc>
+          <w:tcPr>
+            <w:tcW w:w="2336" w:type="dxa"/>
+            <w:vAlign w:val="center"/>
+          </w:tcPr>
+          <w:p>
+            <w:pPr>
+              <w:pStyle w:val="a9"/>
+              <w:ind w:firstLine="0"/>
+              <w:rPr>
+                <w:rFonts w:cs="Times New Roman"/>
+                <w:sz w:val="24"/>
+                <w:szCs w:val="24"/>
+                <w:lang w:eastAsia="ru-RU"/>
+              </w:rPr>
+            </w:pPr>
+            <w:r>
+              <w:rPr>
+                <w:rFonts w:cs="Times New Roman"/>
+                <w:sz w:val="24"/>
+                <w:szCs w:val="24"/>
+              </w:rPr>
+              <w:t>13,82:1</w:t>
+            </w:r>
+          </w:p>
+        </w:tc>
+        <w:tc>
+          <w:tcPr>
+            <w:tcW w:w="2337" w:type="dxa"/>
+            <w:vAlign w:val="center"/>
+          </w:tcPr>
+          <w:p>
+            <w:pPr>
+              <w:pStyle w:val="a9"/>
+              <w:ind w:firstLine="0"/>
+              <w:rPr>
+                <w:rFonts w:cs="Times New Roman"/>
+                <w:sz w:val="24"/>
+                <w:szCs w:val="24"/>
+                <w:lang w:eastAsia="ru-RU"/>
+              </w:rPr>
+            </w:pPr>
+            <w:r>
+              <w:rPr>
+                <w:rFonts w:cs="Times New Roman"/>
+                <w:sz w:val="24"/>
+                <w:szCs w:val="24"/>
+              </w:rPr>
+              <w:t>Соответствует</w:t>
+            </w:r>
+          </w:p>
+        </w:tc>
+      </w:tr>
+      <w:tr>
+        <w:tc>
+          <w:tcPr>
+            <w:tcW w:w="2336" w:type="dxa"/>
+            <w:vAlign w:val="center"/>
+          </w:tcPr>
+          <w:p>
+            <w:pPr>
+              <w:pStyle w:val="a9"/>
+              <w:ind w:firstLine="0"/>
+              <w:rPr>
+                <w:rFonts w:cs="Times New Roman"/>
+                <w:sz w:val="24"/>
+                <w:szCs w:val="24"/>
+                <w:lang w:eastAsia="ru-RU"/>
+              </w:rPr>
+            </w:pPr>
+            <w:r>
+              <w:rPr>
+                <w:rStyle w:val="HTML1"/>
+                <w:rFonts w:ascii="Times New Roman" w:eastAsiaTheme="minorHAnsi" w:hAnsi="Times New Roman" w:cs="Times New Roman"/>
+                <w:sz w:val="24"/>
+                <w:szCs w:val="24"/>
+              </w:rPr>
+              <w:t>text2</w:t>
+            </w:r>
+            <w:r>
+              <w:rPr>
+                <w:rFonts w:cs="Times New Roman"/>
+                <w:sz w:val="24"/>
+                <w:szCs w:val="24"/>
+              </w:rPr>
+              <w:t xml:space="preserve"> + </w:t>
+            </w:r>
+            <w:proofErr w:type="spellStart"/>
+            <w:r>
+              <w:rPr>
+                <w:rStyle w:val="HTML1"/>
+                <w:rFonts w:ascii="Times New Roman" w:eastAsiaTheme="minorHAnsi" w:hAnsi="Times New Roman" w:cs="Times New Roman"/>
+                <w:sz w:val="24"/>
+                <w:szCs w:val="24"/>
+              </w:rPr>
+              <w:t>bg</w:t>
+            </w:r>
+            <w:proofErr w:type="spellEnd"/>
+          </w:p>
+        </w:tc>
+        <w:tc>
+          <w:tcPr>
+            <w:tcW w:w="2336" w:type="dxa"/>
+            <w:vAlign w:val="center"/>
+          </w:tcPr>
+          <w:p>
+            <w:pPr>
+              <w:pStyle w:val="a9"/>
+              <w:ind w:firstLine="0"/>
+              <w:rPr>
+                <w:rFonts w:cs="Times New Roman"/>
+                <w:sz w:val="24"/>
+                <w:szCs w:val="24"/>
+                <w:lang w:eastAsia="ru-RU"/>
+              </w:rPr>
+            </w:pPr>
+            <w:r>
+              <w:rPr>
+                <w:rFonts w:cs="Times New Roman"/>
+                <w:sz w:val="24"/>
+                <w:szCs w:val="24"/>
+              </w:rPr>
+              <w:t>12,89:1</w:t>
+            </w:r>
+          </w:p>
+        </w:tc>
+        <w:tc>
+          <w:tcPr>
+            <w:tcW w:w="2336" w:type="dxa"/>
+            <w:vAlign w:val="center"/>
+          </w:tcPr>
+          <w:p>
+            <w:pPr>
+              <w:pStyle w:val="a9"/>
+              <w:ind w:firstLine="0"/>
+              <w:rPr>
+                <w:rFonts w:cs="Times New Roman"/>
+                <w:sz w:val="24"/>
+                <w:szCs w:val="24"/>
+                <w:lang w:eastAsia="ru-RU"/>
+              </w:rPr>
+            </w:pPr>
+            <w:r>
+              <w:rPr>
+                <w:rFonts w:cs="Times New Roman"/>
+                <w:sz w:val="24"/>
+                <w:szCs w:val="24"/>
+              </w:rPr>
+              <w:t>5,05:1</w:t>
+            </w:r>
+          </w:p>
+        </w:tc>
+        <w:tc>
+          <w:tcPr>
+            <w:tcW w:w="2337" w:type="dxa"/>
+            <w:vAlign w:val="center"/>
+          </w:tcPr>
+          <w:p>
+            <w:pPr>
+              <w:pStyle w:val="a9"/>
+              <w:ind w:firstLine="0"/>
+              <w:rPr>
+                <w:rFonts w:cs="Times New Roman"/>
+                <w:sz w:val="24"/>
+                <w:szCs w:val="24"/>
+                <w:lang w:eastAsia="ru-RU"/>
+              </w:rPr>
+            </w:pPr>
+            <w:r>
+              <w:rPr>
+                <w:rFonts w:cs="Times New Roman"/>
+                <w:sz w:val="24"/>
+                <w:szCs w:val="24"/>
+              </w:rPr>
+              <w:t>Соответствует</w:t>
+            </w:r>
+          </w:p>
+        </w:tc>
+      </w:tr>
+      <w:tr>
+        <w:tc>
+          <w:tcPr>
+            <w:tcW w:w="2336" w:type="dxa"/>
+            <w:vAlign w:val="center"/>
+          </w:tcPr>
+          <w:p>
+            <w:pPr>
+              <w:pStyle w:val="a9"/>
+              <w:ind w:firstLine="0"/>
+              <w:rPr>
+                <w:rFonts w:cs="Times New Roman"/>
+                <w:sz w:val="24"/>
+                <w:szCs w:val="24"/>
+                <w:lang w:eastAsia="ru-RU"/>
+              </w:rPr>
+            </w:pPr>
+            <w:proofErr w:type="spellStart"/>
+            <w:r>
+              <w:rPr>
+                <w:rStyle w:val="HTML1"/>
+                <w:rFonts w:ascii="Times New Roman" w:eastAsiaTheme="minorHAnsi" w:hAnsi="Times New Roman" w:cs="Times New Roman"/>
+                <w:sz w:val="24"/>
+                <w:szCs w:val="24"/>
+              </w:rPr>
+              <w:t>onaccent</w:t>
+            </w:r>
+            <w:proofErr w:type="spellEnd"/>
+            <w:r>
+              <w:rPr>
+                <w:rFonts w:cs="Times New Roman"/>
+                <w:sz w:val="24"/>
+                <w:szCs w:val="24"/>
+              </w:rPr>
+              <w:t xml:space="preserve"> + </w:t>
+            </w:r>
+            <w:proofErr w:type="spellStart"/>
+            <w:r>
+              <w:rPr>
+                <w:rStyle w:val="HTML1"/>
+                <w:rFonts w:ascii="Times New Roman" w:eastAsiaTheme="minorHAnsi" w:hAnsi="Times New Roman" w:cs="Times New Roman"/>
+                <w:sz w:val="24"/>
+                <w:szCs w:val="24"/>
+              </w:rPr>
+              <w:t>accent</w:t>
+            </w:r>
+            <w:proofErr w:type="spellEnd"/>
+          </w:p>
+        </w:tc>
+        <w:tc>
+          <w:tcPr>
+            <w:tcW w:w="2336" w:type="dxa"/>
+            <w:vAlign w:val="center"/>
+          </w:tcPr>
+          <w:p>
+            <w:pPr>
+              <w:pStyle w:val="a9"/>
+              <w:ind w:firstLine="0"/>
+              <w:rPr>
+                <w:rFonts w:cs="Times New Roman"/>
+                <w:sz w:val="24"/>
+                <w:szCs w:val="24"/>
+                <w:lang w:eastAsia="ru-RU"/>
+              </w:rPr>
+            </w:pPr>
+            <w:r>
+              <w:rPr>
+                <w:rFonts w:cs="Times New Roman"/>
+                <w:sz w:val="24"/>
+                <w:szCs w:val="24"/>
+              </w:rPr>
+              <w:t>4,55:1</w:t>
+            </w:r>
+          </w:p>
+        </w:tc>
+        <w:tc>
+          <w:tcPr>
+            <w:tcW w:w="2336" w:type="dxa"/>
+            <w:vAlign w:val="center"/>
+          </w:tcPr>
+          <w:p>
+            <w:pPr>
+              <w:pStyle w:val="a9"/>
+              <w:ind w:firstLine="0"/>
+              <w:rPr>
+                <w:rFonts w:cs="Times New Roman"/>
+                <w:sz w:val="24"/>
+                <w:szCs w:val="24"/>
+                <w:lang w:eastAsia="ru-RU"/>
+              </w:rPr>
+            </w:pPr>
+            <w:r>
+              <w:rPr>
+                <w:rFonts w:cs="Times New Roman"/>
+                <w:sz w:val="24"/>
+                <w:szCs w:val="24"/>
+              </w:rPr>
+              <w:t>8,84:1</w:t>
+            </w:r>
+          </w:p>
+        </w:tc>
+        <w:tc>
+          <w:tcPr>
+            <w:tcW w:w="2337" w:type="dxa"/>
+            <w:vAlign w:val="center"/>
+          </w:tcPr>
+          <w:p>
+            <w:pPr>
+              <w:pStyle w:val="a9"/>
+              <w:ind w:firstLine="0"/>
+              <w:rPr>
+                <w:rFonts w:cs="Times New Roman"/>
+                <w:sz w:val="24"/>
+                <w:szCs w:val="24"/>
+                <w:lang w:eastAsia="ru-RU"/>
+              </w:rPr>
+            </w:pPr>
+            <w:r>
+              <w:rPr>
+                <w:rFonts w:cs="Times New Roman"/>
+                <w:sz w:val="24"/>
+                <w:szCs w:val="24"/>
+              </w:rPr>
+              <w:t>Соответствует</w:t>
+            </w:r>
+          </w:p>
+        </w:tc>
+      </w:tr>
+      <w:tr>
+        <w:tc>
+          <w:tcPr>
+            <w:tcW w:w="2336" w:type="dxa"/>
+            <w:vAlign w:val="center"/>
+          </w:tcPr>
+          <w:p>
+            <w:pPr>
+              <w:pStyle w:val="a9"/>
+              <w:ind w:firstLine="0"/>
+              <w:rPr>
+                <w:rFonts w:cs="Times New Roman"/>
+                <w:sz w:val="24"/>
+                <w:szCs w:val="24"/>
+                <w:lang w:eastAsia="ru-RU"/>
+              </w:rPr>
+            </w:pPr>
+            <w:proofErr w:type="spellStart"/>
+            <w:r>
+              <w:rPr>
+                <w:rStyle w:val="HTML1"/>
+                <w:rFonts w:ascii="Times New Roman" w:eastAsiaTheme="minorHAnsi" w:hAnsi="Times New Roman" w:cs="Times New Roman"/>
+                <w:sz w:val="24"/>
+                <w:szCs w:val="24"/>
+              </w:rPr>
+              <w:t>outline</w:t>
+            </w:r>
+            <w:proofErr w:type="spellEnd"/>
+            <w:r>
+              <w:rPr>
+                <w:rFonts w:cs="Times New Roman"/>
+                <w:sz w:val="24"/>
+                <w:szCs w:val="24"/>
+              </w:rPr>
+              <w:t xml:space="preserve"> + </w:t>
+            </w:r>
+            <w:proofErr w:type="spellStart"/>
+            <w:r>
+              <w:rPr>
+                <w:rStyle w:val="HTML1"/>
+                <w:rFonts w:ascii="Times New Roman" w:eastAsiaTheme="minorHAnsi" w:hAnsi="Times New Roman" w:cs="Times New Roman"/>
+                <w:sz w:val="24"/>
+                <w:szCs w:val="24"/>
+              </w:rPr>
+              <w:t>bg</w:t>
+            </w:r>
+            <w:proofErr w:type="spellEnd"/>
+          </w:p>
+        </w:tc>
+        <w:tc>
+          <w:tcPr>
+            <w:tcW w:w="2336" w:type="dxa"/>
+            <w:vAlign w:val="center"/>
+          </w:tcPr>
+          <w:p>
+            <w:pPr>
+              <w:pStyle w:val="a9"/>
+              <w:ind w:firstLine="0"/>
+              <w:rPr>
+                <w:rFonts w:cs="Times New Roman"/>
+                <w:sz w:val="24"/>
+                <w:szCs w:val="24"/>
+                <w:lang w:eastAsia="ru-RU"/>
+              </w:rPr>
+            </w:pPr>
+            <w:r>
+              <w:rPr>
+                <w:rFonts w:cs="Times New Roman"/>
+                <w:sz w:val="24"/>
+                <w:szCs w:val="24"/>
+              </w:rPr>
+              <w:t>4,87:1</w:t>
+            </w:r>
+          </w:p>
+        </w:tc>
+        <w:tc>
+          <w:tcPr>
+            <w:tcW w:w="2336" w:type="dxa"/>
+            <w:vAlign w:val="center"/>
+          </w:tcPr>
+          <w:p>
+            <w:pPr>
+              <w:pStyle w:val="a9"/>
+              <w:ind w:firstLine="0"/>
+              <w:rPr>
+                <w:rFonts w:cs="Times New Roman"/>
+                <w:sz w:val="24"/>
+                <w:szCs w:val="24"/>
+                <w:lang w:eastAsia="ru-RU"/>
+              </w:rPr>
+            </w:pPr>
+            <w:r>
+              <w:rPr>
+                <w:rFonts w:cs="Times New Roman"/>
+                <w:sz w:val="24"/>
+                <w:szCs w:val="24"/>
+              </w:rPr>
+              <w:t>4,83:1</w:t>
+            </w:r>
+          </w:p>
+        </w:tc>
+        <w:tc>
+          <w:tcPr>
+            <w:tcW w:w="2337" w:type="dxa"/>
+            <w:vAlign w:val="center"/>
+          </w:tcPr>
+          <w:p>
+            <w:pPr>
+              <w:pStyle w:val="a9"/>
+              <w:ind w:firstLine="0"/>
+              <w:rPr>
+                <w:rFonts w:cs="Times New Roman"/>
+                <w:sz w:val="24"/>
+                <w:szCs w:val="24"/>
+                <w:lang w:eastAsia="ru-RU"/>
+              </w:rPr>
+            </w:pPr>
+            <w:r>
+              <w:rPr>
+                <w:rFonts w:cs="Times New Roman"/>
+                <w:sz w:val="24"/>
+                <w:szCs w:val="24"/>
+              </w:rPr>
+              <w:t>Соответствует</w:t>
+            </w:r>
+          </w:p>
+        </w:tc>
+      </w:tr>
+      <w:tr>
+        <w:tc>
+          <w:tcPr>
+            <w:tcW w:w="2336" w:type="dxa"/>
+            <w:vAlign w:val="center"/>
+          </w:tcPr>
+          <w:p>
+            <w:pPr>
+              <w:pStyle w:val="a9"/>
+              <w:ind w:firstLine="0"/>
+              <w:rPr>
+                <w:rFonts w:cs="Times New Roman"/>
+                <w:sz w:val="24"/>
+                <w:szCs w:val="24"/>
+                <w:lang w:eastAsia="ru-RU"/>
+              </w:rPr>
+            </w:pPr>
+            <w:proofErr w:type="spellStart"/>
+            <w:r>
+              <w:rPr>
+                <w:rStyle w:val="HTML1"/>
+                <w:rFonts w:ascii="Times New Roman" w:eastAsiaTheme="minorHAnsi" w:hAnsi="Times New Roman" w:cs="Times New Roman"/>
+                <w:sz w:val="24"/>
+                <w:szCs w:val="24"/>
+              </w:rPr>
+              <w:t>onaccent</w:t>
+            </w:r>
+            <w:proofErr w:type="spellEnd"/>
+            <w:r>
+              <w:rPr>
+                <w:rFonts w:cs="Times New Roman"/>
+                <w:sz w:val="24"/>
+                <w:szCs w:val="24"/>
+              </w:rPr>
+              <w:t xml:space="preserve"> + </w:t>
+            </w:r>
+            <w:proofErr w:type="spellStart"/>
+            <w:r>
+              <w:rPr>
+                <w:rStyle w:val="HTML1"/>
+                <w:rFonts w:ascii="Times New Roman" w:eastAsiaTheme="minorHAnsi" w:hAnsi="Times New Roman" w:cs="Times New Roman"/>
+                <w:sz w:val="24"/>
+                <w:szCs w:val="24"/>
+              </w:rPr>
+              <w:t>primary</w:t>
+            </w:r>
+            <w:proofErr w:type="spellEnd"/>
+          </w:p>
+        </w:tc>
+        <w:tc>
+          <w:tcPr>
+            <w:tcW w:w="2336" w:type="dxa"/>
+            <w:vAlign w:val="center"/>
+          </w:tcPr>
+          <w:p>
+            <w:pPr>
+              <w:pStyle w:val="a9"/>
+              <w:ind w:firstLine="0"/>
+              <w:rPr>
+                <w:rFonts w:cs="Times New Roman"/>
+                <w:sz w:val="24"/>
+                <w:szCs w:val="24"/>
+                <w:lang w:eastAsia="ru-RU"/>
+              </w:rPr>
+            </w:pPr>
+            <w:r>
+              <w:rPr>
+                <w:rFonts w:cs="Times New Roman"/>
+                <w:sz w:val="24"/>
+                <w:szCs w:val="24"/>
+              </w:rPr>
+              <w:t>4,52:1</w:t>
+            </w:r>
+          </w:p>
+        </w:tc>
+        <w:tc>
+          <w:tcPr>
+            <w:tcW w:w="2336" w:type="dxa"/>
+            <w:vAlign w:val="center"/>
+          </w:tcPr>
+          <w:p>
+            <w:pPr>
+              <w:pStyle w:val="a9"/>
+              <w:ind w:firstLine="0"/>
+              <w:rPr>
+                <w:rFonts w:cs="Times New Roman"/>
+                <w:sz w:val="24"/>
+                <w:szCs w:val="24"/>
+                <w:lang w:eastAsia="ru-RU"/>
+              </w:rPr>
+            </w:pPr>
+            <w:r>
+              <w:rPr>
+                <w:rFonts w:cs="Times New Roman"/>
+                <w:sz w:val="24"/>
+                <w:szCs w:val="24"/>
+                <w:lang w:eastAsia="ru-RU"/>
+              </w:rPr>
+              <w:t>5,48</w:t>
+            </w:r>
+            <w:r>
+              <w:rPr>
+                <w:rFonts w:cs="Times New Roman"/>
+                <w:sz w:val="24"/>
+                <w:szCs w:val="24"/>
+                <w:lang w:eastAsia="ru-RU"/>
+              </w:rPr>
+              <w:t>:1</w:t>
+            </w:r>
+          </w:p>
+        </w:tc>
+        <w:tc>
+          <w:tcPr>
+            <w:tcW w:w="2337" w:type="dxa"/>
+            <w:vAlign w:val="center"/>
+          </w:tcPr>
+          <w:p>
+            <w:pPr>
+              <w:pStyle w:val="a9"/>
+              <w:ind w:firstLine="0"/>
+              <w:rPr>
+                <w:rFonts w:cs="Times New Roman"/>
+                <w:sz w:val="24"/>
+                <w:szCs w:val="24"/>
+                <w:lang w:eastAsia="ru-RU"/>
+              </w:rPr>
+            </w:pPr>
+            <w:r>
+              <w:rPr>
+                <w:rFonts w:cs="Times New Roman"/>
+                <w:sz w:val="24"/>
+                <w:szCs w:val="24"/>
+              </w:rPr>
+              <w:t>Соответствует</w:t>
+            </w:r>
+          </w:p>
+        </w:tc>
+      </w:tr>
+    </w:tbl>
+    <w:p>
+      <w:pPr>
+        <w:pStyle w:val="a9"/>
+        <w:ind w:firstLine="0"/>
+        <w:rPr>
+          <w:lang w:eastAsia="ru-RU"/>
+        </w:rPr>
+      </w:pPr>
+      <w:bookmarkStart w:id="25" w:name="_GoBack"/>
+      <w:bookmarkEnd w:id="25"/>
+    </w:p>
+    <w:p>
+      <w:pPr>
+        <w:pStyle w:val="a9"/>
+        <w:rPr>
+          <w:lang w:eastAsia="ru-RU"/>
+        </w:rPr>
+      </w:pPr>
+      <w:r>
+        <w:rPr>
+          <w:lang w:eastAsia="ru-RU"/>
+        </w:rPr>
+        <w:t xml:space="preserve">Результаты показывают, что </w:t>
+      </w:r>
+      <w:r>
+        <w:rPr>
+          <w:lang w:eastAsia="ru-RU"/>
+        </w:rPr>
+        <w:t>цвета</w:t>
+      </w:r>
+      <w:r>
+        <w:rPr>
+          <w:lang w:eastAsia="ru-RU"/>
+        </w:rPr>
+        <w:t xml:space="preserve"> </w:t>
+      </w:r>
+      <w:proofErr w:type="spellStart"/>
+      <w:r>
+        <w:rPr>
+          <w:lang w:eastAsia="ru-RU"/>
+        </w:rPr>
+        <w:t>text</w:t>
+      </w:r>
+      <w:proofErr w:type="spellEnd"/>
+      <w:r>
+        <w:rPr>
+          <w:lang w:eastAsia="ru-RU"/>
+        </w:rPr>
+        <w:t xml:space="preserve"> и text2 обеспечивают достаточную читаемость на основном фоне </w:t>
+      </w:r>
+      <w:proofErr w:type="spellStart"/>
+      <w:r>
+        <w:rPr>
+          <w:lang w:eastAsia="ru-RU"/>
+        </w:rPr>
+        <w:t>bg</w:t>
+      </w:r>
+      <w:proofErr w:type="spellEnd"/>
+      <w:r>
+        <w:rPr>
+          <w:lang w:eastAsia="ru-RU"/>
+        </w:rPr>
+        <w:t xml:space="preserve"> и поверхности </w:t>
+      </w:r>
+      <w:proofErr w:type="spellStart"/>
+      <w:r>
+        <w:rPr>
+          <w:lang w:eastAsia="ru-RU"/>
+        </w:rPr>
+        <w:t>surface</w:t>
+      </w:r>
+      <w:proofErr w:type="spellEnd"/>
+      <w:r>
+        <w:rPr>
+          <w:lang w:eastAsia="ru-RU"/>
+        </w:rPr>
+        <w:t xml:space="preserve"> в обеих темах. Сочетание </w:t>
+      </w:r>
+      <w:proofErr w:type="spellStart"/>
+      <w:r>
+        <w:rPr>
+          <w:lang w:eastAsia="ru-RU"/>
+        </w:rPr>
+        <w:t>onaccent</w:t>
+      </w:r>
+      <w:proofErr w:type="spellEnd"/>
+      <w:r>
+        <w:rPr>
+          <w:lang w:eastAsia="ru-RU"/>
+        </w:rPr>
+        <w:t xml:space="preserve"> с </w:t>
+      </w:r>
+      <w:proofErr w:type="spellStart"/>
+      <w:r>
+        <w:rPr>
+          <w:lang w:eastAsia="ru-RU"/>
+        </w:rPr>
+        <w:t>accent</w:t>
+      </w:r>
+      <w:proofErr w:type="spellEnd"/>
+      <w:r>
+        <w:rPr>
+          <w:lang w:eastAsia="ru-RU"/>
+        </w:rPr>
+        <w:t xml:space="preserve"> также соответствует требованиям контрастности для обычного текста. </w:t>
+      </w:r>
+      <w:r>
+        <w:rPr>
+          <w:lang w:eastAsia="ru-RU"/>
+        </w:rPr>
+        <w:t>Цвет</w:t>
+      </w:r>
+      <w:r>
+        <w:rPr>
+          <w:lang w:eastAsia="ru-RU"/>
+        </w:rPr>
+        <w:t xml:space="preserve"> </w:t>
+      </w:r>
+      <w:proofErr w:type="spellStart"/>
+      <w:r>
+        <w:rPr>
+          <w:lang w:eastAsia="ru-RU"/>
+        </w:rPr>
+        <w:t>outline</w:t>
+      </w:r>
+      <w:proofErr w:type="spellEnd"/>
+      <w:r>
+        <w:rPr>
+          <w:lang w:eastAsia="ru-RU"/>
+        </w:rPr>
+        <w:t xml:space="preserve"> обеспечивает достаточное визуальное вы</w:t>
+      </w:r>
+      <w:r>
+        <w:rPr>
+          <w:lang w:eastAsia="ru-RU"/>
+        </w:rPr>
+        <w:t xml:space="preserve">деление границ относительно </w:t>
+      </w:r>
+      <w:proofErr w:type="spellStart"/>
+      <w:r>
+        <w:rPr>
+          <w:lang w:eastAsia="ru-RU"/>
+        </w:rPr>
+        <w:t>bg</w:t>
+      </w:r>
+      <w:proofErr w:type="spellEnd"/>
+      <w:r>
+        <w:rPr>
+          <w:lang w:eastAsia="ru-RU"/>
+        </w:rPr>
+        <w:t>.</w:t>
+      </w:r>
+    </w:p>
+    <w:p>
+      <w:pPr>
+        <w:pStyle w:val="a9"/>
+        <w:rPr>
+          <w:lang w:eastAsia="ru-RU"/>
+        </w:rPr>
+      </w:pPr>
+      <w:r>
+        <w:rPr>
+          <w:lang w:eastAsia="ru-RU"/>
+        </w:rPr>
+        <w:t xml:space="preserve">Таким образом, большинство проверенных сочетаний </w:t>
+      </w:r>
+      <w:r>
+        <w:rPr>
+          <w:lang w:eastAsia="ru-RU"/>
+        </w:rPr>
+        <w:t>цветов</w:t>
+      </w:r>
+      <w:r>
+        <w:rPr>
+          <w:lang w:eastAsia="ru-RU"/>
+        </w:rPr>
+        <w:t xml:space="preserve"> соответствует требованиям WCAG AA. </w:t>
+      </w:r>
     </w:p>
     <w:sectPr>
       <w:pgSz w:w="11906" w:h="16838"/>
@@ -21822,6 +23413,92 @@
     </w:lvl>
   </w:abstractNum>
   <w:abstractNum w:abstractNumId="6" w15:restartNumberingAfterBreak="0">
+    <w:nsid w:val="3594377C"/>
+    <w:multiLevelType w:val="hybridMultilevel"/>
+    <w:tmpl w:val="4B22AB9E"/>
+    <w:lvl w:ilvl="0" w:tplc="04190011">
+      <w:start w:val="1"/>
+      <w:numFmt w:val="decimal"/>
+      <w:lvlText w:val="%1)"/>
+      <w:lvlJc w:val="left"/>
+      <w:pPr>
+        <w:ind w:left="1429" w:hanging="360"/>
+      </w:pPr>
+    </w:lvl>
+    <w:lvl w:ilvl="1" w:tplc="04190019" w:tentative="1">
+      <w:start w:val="1"/>
+      <w:numFmt w:val="lowerLetter"/>
+      <w:lvlText w:val="%2."/>
+      <w:lvlJc w:val="left"/>
+      <w:pPr>
+        <w:ind w:left="2149" w:hanging="360"/>
+      </w:pPr>
+    </w:lvl>
+    <w:lvl w:ilvl="2" w:tplc="0419001B" w:tentative="1">
+      <w:start w:val="1"/>
+      <w:numFmt w:val="lowerRoman"/>
+      <w:lvlText w:val="%3."/>
+      <w:lvlJc w:val="right"/>
+      <w:pPr>
+        <w:ind w:left="2869" w:hanging="180"/>
+      </w:pPr>
+    </w:lvl>
+    <w:lvl w:ilvl="3" w:tplc="0419000F" w:tentative="1">
+      <w:start w:val="1"/>
+      <w:numFmt w:val="decimal"/>
+      <w:lvlText w:val="%4."/>
+      <w:lvlJc w:val="left"/>
+      <w:pPr>
+        <w:ind w:left="3589" w:hanging="360"/>
+      </w:pPr>
+    </w:lvl>
+    <w:lvl w:ilvl="4" w:tplc="04190019" w:tentative="1">
+      <w:start w:val="1"/>
+      <w:numFmt w:val="lowerLetter"/>
+      <w:lvlText w:val="%5."/>
+      <w:lvlJc w:val="left"/>
+      <w:pPr>
+        <w:ind w:left="4309" w:hanging="360"/>
+      </w:pPr>
+    </w:lvl>
+    <w:lvl w:ilvl="5" w:tplc="0419001B" w:tentative="1">
+      <w:start w:val="1"/>
+      <w:numFmt w:val="lowerRoman"/>
+      <w:lvlText w:val="%6."/>
+      <w:lvlJc w:val="right"/>
+      <w:pPr>
+        <w:ind w:left="5029" w:hanging="180"/>
+      </w:pPr>
+    </w:lvl>
+    <w:lvl w:ilvl="6" w:tplc="0419000F" w:tentative="1">
+      <w:start w:val="1"/>
+      <w:numFmt w:val="decimal"/>
+      <w:lvlText w:val="%7."/>
+      <w:lvlJc w:val="left"/>
+      <w:pPr>
+        <w:ind w:left="5749" w:hanging="360"/>
+      </w:pPr>
+    </w:lvl>
+    <w:lvl w:ilvl="7" w:tplc="04190019" w:tentative="1">
+      <w:start w:val="1"/>
+      <w:numFmt w:val="lowerLetter"/>
+      <w:lvlText w:val="%8."/>
+      <w:lvlJc w:val="left"/>
+      <w:pPr>
+        <w:ind w:left="6469" w:hanging="360"/>
+      </w:pPr>
+    </w:lvl>
+    <w:lvl w:ilvl="8" w:tplc="0419001B" w:tentative="1">
+      <w:start w:val="1"/>
+      <w:numFmt w:val="lowerRoman"/>
+      <w:lvlText w:val="%9."/>
+      <w:lvlJc w:val="right"/>
+      <w:pPr>
+        <w:ind w:left="7189" w:hanging="180"/>
+      </w:pPr>
+    </w:lvl>
+  </w:abstractNum>
+  <w:abstractNum w:abstractNumId="7" w15:restartNumberingAfterBreak="0">
     <w:nsid w:val="3FFF562D"/>
     <w:multiLevelType w:val="multilevel"/>
     <w:tmpl w:val="9822CC4A"/>
@@ -21934,7 +23611,7 @@
       </w:rPr>
     </w:lvl>
   </w:abstractNum>
-  <w:abstractNum w:abstractNumId="7" w15:restartNumberingAfterBreak="0">
+  <w:abstractNum w:abstractNumId="8" w15:restartNumberingAfterBreak="0">
     <w:nsid w:val="411F00C2"/>
     <w:multiLevelType w:val="hybridMultilevel"/>
     <w:tmpl w:val="9582019E"/>
@@ -22047,7 +23724,7 @@
       </w:rPr>
     </w:lvl>
   </w:abstractNum>
-  <w:abstractNum w:abstractNumId="8" w15:restartNumberingAfterBreak="0">
+  <w:abstractNum w:abstractNumId="9" w15:restartNumberingAfterBreak="0">
     <w:nsid w:val="44F22ECF"/>
     <w:multiLevelType w:val="hybridMultilevel"/>
     <w:tmpl w:val="10029DFC"/>
@@ -22160,7 +23837,7 @@
       </w:rPr>
     </w:lvl>
   </w:abstractNum>
-  <w:abstractNum w:abstractNumId="9" w15:restartNumberingAfterBreak="0">
+  <w:abstractNum w:abstractNumId="10" w15:restartNumberingAfterBreak="0">
     <w:nsid w:val="497271AE"/>
     <w:multiLevelType w:val="hybridMultilevel"/>
     <w:tmpl w:val="C370258E"/>
@@ -22273,7 +23950,7 @@
       </w:rPr>
     </w:lvl>
   </w:abstractNum>
-  <w:abstractNum w:abstractNumId="10" w15:restartNumberingAfterBreak="0">
+  <w:abstractNum w:abstractNumId="11" w15:restartNumberingAfterBreak="0">
     <w:nsid w:val="4D2418F4"/>
     <w:multiLevelType w:val="multilevel"/>
     <w:tmpl w:val="E1DC77AA"/>
@@ -22386,7 +24063,7 @@
       </w:rPr>
     </w:lvl>
   </w:abstractNum>
-  <w:abstractNum w:abstractNumId="11" w15:restartNumberingAfterBreak="0">
+  <w:abstractNum w:abstractNumId="12" w15:restartNumberingAfterBreak="0">
     <w:nsid w:val="4FD318BF"/>
     <w:multiLevelType w:val="hybridMultilevel"/>
     <w:tmpl w:val="1B1AF7A4"/>
@@ -22499,7 +24176,7 @@
       </w:rPr>
     </w:lvl>
   </w:abstractNum>
-  <w:abstractNum w:abstractNumId="12" w15:restartNumberingAfterBreak="0">
+  <w:abstractNum w:abstractNumId="13" w15:restartNumberingAfterBreak="0">
     <w:nsid w:val="50517234"/>
     <w:multiLevelType w:val="hybridMultilevel"/>
     <w:tmpl w:val="FC921BF0"/>
@@ -22612,10 +24289,10 @@
       </w:rPr>
     </w:lvl>
   </w:abstractNum>
-  <w:abstractNum w:abstractNumId="13" w15:restartNumberingAfterBreak="0">
+  <w:abstractNum w:abstractNumId="14" w15:restartNumberingAfterBreak="0">
     <w:nsid w:val="546622A5"/>
     <w:multiLevelType w:val="hybridMultilevel"/>
-    <w:tmpl w:val="60A892C2"/>
+    <w:tmpl w:val="4B22AB9E"/>
     <w:lvl w:ilvl="0" w:tplc="04190011">
       <w:start w:val="1"/>
       <w:numFmt w:val="decimal"/>
@@ -22698,7 +24375,7 @@
       </w:pPr>
     </w:lvl>
   </w:abstractNum>
-  <w:abstractNum w:abstractNumId="14" w15:restartNumberingAfterBreak="0">
+  <w:abstractNum w:abstractNumId="15" w15:restartNumberingAfterBreak="0">
     <w:nsid w:val="552D6126"/>
     <w:multiLevelType w:val="hybridMultilevel"/>
     <w:tmpl w:val="9434360E"/>
@@ -22784,7 +24461,7 @@
       </w:pPr>
     </w:lvl>
   </w:abstractNum>
-  <w:abstractNum w:abstractNumId="15" w15:restartNumberingAfterBreak="0">
+  <w:abstractNum w:abstractNumId="16" w15:restartNumberingAfterBreak="0">
     <w:nsid w:val="5C7F40D6"/>
     <w:multiLevelType w:val="hybridMultilevel"/>
     <w:tmpl w:val="17743BC8"/>
@@ -22897,7 +24574,7 @@
       </w:rPr>
     </w:lvl>
   </w:abstractNum>
-  <w:abstractNum w:abstractNumId="16" w15:restartNumberingAfterBreak="0">
+  <w:abstractNum w:abstractNumId="17" w15:restartNumberingAfterBreak="0">
     <w:nsid w:val="5D0A221A"/>
     <w:multiLevelType w:val="hybridMultilevel"/>
     <w:tmpl w:val="D07CC9A0"/>
@@ -23010,7 +24687,7 @@
       </w:rPr>
     </w:lvl>
   </w:abstractNum>
-  <w:abstractNum w:abstractNumId="17" w15:restartNumberingAfterBreak="0">
+  <w:abstractNum w:abstractNumId="18" w15:restartNumberingAfterBreak="0">
     <w:nsid w:val="62005D86"/>
     <w:multiLevelType w:val="hybridMultilevel"/>
     <w:tmpl w:val="6E14702E"/>
@@ -23123,7 +24800,7 @@
       </w:rPr>
     </w:lvl>
   </w:abstractNum>
-  <w:abstractNum w:abstractNumId="18" w15:restartNumberingAfterBreak="0">
+  <w:abstractNum w:abstractNumId="19" w15:restartNumberingAfterBreak="0">
     <w:nsid w:val="62603B02"/>
     <w:multiLevelType w:val="hybridMultilevel"/>
     <w:tmpl w:val="EC10A5F6"/>
@@ -23236,7 +24913,7 @@
       </w:rPr>
     </w:lvl>
   </w:abstractNum>
-  <w:abstractNum w:abstractNumId="19" w15:restartNumberingAfterBreak="0">
+  <w:abstractNum w:abstractNumId="20" w15:restartNumberingAfterBreak="0">
     <w:nsid w:val="63D40C2F"/>
     <w:multiLevelType w:val="hybridMultilevel"/>
     <w:tmpl w:val="4DBCA470"/>
@@ -23349,7 +25026,7 @@
       </w:rPr>
     </w:lvl>
   </w:abstractNum>
-  <w:abstractNum w:abstractNumId="20" w15:restartNumberingAfterBreak="0">
+  <w:abstractNum w:abstractNumId="21" w15:restartNumberingAfterBreak="0">
     <w:nsid w:val="67A03DF0"/>
     <w:multiLevelType w:val="multilevel"/>
     <w:tmpl w:val="E1DC77AA"/>
@@ -23462,7 +25139,7 @@
       </w:rPr>
     </w:lvl>
   </w:abstractNum>
-  <w:abstractNum w:abstractNumId="21" w15:restartNumberingAfterBreak="0">
+  <w:abstractNum w:abstractNumId="22" w15:restartNumberingAfterBreak="0">
     <w:nsid w:val="76E15ECA"/>
     <w:multiLevelType w:val="hybridMultilevel"/>
     <w:tmpl w:val="19F8A95A"/>
@@ -23575,7 +25252,7 @@
       </w:rPr>
     </w:lvl>
   </w:abstractNum>
-  <w:abstractNum w:abstractNumId="22" w15:restartNumberingAfterBreak="0">
+  <w:abstractNum w:abstractNumId="23" w15:restartNumberingAfterBreak="0">
     <w:nsid w:val="7E5441D8"/>
     <w:multiLevelType w:val="hybridMultilevel"/>
     <w:tmpl w:val="9BC449AC"/>
@@ -23689,61 +25366,61 @@
     </w:lvl>
   </w:abstractNum>
   <w:num w:numId="1">
-    <w:abstractNumId w:val="6"/>
+    <w:abstractNumId w:val="7"/>
   </w:num>
   <w:num w:numId="2">
     <w:abstractNumId w:val="2"/>
   </w:num>
   <w:num w:numId="3">
-    <w:abstractNumId w:val="14"/>
+    <w:abstractNumId w:val="15"/>
   </w:num>
   <w:num w:numId="4">
-    <w:abstractNumId w:val="11"/>
+    <w:abstractNumId w:val="12"/>
   </w:num>
   <w:num w:numId="5">
-    <w:abstractNumId w:val="12"/>
+    <w:abstractNumId w:val="13"/>
   </w:num>
   <w:num w:numId="6">
-    <w:abstractNumId w:val="21"/>
+    <w:abstractNumId w:val="22"/>
   </w:num>
   <w:num w:numId="7">
     <w:abstractNumId w:val="1"/>
   </w:num>
   <w:num w:numId="8">
-    <w:abstractNumId w:val="13"/>
+    <w:abstractNumId w:val="14"/>
   </w:num>
   <w:num w:numId="9">
-    <w:abstractNumId w:val="17"/>
+    <w:abstractNumId w:val="18"/>
   </w:num>
   <w:num w:numId="10">
-    <w:abstractNumId w:val="9"/>
+    <w:abstractNumId w:val="10"/>
   </w:num>
   <w:num w:numId="11">
-    <w:abstractNumId w:val="22"/>
+    <w:abstractNumId w:val="23"/>
   </w:num>
   <w:num w:numId="12">
-    <w:abstractNumId w:val="18"/>
+    <w:abstractNumId w:val="19"/>
   </w:num>
   <w:num w:numId="13">
     <w:abstractNumId w:val="0"/>
   </w:num>
   <w:num w:numId="14">
-    <w:abstractNumId w:val="8"/>
+    <w:abstractNumId w:val="9"/>
   </w:num>
   <w:num w:numId="15">
+    <w:abstractNumId w:val="17"/>
+  </w:num>
+  <w:num w:numId="16">
+    <w:abstractNumId w:val="20"/>
+  </w:num>
+  <w:num w:numId="17">
     <w:abstractNumId w:val="16"/>
   </w:num>
-  <w:num w:numId="16">
-    <w:abstractNumId w:val="19"/>
-  </w:num>
-  <w:num w:numId="17">
-    <w:abstractNumId w:val="15"/>
-  </w:num>
   <w:num w:numId="18">
-    <w:abstractNumId w:val="10"/>
+    <w:abstractNumId w:val="11"/>
   </w:num>
   <w:num w:numId="19">
-    <w:abstractNumId w:val="20"/>
+    <w:abstractNumId w:val="21"/>
   </w:num>
   <w:num w:numId="20">
     <w:abstractNumId w:val="5"/>
@@ -23755,7 +25432,10 @@
     <w:abstractNumId w:val="3"/>
   </w:num>
   <w:num w:numId="23">
-    <w:abstractNumId w:val="7"/>
+    <w:abstractNumId w:val="8"/>
+  </w:num>
+  <w:num w:numId="24">
+    <w:abstractNumId w:val="6"/>
   </w:num>
   <w:numIdMacAtCleanup w:val="22"/>
 </w:numbering>
@@ -24513,6 +26193,18 @@
       <w:szCs w:val="20"/>
     </w:rPr>
   </w:style>
+  <w:style w:type="character" w:styleId="aa">
+    <w:name w:val="FollowedHyperlink"/>
+    <w:basedOn w:val="a0"/>
+    <w:uiPriority w:val="99"/>
+    <w:semiHidden/>
+    <w:unhideWhenUsed/>
+    <w:rsid w:val="001237ED"/>
+    <w:rPr>
+      <w:color w:val="954F72" w:themeColor="followedHyperlink"/>
+      <w:u w:val="single"/>
+    </w:rPr>
+  </w:style>
 </w:styles>
 </file>
 
@@ -24816,7 +26508,7 @@
 </file>
 
 <file path=customXml/itemProps1.xml><?xml version="1.0" encoding="utf-8"?>
-<ds:datastoreItem xmlns:ds="http://schemas.openxmlformats.org/officeDocument/2006/customXml" ds:itemID="{E61FBDD6-33E4-4712-A7FD-B0D9424F5DD1}">
+<ds:datastoreItem xmlns:ds="http://schemas.openxmlformats.org/officeDocument/2006/customXml" ds:itemID="{FB719F64-1F11-4552-AF35-E52B6CD37C6B}">
   <ds:schemaRefs>
     <ds:schemaRef ds:uri="http://schemas.openxmlformats.org/officeDocument/2006/bibliography"/>
   </ds:schemaRefs>

</xml_diff>

<commit_message>
Add: diagramm clases for layer domain and add documents 04 and 05
</commit_message>
<xml_diff>
--- a/Documentation/Основной документ.docx
+++ b/Documentation/Основной документ.docx
@@ -699,7 +699,7 @@
           <w:lang w:eastAsia="ru-RU"/>
         </w:rPr>
       </w:pPr>
-      <w:bookmarkStart w:id="0" w:name="_Toc243599213"/>
+      <w:bookmarkStart w:id="0" w:name="_Toc244274810"/>
       <w:r>
         <w:rPr>
           <w:rFonts w:eastAsia="Times New Roman"/>
@@ -740,7 +740,7 @@
         </w:rPr>
         <w:fldChar w:fldCharType="separate"/>
       </w:r>
-      <w:hyperlink w:anchor="_Toc243599213" w:history="1">
+      <w:hyperlink w:anchor="_Toc244274810" w:history="1">
         <w:r>
           <w:rPr>
             <w:rStyle w:val="a6"/>
@@ -769,7 +769,7 @@
             <w:noProof/>
             <w:webHidden/>
           </w:rPr>
-          <w:instrText xml:space="preserve"> PAGEREF _Toc243599213 \h </w:instrText>
+          <w:instrText xml:space="preserve"> PAGEREF _Toc244274810 \h </w:instrText>
         </w:r>
         <w:r>
           <w:rPr>
@@ -813,7 +813,7 @@
           <w:lang w:eastAsia="ru-RU"/>
         </w:rPr>
       </w:pPr>
-      <w:hyperlink w:anchor="_Toc243599214" w:history="1">
+      <w:hyperlink w:anchor="_Toc244274811" w:history="1">
         <w:r>
           <w:rPr>
             <w:rStyle w:val="a6"/>
@@ -857,7 +857,7 @@
             <w:noProof/>
             <w:webHidden/>
           </w:rPr>
-          <w:instrText xml:space="preserve"> PAGEREF _Toc243599214 \h </w:instrText>
+          <w:instrText xml:space="preserve"> PAGEREF _Toc244274811 \h </w:instrText>
         </w:r>
         <w:r>
           <w:rPr>
@@ -901,7 +901,7 @@
           <w:lang w:eastAsia="ru-RU"/>
         </w:rPr>
       </w:pPr>
-      <w:hyperlink w:anchor="_Toc243599215" w:history="1">
+      <w:hyperlink w:anchor="_Toc244274812" w:history="1">
         <w:r>
           <w:rPr>
             <w:rStyle w:val="a6"/>
@@ -947,7 +947,7 @@
             <w:noProof/>
             <w:webHidden/>
           </w:rPr>
-          <w:instrText xml:space="preserve"> PAGEREF _Toc243599215 \h </w:instrText>
+          <w:instrText xml:space="preserve"> PAGEREF _Toc244274812 \h </w:instrText>
         </w:r>
         <w:r>
           <w:rPr>
@@ -991,7 +991,7 @@
           <w:lang w:eastAsia="ru-RU"/>
         </w:rPr>
       </w:pPr>
-      <w:hyperlink w:anchor="_Toc243599216" w:history="1">
+      <w:hyperlink w:anchor="_Toc244274813" w:history="1">
         <w:r>
           <w:rPr>
             <w:rStyle w:val="a6"/>
@@ -1035,7 +1035,7 @@
             <w:noProof/>
             <w:webHidden/>
           </w:rPr>
-          <w:instrText xml:space="preserve"> PAGEREF _Toc243599216 \h </w:instrText>
+          <w:instrText xml:space="preserve"> PAGEREF _Toc244274813 \h </w:instrText>
         </w:r>
         <w:r>
           <w:rPr>
@@ -1079,7 +1079,7 @@
           <w:lang w:eastAsia="ru-RU"/>
         </w:rPr>
       </w:pPr>
-      <w:hyperlink w:anchor="_Toc243599217" w:history="1">
+      <w:hyperlink w:anchor="_Toc244274814" w:history="1">
         <w:r>
           <w:rPr>
             <w:rStyle w:val="a6"/>
@@ -1124,7 +1124,7 @@
             <w:noProof/>
             <w:webHidden/>
           </w:rPr>
-          <w:instrText xml:space="preserve"> PAGEREF _Toc243599217 \h </w:instrText>
+          <w:instrText xml:space="preserve"> PAGEREF _Toc244274814 \h </w:instrText>
         </w:r>
         <w:r>
           <w:rPr>
@@ -1168,7 +1168,7 @@
           <w:lang w:eastAsia="ru-RU"/>
         </w:rPr>
       </w:pPr>
-      <w:hyperlink w:anchor="_Toc243599218" w:history="1">
+      <w:hyperlink w:anchor="_Toc244274815" w:history="1">
         <w:r>
           <w:rPr>
             <w:rStyle w:val="a6"/>
@@ -1212,7 +1212,7 @@
             <w:noProof/>
             <w:webHidden/>
           </w:rPr>
-          <w:instrText xml:space="preserve"> PAGEREF _Toc243599218 \h </w:instrText>
+          <w:instrText xml:space="preserve"> PAGEREF _Toc244274815 \h </w:instrText>
         </w:r>
         <w:r>
           <w:rPr>
@@ -1256,7 +1256,7 @@
           <w:lang w:eastAsia="ru-RU"/>
         </w:rPr>
       </w:pPr>
-      <w:hyperlink w:anchor="_Toc243599219" w:history="1">
+      <w:hyperlink w:anchor="_Toc244274816" w:history="1">
         <w:r>
           <w:rPr>
             <w:rStyle w:val="a6"/>
@@ -1300,7 +1300,7 @@
             <w:noProof/>
             <w:webHidden/>
           </w:rPr>
-          <w:instrText xml:space="preserve"> PAGEREF _Toc243599219 \h </w:instrText>
+          <w:instrText xml:space="preserve"> PAGEREF _Toc244274816 \h </w:instrText>
         </w:r>
         <w:r>
           <w:rPr>
@@ -1344,7 +1344,7 @@
           <w:lang w:eastAsia="ru-RU"/>
         </w:rPr>
       </w:pPr>
-      <w:hyperlink w:anchor="_Toc243599220" w:history="1">
+      <w:hyperlink w:anchor="_Toc244274817" w:history="1">
         <w:r>
           <w:rPr>
             <w:rStyle w:val="a6"/>
@@ -1388,7 +1388,7 @@
             <w:noProof/>
             <w:webHidden/>
           </w:rPr>
-          <w:instrText xml:space="preserve"> PAGEREF _Toc243599220 \h </w:instrText>
+          <w:instrText xml:space="preserve"> PAGEREF _Toc244274817 \h </w:instrText>
         </w:r>
         <w:r>
           <w:rPr>
@@ -1432,7 +1432,7 @@
           <w:lang w:eastAsia="ru-RU"/>
         </w:rPr>
       </w:pPr>
-      <w:hyperlink w:anchor="_Toc243599221" w:history="1">
+      <w:hyperlink w:anchor="_Toc244274818" w:history="1">
         <w:r>
           <w:rPr>
             <w:rStyle w:val="a6"/>
@@ -1476,7 +1476,7 @@
             <w:noProof/>
             <w:webHidden/>
           </w:rPr>
-          <w:instrText xml:space="preserve"> PAGEREF _Toc243599221 \h </w:instrText>
+          <w:instrText xml:space="preserve"> PAGEREF _Toc244274818 \h </w:instrText>
         </w:r>
         <w:r>
           <w:rPr>
@@ -1520,7 +1520,7 @@
           <w:lang w:eastAsia="ru-RU"/>
         </w:rPr>
       </w:pPr>
-      <w:hyperlink w:anchor="_Toc243599222" w:history="1">
+      <w:hyperlink w:anchor="_Toc244274819" w:history="1">
         <w:r>
           <w:rPr>
             <w:rStyle w:val="a6"/>
@@ -1596,7 +1596,7 @@
             <w:noProof/>
             <w:webHidden/>
           </w:rPr>
-          <w:instrText xml:space="preserve"> PAGEREF _Toc243599222 \h </w:instrText>
+          <w:instrText xml:space="preserve"> PAGEREF _Toc244274819 \h </w:instrText>
         </w:r>
         <w:r>
           <w:rPr>
@@ -1640,7 +1640,7 @@
           <w:lang w:eastAsia="ru-RU"/>
         </w:rPr>
       </w:pPr>
-      <w:hyperlink w:anchor="_Toc243599223" w:history="1">
+      <w:hyperlink w:anchor="_Toc244274820" w:history="1">
         <w:r>
           <w:rPr>
             <w:rStyle w:val="a6"/>
@@ -1684,7 +1684,7 @@
             <w:noProof/>
             <w:webHidden/>
           </w:rPr>
-          <w:instrText xml:space="preserve"> PAGEREF _Toc243599223 \h </w:instrText>
+          <w:instrText xml:space="preserve"> PAGEREF _Toc244274820 \h </w:instrText>
         </w:r>
         <w:r>
           <w:rPr>
@@ -1728,7 +1728,7 @@
           <w:lang w:eastAsia="ru-RU"/>
         </w:rPr>
       </w:pPr>
-      <w:hyperlink w:anchor="_Toc243599224" w:history="1">
+      <w:hyperlink w:anchor="_Toc244274821" w:history="1">
         <w:r>
           <w:rPr>
             <w:rStyle w:val="a6"/>
@@ -1772,7 +1772,7 @@
             <w:noProof/>
             <w:webHidden/>
           </w:rPr>
-          <w:instrText xml:space="preserve"> PAGEREF _Toc243599224 \h </w:instrText>
+          <w:instrText xml:space="preserve"> PAGEREF _Toc244274821 \h </w:instrText>
         </w:r>
         <w:r>
           <w:rPr>
@@ -1816,7 +1816,7 @@
           <w:lang w:eastAsia="ru-RU"/>
         </w:rPr>
       </w:pPr>
-      <w:hyperlink w:anchor="_Toc243599225" w:history="1">
+      <w:hyperlink w:anchor="_Toc244274822" w:history="1">
         <w:r>
           <w:rPr>
             <w:rStyle w:val="a6"/>
@@ -1860,7 +1860,7 @@
             <w:noProof/>
             <w:webHidden/>
           </w:rPr>
-          <w:instrText xml:space="preserve"> PAGEREF _Toc243599225 \h </w:instrText>
+          <w:instrText xml:space="preserve"> PAGEREF _Toc244274822 \h </w:instrText>
         </w:r>
         <w:r>
           <w:rPr>
@@ -1904,7 +1904,7 @@
           <w:lang w:eastAsia="ru-RU"/>
         </w:rPr>
       </w:pPr>
-      <w:hyperlink w:anchor="_Toc243599226" w:history="1">
+      <w:hyperlink w:anchor="_Toc244274823" w:history="1">
         <w:r>
           <w:rPr>
             <w:rStyle w:val="a6"/>
@@ -1956,7 +1956,7 @@
             <w:noProof/>
             <w:webHidden/>
           </w:rPr>
-          <w:instrText xml:space="preserve"> PAGEREF _Toc243599226 \h </w:instrText>
+          <w:instrText xml:space="preserve"> PAGEREF _Toc244274823 \h </w:instrText>
         </w:r>
         <w:r>
           <w:rPr>
@@ -2000,7 +2000,7 @@
           <w:lang w:eastAsia="ru-RU"/>
         </w:rPr>
       </w:pPr>
-      <w:hyperlink w:anchor="_Toc243599227" w:history="1">
+      <w:hyperlink w:anchor="_Toc244274824" w:history="1">
         <w:r>
           <w:rPr>
             <w:rStyle w:val="a6"/>
@@ -2044,7 +2044,7 @@
             <w:noProof/>
             <w:webHidden/>
           </w:rPr>
-          <w:instrText xml:space="preserve"> PAGEREF _Toc243599227 \h </w:instrText>
+          <w:instrText xml:space="preserve"> PAGEREF _Toc244274824 \h </w:instrText>
         </w:r>
         <w:r>
           <w:rPr>
@@ -2088,7 +2088,7 @@
           <w:lang w:eastAsia="ru-RU"/>
         </w:rPr>
       </w:pPr>
-      <w:hyperlink w:anchor="_Toc243599228" w:history="1">
+      <w:hyperlink w:anchor="_Toc244274825" w:history="1">
         <w:r>
           <w:rPr>
             <w:rStyle w:val="a6"/>
@@ -2130,7 +2130,7 @@
             <w:noProof/>
             <w:webHidden/>
           </w:rPr>
-          <w:instrText xml:space="preserve"> PAGEREF _Toc243599228 \h </w:instrText>
+          <w:instrText xml:space="preserve"> PAGEREF _Toc244274825 \h </w:instrText>
         </w:r>
         <w:r>
           <w:rPr>
@@ -2174,7 +2174,7 @@
           <w:lang w:eastAsia="ru-RU"/>
         </w:rPr>
       </w:pPr>
-      <w:hyperlink w:anchor="_Toc243599229" w:history="1">
+      <w:hyperlink w:anchor="_Toc244274826" w:history="1">
         <w:r>
           <w:rPr>
             <w:rStyle w:val="a6"/>
@@ -2218,7 +2218,7 @@
             <w:noProof/>
             <w:webHidden/>
           </w:rPr>
-          <w:instrText xml:space="preserve"> PAGEREF _Toc243599229 \h </w:instrText>
+          <w:instrText xml:space="preserve"> PAGEREF _Toc244274826 \h </w:instrText>
         </w:r>
         <w:r>
           <w:rPr>
@@ -2262,7 +2262,7 @@
           <w:lang w:eastAsia="ru-RU"/>
         </w:rPr>
       </w:pPr>
-      <w:hyperlink w:anchor="_Toc243599230" w:history="1">
+      <w:hyperlink w:anchor="_Toc244274827" w:history="1">
         <w:r>
           <w:rPr>
             <w:rStyle w:val="a6"/>
@@ -2306,7 +2306,7 @@
             <w:noProof/>
             <w:webHidden/>
           </w:rPr>
-          <w:instrText xml:space="preserve"> PAGEREF _Toc243599230 \h </w:instrText>
+          <w:instrText xml:space="preserve"> PAGEREF _Toc244274827 \h </w:instrText>
         </w:r>
         <w:r>
           <w:rPr>
@@ -2350,7 +2350,7 @@
           <w:lang w:eastAsia="ru-RU"/>
         </w:rPr>
       </w:pPr>
-      <w:hyperlink w:anchor="_Toc243599231" w:history="1">
+      <w:hyperlink w:anchor="_Toc244274828" w:history="1">
         <w:r>
           <w:rPr>
             <w:rStyle w:val="a6"/>
@@ -2394,7 +2394,7 @@
             <w:noProof/>
             <w:webHidden/>
           </w:rPr>
-          <w:instrText xml:space="preserve"> PAGEREF _Toc243599231 \h </w:instrText>
+          <w:instrText xml:space="preserve"> PAGEREF _Toc244274828 \h </w:instrText>
         </w:r>
         <w:r>
           <w:rPr>
@@ -2438,7 +2438,7 @@
           <w:lang w:eastAsia="ru-RU"/>
         </w:rPr>
       </w:pPr>
-      <w:hyperlink w:anchor="_Toc243599232" w:history="1">
+      <w:hyperlink w:anchor="_Toc244274829" w:history="1">
         <w:r>
           <w:rPr>
             <w:rStyle w:val="a6"/>
@@ -2482,7 +2482,7 @@
             <w:noProof/>
             <w:webHidden/>
           </w:rPr>
-          <w:instrText xml:space="preserve"> PAGEREF _Toc243599232 \h </w:instrText>
+          <w:instrText xml:space="preserve"> PAGEREF _Toc244274829 \h </w:instrText>
         </w:r>
         <w:r>
           <w:rPr>
@@ -2526,7 +2526,7 @@
           <w:lang w:eastAsia="ru-RU"/>
         </w:rPr>
       </w:pPr>
-      <w:hyperlink w:anchor="_Toc243599233" w:history="1">
+      <w:hyperlink w:anchor="_Toc244274830" w:history="1">
         <w:r>
           <w:rPr>
             <w:rStyle w:val="a6"/>
@@ -2570,7 +2570,7 @@
             <w:noProof/>
             <w:webHidden/>
           </w:rPr>
-          <w:instrText xml:space="preserve"> PAGEREF _Toc243599233 \h </w:instrText>
+          <w:instrText xml:space="preserve"> PAGEREF _Toc244274830 \h </w:instrText>
         </w:r>
         <w:r>
           <w:rPr>
@@ -2614,7 +2614,7 @@
           <w:lang w:eastAsia="ru-RU"/>
         </w:rPr>
       </w:pPr>
-      <w:hyperlink w:anchor="_Toc243599234" w:history="1">
+      <w:hyperlink w:anchor="_Toc244274831" w:history="1">
         <w:r>
           <w:rPr>
             <w:rStyle w:val="a6"/>
@@ -2645,7 +2645,23 @@
             <w:noProof/>
             <w:lang w:val="en-US" w:eastAsia="ru-RU"/>
           </w:rPr>
-          <w:t>domain</w:t>
+          <w:t>dom</w:t>
+        </w:r>
+        <w:r>
+          <w:rPr>
+            <w:rStyle w:val="a6"/>
+            <w:noProof/>
+            <w:lang w:val="en-US" w:eastAsia="ru-RU"/>
+          </w:rPr>
+          <w:t>a</w:t>
+        </w:r>
+        <w:r>
+          <w:rPr>
+            <w:rStyle w:val="a6"/>
+            <w:noProof/>
+            <w:lang w:val="en-US" w:eastAsia="ru-RU"/>
+          </w:rPr>
+          <w:t>in</w:t>
         </w:r>
         <w:r>
           <w:rPr>
@@ -2666,7 +2682,7 @@
             <w:noProof/>
             <w:webHidden/>
           </w:rPr>
-          <w:instrText xml:space="preserve"> PAGEREF _Toc243599234 \h </w:instrText>
+          <w:instrText xml:space="preserve"> PAGEREF _Toc244274831 \h </w:instrText>
         </w:r>
         <w:r>
           <w:rPr>
@@ -2710,7 +2726,7 @@
           <w:lang w:eastAsia="ru-RU"/>
         </w:rPr>
       </w:pPr>
-      <w:hyperlink w:anchor="_Toc243599235" w:history="1">
+      <w:hyperlink w:anchor="_Toc244274832" w:history="1">
         <w:r>
           <w:rPr>
             <w:rStyle w:val="a6"/>
@@ -2786,7 +2802,7 @@
             <w:noProof/>
             <w:webHidden/>
           </w:rPr>
-          <w:instrText xml:space="preserve"> PAGEREF _Toc243599235 \h </w:instrText>
+          <w:instrText xml:space="preserve"> PAGEREF _Toc244274832 \h </w:instrText>
         </w:r>
         <w:r>
           <w:rPr>
@@ -2830,7 +2846,7 @@
           <w:lang w:eastAsia="ru-RU"/>
         </w:rPr>
       </w:pPr>
-      <w:hyperlink w:anchor="_Toc243599236" w:history="1">
+      <w:hyperlink w:anchor="_Toc244274833" w:history="1">
         <w:r>
           <w:rPr>
             <w:rStyle w:val="a6"/>
@@ -2882,7 +2898,7 @@
             <w:noProof/>
             <w:webHidden/>
           </w:rPr>
-          <w:instrText xml:space="preserve"> PAGEREF _Toc243599236 \h </w:instrText>
+          <w:instrText xml:space="preserve"> PAGEREF _Toc244274833 \h </w:instrText>
         </w:r>
         <w:r>
           <w:rPr>
@@ -2902,7 +2918,7 @@
             <w:noProof/>
             <w:webHidden/>
           </w:rPr>
-          <w:t>23</w:t>
+          <w:t>24</w:t>
         </w:r>
         <w:r>
           <w:rPr>
@@ -2926,7 +2942,7 @@
           <w:lang w:eastAsia="ru-RU"/>
         </w:rPr>
       </w:pPr>
-      <w:hyperlink w:anchor="_Toc243599237" w:history="1">
+      <w:hyperlink w:anchor="_Toc244274834" w:history="1">
         <w:r>
           <w:rPr>
             <w:rStyle w:val="a6"/>
@@ -2949,7 +2965,7 @@
             <w:noProof/>
             <w:lang w:eastAsia="ru-RU"/>
           </w:rPr>
-          <w:t>Решение по многомодульности</w:t>
+          <w:t>Решение по много модульности</w:t>
         </w:r>
         <w:r>
           <w:rPr>
@@ -2970,7 +2986,7 @@
             <w:noProof/>
             <w:webHidden/>
           </w:rPr>
-          <w:instrText xml:space="preserve"> PAGEREF _Toc243599237 \h </w:instrText>
+          <w:instrText xml:space="preserve"> PAGEREF _Toc244274834 \h </w:instrText>
         </w:r>
         <w:r>
           <w:rPr>
@@ -2990,7 +3006,447 @@
             <w:noProof/>
             <w:webHidden/>
           </w:rPr>
-          <w:t>24</w:t>
+          <w:t>26</w:t>
+        </w:r>
+        <w:r>
+          <w:rPr>
+            <w:noProof/>
+            <w:webHidden/>
+          </w:rPr>
+          <w:fldChar w:fldCharType="end"/>
+        </w:r>
+      </w:hyperlink>
+    </w:p>
+    <w:p>
+      <w:pPr>
+        <w:pStyle w:val="21"/>
+        <w:tabs>
+          <w:tab w:val="left" w:pos="880"/>
+          <w:tab w:val="right" w:leader="dot" w:pos="9345"/>
+        </w:tabs>
+        <w:rPr>
+          <w:rFonts w:eastAsiaTheme="minorEastAsia"/>
+          <w:noProof/>
+          <w:lang w:eastAsia="ru-RU"/>
+        </w:rPr>
+      </w:pPr>
+      <w:hyperlink w:anchor="_Toc244274835" w:history="1">
+        <w:r>
+          <w:rPr>
+            <w:rStyle w:val="a6"/>
+            <w:noProof/>
+            <w:lang w:eastAsia="ru-RU"/>
+          </w:rPr>
+          <w:t>1.5.</w:t>
+        </w:r>
+        <w:r>
+          <w:rPr>
+            <w:rFonts w:eastAsiaTheme="minorEastAsia"/>
+            <w:noProof/>
+            <w:lang w:eastAsia="ru-RU"/>
+          </w:rPr>
+          <w:tab/>
+        </w:r>
+        <w:r>
+          <w:rPr>
+            <w:rStyle w:val="a6"/>
+            <w:noProof/>
+            <w:lang w:eastAsia="ru-RU"/>
+          </w:rPr>
+          <w:t>Проектирование дизайна системы.</w:t>
+        </w:r>
+        <w:r>
+          <w:rPr>
+            <w:noProof/>
+            <w:webHidden/>
+          </w:rPr>
+          <w:tab/>
+        </w:r>
+        <w:r>
+          <w:rPr>
+            <w:noProof/>
+            <w:webHidden/>
+          </w:rPr>
+          <w:fldChar w:fldCharType="begin"/>
+        </w:r>
+        <w:r>
+          <w:rPr>
+            <w:noProof/>
+            <w:webHidden/>
+          </w:rPr>
+          <w:instrText xml:space="preserve"> PAGEREF _Toc244274835 \h </w:instrText>
+        </w:r>
+        <w:r>
+          <w:rPr>
+            <w:noProof/>
+            <w:webHidden/>
+          </w:rPr>
+        </w:r>
+        <w:r>
+          <w:rPr>
+            <w:noProof/>
+            <w:webHidden/>
+          </w:rPr>
+          <w:fldChar w:fldCharType="separate"/>
+        </w:r>
+        <w:r>
+          <w:rPr>
+            <w:noProof/>
+            <w:webHidden/>
+          </w:rPr>
+          <w:t>27</w:t>
+        </w:r>
+        <w:r>
+          <w:rPr>
+            <w:noProof/>
+            <w:webHidden/>
+          </w:rPr>
+          <w:fldChar w:fldCharType="end"/>
+        </w:r>
+      </w:hyperlink>
+    </w:p>
+    <w:p>
+      <w:pPr>
+        <w:pStyle w:val="31"/>
+        <w:tabs>
+          <w:tab w:val="left" w:pos="1320"/>
+          <w:tab w:val="right" w:leader="dot" w:pos="9345"/>
+        </w:tabs>
+        <w:rPr>
+          <w:rFonts w:eastAsiaTheme="minorEastAsia"/>
+          <w:noProof/>
+          <w:lang w:eastAsia="ru-RU"/>
+        </w:rPr>
+      </w:pPr>
+      <w:hyperlink w:anchor="_Toc244274836" w:history="1">
+        <w:r>
+          <w:rPr>
+            <w:rStyle w:val="a6"/>
+            <w:noProof/>
+            <w:lang w:eastAsia="ru-RU"/>
+          </w:rPr>
+          <w:t>1.5.1.</w:t>
+        </w:r>
+        <w:r>
+          <w:rPr>
+            <w:rFonts w:eastAsiaTheme="minorEastAsia"/>
+            <w:noProof/>
+            <w:lang w:eastAsia="ru-RU"/>
+          </w:rPr>
+          <w:tab/>
+        </w:r>
+        <w:r>
+          <w:rPr>
+            <w:rStyle w:val="a6"/>
+            <w:noProof/>
+            <w:lang w:eastAsia="ru-RU"/>
+          </w:rPr>
+          <w:t>Составление цветовой палитры.</w:t>
+        </w:r>
+        <w:r>
+          <w:rPr>
+            <w:noProof/>
+            <w:webHidden/>
+          </w:rPr>
+          <w:tab/>
+        </w:r>
+        <w:r>
+          <w:rPr>
+            <w:noProof/>
+            <w:webHidden/>
+          </w:rPr>
+          <w:fldChar w:fldCharType="begin"/>
+        </w:r>
+        <w:r>
+          <w:rPr>
+            <w:noProof/>
+            <w:webHidden/>
+          </w:rPr>
+          <w:instrText xml:space="preserve"> PAGEREF _Toc244274836 \h </w:instrText>
+        </w:r>
+        <w:r>
+          <w:rPr>
+            <w:noProof/>
+            <w:webHidden/>
+          </w:rPr>
+        </w:r>
+        <w:r>
+          <w:rPr>
+            <w:noProof/>
+            <w:webHidden/>
+          </w:rPr>
+          <w:fldChar w:fldCharType="separate"/>
+        </w:r>
+        <w:r>
+          <w:rPr>
+            <w:noProof/>
+            <w:webHidden/>
+          </w:rPr>
+          <w:t>27</w:t>
+        </w:r>
+        <w:r>
+          <w:rPr>
+            <w:noProof/>
+            <w:webHidden/>
+          </w:rPr>
+          <w:fldChar w:fldCharType="end"/>
+        </w:r>
+      </w:hyperlink>
+    </w:p>
+    <w:p>
+      <w:pPr>
+        <w:pStyle w:val="31"/>
+        <w:tabs>
+          <w:tab w:val="left" w:pos="1320"/>
+          <w:tab w:val="right" w:leader="dot" w:pos="9345"/>
+        </w:tabs>
+        <w:rPr>
+          <w:rFonts w:eastAsiaTheme="minorEastAsia"/>
+          <w:noProof/>
+          <w:lang w:eastAsia="ru-RU"/>
+        </w:rPr>
+      </w:pPr>
+      <w:hyperlink w:anchor="_Toc244274837" w:history="1">
+        <w:r>
+          <w:rPr>
+            <w:rStyle w:val="a6"/>
+            <w:noProof/>
+            <w:lang w:eastAsia="ru-RU"/>
+          </w:rPr>
+          <w:t>1.5.2.</w:t>
+        </w:r>
+        <w:r>
+          <w:rPr>
+            <w:rFonts w:eastAsiaTheme="minorEastAsia"/>
+            <w:noProof/>
+            <w:lang w:eastAsia="ru-RU"/>
+          </w:rPr>
+          <w:tab/>
+        </w:r>
+        <w:r>
+          <w:rPr>
+            <w:rStyle w:val="a6"/>
+            <w:noProof/>
+            <w:lang w:eastAsia="ru-RU"/>
+          </w:rPr>
+          <w:t>Выбор шрифтов, размеров и величины отступов.</w:t>
+        </w:r>
+        <w:r>
+          <w:rPr>
+            <w:noProof/>
+            <w:webHidden/>
+          </w:rPr>
+          <w:tab/>
+        </w:r>
+        <w:r>
+          <w:rPr>
+            <w:noProof/>
+            <w:webHidden/>
+          </w:rPr>
+          <w:fldChar w:fldCharType="begin"/>
+        </w:r>
+        <w:r>
+          <w:rPr>
+            <w:noProof/>
+            <w:webHidden/>
+          </w:rPr>
+          <w:instrText xml:space="preserve"> PAGEREF _Toc244274837 \h </w:instrText>
+        </w:r>
+        <w:r>
+          <w:rPr>
+            <w:noProof/>
+            <w:webHidden/>
+          </w:rPr>
+        </w:r>
+        <w:r>
+          <w:rPr>
+            <w:noProof/>
+            <w:webHidden/>
+          </w:rPr>
+          <w:fldChar w:fldCharType="separate"/>
+        </w:r>
+        <w:r>
+          <w:rPr>
+            <w:noProof/>
+            <w:webHidden/>
+          </w:rPr>
+          <w:t>28</w:t>
+        </w:r>
+        <w:r>
+          <w:rPr>
+            <w:noProof/>
+            <w:webHidden/>
+          </w:rPr>
+          <w:fldChar w:fldCharType="end"/>
+        </w:r>
+      </w:hyperlink>
+    </w:p>
+    <w:p>
+      <w:pPr>
+        <w:pStyle w:val="31"/>
+        <w:tabs>
+          <w:tab w:val="left" w:pos="1320"/>
+          <w:tab w:val="right" w:leader="dot" w:pos="9345"/>
+        </w:tabs>
+        <w:rPr>
+          <w:rFonts w:eastAsiaTheme="minorEastAsia"/>
+          <w:noProof/>
+          <w:lang w:eastAsia="ru-RU"/>
+        </w:rPr>
+      </w:pPr>
+      <w:hyperlink w:anchor="_Toc244274838" w:history="1">
+        <w:r>
+          <w:rPr>
+            <w:rStyle w:val="a6"/>
+            <w:noProof/>
+            <w:lang w:eastAsia="ru-RU"/>
+          </w:rPr>
+          <w:t>1.5.3.</w:t>
+        </w:r>
+        <w:r>
+          <w:rPr>
+            <w:rFonts w:eastAsiaTheme="minorEastAsia"/>
+            <w:noProof/>
+            <w:lang w:eastAsia="ru-RU"/>
+          </w:rPr>
+          <w:tab/>
+        </w:r>
+        <w:r>
+          <w:rPr>
+            <w:rStyle w:val="a6"/>
+            <w:noProof/>
+            <w:lang w:eastAsia="ru-RU"/>
+          </w:rPr>
+          <w:t>Библиотека компонентов</w:t>
+        </w:r>
+        <w:r>
+          <w:rPr>
+            <w:noProof/>
+            <w:webHidden/>
+          </w:rPr>
+          <w:tab/>
+        </w:r>
+        <w:r>
+          <w:rPr>
+            <w:noProof/>
+            <w:webHidden/>
+          </w:rPr>
+          <w:fldChar w:fldCharType="begin"/>
+        </w:r>
+        <w:r>
+          <w:rPr>
+            <w:noProof/>
+            <w:webHidden/>
+          </w:rPr>
+          <w:instrText xml:space="preserve"> PAGEREF _Toc244274838 \h </w:instrText>
+        </w:r>
+        <w:r>
+          <w:rPr>
+            <w:noProof/>
+            <w:webHidden/>
+          </w:rPr>
+        </w:r>
+        <w:r>
+          <w:rPr>
+            <w:noProof/>
+            <w:webHidden/>
+          </w:rPr>
+          <w:fldChar w:fldCharType="separate"/>
+        </w:r>
+        <w:r>
+          <w:rPr>
+            <w:noProof/>
+            <w:webHidden/>
+          </w:rPr>
+          <w:t>30</w:t>
+        </w:r>
+        <w:r>
+          <w:rPr>
+            <w:noProof/>
+            <w:webHidden/>
+          </w:rPr>
+          <w:fldChar w:fldCharType="end"/>
+        </w:r>
+      </w:hyperlink>
+    </w:p>
+    <w:p>
+      <w:pPr>
+        <w:pStyle w:val="31"/>
+        <w:tabs>
+          <w:tab w:val="left" w:pos="1320"/>
+          <w:tab w:val="right" w:leader="dot" w:pos="9345"/>
+        </w:tabs>
+        <w:rPr>
+          <w:rFonts w:eastAsiaTheme="minorEastAsia"/>
+          <w:noProof/>
+          <w:lang w:eastAsia="ru-RU"/>
+        </w:rPr>
+      </w:pPr>
+      <w:hyperlink w:anchor="_Toc244274839" w:history="1">
+        <w:r>
+          <w:rPr>
+            <w:rStyle w:val="a6"/>
+            <w:noProof/>
+            <w:lang w:eastAsia="ru-RU"/>
+          </w:rPr>
+          <w:t>1.5.4.</w:t>
+        </w:r>
+        <w:r>
+          <w:rPr>
+            <w:rFonts w:eastAsiaTheme="minorEastAsia"/>
+            <w:noProof/>
+            <w:lang w:eastAsia="ru-RU"/>
+          </w:rPr>
+          <w:tab/>
+        </w:r>
+        <w:r>
+          <w:rPr>
+            <w:rStyle w:val="a6"/>
+            <w:noProof/>
+            <w:lang w:eastAsia="ru-RU"/>
+          </w:rPr>
+          <w:t>Проверка контрастности по WCAG AA</w:t>
+        </w:r>
+        <w:r>
+          <w:rPr>
+            <w:noProof/>
+            <w:webHidden/>
+          </w:rPr>
+          <w:tab/>
+        </w:r>
+        <w:r>
+          <w:rPr>
+            <w:noProof/>
+            <w:webHidden/>
+          </w:rPr>
+          <w:fldChar w:fldCharType="begin"/>
+        </w:r>
+        <w:r>
+          <w:rPr>
+            <w:noProof/>
+            <w:webHidden/>
+          </w:rPr>
+          <w:instrText xml:space="preserve"> PAGEREF _Toc244274839 \h </w:instrText>
+        </w:r>
+        <w:r>
+          <w:rPr>
+            <w:noProof/>
+            <w:webHidden/>
+          </w:rPr>
+        </w:r>
+        <w:r>
+          <w:rPr>
+            <w:noProof/>
+            <w:webHidden/>
+          </w:rPr>
+          <w:fldChar w:fldCharType="separate"/>
+        </w:r>
+        <w:r>
+          <w:rPr>
+            <w:noProof/>
+            <w:webHidden/>
+          </w:rPr>
+          <w:t>30</w:t>
         </w:r>
         <w:r>
           <w:rPr>
@@ -3050,7 +3506,7 @@
           <w:lang w:eastAsia="ru-RU"/>
         </w:rPr>
       </w:pPr>
-      <w:bookmarkStart w:id="1" w:name="_Toc243599214"/>
+      <w:bookmarkStart w:id="1" w:name="_Toc244274811"/>
       <w:r>
         <w:rPr>
           <w:lang w:eastAsia="ru-RU"/>
@@ -3072,7 +3528,7 @@
           <w:lang w:eastAsia="ru-RU"/>
         </w:rPr>
       </w:pPr>
-      <w:bookmarkStart w:id="2" w:name="_Toc243599215"/>
+      <w:bookmarkStart w:id="2" w:name="_Toc244274812"/>
       <w:r>
         <w:rPr>
           <w:rFonts w:eastAsia="Times New Roman"/>
@@ -3094,7 +3550,7 @@
           <w:lang w:eastAsia="ru-RU"/>
         </w:rPr>
       </w:pPr>
-      <w:bookmarkStart w:id="3" w:name="_Toc243599216"/>
+      <w:bookmarkStart w:id="3" w:name="_Toc244274813"/>
       <w:r>
         <w:rPr>
           <w:lang w:eastAsia="ru-RU"/>
@@ -3164,7 +3620,7 @@
           <w:lang w:eastAsia="ru-RU"/>
         </w:rPr>
       </w:pPr>
-      <w:bookmarkStart w:id="4" w:name="_Toc243599217"/>
+      <w:bookmarkStart w:id="4" w:name="_Toc244274814"/>
       <w:r>
         <w:rPr>
           <w:lang w:eastAsia="ru-RU"/>
@@ -3390,7 +3846,7 @@
           <w:lang w:eastAsia="ru-RU"/>
         </w:rPr>
       </w:pPr>
-      <w:bookmarkStart w:id="5" w:name="_Toc243599218"/>
+      <w:bookmarkStart w:id="5" w:name="_Toc244274815"/>
       <w:r>
         <w:rPr>
           <w:lang w:eastAsia="ru-RU"/>
@@ -4495,7 +4951,7 @@
           <w:lang w:eastAsia="ru-RU"/>
         </w:rPr>
       </w:pPr>
-      <w:bookmarkStart w:id="6" w:name="_Toc243599219"/>
+      <w:bookmarkStart w:id="6" w:name="_Toc244274816"/>
       <w:r>
         <w:rPr>
           <w:lang w:eastAsia="ru-RU"/>
@@ -4517,7 +4973,7 @@
           <w:lang w:eastAsia="ru-RU"/>
         </w:rPr>
       </w:pPr>
-      <w:bookmarkStart w:id="7" w:name="_Toc243599220"/>
+      <w:bookmarkStart w:id="7" w:name="_Toc244274817"/>
       <w:r>
         <w:rPr>
           <w:lang w:eastAsia="ru-RU"/>
@@ -4724,7 +5180,7 @@
           <w:lang w:eastAsia="ru-RU"/>
         </w:rPr>
       </w:pPr>
-      <w:bookmarkStart w:id="8" w:name="_Toc243599221"/>
+      <w:bookmarkStart w:id="8" w:name="_Toc244274818"/>
       <w:r>
         <w:rPr>
           <w:lang w:eastAsia="ru-RU"/>
@@ -5854,7 +6310,7 @@
           <w:lang w:eastAsia="ru-RU"/>
         </w:rPr>
       </w:pPr>
-      <w:bookmarkStart w:id="9" w:name="_Toc243599222"/>
+      <w:bookmarkStart w:id="9" w:name="_Toc244274819"/>
       <w:r>
         <w:rPr>
           <w:lang w:eastAsia="ru-RU"/>
@@ -6746,7 +7202,7 @@
           <w:lang w:eastAsia="ru-RU"/>
         </w:rPr>
       </w:pPr>
-      <w:bookmarkStart w:id="10" w:name="_Toc243599223"/>
+      <w:bookmarkStart w:id="10" w:name="_Toc244274820"/>
       <w:r>
         <w:rPr>
           <w:lang w:eastAsia="ru-RU"/>
@@ -7198,7 +7654,7 @@
           <w:lang w:eastAsia="ru-RU"/>
         </w:rPr>
       </w:pPr>
-      <w:bookmarkStart w:id="11" w:name="_Toc243599224"/>
+      <w:bookmarkStart w:id="11" w:name="_Toc244274821"/>
       <w:r>
         <w:rPr>
           <w:lang w:eastAsia="ru-RU"/>
@@ -7392,7 +7848,7 @@
           <w:lang w:eastAsia="ru-RU"/>
         </w:rPr>
       </w:pPr>
-      <w:bookmarkStart w:id="12" w:name="_Toc243599225"/>
+      <w:bookmarkStart w:id="12" w:name="_Toc244274822"/>
       <w:proofErr w:type="spellStart"/>
       <w:r>
         <w:rPr>
@@ -7816,7 +8272,7 @@
           <w:lang w:val="en-US" w:eastAsia="ru-RU"/>
         </w:rPr>
       </w:pPr>
-      <w:bookmarkStart w:id="13" w:name="_Toc243599226"/>
+      <w:bookmarkStart w:id="13" w:name="_Toc244274823"/>
       <w:proofErr w:type="spellStart"/>
       <w:r>
         <w:rPr>
@@ -8152,7 +8608,7 @@
           <w:lang w:eastAsia="ru-RU"/>
         </w:rPr>
       </w:pPr>
-      <w:bookmarkStart w:id="14" w:name="_Toc243599227"/>
+      <w:bookmarkStart w:id="14" w:name="_Toc244274824"/>
       <w:r>
         <w:rPr>
           <w:lang w:eastAsia="ru-RU"/>
@@ -8346,7 +8802,7 @@
         </w:numPr>
         <w:ind w:left="0" w:firstLine="709"/>
       </w:pPr>
-      <w:bookmarkStart w:id="15" w:name="_Toc243599228"/>
+      <w:bookmarkStart w:id="15" w:name="_Toc244274825"/>
       <w:r>
         <w:t>Требования к мобильному приложению</w:t>
       </w:r>
@@ -8523,7 +8979,7 @@
           <w:lang w:eastAsia="ru-RU"/>
         </w:rPr>
       </w:pPr>
-      <w:bookmarkStart w:id="16" w:name="_Toc243599229"/>
+      <w:bookmarkStart w:id="16" w:name="_Toc244274826"/>
       <w:r>
         <w:rPr>
           <w:lang w:eastAsia="ru-RU"/>
@@ -9324,7 +9780,7 @@
           <w:lang w:eastAsia="ru-RU"/>
         </w:rPr>
       </w:pPr>
-      <w:bookmarkStart w:id="17" w:name="_Toc243599230"/>
+      <w:bookmarkStart w:id="17" w:name="_Toc244274827"/>
       <w:r>
         <w:rPr>
           <w:lang w:eastAsia="ru-RU"/>
@@ -10261,7 +10717,7 @@
           <w:lang w:eastAsia="ru-RU"/>
         </w:rPr>
       </w:pPr>
-      <w:bookmarkStart w:id="18" w:name="_Toc243599231"/>
+      <w:bookmarkStart w:id="18" w:name="_Toc244274828"/>
       <w:r>
         <w:rPr>
           <w:lang w:eastAsia="ru-RU"/>
@@ -10911,7 +11367,7 @@
           <w:lang w:val="en-US" w:eastAsia="ru-RU"/>
         </w:rPr>
       </w:pPr>
-      <w:bookmarkStart w:id="19" w:name="_Toc243599232"/>
+      <w:bookmarkStart w:id="19" w:name="_Toc244274829"/>
       <w:r>
         <w:rPr>
           <w:lang w:val="en-US" w:eastAsia="ru-RU"/>
@@ -10933,7 +11389,7 @@
           <w:lang w:eastAsia="ru-RU"/>
         </w:rPr>
       </w:pPr>
-      <w:bookmarkStart w:id="20" w:name="_Toc243599233"/>
+      <w:bookmarkStart w:id="20" w:name="_Toc244274830"/>
       <w:r>
         <w:rPr>
           <w:lang w:eastAsia="ru-RU"/>
@@ -11685,7 +12141,7 @@
           <w:lang w:val="en-US" w:eastAsia="ru-RU"/>
         </w:rPr>
       </w:pPr>
-      <w:bookmarkStart w:id="21" w:name="_Toc243599234"/>
+      <w:bookmarkStart w:id="21" w:name="_Toc244274831"/>
       <w:r>
         <w:rPr>
           <w:lang w:eastAsia="ru-RU"/>
@@ -11780,9 +12236,9 @@
         <w:tblLook w:val="04A0" w:firstRow="1" w:lastRow="0" w:firstColumn="1" w:lastColumn="0" w:noHBand="0" w:noVBand="1"/>
       </w:tblPr>
       <w:tblGrid>
-        <w:gridCol w:w="3164"/>
-        <w:gridCol w:w="3104"/>
-        <w:gridCol w:w="3077"/>
+        <w:gridCol w:w="3154"/>
+        <w:gridCol w:w="3094"/>
+        <w:gridCol w:w="3097"/>
       </w:tblGrid>
       <w:tr>
         <w:tc>
@@ -11938,58 +12394,7 @@
                 <w:szCs w:val="24"/>
                 <w:lang w:val="en-US"/>
               </w:rPr>
-              <w:t>), objective (</w:t>
-            </w:r>
-            <w:r>
-              <w:rPr>
-                <w:rFonts w:ascii="Times New Roman" w:hAnsi="Times New Roman" w:cs="Times New Roman"/>
-                <w:sz w:val="24"/>
-                <w:szCs w:val="24"/>
-              </w:rPr>
-              <w:t>цель</w:t>
-            </w:r>
-            <w:r>
-              <w:rPr>
-                <w:rFonts w:ascii="Times New Roman" w:hAnsi="Times New Roman" w:cs="Times New Roman"/>
-                <w:sz w:val="24"/>
-                <w:szCs w:val="24"/>
-                <w:lang w:val="en-US"/>
-              </w:rPr>
-              <w:t>), status (</w:t>
-            </w:r>
-            <w:r>
-              <w:rPr>
-                <w:rFonts w:ascii="Times New Roman" w:hAnsi="Times New Roman" w:cs="Times New Roman"/>
-                <w:sz w:val="24"/>
-                <w:szCs w:val="24"/>
-              </w:rPr>
-              <w:t>статус</w:t>
-            </w:r>
-            <w:r>
-              <w:rPr>
-                <w:rFonts w:ascii="Times New Roman" w:hAnsi="Times New Roman" w:cs="Times New Roman"/>
-                <w:sz w:val="24"/>
-                <w:szCs w:val="24"/>
-                <w:lang w:val="en-US"/>
-              </w:rPr>
-              <w:t xml:space="preserve"> </w:t>
-            </w:r>
-            <w:r>
-              <w:rPr>
-                <w:rFonts w:ascii="Times New Roman" w:hAnsi="Times New Roman" w:cs="Times New Roman"/>
-                <w:sz w:val="24"/>
-                <w:szCs w:val="24"/>
-              </w:rPr>
-              <w:t>дела</w:t>
-            </w:r>
-            <w:r>
-              <w:rPr>
-                <w:rFonts w:ascii="Times New Roman" w:hAnsi="Times New Roman" w:cs="Times New Roman"/>
-                <w:sz w:val="24"/>
-                <w:szCs w:val="24"/>
-                <w:lang w:val="en-US"/>
-              </w:rPr>
-              <w:t>).</w:t>
+              <w:t>)</w:t>
             </w:r>
           </w:p>
         </w:tc>
@@ -12267,7 +12672,6 @@
                 <w:szCs w:val="24"/>
                 <w:lang w:val="en-US"/>
               </w:rPr>
-              <w:lastRenderedPageBreak/>
               <w:t>description</w:t>
             </w:r>
             <w:r>
@@ -12317,7 +12721,6 @@
                 <w:sz w:val="24"/>
                 <w:szCs w:val="24"/>
               </w:rPr>
-              <w:lastRenderedPageBreak/>
               <w:t>Улика, которую игрок получает и изучает.</w:t>
             </w:r>
           </w:p>
@@ -12611,7 +13014,23 @@
                 <w:sz w:val="24"/>
                 <w:szCs w:val="24"/>
               </w:rPr>
-              <w:t xml:space="preserve"> (статус расследования).</w:t>
+              <w:t xml:space="preserve"> (статус расследования</w:t>
+            </w:r>
+            <w:r>
+              <w:rPr>
+                <w:rFonts w:ascii="Times New Roman" w:hAnsi="Times New Roman" w:cs="Times New Roman"/>
+                <w:sz w:val="24"/>
+                <w:szCs w:val="24"/>
+              </w:rPr>
+              <w:t xml:space="preserve"> из перечисления</w:t>
+            </w:r>
+            <w:r>
+              <w:rPr>
+                <w:rFonts w:ascii="Times New Roman" w:hAnsi="Times New Roman" w:cs="Times New Roman"/>
+                <w:sz w:val="24"/>
+                <w:szCs w:val="24"/>
+              </w:rPr>
+              <w:t>).</w:t>
             </w:r>
           </w:p>
         </w:tc>
@@ -12753,7 +13172,41 @@
                 <w:sz w:val="24"/>
                 <w:szCs w:val="24"/>
               </w:rPr>
-              <w:t xml:space="preserve"> (правильность обвинения), </w:t>
+              <w:t xml:space="preserve"> (правильность обвинения</w:t>
+            </w:r>
+            <w:r>
+              <w:rPr>
+                <w:rFonts w:ascii="Times New Roman" w:hAnsi="Times New Roman" w:cs="Times New Roman"/>
+                <w:sz w:val="24"/>
+                <w:szCs w:val="24"/>
+              </w:rPr>
+              <w:t xml:space="preserve"> </w:t>
+            </w:r>
+            <w:r>
+              <w:rPr>
+                <w:rFonts w:ascii="Times New Roman" w:hAnsi="Times New Roman" w:cs="Times New Roman"/>
+                <w:sz w:val="24"/>
+                <w:szCs w:val="24"/>
+              </w:rPr>
+              <w:t xml:space="preserve">из </w:t>
+            </w:r>
+            <w:proofErr w:type="spellStart"/>
+            <w:r>
+              <w:rPr>
+                <w:rFonts w:ascii="Times New Roman" w:hAnsi="Times New Roman" w:cs="Times New Roman"/>
+                <w:sz w:val="24"/>
+                <w:szCs w:val="24"/>
+              </w:rPr>
+              <w:t>перечисленния</w:t>
+            </w:r>
+            <w:proofErr w:type="spellEnd"/>
+            <w:r>
+              <w:rPr>
+                <w:rFonts w:ascii="Times New Roman" w:hAnsi="Times New Roman" w:cs="Times New Roman"/>
+                <w:sz w:val="24"/>
+                <w:szCs w:val="24"/>
+              </w:rPr>
+              <w:t xml:space="preserve">), </w:t>
             </w:r>
             <w:r>
               <w:rPr>
@@ -12796,6 +13249,22 @@
               </w:rPr>
               <w:t>Итоговый выбор подозреваемого.</w:t>
             </w:r>
+            <w:r>
+              <w:rPr>
+                <w:rFonts w:ascii="Times New Roman" w:hAnsi="Times New Roman" w:cs="Times New Roman"/>
+                <w:sz w:val="24"/>
+                <w:szCs w:val="24"/>
+              </w:rPr>
+              <w:t xml:space="preserve"> </w:t>
+            </w:r>
+            <w:r>
+              <w:rPr>
+                <w:rFonts w:ascii="Times New Roman" w:hAnsi="Times New Roman" w:cs="Times New Roman"/>
+                <w:sz w:val="24"/>
+                <w:szCs w:val="24"/>
+              </w:rPr>
+              <w:t>До того как проверка верности ответа не пройдена на сервере, в поле правильности обвинения стоит: «Неопределённо»</w:t>
+            </w:r>
           </w:p>
         </w:tc>
       </w:tr>
@@ -12821,7 +13290,7 @@
                 <w:sz w:val="24"/>
                 <w:szCs w:val="24"/>
               </w:rPr>
-              <w:t>MorsePuzzle</w:t>
+              <w:t>Puzzle</w:t>
             </w:r>
             <w:proofErr w:type="spellEnd"/>
           </w:p>
@@ -12874,7 +13343,23 @@
                 <w:sz w:val="24"/>
                 <w:szCs w:val="24"/>
               </w:rPr>
-              <w:t xml:space="preserve"> (закодированный сигнал), </w:t>
+              <w:t xml:space="preserve"> (закодированный сигнал</w:t>
+            </w:r>
+            <w:r>
+              <w:rPr>
+                <w:rFonts w:ascii="Times New Roman" w:hAnsi="Times New Roman" w:cs="Times New Roman"/>
+                <w:sz w:val="24"/>
+                <w:szCs w:val="24"/>
+              </w:rPr>
+              <w:t xml:space="preserve"> или загадка</w:t>
+            </w:r>
+            <w:r>
+              <w:rPr>
+                <w:rFonts w:ascii="Times New Roman" w:hAnsi="Times New Roman" w:cs="Times New Roman"/>
+                <w:sz w:val="24"/>
+                <w:szCs w:val="24"/>
+              </w:rPr>
+              <w:t xml:space="preserve">), </w:t>
             </w:r>
             <w:proofErr w:type="spellStart"/>
             <w:r>
@@ -12934,7 +13419,39 @@
                 <w:sz w:val="24"/>
                 <w:szCs w:val="24"/>
               </w:rPr>
-              <w:t>Вибрационная загадка и награда.</w:t>
+              <w:t>Вибрационная загадка</w:t>
+            </w:r>
+            <w:r>
+              <w:rPr>
+                <w:rFonts w:ascii="Times New Roman" w:hAnsi="Times New Roman" w:cs="Times New Roman"/>
+                <w:sz w:val="24"/>
+                <w:szCs w:val="24"/>
+              </w:rPr>
+              <w:t>,</w:t>
+            </w:r>
+            <w:r>
+              <w:rPr>
+                <w:rFonts w:ascii="Times New Roman" w:hAnsi="Times New Roman" w:cs="Times New Roman"/>
+                <w:sz w:val="24"/>
+                <w:szCs w:val="24"/>
+              </w:rPr>
+              <w:t xml:space="preserve"> </w:t>
+            </w:r>
+            <w:r>
+              <w:rPr>
+                <w:rFonts w:ascii="Times New Roman" w:hAnsi="Times New Roman" w:cs="Times New Roman"/>
+                <w:sz w:val="24"/>
+                <w:szCs w:val="24"/>
+              </w:rPr>
+              <w:t>и другие загадки для получения улик</w:t>
+            </w:r>
+            <w:r>
+              <w:rPr>
+                <w:rFonts w:ascii="Times New Roman" w:hAnsi="Times New Roman" w:cs="Times New Roman"/>
+                <w:sz w:val="24"/>
+                <w:szCs w:val="24"/>
+              </w:rPr>
+              <w:t>.</w:t>
             </w:r>
           </w:p>
         </w:tc>
@@ -12945,33 +13462,102 @@
         <w:pStyle w:val="a9"/>
         <w:jc w:val="left"/>
         <w:rPr>
+          <w:lang w:eastAsia="ru-RU"/>
+        </w:rPr>
+      </w:pPr>
+    </w:p>
+    <w:p>
+      <w:pPr>
+        <w:pStyle w:val="a9"/>
+        <w:ind w:firstLine="0"/>
+        <w:jc w:val="center"/>
+        <w:rPr>
+          <w:lang w:eastAsia="ru-RU"/>
+        </w:rPr>
+      </w:pPr>
+      <w:r>
+        <w:rPr>
+          <w:lang w:eastAsia="ru-RU"/>
+        </w:rPr>
+        <w:lastRenderedPageBreak/>
+        <w:drawing>
+          <wp:inline distT="0" distB="0" distL="0" distR="0" wp14:anchorId="2D4031B9" wp14:editId="13906853">
+            <wp:extent cx="5476875" cy="4171909"/>
+            <wp:effectExtent l="0" t="0" r="0" b="635"/>
+            <wp:docPr id="4" name="Рисунок 4"/>
+            <wp:cNvGraphicFramePr>
+              <a:graphicFrameLocks xmlns:a="http://schemas.openxmlformats.org/drawingml/2006/main" noChangeAspect="1"/>
+            </wp:cNvGraphicFramePr>
+            <a:graphic xmlns:a="http://schemas.openxmlformats.org/drawingml/2006/main">
+              <a:graphicData uri="http://schemas.openxmlformats.org/drawingml/2006/picture">
+                <pic:pic xmlns:pic="http://schemas.openxmlformats.org/drawingml/2006/picture">
+                  <pic:nvPicPr>
+                    <pic:cNvPr id="1" name=""/>
+                    <pic:cNvPicPr/>
+                  </pic:nvPicPr>
+                  <pic:blipFill>
+                    <a:blip r:embed="rId9"/>
+                    <a:stretch>
+                      <a:fillRect/>
+                    </a:stretch>
+                  </pic:blipFill>
+                  <pic:spPr>
+                    <a:xfrm>
+                      <a:off x="0" y="0"/>
+                      <a:ext cx="5480866" cy="4174949"/>
+                    </a:xfrm>
+                    <a:prstGeom prst="rect">
+                      <a:avLst/>
+                    </a:prstGeom>
+                  </pic:spPr>
+                </pic:pic>
+              </a:graphicData>
+            </a:graphic>
+          </wp:inline>
+        </w:drawing>
+      </w:r>
+    </w:p>
+    <w:p>
+      <w:pPr>
+        <w:pStyle w:val="a9"/>
+        <w:ind w:firstLine="0"/>
+        <w:jc w:val="center"/>
+        <w:rPr>
+          <w:lang w:eastAsia="ru-RU"/>
+        </w:rPr>
+      </w:pPr>
+      <w:r>
+        <w:rPr>
+          <w:lang w:eastAsia="ru-RU"/>
+        </w:rPr>
+        <w:t>Рисунок 4 – Диаграмма классов для с</w:t>
+      </w:r>
+      <w:r>
+        <w:rPr>
+          <w:lang w:eastAsia="ru-RU"/>
+        </w:rPr>
+        <w:t>л</w:t>
+      </w:r>
+      <w:bookmarkStart w:id="22" w:name="_GoBack"/>
+      <w:bookmarkEnd w:id="22"/>
+      <w:r>
+        <w:rPr>
+          <w:lang w:eastAsia="ru-RU"/>
+        </w:rPr>
+        <w:t xml:space="preserve">оя </w:t>
+      </w:r>
+      <w:r>
+        <w:rPr>
           <w:lang w:val="en-US" w:eastAsia="ru-RU"/>
         </w:rPr>
-      </w:pPr>
-    </w:p>
-    <w:p>
-      <w:pPr>
-        <w:pStyle w:val="a9"/>
-        <w:jc w:val="left"/>
-        <w:rPr>
-          <w:lang w:eastAsia="ru-RU"/>
-        </w:rPr>
-      </w:pPr>
-      <w:r>
-        <w:rPr>
-          <w:lang w:eastAsia="ru-RU"/>
-        </w:rPr>
-        <w:t>Добавить сюда диаграмму классов для этого слоя</w:t>
-      </w:r>
-    </w:p>
-    <w:p>
-      <w:pPr>
-        <w:pStyle w:val="a9"/>
-        <w:jc w:val="left"/>
-        <w:rPr>
-          <w:lang w:eastAsia="ru-RU"/>
-        </w:rPr>
-      </w:pPr>
+        <w:t>domain</w:t>
+      </w:r>
+      <w:r>
+        <w:rPr>
+          <w:lang w:eastAsia="ru-RU"/>
+        </w:rPr>
+        <w:t>.</w:t>
+      </w:r>
     </w:p>
     <w:p>
       <w:pPr>
@@ -12994,7 +13580,7 @@
           <w:lang w:eastAsia="ru-RU"/>
         </w:rPr>
       </w:pPr>
-      <w:bookmarkStart w:id="22" w:name="_Toc243599235"/>
+      <w:bookmarkStart w:id="23" w:name="_Toc244274832"/>
       <w:r>
         <w:rPr>
           <w:lang w:eastAsia="ru-RU"/>
@@ -13031,7 +13617,7 @@
         </w:rPr>
         <w:t>и интерфейсов проекта</w:t>
       </w:r>
-      <w:bookmarkEnd w:id="22"/>
+      <w:bookmarkEnd w:id="23"/>
     </w:p>
     <w:p>
       <w:pPr>
@@ -13280,7 +13866,6 @@
               <w:rPr>
                 <w:rFonts w:ascii="Times New Roman" w:hAnsi="Times New Roman" w:cs="Times New Roman"/>
               </w:rPr>
-              <w:lastRenderedPageBreak/>
               <w:t>LoadAvailableCases</w:t>
             </w:r>
             <w:proofErr w:type="spellEnd"/>
@@ -13695,6 +14280,7 @@
               <w:rPr>
                 <w:rFonts w:ascii="Times New Roman" w:hAnsi="Times New Roman" w:cs="Times New Roman"/>
               </w:rPr>
+              <w:lastRenderedPageBreak/>
               <w:t>SaveNote</w:t>
             </w:r>
             <w:proofErr w:type="spellEnd"/>
@@ -14745,7 +15331,6 @@
                 <w:sz w:val="28"/>
                 <w:szCs w:val="28"/>
               </w:rPr>
-              <w:lastRenderedPageBreak/>
               <w:t>SuspectRepository</w:t>
             </w:r>
             <w:proofErr w:type="spellEnd"/>
@@ -15211,6 +15796,7 @@
                 <w:sz w:val="28"/>
                 <w:szCs w:val="28"/>
               </w:rPr>
+              <w:lastRenderedPageBreak/>
               <w:t>ProgressRepository</w:t>
             </w:r>
             <w:proofErr w:type="spellEnd"/>
@@ -16246,7 +16832,7 @@
           <w:lang w:val="en-US" w:eastAsia="ru-RU"/>
         </w:rPr>
       </w:pPr>
-      <w:bookmarkStart w:id="23" w:name="_Toc243599236"/>
+      <w:bookmarkStart w:id="24" w:name="_Toc244274833"/>
       <w:r>
         <w:rPr>
           <w:lang w:eastAsia="ru-RU"/>
@@ -16259,7 +16845,7 @@
         </w:rPr>
         <w:t>SOLID</w:t>
       </w:r>
-      <w:bookmarkEnd w:id="23"/>
+      <w:bookmarkEnd w:id="24"/>
     </w:p>
     <w:p>
       <w:pPr>
@@ -16418,6 +17004,7 @@
                 <w:sz w:val="28"/>
                 <w:szCs w:val="28"/>
               </w:rPr>
+              <w:lastRenderedPageBreak/>
               <w:t>S</w:t>
             </w:r>
           </w:p>
@@ -17065,16 +17652,7 @@
                 <w:sz w:val="28"/>
                 <w:szCs w:val="28"/>
               </w:rPr>
-              <w:t xml:space="preserve"> </w:t>
-            </w:r>
-            <w:r>
-              <w:rPr>
-                <w:rFonts w:ascii="Times New Roman" w:hAnsi="Times New Roman" w:cs="Times New Roman"/>
-                <w:sz w:val="28"/>
-                <w:szCs w:val="28"/>
-              </w:rPr>
-              <w:lastRenderedPageBreak/>
-              <w:t xml:space="preserve">созданы 7 небольших интерфейсов по задачам. </w:t>
+              <w:t xml:space="preserve"> созданы 7 небольших интерфейсов по задачам. </w:t>
             </w:r>
             <w:proofErr w:type="spellStart"/>
             <w:r>
@@ -17368,20 +17946,20 @@
           <w:lang w:eastAsia="ru-RU"/>
         </w:rPr>
       </w:pPr>
-      <w:bookmarkStart w:id="24" w:name="_Toc243599237"/>
+      <w:bookmarkStart w:id="25" w:name="_Toc244274834"/>
       <w:r>
         <w:rPr>
           <w:lang w:eastAsia="ru-RU"/>
         </w:rPr>
         <w:t xml:space="preserve">Решение по </w:t>
       </w:r>
-      <w:bookmarkEnd w:id="24"/>
       <w:r>
         <w:rPr>
           <w:lang w:eastAsia="ru-RU"/>
         </w:rPr>
         <w:t>много модульности</w:t>
       </w:r>
+      <w:bookmarkEnd w:id="25"/>
     </w:p>
     <w:p>
       <w:pPr>
@@ -17880,7 +18458,14 @@
         <w:rPr>
           <w:lang w:eastAsia="ru-RU"/>
         </w:rPr>
-        <w:t xml:space="preserve"> заняла бы время, которое лучше потратить на функциональность. При этом структура подготовлена к разделению: пакет </w:t>
+        <w:t xml:space="preserve"> заняла бы время, которое лучше потратить на функциональность. При этом </w:t>
+      </w:r>
+      <w:r>
+        <w:rPr>
+          <w:lang w:eastAsia="ru-RU"/>
+        </w:rPr>
+        <w:lastRenderedPageBreak/>
+        <w:t xml:space="preserve">структура подготовлена к разделению: пакет </w:t>
       </w:r>
       <w:proofErr w:type="spellStart"/>
       <w:r>
@@ -17922,12 +18507,14 @@
           <w:lang w:eastAsia="ru-RU"/>
         </w:rPr>
       </w:pPr>
+      <w:bookmarkStart w:id="26" w:name="_Toc244274835"/>
       <w:r>
         <w:rPr>
           <w:lang w:eastAsia="ru-RU"/>
         </w:rPr>
         <w:t>Проектирование дизайна системы.</w:t>
       </w:r>
+      <w:bookmarkEnd w:id="26"/>
     </w:p>
     <w:p>
       <w:pPr>
@@ -17941,12 +18528,14 @@
           <w:lang w:eastAsia="ru-RU"/>
         </w:rPr>
       </w:pPr>
+      <w:bookmarkStart w:id="27" w:name="_Toc244274836"/>
       <w:r>
         <w:rPr>
           <w:lang w:eastAsia="ru-RU"/>
         </w:rPr>
         <w:t>Составление цветовой палитры.</w:t>
       </w:r>
+      <w:bookmarkEnd w:id="27"/>
     </w:p>
     <w:p>
       <w:pPr>
@@ -18181,7 +18770,7 @@
                 <w:rFonts w:cs="Times New Roman"/>
                 <w:sz w:val="24"/>
                 <w:szCs w:val="24"/>
-                <w:lang w:val="en-US" w:eastAsia="ru-RU"/>
+                <w:lang w:eastAsia="ru-RU"/>
               </w:rPr>
             </w:pPr>
             <w:r>
@@ -18891,7 +19480,6 @@
               </w:rPr>
             </w:pPr>
             <w:r>
-              <w:lastRenderedPageBreak/>
               <w:t>Успешное действие</w:t>
             </w:r>
           </w:p>
@@ -19149,6 +19737,7 @@
         <w:rPr>
           <w:lang w:eastAsia="ru-RU"/>
         </w:rPr>
+        <w:lastRenderedPageBreak/>
         <w:t>Светлая тема предназначена для комфортного использования приложения при обычном освещении. Тёплый фон уменьшает визуальную резкость по сравнению с чисто белым фоном, а тёмно-синий основной цвет используется для ключевых кнопок и активных состояний.</w:t>
       </w:r>
     </w:p>
@@ -19178,6 +19767,7 @@
           <w:lang w:eastAsia="ru-RU"/>
         </w:rPr>
       </w:pPr>
+      <w:bookmarkStart w:id="28" w:name="_Toc244274837"/>
       <w:r>
         <w:rPr>
           <w:lang w:eastAsia="ru-RU"/>
@@ -19202,6 +19792,7 @@
         </w:rPr>
         <w:t>.</w:t>
       </w:r>
+      <w:bookmarkEnd w:id="28"/>
     </w:p>
     <w:p>
       <w:pPr>
@@ -20104,7 +20695,6 @@
                 <w:sz w:val="24"/>
                 <w:szCs w:val="24"/>
               </w:rPr>
-              <w:lastRenderedPageBreak/>
               <w:t>Body</w:t>
             </w:r>
             <w:proofErr w:type="spellEnd"/>
@@ -21032,13 +21622,14 @@
           <w:lang w:eastAsia="ru-RU"/>
         </w:rPr>
       </w:pPr>
-      <w:r>
-        <w:rPr>
-          <w:lang w:eastAsia="ru-RU"/>
-        </w:rPr>
-        <w:lastRenderedPageBreak/>
+      <w:bookmarkStart w:id="29" w:name="_Toc244274838"/>
+      <w:r>
+        <w:rPr>
+          <w:lang w:eastAsia="ru-RU"/>
+        </w:rPr>
         <w:t>Библиотека компонентов</w:t>
       </w:r>
+      <w:bookmarkEnd w:id="29"/>
     </w:p>
     <w:p>
       <w:pPr>
@@ -21084,13 +21675,7 @@
         <w:rPr>
           <w:lang w:eastAsia="ru-RU"/>
         </w:rPr>
-        <w:t>Цветовые палитры (две темы). Набор HEX-кодов для темной и светлой темы: цвета фона, поверхностей (карточек), ос</w:t>
-      </w:r>
-      <w:r>
-        <w:rPr>
-          <w:lang w:eastAsia="ru-RU"/>
-        </w:rPr>
-        <w:t>новного текста, акцентные цвета.</w:t>
+        <w:t>Цветовые палитры (две темы). Набор HEX-кодов для темной и светлой темы: цвета фона, поверхностей (карточек), основного текста, акцентные цвета.</w:t>
       </w:r>
     </w:p>
     <w:p>
@@ -21128,6 +21713,7 @@
         <w:rPr>
           <w:lang w:eastAsia="ru-RU"/>
         </w:rPr>
+        <w:lastRenderedPageBreak/>
         <w:t xml:space="preserve">Поля ввода. Два состояния полей для ввода текста (пустое с </w:t>
       </w:r>
       <w:proofErr w:type="spellStart"/>
@@ -21142,13 +21728,7 @@
         <w:rPr>
           <w:lang w:eastAsia="ru-RU"/>
         </w:rPr>
-        <w:t xml:space="preserve"> и заполненное)</w:t>
-      </w:r>
-      <w:r>
-        <w:rPr>
-          <w:lang w:eastAsia="ru-RU"/>
-        </w:rPr>
-        <w:t>.</w:t>
+        <w:t xml:space="preserve"> и заполненное).</w:t>
       </w:r>
     </w:p>
     <w:p>
@@ -21186,13 +21766,7 @@
         <w:rPr>
           <w:lang w:eastAsia="ru-RU"/>
         </w:rPr>
-        <w:t>Статусные плашки. Индикаторы состояний («Улика найдена», «До</w:t>
-      </w:r>
-      <w:r>
-        <w:rPr>
-          <w:lang w:eastAsia="ru-RU"/>
-        </w:rPr>
-        <w:t>ступно», «Выполнено», «Ошибка»).</w:t>
+        <w:t>Статусные плашки. Индикаторы состояний («Улика найдена», «Доступно», «Выполнено», «Ошибка»).</w:t>
       </w:r>
     </w:p>
     <w:p>
@@ -21244,13 +21818,7 @@
         <w:rPr>
           <w:lang w:eastAsia="ru-RU"/>
         </w:rPr>
-        <w:t>Карточка улики. Компонент с изображением предмета, названием, описанием</w:t>
-      </w:r>
-      <w:r>
-        <w:rPr>
-          <w:lang w:eastAsia="ru-RU"/>
-        </w:rPr>
-        <w:t>.</w:t>
+        <w:t>Карточка улики. Компонент с изображением предмета, названием, описанием.</w:t>
       </w:r>
     </w:p>
     <w:p>
@@ -21288,31 +21856,7 @@
         <w:rPr>
           <w:lang w:eastAsia="ru-RU"/>
         </w:rPr>
-        <w:t xml:space="preserve">Экран допроса в темной </w:t>
-      </w:r>
-      <w:r>
-        <w:rPr>
-          <w:lang w:eastAsia="ru-RU"/>
-        </w:rPr>
-        <w:t>и светлой темах</w:t>
-      </w:r>
-      <w:r>
-        <w:rPr>
-          <w:lang w:eastAsia="ru-RU"/>
-        </w:rPr>
-        <w:t xml:space="preserve">. Интерфейс диалога с NPC: </w:t>
-      </w:r>
-      <w:r>
-        <w:rPr>
-          <w:lang w:eastAsia="ru-RU"/>
-        </w:rPr>
-        <w:t xml:space="preserve">сообщения </w:t>
-      </w:r>
-      <w:r>
-        <w:rPr>
-          <w:lang w:eastAsia="ru-RU"/>
-        </w:rPr>
-        <w:t>персонажа и игрока, время отправки, поле ввода.</w:t>
+        <w:t>Экран допроса в темной и светлой темах. Интерфейс диалога с NPC: сообщения персонажа и игрока, время отправки, поле ввода.</w:t>
       </w:r>
     </w:p>
     <w:p>
@@ -21336,27 +21880,13 @@
           <w:lang w:eastAsia="ru-RU"/>
         </w:rPr>
       </w:pPr>
-      <w:hyperlink r:id="rId9" w:history="1">
+      <w:hyperlink r:id="rId10" w:history="1">
         <w:r>
           <w:rPr>
             <w:rStyle w:val="a6"/>
             <w:lang w:eastAsia="ru-RU"/>
           </w:rPr>
-          <w:t>https://www.figma.</w:t>
-        </w:r>
-        <w:r>
-          <w:rPr>
-            <w:rStyle w:val="a6"/>
-            <w:lang w:eastAsia="ru-RU"/>
-          </w:rPr>
-          <w:t>c</w:t>
-        </w:r>
-        <w:r>
-          <w:rPr>
-            <w:rStyle w:val="a6"/>
-            <w:lang w:eastAsia="ru-RU"/>
-          </w:rPr>
-          <w:t>om/design/G4p5PalgXFhdN4fEIbo5ie/ColdTrail?node-id=0-1&amp;p=f&amp;t=764HDufG8wXUSKtE-0</w:t>
+          <w:t>https://www.figma.com/design/G4p5PalgXFhdN4fEIbo5ie/ColdTrail?node-id=0-1&amp;p=f&amp;t=764HDufG8wXUSKtE-0</w:t>
         </w:r>
       </w:hyperlink>
     </w:p>
@@ -21372,6 +21902,7 @@
           <w:lang w:eastAsia="ru-RU"/>
         </w:rPr>
       </w:pPr>
+      <w:bookmarkStart w:id="30" w:name="_Toc244274839"/>
       <w:r>
         <w:rPr>
           <w:lang w:eastAsia="ru-RU"/>
@@ -21384,6 +21915,7 @@
         </w:rPr>
         <w:t>WCAG AA</w:t>
       </w:r>
+      <w:bookmarkEnd w:id="30"/>
     </w:p>
     <w:p>
       <w:pPr>
@@ -21410,32 +21942,7 @@
         <w:rPr>
           <w:lang w:eastAsia="ru-RU"/>
         </w:rPr>
-        <w:t xml:space="preserve"> тёмной и светлой тем. Проверка выполнялась на основе требований WCAG AA, согласно которым </w:t>
-      </w:r>
-      <w:r>
-        <w:rPr>
-          <w:lang w:eastAsia="ru-RU"/>
-        </w:rPr>
-        <w:lastRenderedPageBreak/>
-        <w:t xml:space="preserve">коэффициент контрастности обычного текста и фона должен составлять не менее 4,5:1, а крупного текста </w:t>
-      </w:r>
-      <w:r>
-        <w:rPr>
-          <w:lang w:eastAsia="ru-RU"/>
-        </w:rPr>
-        <w:t>-</w:t>
-      </w:r>
-      <w:r>
-        <w:rPr>
-          <w:lang w:eastAsia="ru-RU"/>
-        </w:rPr>
-        <w:t xml:space="preserve"> не менее 3:1. Для значимых графических элементов и границ компонентов интерфейса минимальный коэффициент составляет 3:</w:t>
-      </w:r>
-      <w:r>
-        <w:rPr>
-          <w:lang w:eastAsia="ru-RU"/>
-        </w:rPr>
-        <w:t>1 относительно соседнего цвета.</w:t>
+        <w:t xml:space="preserve"> тёмной и светлой тем. Проверка выполнялась на основе требований WCAG AA, согласно которым коэффициент контрастности обычного текста и фона должен составлять не менее 4,5:1, а крупного текста - не менее 3:1. Для значимых графических элементов и границ компонентов интерфейса минимальный коэффициент составляет 3:1 относительно соседнего цвета.</w:t>
       </w:r>
     </w:p>
     <w:p>
@@ -21449,19 +21956,7 @@
         <w:rPr>
           <w:lang w:eastAsia="ru-RU"/>
         </w:rPr>
-        <w:t xml:space="preserve">В ходе анализа были рассмотрены сочетания </w:t>
-      </w:r>
-      <w:r>
-        <w:rPr>
-          <w:lang w:eastAsia="ru-RU"/>
-        </w:rPr>
-        <w:t>цветов</w:t>
-      </w:r>
-      <w:r>
-        <w:rPr>
-          <w:lang w:eastAsia="ru-RU"/>
-        </w:rPr>
-        <w:t xml:space="preserve"> </w:t>
+        <w:t xml:space="preserve">В ходе анализа были рассмотрены сочетания цветов </w:t>
       </w:r>
       <w:proofErr w:type="spellStart"/>
       <w:r>
@@ -21618,19 +22113,7 @@
         <w:rPr>
           <w:lang w:eastAsia="ru-RU"/>
         </w:rPr>
-        <w:t xml:space="preserve">Таблица 13 – Проверка соответствия контрастности по системе </w:t>
-      </w:r>
-      <w:r>
-        <w:rPr>
-          <w:lang w:eastAsia="ru-RU"/>
-        </w:rPr>
-        <w:t>WCAG AA</w:t>
-      </w:r>
-      <w:r>
-        <w:rPr>
-          <w:lang w:eastAsia="ru-RU"/>
-        </w:rPr>
-        <w:t>.</w:t>
+        <w:t>Таблица 13 – Проверка соответствия контрастности по системе WCAG AA.</w:t>
       </w:r>
     </w:p>
     <w:tbl>
@@ -21669,6 +22152,7 @@
                 <w:sz w:val="24"/>
                 <w:szCs w:val="24"/>
               </w:rPr>
+              <w:lastRenderedPageBreak/>
               <w:t xml:space="preserve">Сочетание </w:t>
             </w:r>
             <w:proofErr w:type="spellStart"/>
@@ -22551,8 +23035,6 @@
           <w:lang w:eastAsia="ru-RU"/>
         </w:rPr>
       </w:pPr>
-      <w:bookmarkStart w:id="25" w:name="_GoBack"/>
-      <w:bookmarkEnd w:id="25"/>
     </w:p>
     <w:p>
       <w:pPr>
@@ -22565,19 +23047,7 @@
         <w:rPr>
           <w:lang w:eastAsia="ru-RU"/>
         </w:rPr>
-        <w:t xml:space="preserve">Результаты показывают, что </w:t>
-      </w:r>
-      <w:r>
-        <w:rPr>
-          <w:lang w:eastAsia="ru-RU"/>
-        </w:rPr>
-        <w:t>цвета</w:t>
-      </w:r>
-      <w:r>
-        <w:rPr>
-          <w:lang w:eastAsia="ru-RU"/>
-        </w:rPr>
-        <w:t xml:space="preserve"> </w:t>
+        <w:t xml:space="preserve">Результаты показывают, что цвета </w:t>
       </w:r>
       <w:proofErr w:type="spellStart"/>
       <w:r>
@@ -22647,19 +23117,7 @@
         <w:rPr>
           <w:lang w:eastAsia="ru-RU"/>
         </w:rPr>
-        <w:t xml:space="preserve"> также соответствует требованиям контрастности для обычного текста. </w:t>
-      </w:r>
-      <w:r>
-        <w:rPr>
-          <w:lang w:eastAsia="ru-RU"/>
-        </w:rPr>
-        <w:t>Цвет</w:t>
-      </w:r>
-      <w:r>
-        <w:rPr>
-          <w:lang w:eastAsia="ru-RU"/>
-        </w:rPr>
-        <w:t xml:space="preserve"> </w:t>
+        <w:t xml:space="preserve"> также соответствует требованиям контрастности для обычного текста. Цвет </w:t>
       </w:r>
       <w:proofErr w:type="spellStart"/>
       <w:r>
@@ -22673,13 +23131,7 @@
         <w:rPr>
           <w:lang w:eastAsia="ru-RU"/>
         </w:rPr>
-        <w:t xml:space="preserve"> обеспечивает достаточное визуальное вы</w:t>
-      </w:r>
-      <w:r>
-        <w:rPr>
-          <w:lang w:eastAsia="ru-RU"/>
-        </w:rPr>
-        <w:t xml:space="preserve">деление границ относительно </w:t>
+        <w:t xml:space="preserve"> обеспечивает достаточное визуальное выделение границ относительно </w:t>
       </w:r>
       <w:proofErr w:type="spellStart"/>
       <w:r>
@@ -22707,19 +23159,7 @@
         <w:rPr>
           <w:lang w:eastAsia="ru-RU"/>
         </w:rPr>
-        <w:t xml:space="preserve">Таким образом, большинство проверенных сочетаний </w:t>
-      </w:r>
-      <w:r>
-        <w:rPr>
-          <w:lang w:eastAsia="ru-RU"/>
-        </w:rPr>
-        <w:t>цветов</w:t>
-      </w:r>
-      <w:r>
-        <w:rPr>
-          <w:lang w:eastAsia="ru-RU"/>
-        </w:rPr>
-        <w:t xml:space="preserve"> соответствует требованиям WCAG AA. </w:t>
+        <w:t xml:space="preserve">Таким образом, большинство проверенных сочетаний цветов соответствует требованиям WCAG AA. </w:t>
       </w:r>
     </w:p>
     <w:sectPr>
@@ -26508,7 +26948,7 @@
 </file>
 
 <file path=customXml/itemProps1.xml><?xml version="1.0" encoding="utf-8"?>
-<ds:datastoreItem xmlns:ds="http://schemas.openxmlformats.org/officeDocument/2006/customXml" ds:itemID="{FB719F64-1F11-4552-AF35-E52B6CD37C6B}">
+<ds:datastoreItem xmlns:ds="http://schemas.openxmlformats.org/officeDocument/2006/customXml" ds:itemID="{AA5AD913-D601-4DE7-B5DD-FFA8F969781C}">
   <ds:schemaRefs>
     <ds:schemaRef ds:uri="http://schemas.openxmlformats.org/officeDocument/2006/bibliography"/>
   </ds:schemaRefs>

</xml_diff>